<commit_message>
fix: corrige mapeo RPC y almacenamiento de presupuesto_detalle en carga masiva
- CargaMasivaService: mueve deteccion de RPC a prioridades con continue
- CargaMasivaService: amplia condicion de guardia (incluye rp_fecha, cdp_fecha, cdp_valor)
- CargaMasivaService: corrige deduplicacion de presupuesto_detalle (1 por contrato)
- Plantillas MODIFICACION_1 y MODIFICACION_2: actualizadas
</commit_message>
<xml_diff>
--- a/plantillas/MODIFICACION_1_JUSTIFICACION.docx
+++ b/plantillas/MODIFICACION_1_JUSTIFICACION.docx
@@ -1247,8 +1247,6 @@
               </w:rPr>
               <w:t>{{VALOR_TOTAL_A_LA_FECHA}}</w:t>
             </w:r>
-            <w:bookmarkStart w:id="0" w:name="_GoBack"/>
-            <w:bookmarkEnd w:id="0"/>
           </w:p>
         </w:tc>
       </w:tr>
@@ -1763,7 +1761,51 @@
                 <w:szCs w:val="24"/>
                 <w:lang w:val="es-CO"/>
               </w:rPr>
-              <w:t xml:space="preserve">" realiza la siguiente justificación de solicitud de modificación al contrato de Prestación de servicios profesionales </w:t>
+              <w:t>", realiza la siguiente justificación de solicitud de modificación al</w:t>
+            </w:r>
+            <w:r>
+              <w:t xml:space="preserve"> </w:t>
+            </w:r>
+            <w:r>
+              <w:rPr>
+                <w:rFonts w:ascii="Arial" w:hAnsi="Arial" w:cs="Arial"/>
+                <w:color w:val="000000"/>
+                <w:sz w:val="24"/>
+                <w:szCs w:val="24"/>
+                <w:lang w:val="es-CO"/>
+              </w:rPr>
+              <w:t>Contrato de</w:t>
+            </w:r>
+            <w:r>
+              <w:rPr>
+                <w:rFonts w:ascii="Arial" w:hAnsi="Arial" w:cs="Arial"/>
+                <w:color w:val="000000"/>
+                <w:sz w:val="24"/>
+                <w:szCs w:val="24"/>
+                <w:lang w:val="es-CO"/>
+              </w:rPr>
+              <w:t xml:space="preserve"> </w:t>
+            </w:r>
+            <w:r>
+              <w:rPr>
+                <w:rFonts w:ascii="Arial" w:hAnsi="Arial" w:cs="Arial"/>
+                <w:color w:val="000000"/>
+                <w:sz w:val="24"/>
+                <w:szCs w:val="24"/>
+                <w:highlight w:val="yellow"/>
+                <w:lang w:val="es-CO"/>
+              </w:rPr>
+              <w:t>{{TIPO_CONTRATO}}</w:t>
+            </w:r>
+            <w:r>
+              <w:rPr>
+                <w:rFonts w:ascii="Arial" w:hAnsi="Arial" w:cs="Arial"/>
+                <w:color w:val="000000"/>
+                <w:sz w:val="24"/>
+                <w:szCs w:val="24"/>
+                <w:lang w:val="es-CO"/>
+              </w:rPr>
+              <w:t xml:space="preserve"> </w:t>
             </w:r>
             <w:r>
               <w:rPr>
@@ -2063,7 +2105,28 @@
                 <w:szCs w:val="24"/>
                 <w:lang w:val="es-CO"/>
               </w:rPr>
-              <w:t xml:space="preserve">, se dio inicio al plazo de ejecución del contrato de Prestación de servicios profesionales No. </w:t>
+              <w:t xml:space="preserve">, se dio inicio al plazo de ejecución del contrato de </w:t>
+            </w:r>
+            <w:r>
+              <w:rPr>
+                <w:rFonts w:ascii="Arial" w:hAnsi="Arial" w:cs="Arial"/>
+                <w:color w:val="000000"/>
+                <w:sz w:val="24"/>
+                <w:szCs w:val="24"/>
+                <w:highlight w:val="yellow"/>
+                <w:lang w:val="es-CO"/>
+              </w:rPr>
+              <w:t>{{TIPO_CONTRATO}}</w:t>
+            </w:r>
+            <w:r>
+              <w:rPr>
+                <w:rFonts w:ascii="Arial" w:hAnsi="Arial" w:cs="Arial"/>
+                <w:color w:val="000000"/>
+                <w:sz w:val="24"/>
+                <w:szCs w:val="24"/>
+                <w:lang w:val="es-CO"/>
+              </w:rPr>
+              <w:t xml:space="preserve"> No. </w:t>
             </w:r>
             <w:r>
               <w:rPr>
@@ -2136,7 +2199,28 @@
                 <w:szCs w:val="24"/>
                 <w:lang w:val="es-CO"/>
               </w:rPr>
-              <w:t xml:space="preserve">La vigilancia de la ejecución de las actividades derivadas del objeto del contrato de Prestación de servicios profesionales No. </w:t>
+              <w:t xml:space="preserve">La vigilancia de la ejecución de las actividades derivadas del objeto del contrato de </w:t>
+            </w:r>
+            <w:r>
+              <w:rPr>
+                <w:rFonts w:ascii="Arial" w:hAnsi="Arial" w:cs="Arial"/>
+                <w:color w:val="000000"/>
+                <w:sz w:val="24"/>
+                <w:szCs w:val="24"/>
+                <w:highlight w:val="yellow"/>
+                <w:lang w:val="es-CO"/>
+              </w:rPr>
+              <w:t>{{TIPO_CONTRATO}}</w:t>
+            </w:r>
+            <w:r>
+              <w:rPr>
+                <w:rFonts w:ascii="Arial" w:hAnsi="Arial" w:cs="Arial"/>
+                <w:color w:val="000000"/>
+                <w:sz w:val="24"/>
+                <w:szCs w:val="24"/>
+                <w:lang w:val="es-CO"/>
+              </w:rPr>
+              <w:t xml:space="preserve"> No. </w:t>
             </w:r>
             <w:r>
               <w:rPr>
@@ -2157,7 +2241,50 @@
                 <w:szCs w:val="24"/>
                 <w:lang w:val="es-CO"/>
               </w:rPr>
-              <w:t xml:space="preserve"> se ha estado llevando a cabo por ANA CATALINA CASTRO LOZANO - Director Departamento Administrativo, tal y como lo ordena el Manual de Contratación del Distrito Especial de Santiago de Cali, actualmente vigente.</w:t>
+              <w:t xml:space="preserve"> se ha estado llevando a cabo por </w:t>
+            </w:r>
+            <w:r>
+              <w:rPr>
+                <w:rFonts w:ascii="Arial" w:hAnsi="Arial" w:cs="Arial"/>
+                <w:color w:val="000000"/>
+                <w:sz w:val="24"/>
+                <w:szCs w:val="24"/>
+                <w:highlight w:val="yellow"/>
+                <w:lang w:val="es-CO"/>
+              </w:rPr>
+              <w:t>{{SUPERVISOR_NOMBRE_COMPLETO}}</w:t>
+            </w:r>
+            <w:r>
+              <w:rPr>
+                <w:rFonts w:ascii="Arial" w:hAnsi="Arial" w:cs="Arial"/>
+                <w:color w:val="000000"/>
+                <w:sz w:val="24"/>
+                <w:szCs w:val="24"/>
+                <w:lang w:val="es-CO"/>
+              </w:rPr>
+              <w:t xml:space="preserve"> - </w:t>
+            </w:r>
+            <w:r>
+              <w:rPr>
+                <w:rFonts w:ascii="Arial" w:hAnsi="Arial" w:cs="Arial"/>
+                <w:color w:val="000000"/>
+                <w:sz w:val="24"/>
+                <w:szCs w:val="24"/>
+                <w:lang w:val="es-CO"/>
+              </w:rPr>
+              <w:t>{{SUPERVISOR_CARGO}}</w:t>
+            </w:r>
+            <w:bookmarkStart w:id="0" w:name="_GoBack"/>
+            <w:bookmarkEnd w:id="0"/>
+            <w:r>
+              <w:rPr>
+                <w:rFonts w:ascii="Arial" w:hAnsi="Arial" w:cs="Arial"/>
+                <w:color w:val="000000"/>
+                <w:sz w:val="24"/>
+                <w:szCs w:val="24"/>
+                <w:lang w:val="es-CO"/>
+              </w:rPr>
+              <w:t>, tal y como lo ordena el Manual de Contratación del Distrito Especial de Santiago de Cali, actualmente vigente.</w:t>
             </w:r>
           </w:p>
           <w:p>
@@ -2239,83 +2366,17 @@
                 <w:szCs w:val="24"/>
                 <w:lang w:val="es-CO"/>
               </w:rPr>
-              <w:t xml:space="preserve"> se han ejecutado a satisfacción y en atención a la forma de pago establecida en el mismo, se ha autorizado el pago de </w:t>
-            </w:r>
-            <w:r>
-              <w:rPr>
-                <w:rFonts w:ascii="Arial" w:hAnsi="Arial" w:cs="Arial"/>
-                <w:color w:val="000000"/>
-                <w:sz w:val="24"/>
-                <w:szCs w:val="24"/>
-                <w:shd w:val="clear" w:color="auto" w:fill="FFFF00"/>
-                <w:lang w:val="es-CO"/>
-              </w:rPr>
-              <w:t>{{</w:t>
-            </w:r>
-            <w:r>
-              <w:rPr>
-                <w:rFonts w:ascii="Arial" w:hAnsi="Arial" w:cs="Arial"/>
-                <w:color w:val="000000"/>
-                <w:sz w:val="24"/>
-                <w:szCs w:val="24"/>
-                <w:shd w:val="clear" w:color="auto" w:fill="FFFF00"/>
-                <w:lang w:val="es-CO"/>
-              </w:rPr>
-              <w:t>NUMERO_CUOTAS_LETRAS</w:t>
-            </w:r>
-            <w:r>
-              <w:rPr>
-                <w:rFonts w:ascii="Arial" w:hAnsi="Arial" w:cs="Arial"/>
-                <w:color w:val="000000"/>
-                <w:sz w:val="24"/>
-                <w:szCs w:val="24"/>
-                <w:shd w:val="clear" w:color="auto" w:fill="FFFF00"/>
-                <w:lang w:val="es-CO"/>
-              </w:rPr>
-              <w:t>}} ({{</w:t>
-            </w:r>
-            <w:r>
-              <w:rPr>
-                <w:rFonts w:ascii="Arial" w:hAnsi="Arial" w:cs="Arial"/>
-                <w:color w:val="000000"/>
-                <w:sz w:val="24"/>
-                <w:szCs w:val="24"/>
-                <w:shd w:val="clear" w:color="auto" w:fill="FFFF00"/>
-                <w:lang w:val="es-CO"/>
-              </w:rPr>
-              <w:t>NUMERO_CUOTAS_NUMERO</w:t>
-            </w:r>
-            <w:r>
-              <w:rPr>
-                <w:rFonts w:ascii="Arial" w:hAnsi="Arial" w:cs="Arial"/>
-                <w:color w:val="000000"/>
-                <w:sz w:val="24"/>
-                <w:szCs w:val="24"/>
-                <w:shd w:val="clear" w:color="auto" w:fill="FFFF00"/>
-                <w:lang w:val="es-CO"/>
-              </w:rPr>
-              <w:t>}})</w:t>
-            </w:r>
-            <w:r>
-              <w:rPr>
-                <w:rFonts w:ascii="Arial" w:hAnsi="Arial" w:cs="Arial"/>
-                <w:color w:val="000000"/>
-                <w:sz w:val="24"/>
-                <w:szCs w:val="24"/>
-                <w:shd w:val="clear" w:color="auto" w:fill="FFFF00"/>
-                <w:lang w:val="es-CO"/>
-              </w:rPr>
-              <w:t xml:space="preserve"> </w:t>
-            </w:r>
-            <w:r>
-              <w:rPr>
-                <w:rFonts w:ascii="Arial" w:hAnsi="Arial" w:cs="Arial"/>
-                <w:color w:val="000000"/>
-                <w:sz w:val="24"/>
-                <w:szCs w:val="24"/>
-                <w:lang w:val="es-CO"/>
-              </w:rPr>
-              <w:t>cuotas comoquiera que el contratista entregó el informe de gestión en el cual detalla el cumplimiento de las obligaciones contractuales.</w:t>
+              <w:t xml:space="preserve"> se han ejecutado a satisfacción y en atención a la forma de pago establecida en el mismo</w:t>
+            </w:r>
+            <w:r>
+              <w:rPr>
+                <w:rFonts w:ascii="Arial" w:hAnsi="Arial" w:cs="Arial"/>
+                <w:color w:val="000000"/>
+                <w:sz w:val="24"/>
+                <w:szCs w:val="24"/>
+                <w:lang w:val="es-CO"/>
+              </w:rPr>
+              <w:t>.</w:t>
             </w:r>
           </w:p>
           <w:p>
@@ -2574,125 +2635,135 @@
                 <w:szCs w:val="24"/>
                 <w:lang w:val="es-CO"/>
               </w:rPr>
+              <w:t xml:space="preserve">En atención a lo anterior, se recomienda prorrogar el plazo de ejecución del contrato de </w:t>
+            </w:r>
+            <w:r>
+              <w:rPr>
+                <w:rFonts w:ascii="Arial" w:hAnsi="Arial" w:cs="Arial"/>
+                <w:color w:val="000000"/>
+                <w:sz w:val="24"/>
+                <w:szCs w:val="24"/>
+                <w:highlight w:val="yellow"/>
+                <w:lang w:val="es-CO"/>
+              </w:rPr>
+              <w:t>{{TIPO_CONTRATO}}</w:t>
+            </w:r>
+            <w:r>
+              <w:rPr>
+                <w:rFonts w:ascii="Arial" w:hAnsi="Arial" w:cs="Arial"/>
+                <w:color w:val="000000"/>
+                <w:sz w:val="24"/>
+                <w:szCs w:val="24"/>
+                <w:lang w:val="es-CO"/>
+              </w:rPr>
+              <w:t xml:space="preserve"> No. </w:t>
+            </w:r>
+            <w:r>
+              <w:rPr>
+                <w:rFonts w:ascii="Arial" w:hAnsi="Arial" w:cs="Arial"/>
+                <w:color w:val="000000"/>
+                <w:sz w:val="24"/>
+                <w:szCs w:val="24"/>
+                <w:shd w:val="clear" w:color="auto" w:fill="FFFF00"/>
+                <w:lang w:val="es-CO"/>
+              </w:rPr>
+              <w:t>{{NUMERO_CONTRATO}}</w:t>
+            </w:r>
+            <w:r>
+              <w:rPr>
+                <w:rFonts w:ascii="Arial" w:hAnsi="Arial" w:cs="Arial"/>
+                <w:color w:val="000000"/>
+                <w:sz w:val="24"/>
+                <w:szCs w:val="24"/>
+                <w:lang w:val="es-CO"/>
+              </w:rPr>
+              <w:t xml:space="preserve">, hasta el </w:t>
+            </w:r>
+            <w:r>
+              <w:rPr>
+                <w:rFonts w:ascii="Arial" w:hAnsi="Arial" w:cs="Arial"/>
+                <w:color w:val="000000"/>
+                <w:sz w:val="24"/>
+                <w:szCs w:val="24"/>
+                <w:shd w:val="clear" w:color="auto" w:fill="FFFF00"/>
+                <w:lang w:val="es-CO"/>
+              </w:rPr>
+              <w:t>{{FECHA_FINAL_ADICIONAL}}</w:t>
+            </w:r>
+            <w:r>
+              <w:rPr>
+                <w:rFonts w:ascii="Arial" w:hAnsi="Arial" w:cs="Arial"/>
+                <w:color w:val="000000"/>
+                <w:sz w:val="24"/>
+                <w:szCs w:val="24"/>
+                <w:lang w:val="es-CO"/>
+              </w:rPr>
+              <w:t xml:space="preserve"> y en consecuencia adicionar el valor del mismo por la suma </w:t>
+            </w:r>
+            <w:r>
+              <w:rPr>
+                <w:rFonts w:ascii="Arial" w:hAnsi="Arial" w:cs="Arial"/>
+                <w:color w:val="000000"/>
+                <w:sz w:val="24"/>
+                <w:szCs w:val="24"/>
+                <w:shd w:val="clear" w:color="auto" w:fill="FFFF00"/>
+                <w:lang w:val="es-CO"/>
+              </w:rPr>
+              <w:t>{{VALOR_TOTAL_ADICION_LETRAS}}</w:t>
+            </w:r>
+            <w:r>
+              <w:rPr>
+                <w:rFonts w:ascii="Arial" w:hAnsi="Arial" w:cs="Arial"/>
+                <w:color w:val="000000"/>
+                <w:sz w:val="24"/>
+                <w:szCs w:val="24"/>
+                <w:shd w:val="clear" w:color="auto" w:fill="FFFF00"/>
+                <w:lang w:val="es-CO"/>
+              </w:rPr>
+              <w:t xml:space="preserve"> (</w:t>
+            </w:r>
+            <w:r>
+              <w:rPr>
+                <w:rFonts w:ascii="Arial" w:hAnsi="Arial" w:cs="Arial"/>
+                <w:color w:val="000000"/>
+                <w:sz w:val="24"/>
+                <w:szCs w:val="24"/>
+                <w:shd w:val="clear" w:color="auto" w:fill="FFFF00"/>
+                <w:lang w:val="es-CO"/>
+              </w:rPr>
+              <w:t>{{VALOR_TOTAL_ADICION}}</w:t>
+            </w:r>
+            <w:r>
+              <w:rPr>
+                <w:rFonts w:ascii="Arial" w:hAnsi="Arial" w:cs="Arial"/>
+                <w:color w:val="000000"/>
+                <w:sz w:val="24"/>
+                <w:szCs w:val="24"/>
+                <w:shd w:val="clear" w:color="auto" w:fill="FFFF00"/>
+                <w:lang w:val="es-CO"/>
+              </w:rPr>
+              <w:t>),</w:t>
+            </w:r>
+            <w:r>
+              <w:rPr>
+                <w:rFonts w:ascii="Arial" w:hAnsi="Arial" w:cs="Arial"/>
+                <w:color w:val="000000"/>
+                <w:sz w:val="24"/>
+                <w:szCs w:val="24"/>
+                <w:lang w:val="es-CO"/>
+              </w:rPr>
+              <w:t xml:space="preserve"> suma que </w:t>
+            </w:r>
+            <w:r>
+              <w:rPr>
+                <w:rFonts w:ascii="Arial" w:hAnsi="Arial" w:cs="Arial"/>
+                <w:color w:val="000000"/>
+                <w:sz w:val="24"/>
+                <w:szCs w:val="24"/>
+                <w:lang w:val="es-CO"/>
+              </w:rPr>
               <w:lastRenderedPageBreak/>
-              <w:t xml:space="preserve">En atención a lo anterior, se recomienda prorrogar el plazo de ejecución del contrato de </w:t>
-            </w:r>
-            <w:r>
-              <w:rPr>
-                <w:rFonts w:ascii="Arial" w:hAnsi="Arial" w:cs="Arial"/>
-                <w:color w:val="000000"/>
-                <w:sz w:val="24"/>
-                <w:szCs w:val="24"/>
-                <w:highlight w:val="yellow"/>
-                <w:lang w:val="es-CO"/>
-              </w:rPr>
-              <w:t>{{TIPO_CONTRATO}}</w:t>
-            </w:r>
-            <w:r>
-              <w:rPr>
-                <w:rFonts w:ascii="Arial" w:hAnsi="Arial" w:cs="Arial"/>
-                <w:color w:val="000000"/>
-                <w:sz w:val="24"/>
-                <w:szCs w:val="24"/>
-                <w:lang w:val="es-CO"/>
-              </w:rPr>
-              <w:t xml:space="preserve"> No. </w:t>
-            </w:r>
-            <w:r>
-              <w:rPr>
-                <w:rFonts w:ascii="Arial" w:hAnsi="Arial" w:cs="Arial"/>
-                <w:color w:val="000000"/>
-                <w:sz w:val="24"/>
-                <w:szCs w:val="24"/>
-                <w:shd w:val="clear" w:color="auto" w:fill="FFFF00"/>
-                <w:lang w:val="es-CO"/>
-              </w:rPr>
-              <w:t>{{NUMERO_CONTRATO}}</w:t>
-            </w:r>
-            <w:r>
-              <w:rPr>
-                <w:rFonts w:ascii="Arial" w:hAnsi="Arial" w:cs="Arial"/>
-                <w:color w:val="000000"/>
-                <w:sz w:val="24"/>
-                <w:szCs w:val="24"/>
-                <w:lang w:val="es-CO"/>
-              </w:rPr>
-              <w:t xml:space="preserve">, hasta el </w:t>
-            </w:r>
-            <w:r>
-              <w:rPr>
-                <w:rFonts w:ascii="Arial" w:hAnsi="Arial" w:cs="Arial"/>
-                <w:color w:val="000000"/>
-                <w:sz w:val="24"/>
-                <w:szCs w:val="24"/>
-                <w:shd w:val="clear" w:color="auto" w:fill="FFFF00"/>
-                <w:lang w:val="es-CO"/>
-              </w:rPr>
-              <w:t>{{FECHA_FINAL_ADICIONAL}}</w:t>
-            </w:r>
-            <w:r>
-              <w:rPr>
-                <w:rFonts w:ascii="Arial" w:hAnsi="Arial" w:cs="Arial"/>
-                <w:color w:val="000000"/>
-                <w:sz w:val="24"/>
-                <w:szCs w:val="24"/>
-                <w:lang w:val="es-CO"/>
-              </w:rPr>
-              <w:t xml:space="preserve"> y en consecuencia adicionar el valor del mismo por la suma </w:t>
-            </w:r>
-            <w:r>
-              <w:rPr>
-                <w:rFonts w:ascii="Arial" w:hAnsi="Arial" w:cs="Arial"/>
-                <w:color w:val="000000"/>
-                <w:sz w:val="24"/>
-                <w:szCs w:val="24"/>
-                <w:shd w:val="clear" w:color="auto" w:fill="FFFF00"/>
-                <w:lang w:val="es-CO"/>
-              </w:rPr>
-              <w:t>{{VALOR_TOTAL_ADICION_LETRAS}}</w:t>
-            </w:r>
-            <w:r>
-              <w:rPr>
-                <w:rFonts w:ascii="Arial" w:hAnsi="Arial" w:cs="Arial"/>
-                <w:color w:val="000000"/>
-                <w:sz w:val="24"/>
-                <w:szCs w:val="24"/>
-                <w:shd w:val="clear" w:color="auto" w:fill="FFFF00"/>
-                <w:lang w:val="es-CO"/>
-              </w:rPr>
-              <w:t xml:space="preserve"> (</w:t>
-            </w:r>
-            <w:r>
-              <w:rPr>
-                <w:rFonts w:ascii="Arial" w:hAnsi="Arial" w:cs="Arial"/>
-                <w:color w:val="000000"/>
-                <w:sz w:val="24"/>
-                <w:szCs w:val="24"/>
-                <w:shd w:val="clear" w:color="auto" w:fill="FFFF00"/>
-                <w:lang w:val="es-CO"/>
-              </w:rPr>
-              <w:t>{{VALOR_TOTAL_ADICION}}</w:t>
-            </w:r>
-            <w:r>
-              <w:rPr>
-                <w:rFonts w:ascii="Arial" w:hAnsi="Arial" w:cs="Arial"/>
-                <w:color w:val="000000"/>
-                <w:sz w:val="24"/>
-                <w:szCs w:val="24"/>
-                <w:shd w:val="clear" w:color="auto" w:fill="FFFF00"/>
-                <w:lang w:val="es-CO"/>
-              </w:rPr>
-              <w:t>),</w:t>
-            </w:r>
-            <w:r>
-              <w:rPr>
-                <w:rFonts w:ascii="Arial" w:hAnsi="Arial" w:cs="Arial"/>
-                <w:color w:val="000000"/>
-                <w:sz w:val="24"/>
-                <w:szCs w:val="24"/>
-                <w:lang w:val="es-CO"/>
-              </w:rPr>
-              <w:t xml:space="preserve"> suma que no excede el 50% del valor inicial del: contrato, en cumplimiento del parágrafo del Artículo 40 de la Ley 80 de 1993, que establece la posibilidad de adicionar los contratos sin exceder el cincuenta por ciento (50%) del valor del contrato inicial.</w:t>
+              <w:t>no excede el 50% del valor inicial del: contrato, en cumplimiento del parágrafo del Artículo 40 de la Ley 80 de 1993, que establece la posibilidad de adicionar los contratos sin exceder el cincuenta por ciento (50%) del valor del contrato inicial.</w:t>
             </w:r>
           </w:p>
           <w:p>
@@ -3014,7 +3085,12 @@
             <w:pPr>
               <w:jc w:val="both"/>
               <w:rPr>
-                <w:rFonts w:ascii="Arial" w:eastAsia="Arial" w:hAnsi="Arial" w:cs="Arial"/>
+                <w:rFonts w:ascii="Arial" w:hAnsi="Arial" w:cs="Arial"/>
+                <w:color w:val="000000"/>
+                <w:sz w:val="24"/>
+                <w:szCs w:val="24"/>
+                <w:shd w:val="clear" w:color="auto" w:fill="FFFF00"/>
+                <w:lang w:val="es-CO"/>
               </w:rPr>
             </w:pPr>
             <w:r>
@@ -3180,6 +3256,388 @@
           </w:p>
           <w:p>
             <w:pPr>
+              <w:jc w:val="both"/>
+              <w:rPr>
+                <w:rFonts w:ascii="Arial" w:hAnsi="Arial" w:cs="Arial"/>
+                <w:color w:val="000000"/>
+                <w:sz w:val="24"/>
+                <w:szCs w:val="24"/>
+                <w:shd w:val="clear" w:color="auto" w:fill="FFFF00"/>
+                <w:lang w:val="es-CO"/>
+              </w:rPr>
+            </w:pPr>
+          </w:p>
+          <w:p>
+            <w:pPr>
+              <w:spacing w:line="216" w:lineRule="auto"/>
+              <w:ind w:right="29"/>
+              <w:jc w:val="both"/>
+              <w:rPr>
+                <w:rFonts w:ascii="Arial" w:hAnsi="Arial" w:cs="Arial"/>
+              </w:rPr>
+            </w:pPr>
+            <w:r>
+              <w:rPr>
+                <w:rFonts w:ascii="Arial" w:eastAsia="Arial" w:hAnsi="Arial" w:cs="Arial"/>
+              </w:rPr>
+              <w:t>Es importante recordar que el cumplimiento del interés general debe prevalecer en todas las actuaciones de la administración pública, en este sentido la Corte Constitucional mediante Sentencia C-713 de 2009, ha manifestado: “</w:t>
+            </w:r>
+            <w:r>
+              <w:rPr>
+                <w:rFonts w:ascii="Arial" w:eastAsia="Arial" w:hAnsi="Arial" w:cs="Arial"/>
+                <w:i/>
+                <w:iCs/>
+                <w:sz w:val="20"/>
+                <w:szCs w:val="20"/>
+              </w:rPr>
+              <w:t>El fin de la contratación pública en el Estado Social de Derecho está directamente asociado al cumplimiento del interés general, puesto que el contrato público es uno de aquellos instrumentos jurídicos de los que se vale el Estado para cumplir sus finalidades, hacer efectivos los deberes públicos y prestar los servicios a su cargo, con la colaboración de los particulares a quienes corresponde ejecutar, a nombre de la administración, las tareas acordadas. El interés general, además de guiar y explicar la manera como el legislador está llamado a regular el régimen de contratación administrativa, determina las actuaciones de la Administración, de los servidores que la representan y de los contratistas, estos últimos vinculados al cumplimiento de las obligaciones generales de todo contrato y por ende supeditados al cumplimiento de los fines del Estado</w:t>
+            </w:r>
+            <w:r>
+              <w:rPr>
+                <w:rFonts w:ascii="Arial" w:eastAsia="Arial" w:hAnsi="Arial" w:cs="Arial"/>
+              </w:rPr>
+              <w:t>”.</w:t>
+            </w:r>
+          </w:p>
+          <w:p>
+            <w:pPr>
+              <w:jc w:val="both"/>
+              <w:rPr>
+                <w:rFonts w:ascii="Arial" w:eastAsia="Arial" w:hAnsi="Arial" w:cs="Arial"/>
+              </w:rPr>
+            </w:pPr>
+          </w:p>
+          <w:p>
+            <w:pPr>
+              <w:spacing w:after="260" w:line="249" w:lineRule="auto"/>
+              <w:ind w:right="40"/>
+              <w:jc w:val="both"/>
+              <w:rPr>
+                <w:rFonts w:ascii="Arial" w:eastAsia="Arial" w:hAnsi="Arial" w:cs="Arial"/>
+              </w:rPr>
+            </w:pPr>
+            <w:r>
+              <w:rPr>
+                <w:rFonts w:ascii="Arial" w:eastAsia="Arial" w:hAnsi="Arial" w:cs="Arial"/>
+              </w:rPr>
+              <w:t>Así mismo, en Sentencia C – 300 de 2012 la Corte Constitucional señalo que “</w:t>
+            </w:r>
+            <w:r>
+              <w:rPr>
+                <w:rFonts w:ascii="Arial" w:eastAsia="Arial" w:hAnsi="Arial" w:cs="Arial"/>
+                <w:sz w:val="20"/>
+                <w:szCs w:val="20"/>
+              </w:rPr>
+              <w:t>Por regla general, los contratos estatales pueden ser modificados cuando sea necesario para lograr su finalidad y en aras de la realización de los fines del Estado, a los cuales sirve el contrato. Así lo prevén por ejemplo los artículos 14 y 16 de la ley 80, los cuales facultan a las entidades contratantes a modificar los contratos de común acuerdo o de forma unilateral, para (…) evitar la paralización o la afectación grave de los servicios públicos a su cargo y asegurar la inmediata, continua y adecuada prestación, entre otros</w:t>
+            </w:r>
+            <w:r>
+              <w:rPr>
+                <w:rFonts w:ascii="Arial" w:eastAsia="Arial" w:hAnsi="Arial" w:cs="Arial"/>
+              </w:rPr>
+              <w:t>”</w:t>
+            </w:r>
+            <w:r>
+              <w:rPr>
+                <w:rFonts w:ascii="Arial" w:eastAsia="Arial" w:hAnsi="Arial" w:cs="Arial"/>
+              </w:rPr>
+              <w:t>.</w:t>
+            </w:r>
+          </w:p>
+          <w:p>
+            <w:pPr>
+              <w:spacing w:after="260" w:line="249" w:lineRule="auto"/>
+              <w:ind w:right="40"/>
+              <w:jc w:val="both"/>
+              <w:rPr>
+                <w:rFonts w:ascii="Arial" w:eastAsia="Arial" w:hAnsi="Arial" w:cs="Arial"/>
+              </w:rPr>
+            </w:pPr>
+            <w:r>
+              <w:rPr>
+                <w:rFonts w:ascii="Arial" w:eastAsia="Arial" w:hAnsi="Arial" w:cs="Arial"/>
+              </w:rPr>
+              <w:lastRenderedPageBreak/>
+              <w:t>Vale la pena destacar lo señalado por la Sala de Consulta y Servicio Civil del Consejo de Estado en concepto del 13 de agosto de 2009: “</w:t>
+            </w:r>
+            <w:r>
+              <w:rPr>
+                <w:rFonts w:ascii="Arial" w:eastAsia="Arial" w:hAnsi="Arial" w:cs="Arial"/>
+                <w:sz w:val="20"/>
+                <w:szCs w:val="20"/>
+              </w:rPr>
+              <w:t>La contratación estatal responde de múltiples maneras a ese mandato y, en cuanto al concepto que se emite, se resalta que la posibilidad de modificar los contratos estatales es una especial forma de hacer prevalecer la finalidad del contrato sobre los restantes elementos del mismo. Por mutabilidad del contrato estatal se entiende el derecho que tiene la administración de variar, dadas ciertas condiciones, las obligaciones a cargo del contratista particular, cuando sea necesario para el cumplimiento del objeto y de los fines generales del Estado</w:t>
+            </w:r>
+            <w:r>
+              <w:rPr>
+                <w:rFonts w:ascii="Arial" w:eastAsia="Arial" w:hAnsi="Arial" w:cs="Arial"/>
+              </w:rPr>
+              <w:t>” (Radicación No. 11001-03-06-000- 2009-00033-00, expediente 1952).</w:t>
+            </w:r>
+          </w:p>
+          <w:p>
+            <w:pPr>
+              <w:spacing w:after="260" w:line="249" w:lineRule="auto"/>
+              <w:ind w:right="40"/>
+              <w:jc w:val="both"/>
+              <w:rPr>
+                <w:rFonts w:ascii="Arial" w:eastAsia="Arial" w:hAnsi="Arial" w:cs="Arial"/>
+              </w:rPr>
+            </w:pPr>
+            <w:r>
+              <w:rPr>
+                <w:rFonts w:ascii="Arial" w:eastAsia="Arial" w:hAnsi="Arial" w:cs="Arial"/>
+              </w:rPr>
+              <w:t>Ahora bien, no se puede perder de vista el deber de los funcionarios públicos de cumplir</w:t>
+            </w:r>
+            <w:r>
+              <w:rPr>
+                <w:rFonts w:ascii="Arial" w:eastAsia="Arial" w:hAnsi="Arial" w:cs="Arial"/>
+              </w:rPr>
+              <w:t xml:space="preserve"> </w:t>
+            </w:r>
+            <w:r>
+              <w:rPr>
+                <w:rFonts w:ascii="Arial" w:eastAsia="Arial" w:hAnsi="Arial" w:cs="Arial"/>
+              </w:rPr>
+              <w:t>cabalmente con los principios que rigen la función administrativa conforme a lo descrito en el</w:t>
+            </w:r>
+            <w:r>
+              <w:rPr>
+                <w:rFonts w:ascii="Arial" w:eastAsia="Arial" w:hAnsi="Arial" w:cs="Arial"/>
+              </w:rPr>
+              <w:t xml:space="preserve"> </w:t>
+            </w:r>
+            <w:r>
+              <w:rPr>
+                <w:rFonts w:ascii="Arial" w:eastAsia="Arial" w:hAnsi="Arial" w:cs="Arial"/>
+              </w:rPr>
+              <w:t xml:space="preserve">artículo 209 de la Constitución Nacional, y la </w:t>
+            </w:r>
+            <w:r>
+              <w:rPr>
+                <w:rFonts w:ascii="Arial" w:eastAsia="Arial" w:hAnsi="Arial" w:cs="Arial"/>
+              </w:rPr>
+              <w:t>L</w:t>
+            </w:r>
+            <w:r>
+              <w:rPr>
+                <w:rFonts w:ascii="Arial" w:eastAsia="Arial" w:hAnsi="Arial" w:cs="Arial"/>
+              </w:rPr>
+              <w:t xml:space="preserve">ey así: </w:t>
+            </w:r>
+            <w:r>
+              <w:rPr>
+                <w:rFonts w:ascii="Arial" w:eastAsia="Arial" w:hAnsi="Arial" w:cs="Arial"/>
+              </w:rPr>
+              <w:t>“</w:t>
+            </w:r>
+            <w:r>
+              <w:rPr>
+                <w:rFonts w:ascii="Arial" w:eastAsia="Arial" w:hAnsi="Arial" w:cs="Arial"/>
+                <w:sz w:val="20"/>
+                <w:szCs w:val="20"/>
+              </w:rPr>
+              <w:t xml:space="preserve">ARTÍCULO 209. </w:t>
+            </w:r>
+            <w:r>
+              <w:rPr>
+                <w:rFonts w:ascii="Arial" w:hAnsi="Arial" w:cs="Arial"/>
+                <w:sz w:val="20"/>
+                <w:szCs w:val="20"/>
+              </w:rPr>
+              <w:t>La función administrativa está al servicio de los intereses generales y se desarrolla con fundamento en los principios de igualdad, moralidad, eficacia, economía, celeridad, imparcialidad y publicidad, mediante la descentralización, la delegación y la desconcentración de funciones</w:t>
+            </w:r>
+            <w:r>
+              <w:rPr>
+                <w:rFonts w:ascii="Arial" w:eastAsia="Arial" w:hAnsi="Arial" w:cs="Arial"/>
+                <w:sz w:val="20"/>
+                <w:szCs w:val="20"/>
+              </w:rPr>
+              <w:t>.</w:t>
+            </w:r>
+            <w:r>
+              <w:rPr>
+                <w:rFonts w:ascii="Arial" w:eastAsia="Arial" w:hAnsi="Arial" w:cs="Arial"/>
+              </w:rPr>
+              <w:t xml:space="preserve"> </w:t>
+            </w:r>
+            <w:r>
+              <w:rPr>
+                <w:rFonts w:ascii="Arial" w:hAnsi="Arial" w:cs="Arial"/>
+                <w:sz w:val="20"/>
+                <w:szCs w:val="20"/>
+              </w:rPr>
+              <w:t>Las autoridades administrativas deben coordinar sus actuaciones para el adecuado cumplimiento de los fines del Estado. La administración pública, en todos sus órdenes, tendrá un control interno que se ejercerá en los términos que señale la ley</w:t>
+            </w:r>
+            <w:r>
+              <w:rPr>
+                <w:rFonts w:ascii="Arial" w:eastAsia="Arial" w:hAnsi="Arial" w:cs="Arial"/>
+              </w:rPr>
+              <w:t>.”.</w:t>
+            </w:r>
+          </w:p>
+          <w:p>
+            <w:pPr>
+              <w:spacing w:after="260" w:line="249" w:lineRule="auto"/>
+              <w:ind w:right="40"/>
+              <w:jc w:val="both"/>
+              <w:rPr>
+                <w:rFonts w:ascii="Arial" w:eastAsia="Arial" w:hAnsi="Arial" w:cs="Arial"/>
+              </w:rPr>
+            </w:pPr>
+            <w:r>
+              <w:rPr>
+                <w:rFonts w:ascii="Arial" w:eastAsia="Arial" w:hAnsi="Arial" w:cs="Arial"/>
+              </w:rPr>
+              <w:t>A su vez la Ley 1437 de 2011, por la cual se expide el Código de Procedimiento Administrativo y de lo Contencioso Administrativo, en su artículo 3 señala que “</w:t>
+            </w:r>
+            <w:r>
+              <w:rPr>
+                <w:rFonts w:ascii="Arial" w:eastAsia="Arial" w:hAnsi="Arial" w:cs="Arial"/>
+                <w:sz w:val="20"/>
+                <w:szCs w:val="20"/>
+              </w:rPr>
+              <w:t>Todas las autoridades deberán interpretar y aplicar las disposiciones que regulan las actuaciones y procedimientos administrativos a la luz de los principios consagrados en la Constitución Política, en la Parte Primera de este Código y en las leyes especiales. Las actuaciones administrativas se desarrollarán, especialmente, con arreglo a los principios del debido proceso, igualdad, imparcialidad, buena fe, moralidad, participación, responsabilidad, transparencia, publicidad, coordinación, eficacia, economía y celeridad</w:t>
+            </w:r>
+            <w:r>
+              <w:rPr>
+                <w:rFonts w:ascii="Arial" w:eastAsia="Arial" w:hAnsi="Arial" w:cs="Arial"/>
+              </w:rPr>
+              <w:t>.”.</w:t>
+            </w:r>
+          </w:p>
+          <w:p>
+            <w:pPr>
+              <w:spacing w:after="260" w:line="249" w:lineRule="auto"/>
+              <w:ind w:right="40"/>
+              <w:jc w:val="both"/>
+              <w:rPr>
+                <w:rFonts w:ascii="Arial" w:eastAsia="Arial" w:hAnsi="Arial" w:cs="Arial"/>
+              </w:rPr>
+            </w:pPr>
+            <w:r>
+              <w:rPr>
+                <w:rFonts w:ascii="Arial" w:eastAsia="Arial" w:hAnsi="Arial" w:cs="Arial"/>
+              </w:rPr>
+              <w:t xml:space="preserve">Así las cosas, es necesario traer a colación la definición del principio de eficacia y economía regulado en el numeral 11 y 12 </w:t>
+            </w:r>
+            <w:proofErr w:type="spellStart"/>
+            <w:r>
+              <w:rPr>
+                <w:rFonts w:ascii="Arial" w:eastAsia="Arial" w:hAnsi="Arial" w:cs="Arial"/>
+              </w:rPr>
+              <w:t>ibidem</w:t>
+            </w:r>
+            <w:proofErr w:type="spellEnd"/>
+            <w:r>
+              <w:rPr>
+                <w:rFonts w:ascii="Arial" w:eastAsia="Arial" w:hAnsi="Arial" w:cs="Arial"/>
+              </w:rPr>
+              <w:t xml:space="preserve">, así: “(…) </w:t>
+            </w:r>
+            <w:r>
+              <w:rPr>
+                <w:rFonts w:ascii="Arial" w:eastAsia="Arial" w:hAnsi="Arial" w:cs="Arial"/>
+                <w:sz w:val="20"/>
+                <w:szCs w:val="20"/>
+              </w:rPr>
+              <w:t>11. En virtud del principio de eficacia, las autoridades buscarán que los procedimientos logren su finalidad y, para el efecto, removerán de oficio los obstáculos puramente formales, evitarán decisiones inhibitorias, dilaciones o retardos y sanearán, de acuerdo con este Código las irregularidades procedimentales que se presenten, en procura de la efectividad del derecho material objeto de la actuación administrativa. 12. En virtud del principio de economía, las autoridades deberán proceder con austeridad y eficiencia, optimizar el uso del tiempo y de los demás recursos, procurando el más alto nivel de calidad en sus actuaciones y la protección de los derechos de las personas</w:t>
+            </w:r>
+            <w:r>
+              <w:rPr>
+                <w:rFonts w:ascii="Arial" w:eastAsia="Arial" w:hAnsi="Arial" w:cs="Arial"/>
+              </w:rPr>
+              <w:t xml:space="preserve">.”. </w:t>
+            </w:r>
+          </w:p>
+          <w:p>
+            <w:pPr>
+              <w:spacing w:after="260" w:line="249" w:lineRule="auto"/>
+              <w:ind w:right="40"/>
+              <w:jc w:val="both"/>
+              <w:rPr>
+                <w:rFonts w:ascii="Arial" w:eastAsia="Arial" w:hAnsi="Arial" w:cs="Arial"/>
+              </w:rPr>
+            </w:pPr>
+            <w:r>
+              <w:rPr>
+                <w:rFonts w:ascii="Arial" w:eastAsia="Arial" w:hAnsi="Arial" w:cs="Arial"/>
+              </w:rPr>
+              <w:t>Dicho lo anterior, es posible afirmar que se podrá promover o diseñar medidas o realizar</w:t>
+            </w:r>
+            <w:r>
+              <w:rPr>
+                <w:rFonts w:ascii="Arial" w:eastAsia="Arial" w:hAnsi="Arial" w:cs="Arial"/>
+              </w:rPr>
+              <w:t xml:space="preserve"> </w:t>
+            </w:r>
+            <w:r>
+              <w:rPr>
+                <w:rFonts w:ascii="Arial" w:eastAsia="Arial" w:hAnsi="Arial" w:cs="Arial"/>
+              </w:rPr>
+              <w:t>modificaciones al contrato estatal, siempre y cuando se realicen con el fin de obtener la</w:t>
+            </w:r>
+            <w:r>
+              <w:rPr>
+                <w:rFonts w:ascii="Arial" w:eastAsia="Arial" w:hAnsi="Arial" w:cs="Arial"/>
+              </w:rPr>
+              <w:t xml:space="preserve"> </w:t>
+            </w:r>
+            <w:r>
+              <w:rPr>
+                <w:rFonts w:ascii="Arial" w:eastAsia="Arial" w:hAnsi="Arial" w:cs="Arial"/>
+              </w:rPr>
+              <w:t>consecución del objeto del contrato estatal y la finalidad pública, como consecuencia lógica</w:t>
+            </w:r>
+            <w:r>
+              <w:rPr>
+                <w:rFonts w:ascii="Arial" w:eastAsia="Arial" w:hAnsi="Arial" w:cs="Arial"/>
+              </w:rPr>
+              <w:t xml:space="preserve"> </w:t>
+            </w:r>
+            <w:r>
+              <w:rPr>
+                <w:rFonts w:ascii="Arial" w:eastAsia="Arial" w:hAnsi="Arial" w:cs="Arial"/>
+              </w:rPr>
+              <w:t>de prevalencia de los principios que rigen la actuación de los servidores públicos, y es ahí</w:t>
+            </w:r>
+            <w:r>
+              <w:rPr>
+                <w:rFonts w:ascii="Arial" w:eastAsia="Arial" w:hAnsi="Arial" w:cs="Arial"/>
+              </w:rPr>
+              <w:t xml:space="preserve"> </w:t>
+            </w:r>
+            <w:r>
+              <w:rPr>
+                <w:rFonts w:ascii="Arial" w:eastAsia="Arial" w:hAnsi="Arial" w:cs="Arial"/>
+              </w:rPr>
+              <w:t>donde encontramos que se cumple con el principio de eficacia y economía.</w:t>
+            </w:r>
+          </w:p>
+          <w:p>
+            <w:pPr>
+              <w:jc w:val="both"/>
+              <w:rPr>
+                <w:rFonts w:ascii="Arial" w:eastAsia="Arial" w:hAnsi="Arial" w:cs="Arial"/>
+              </w:rPr>
+            </w:pPr>
+            <w:r>
+              <w:rPr>
+                <w:rFonts w:ascii="Arial" w:eastAsia="Arial" w:hAnsi="Arial" w:cs="Arial"/>
+              </w:rPr>
+              <w:t xml:space="preserve">De este modo, con la adición y prórroga al contrato en mención, el Departamento Administrativo de Gestión Jurídica Pública propendería por el cumplimiento de los fines del estado aplicando los </w:t>
+            </w:r>
+            <w:r>
+              <w:rPr>
+                <w:rFonts w:ascii="Arial" w:eastAsia="Arial" w:hAnsi="Arial" w:cs="Arial"/>
+              </w:rPr>
+              <w:lastRenderedPageBreak/>
+              <w:t>principios de eficacia y economía, al prever la posibilidad de optimizar el tiempo y los recursos con que cuenta este organismo, ya que celebrar un nuevo contrato para satisfacer la necesidad descrita implicaría el inicio de procedimientos contractuales, selección y verificación de cumplimiento de perfiles y demás trámites administrativos necesarios para la suscripción de contratos de prestación de servicios, lo que conllevaría a un tiempo adicional en la operación administrativa.</w:t>
+            </w:r>
+          </w:p>
+          <w:p>
+            <w:pPr>
+              <w:jc w:val="both"/>
               <w:rPr>
                 <w:rFonts w:ascii="Arial" w:eastAsia="Arial" w:hAnsi="Arial" w:cs="Arial"/>
               </w:rPr>
@@ -3231,6 +3689,130 @@
               </w:rPr>
               <w:t>SOLICITUD DEL SUPERVISOR Y/O INTERVENTOR</w:t>
             </w:r>
+          </w:p>
+          <w:p>
+            <w:pPr>
+              <w:rPr>
+                <w:rFonts w:ascii="Arial" w:eastAsia="Arial" w:hAnsi="Arial" w:cs="Arial"/>
+              </w:rPr>
+            </w:pPr>
+          </w:p>
+          <w:p>
+            <w:pPr>
+              <w:jc w:val="both"/>
+              <w:rPr>
+                <w:rFonts w:ascii="Arial" w:eastAsia="Arial" w:hAnsi="Arial" w:cs="Arial"/>
+              </w:rPr>
+            </w:pPr>
+            <w:r>
+              <w:rPr>
+                <w:rFonts w:ascii="Arial" w:eastAsia="Arial" w:hAnsi="Arial" w:cs="Arial"/>
+              </w:rPr>
+              <w:t xml:space="preserve">Por lo anteriormente expuesto, se solicita prorrogar el plazo de ejecución del </w:t>
+            </w:r>
+            <w:r>
+              <w:rPr>
+                <w:rFonts w:ascii="Arial" w:eastAsia="Arial" w:hAnsi="Arial" w:cs="Arial"/>
+                <w:highlight w:val="yellow"/>
+              </w:rPr>
+              <w:t>{{TIPO_CONTRATO}}</w:t>
+            </w:r>
+            <w:r>
+              <w:rPr>
+                <w:rFonts w:ascii="Arial" w:eastAsia="Arial" w:hAnsi="Arial" w:cs="Arial"/>
+              </w:rPr>
+              <w:t xml:space="preserve"> </w:t>
+            </w:r>
+            <w:r>
+              <w:rPr>
+                <w:rFonts w:ascii="Arial" w:eastAsia="Arial" w:hAnsi="Arial" w:cs="Arial"/>
+              </w:rPr>
+              <w:t xml:space="preserve">No. </w:t>
+            </w:r>
+            <w:r>
+              <w:rPr>
+                <w:rFonts w:ascii="Arial" w:eastAsia="Arial" w:hAnsi="Arial" w:cs="Arial"/>
+                <w:highlight w:val="yellow"/>
+              </w:rPr>
+              <w:t>{{NUMERO_CONTRATO}}</w:t>
+            </w:r>
+            <w:r>
+              <w:rPr>
+                <w:rFonts w:ascii="Arial" w:eastAsia="Arial" w:hAnsi="Arial" w:cs="Arial"/>
+              </w:rPr>
+              <w:t xml:space="preserve">, hasta el </w:t>
+            </w:r>
+            <w:r>
+              <w:rPr>
+                <w:rFonts w:ascii="Arial" w:eastAsia="Arial" w:hAnsi="Arial" w:cs="Arial"/>
+              </w:rPr>
+              <w:t>{{FECHA_FINAL_ADICIONAL}}</w:t>
+            </w:r>
+            <w:r>
+              <w:rPr>
+                <w:rFonts w:ascii="Arial" w:eastAsia="Arial" w:hAnsi="Arial" w:cs="Arial"/>
+              </w:rPr>
+              <w:t xml:space="preserve"> y en consecuencia adicionar el valor del mismo por la suma</w:t>
+            </w:r>
+            <w:r>
+              <w:rPr>
+                <w:rFonts w:ascii="Arial" w:eastAsia="Arial" w:hAnsi="Arial" w:cs="Arial"/>
+              </w:rPr>
+              <w:t xml:space="preserve"> </w:t>
+            </w:r>
+            <w:r>
+              <w:rPr>
+                <w:rFonts w:ascii="Arial" w:eastAsia="Arial" w:hAnsi="Arial" w:cs="Arial"/>
+                <w:highlight w:val="yellow"/>
+              </w:rPr>
+              <w:t>{{VALOR_CONTRATO_MAS_ADICION_LETRAS}}</w:t>
+            </w:r>
+            <w:r>
+              <w:rPr>
+                <w:rFonts w:ascii="Arial" w:eastAsia="Arial" w:hAnsi="Arial" w:cs="Arial"/>
+              </w:rPr>
+              <w:t xml:space="preserve"> </w:t>
+            </w:r>
+            <w:r>
+              <w:rPr>
+                <w:rFonts w:ascii="Arial" w:eastAsia="Arial" w:hAnsi="Arial" w:cs="Arial"/>
+                <w:highlight w:val="yellow"/>
+              </w:rPr>
+              <w:t>({{VALOR_CONTRATO_MAS_ADICION}})</w:t>
+            </w:r>
+            <w:r>
+              <w:rPr>
+                <w:rFonts w:ascii="Arial" w:eastAsia="Arial" w:hAnsi="Arial" w:cs="Arial"/>
+              </w:rPr>
+              <w:t>, suma que no excede el 50% del valor inicial del contrato, en cumplimiento del parágrafo del Artículo 40 de la Ley 80 de 1993, que establece la posibilidad de adicionar los contratos sin exceder el cincuenta por ciento (50%) del valor del contrato inicial.</w:t>
+            </w:r>
+          </w:p>
+          <w:p>
+            <w:pPr>
+              <w:rPr>
+                <w:rFonts w:ascii="Arial" w:eastAsia="Arial" w:hAnsi="Arial" w:cs="Arial"/>
+              </w:rPr>
+            </w:pPr>
+          </w:p>
+          <w:p>
+            <w:pPr>
+              <w:rPr>
+                <w:rFonts w:ascii="Arial" w:eastAsia="Arial" w:hAnsi="Arial" w:cs="Arial"/>
+              </w:rPr>
+            </w:pPr>
+            <w:r>
+              <w:rPr>
+                <w:rFonts w:ascii="Arial" w:eastAsia="Arial" w:hAnsi="Arial" w:cs="Arial"/>
+              </w:rPr>
+              <w:t>Las demás cláusulas no requieren ser modificadas.</w:t>
+            </w:r>
+          </w:p>
+          <w:p>
+            <w:pPr>
+              <w:rPr>
+                <w:rFonts w:ascii="Arial" w:eastAsia="Arial" w:hAnsi="Arial" w:cs="Arial"/>
+              </w:rPr>
+            </w:pPr>
           </w:p>
         </w:tc>
       </w:tr>
@@ -3506,7 +4088,7 @@
         <w:sz w:val="16"/>
         <w:szCs w:val="16"/>
       </w:rPr>
-      <w:t>3</w:t>
+      <w:t>2</w:t>
     </w:r>
     <w:r>
       <w:rPr>
@@ -3561,7 +4143,7 @@
         <w:sz w:val="16"/>
         <w:szCs w:val="16"/>
       </w:rPr>
-      <w:t>3</w:t>
+      <w:t>5</w:t>
     </w:r>
     <w:r>
       <w:rPr>

</xml_diff>

<commit_message>
Mejora calidad PDF multi-plataforma, filtros inteligentes de adicion y formatos de fecha legal
</commit_message>
<xml_diff>
--- a/plantillas/MODIFICACION_1_JUSTIFICACION.docx
+++ b/plantillas/MODIFICACION_1_JUSTIFICACION.docx
@@ -1984,9 +1984,30 @@
                 <w:color w:val="000000"/>
                 <w:sz w:val="24"/>
                 <w:szCs w:val="24"/>
-                <w:lang w:val="es-CO"/>
-              </w:rPr>
-              <w:t xml:space="preserve"> por fa suma de </w:t>
+                <w:shd w:val="clear" w:color="auto" w:fill="FFFF00"/>
+                <w:lang w:val="es-CO"/>
+              </w:rPr>
+              <w:t>”</w:t>
+            </w:r>
+            <w:r>
+              <w:rPr>
+                <w:rFonts w:ascii="Arial" w:hAnsi="Arial" w:cs="Arial"/>
+                <w:color w:val="000000"/>
+                <w:sz w:val="24"/>
+                <w:szCs w:val="24"/>
+                <w:lang w:val="es-CO"/>
+              </w:rPr>
+              <w:t xml:space="preserve"> por l</w:t>
+            </w:r>
+            <w:r>
+              <w:rPr>
+                <w:rFonts w:ascii="Arial" w:hAnsi="Arial" w:cs="Arial"/>
+                <w:color w:val="000000"/>
+                <w:sz w:val="24"/>
+                <w:szCs w:val="24"/>
+                <w:lang w:val="es-CO"/>
+              </w:rPr>
+              <w:t xml:space="preserve">a suma de </w:t>
             </w:r>
             <w:r>
               <w:rPr>
@@ -2274,8 +2295,6 @@
               </w:rPr>
               <w:t>{{SUPERVISOR_CARGO}}</w:t>
             </w:r>
-            <w:bookmarkStart w:id="0" w:name="_GoBack"/>
-            <w:bookmarkEnd w:id="0"/>
             <w:r>
               <w:rPr>
                 <w:rFonts w:ascii="Arial" w:hAnsi="Arial" w:cs="Arial"/>
@@ -2583,7 +2602,27 @@
                 <w:szCs w:val="24"/>
                 <w:lang w:val="es-CO"/>
               </w:rPr>
-              <w:t xml:space="preserve">A la fecha, persiste la necesidad del fortalecimiento de las funciones de este organismo de la Administración Central del Distrito Especial de Santiago de Cali y en la planta de se cuenta con el personal suficiente para el cumplimiento de las actividades que se Orientan a robustecer. </w:t>
+              <w:t xml:space="preserve">A la fecha, persiste la necesidad del fortalecimiento de las funciones de este organismo de la Administración Central del Distrito Especial de Santiago de Cali y en la planta </w:t>
+            </w:r>
+            <w:r>
+              <w:rPr>
+                <w:rFonts w:ascii="Arial" w:hAnsi="Arial" w:cs="Arial"/>
+                <w:color w:val="000000"/>
+                <w:sz w:val="24"/>
+                <w:szCs w:val="24"/>
+                <w:lang w:val="es-CO"/>
+              </w:rPr>
+              <w:t>no</w:t>
+            </w:r>
+            <w:r>
+              <w:rPr>
+                <w:rFonts w:ascii="Arial" w:hAnsi="Arial" w:cs="Arial"/>
+                <w:color w:val="000000"/>
+                <w:sz w:val="24"/>
+                <w:szCs w:val="24"/>
+                <w:lang w:val="es-CO"/>
+              </w:rPr>
+              <w:t xml:space="preserve"> se cuenta con el personal suficiente para el cumplimiento de las actividades que se Orientan a robustecer. </w:t>
             </w:r>
             <w:r>
               <w:rPr>
@@ -2958,7 +2997,29 @@
                 <w:szCs w:val="24"/>
                 <w:lang w:val="es-CO"/>
               </w:rPr>
-              <w:t xml:space="preserve">En virtud de la adición antes .mencionada, el valor total del contrato queda en la suma de </w:t>
+              <w:t>En virtud de la adición antes</w:t>
+            </w:r>
+            <w:r>
+              <w:rPr>
+                <w:rFonts w:ascii="Arial" w:hAnsi="Arial" w:cs="Arial"/>
+                <w:color w:val="000000"/>
+                <w:sz w:val="24"/>
+                <w:szCs w:val="24"/>
+                <w:lang w:val="es-CO"/>
+              </w:rPr>
+              <w:t xml:space="preserve"> </w:t>
+            </w:r>
+            <w:bookmarkStart w:id="0" w:name="_GoBack"/>
+            <w:bookmarkEnd w:id="0"/>
+            <w:r>
+              <w:rPr>
+                <w:rFonts w:ascii="Arial" w:hAnsi="Arial" w:cs="Arial"/>
+                <w:color w:val="000000"/>
+                <w:sz w:val="24"/>
+                <w:szCs w:val="24"/>
+                <w:lang w:val="es-CO"/>
+              </w:rPr>
+              <w:t xml:space="preserve">mencionada, el valor total del contrato queda en la suma de </w:t>
             </w:r>
             <w:r>
               <w:rPr>
@@ -3120,7 +3181,17 @@
                 <w:shd w:val="clear" w:color="auto" w:fill="FFFF00"/>
                 <w:lang w:val="es-CO"/>
               </w:rPr>
-              <w:t>{{NUMERO_CDP}}</w:t>
+              <w:t>{{CDP_ADICION}}</w:t>
+            </w:r>
+            <w:r>
+              <w:rPr>
+                <w:rFonts w:ascii="Arial" w:hAnsi="Arial" w:cs="Arial"/>
+                <w:color w:val="000000"/>
+                <w:sz w:val="24"/>
+                <w:szCs w:val="24"/>
+                <w:lang w:val="es-CO"/>
+              </w:rPr>
+              <w:t xml:space="preserve">, por de </w:t>
             </w:r>
             <w:r>
               <w:rPr>
@@ -3131,7 +3202,7 @@
                 <w:shd w:val="clear" w:color="auto" w:fill="FFFF00"/>
                 <w:lang w:val="es-CO"/>
               </w:rPr>
-              <w:t xml:space="preserve"> del </w:t>
+              <w:t>{{VALOR_CDP_ADICION_LETRAS}}</w:t>
             </w:r>
             <w:r>
               <w:rPr>
@@ -3142,17 +3213,7 @@
                 <w:shd w:val="clear" w:color="auto" w:fill="FFFF00"/>
                 <w:lang w:val="es-CO"/>
               </w:rPr>
-              <w:t>{{FECHA_EXPEDICION_CDP}}</w:t>
-            </w:r>
-            <w:r>
-              <w:rPr>
-                <w:rFonts w:ascii="Arial" w:hAnsi="Arial" w:cs="Arial"/>
-                <w:color w:val="000000"/>
-                <w:sz w:val="24"/>
-                <w:szCs w:val="24"/>
-                <w:lang w:val="es-CO"/>
-              </w:rPr>
-              <w:t xml:space="preserve">, por de </w:t>
+              <w:t xml:space="preserve">. </w:t>
             </w:r>
             <w:r>
               <w:rPr>
@@ -3163,7 +3224,7 @@
                 <w:shd w:val="clear" w:color="auto" w:fill="FFFF00"/>
                 <w:lang w:val="es-CO"/>
               </w:rPr>
-              <w:t>{{</w:t>
+              <w:t>{{VALOR_CDP_ADICION}}</w:t>
             </w:r>
             <w:r>
               <w:rPr>
@@ -3174,84 +3235,7 @@
                 <w:shd w:val="clear" w:color="auto" w:fill="FFFF00"/>
                 <w:lang w:val="es-CO"/>
               </w:rPr>
-              <w:t>CDP_VALOR_LETRAS_MIN</w:t>
-            </w:r>
-            <w:r>
-              <w:rPr>
-                <w:rFonts w:ascii="Arial" w:hAnsi="Arial" w:cs="Arial"/>
-                <w:color w:val="000000"/>
-                <w:sz w:val="24"/>
-                <w:szCs w:val="24"/>
-                <w:shd w:val="clear" w:color="auto" w:fill="FFFF00"/>
-                <w:lang w:val="es-CO"/>
-              </w:rPr>
-              <w:t>}}</w:t>
-            </w:r>
-            <w:r>
-              <w:rPr>
-                <w:rFonts w:ascii="Arial" w:hAnsi="Arial" w:cs="Arial"/>
-                <w:color w:val="000000"/>
-                <w:sz w:val="24"/>
-                <w:szCs w:val="24"/>
-                <w:shd w:val="clear" w:color="auto" w:fill="FFFF00"/>
-                <w:lang w:val="es-CO"/>
-              </w:rPr>
-              <w:t xml:space="preserve">. </w:t>
-            </w:r>
-            <w:r>
-              <w:rPr>
-                <w:rFonts w:ascii="Arial" w:hAnsi="Arial" w:cs="Arial"/>
-                <w:color w:val="000000"/>
-                <w:sz w:val="24"/>
-                <w:szCs w:val="24"/>
-                <w:shd w:val="clear" w:color="auto" w:fill="FFFF00"/>
-                <w:lang w:val="es-CO"/>
-              </w:rPr>
-              <w:t>(</w:t>
-            </w:r>
-            <w:r>
-              <w:rPr>
-                <w:rFonts w:ascii="Arial" w:hAnsi="Arial" w:cs="Arial"/>
-                <w:color w:val="000000"/>
-                <w:sz w:val="24"/>
-                <w:szCs w:val="24"/>
-                <w:shd w:val="clear" w:color="auto" w:fill="FFFF00"/>
-                <w:lang w:val="es-CO"/>
-              </w:rPr>
-              <w:t>{{</w:t>
-            </w:r>
-            <w:r>
-              <w:rPr>
-                <w:rFonts w:ascii="Arial" w:hAnsi="Arial" w:cs="Arial"/>
-                <w:color w:val="000000"/>
-                <w:sz w:val="24"/>
-                <w:szCs w:val="24"/>
-                <w:shd w:val="clear" w:color="auto" w:fill="FFFF00"/>
-                <w:lang w:val="es-CO"/>
-              </w:rPr>
-              <w:t>CDP_VALOR</w:t>
-            </w:r>
-            <w:r>
-              <w:rPr>
-                <w:rFonts w:ascii="Arial" w:hAnsi="Arial" w:cs="Arial"/>
-                <w:color w:val="000000"/>
-                <w:sz w:val="24"/>
-                <w:szCs w:val="24"/>
-                <w:shd w:val="clear" w:color="auto" w:fill="FFFF00"/>
-                <w:lang w:val="es-CO"/>
-              </w:rPr>
-              <w:t>}}</w:t>
-            </w:r>
-            <w:r>
-              <w:rPr>
-                <w:rFonts w:ascii="Arial" w:hAnsi="Arial" w:cs="Arial"/>
-                <w:color w:val="000000"/>
-                <w:sz w:val="24"/>
-                <w:szCs w:val="24"/>
-                <w:shd w:val="clear" w:color="auto" w:fill="FFFF00"/>
-                <w:lang w:val="es-CO"/>
-              </w:rPr>
-              <w:t>).</w:t>
+              <w:t>.</w:t>
             </w:r>
           </w:p>
           <w:p>
@@ -3765,7 +3749,7 @@
                 <w:rFonts w:ascii="Arial" w:eastAsia="Arial" w:hAnsi="Arial" w:cs="Arial"/>
                 <w:highlight w:val="yellow"/>
               </w:rPr>
-              <w:t>{{VALOR_CONTRATO_MAS_ADICION_LETRAS}}</w:t>
+              <w:t>{{VALOR_TOTAL_ADICION_LETRAS}}</w:t>
             </w:r>
             <w:r>
               <w:rPr>
@@ -3778,7 +3762,7 @@
                 <w:rFonts w:ascii="Arial" w:eastAsia="Arial" w:hAnsi="Arial" w:cs="Arial"/>
                 <w:highlight w:val="yellow"/>
               </w:rPr>
-              <w:t>({{VALOR_CONTRATO_MAS_ADICION}})</w:t>
+              <w:t>({{VALOR_TOTAL_ADICION}})</w:t>
             </w:r>
             <w:r>
               <w:rPr>
@@ -4088,7 +4072,7 @@
         <w:sz w:val="16"/>
         <w:szCs w:val="16"/>
       </w:rPr>
-      <w:t>2</w:t>
+      <w:t>3</w:t>
     </w:r>
     <w:r>
       <w:rPr>

</xml_diff>

<commit_message>
Fix: Ajuste de posicionamiento del footer y sincronizacion de plantillas
</commit_message>
<xml_diff>
--- a/plantillas/MODIFICACION_1_JUSTIFICACION.docx
+++ b/plantillas/MODIFICACION_1_JUSTIFICACION.docx
@@ -1,6 +1,6 @@
 
 <file path=word/document.xml><?xml version="1.0" encoding="utf-8"?>
-<w:document xmlns:wpc="http://schemas.microsoft.com/office/word/2010/wordprocessingCanvas" xmlns:mc="http://schemas.openxmlformats.org/markup-compatibility/2006" xmlns:o="urn:schemas-microsoft-com:office:office" xmlns:r="http://schemas.openxmlformats.org/officeDocument/2006/relationships" xmlns:m="http://schemas.openxmlformats.org/officeDocument/2006/math" xmlns:v="urn:schemas-microsoft-com:vml" xmlns:wp14="http://schemas.microsoft.com/office/word/2010/wordprocessingDrawing" xmlns:wp="http://schemas.openxmlformats.org/drawingml/2006/wordprocessingDrawing" xmlns:w10="urn:schemas-microsoft-com:office:word" xmlns:w="http://schemas.openxmlformats.org/wordprocessingml/2006/main" xmlns:w14="http://schemas.microsoft.com/office/word/2010/wordml" xmlns:wpg="http://schemas.microsoft.com/office/word/2010/wordprocessingGroup" xmlns:wpi="http://schemas.microsoft.com/office/word/2010/wordprocessingInk" xmlns:wne="http://schemas.microsoft.com/office/word/2006/wordml" xmlns:wps="http://schemas.microsoft.com/office/word/2010/wordprocessingShape" mc:Ignorable="w14 wp14">
+<w:document xmlns:wpc="http://schemas.microsoft.com/office/word/2010/wordprocessingCanvas" xmlns:cx="http://schemas.microsoft.com/office/drawing/2014/chartex" xmlns:cx1="http://schemas.microsoft.com/office/drawing/2015/9/8/chartex" xmlns:cx2="http://schemas.microsoft.com/office/drawing/2015/10/21/chartex" xmlns:cx3="http://schemas.microsoft.com/office/drawing/2016/5/9/chartex" xmlns:cx4="http://schemas.microsoft.com/office/drawing/2016/5/10/chartex" xmlns:cx5="http://schemas.microsoft.com/office/drawing/2016/5/11/chartex" xmlns:cx6="http://schemas.microsoft.com/office/drawing/2016/5/12/chartex" xmlns:cx7="http://schemas.microsoft.com/office/drawing/2016/5/13/chartex" xmlns:cx8="http://schemas.microsoft.com/office/drawing/2016/5/14/chartex" xmlns:mc="http://schemas.openxmlformats.org/markup-compatibility/2006" xmlns:aink="http://schemas.microsoft.com/office/drawing/2016/ink" xmlns:am3d="http://schemas.microsoft.com/office/drawing/2017/model3d" xmlns:o="urn:schemas-microsoft-com:office:office" xmlns:r="http://schemas.openxmlformats.org/officeDocument/2006/relationships" xmlns:m="http://schemas.openxmlformats.org/officeDocument/2006/math" xmlns:v="urn:schemas-microsoft-com:vml" xmlns:wp14="http://schemas.microsoft.com/office/word/2010/wordprocessingDrawing" xmlns:wp="http://schemas.openxmlformats.org/drawingml/2006/wordprocessingDrawing" xmlns:w10="urn:schemas-microsoft-com:office:word" xmlns:w="http://schemas.openxmlformats.org/wordprocessingml/2006/main" xmlns:w14="http://schemas.microsoft.com/office/word/2010/wordml" xmlns:w15="http://schemas.microsoft.com/office/word/2012/wordml" xmlns:w16cex="http://schemas.microsoft.com/office/word/2018/wordml/cex" xmlns:w16cid="http://schemas.microsoft.com/office/word/2016/wordml/cid" xmlns:w16="http://schemas.microsoft.com/office/word/2018/wordml" xmlns:w16sdtdh="http://schemas.microsoft.com/office/word/2020/wordml/sdtdatahash" xmlns:w16se="http://schemas.microsoft.com/office/word/2015/wordml/symex" xmlns:wpg="http://schemas.microsoft.com/office/word/2010/wordprocessingGroup" xmlns:wpi="http://schemas.microsoft.com/office/word/2010/wordprocessingInk" xmlns:wne="http://schemas.microsoft.com/office/word/2006/wordml" xmlns:wps="http://schemas.microsoft.com/office/word/2010/wordprocessingShape" mc:Ignorable="w14 w15 w16se w16cid w16 w16cex w16sdtdh wp14">
   <w:body>
     <w:tbl>
       <w:tblPr>
@@ -1902,7 +1902,27 @@
                 <w:szCs w:val="24"/>
                 <w:lang w:val="es-CO"/>
               </w:rPr>
-              <w:t xml:space="preserve">, el Distrito Especial de Santiago de Cali - Departamento Administrativo de Gestión Jurídica Pública y </w:t>
+              <w:t xml:space="preserve">, el Distrito Especial de Santiago de Cali - </w:t>
+            </w:r>
+            <w:r>
+              <w:rPr>
+                <w:rFonts w:ascii="Arial" w:hAnsi="Arial" w:cs="Arial"/>
+                <w:color w:val="000000"/>
+                <w:sz w:val="24"/>
+                <w:szCs w:val="24"/>
+                <w:lang w:val="es-CO"/>
+              </w:rPr>
+              <w:t>DEPARTAMENTO ADMINISTRATIVO DE GESTIÓN JURÍDICA PÚBLICA</w:t>
+            </w:r>
+            <w:r>
+              <w:rPr>
+                <w:rFonts w:ascii="Arial" w:hAnsi="Arial" w:cs="Arial"/>
+                <w:color w:val="000000"/>
+                <w:sz w:val="24"/>
+                <w:szCs w:val="24"/>
+                <w:lang w:val="es-CO"/>
+              </w:rPr>
+              <w:t xml:space="preserve"> y </w:t>
             </w:r>
             <w:r>
               <w:rPr>
@@ -2018,6 +2038,7 @@
                 <w:shd w:val="clear" w:color="auto" w:fill="FFFF00"/>
                 <w:lang w:val="es-CO"/>
               </w:rPr>
+              <w:lastRenderedPageBreak/>
               <w:t>{{VALOR_CONTRATO_LETRAS}}</w:t>
             </w:r>
             <w:r>
@@ -2029,19 +2050,7 @@
                 <w:shd w:val="clear" w:color="auto" w:fill="FFFF00"/>
                 <w:lang w:val="es-CO"/>
               </w:rPr>
-              <w:t xml:space="preserve"> </w:t>
-            </w:r>
-            <w:r>
-              <w:rPr>
-                <w:rFonts w:ascii="Arial" w:hAnsi="Arial" w:cs="Arial"/>
-                <w:color w:val="000000"/>
-                <w:sz w:val="24"/>
-                <w:szCs w:val="24"/>
-                <w:shd w:val="clear" w:color="auto" w:fill="FFFF00"/>
-                <w:lang w:val="es-CO"/>
-              </w:rPr>
-              <w:lastRenderedPageBreak/>
-              <w:t>(</w:t>
+              <w:t xml:space="preserve"> (</w:t>
             </w:r>
             <w:r>
               <w:rPr>
@@ -2084,7 +2093,67 @@
                 <w:szCs w:val="24"/>
                 <w:lang w:val="es-CO"/>
               </w:rPr>
-              <w:t xml:space="preserve">Una vez cumplidos todos los requisitos de perfeccionamiento y de ejecución contemplados en las normas legales vigentes, esto es, la expedición del registro presupuestal de compromiso (RPC) No. </w:t>
+              <w:t xml:space="preserve">Una vez cumplidos todos los requisitos de perfeccionamiento y de ejecución contemplados en las normas legales vigentes, esto es, la expedición del </w:t>
+            </w:r>
+            <w:r>
+              <w:rPr>
+                <w:rFonts w:ascii="Arial" w:hAnsi="Arial" w:cs="Arial"/>
+                <w:color w:val="000000"/>
+                <w:sz w:val="24"/>
+                <w:szCs w:val="24"/>
+                <w:lang w:val="es-CO"/>
+              </w:rPr>
+              <w:t>R</w:t>
+            </w:r>
+            <w:r>
+              <w:rPr>
+                <w:rFonts w:ascii="Arial" w:hAnsi="Arial" w:cs="Arial"/>
+                <w:color w:val="000000"/>
+                <w:sz w:val="24"/>
+                <w:szCs w:val="24"/>
+                <w:lang w:val="es-CO"/>
+              </w:rPr>
+              <w:t xml:space="preserve">egistro </w:t>
+            </w:r>
+            <w:r>
+              <w:rPr>
+                <w:rFonts w:ascii="Arial" w:hAnsi="Arial" w:cs="Arial"/>
+                <w:color w:val="000000"/>
+                <w:sz w:val="24"/>
+                <w:szCs w:val="24"/>
+                <w:lang w:val="es-CO"/>
+              </w:rPr>
+              <w:t>P</w:t>
+            </w:r>
+            <w:r>
+              <w:rPr>
+                <w:rFonts w:ascii="Arial" w:hAnsi="Arial" w:cs="Arial"/>
+                <w:color w:val="000000"/>
+                <w:sz w:val="24"/>
+                <w:szCs w:val="24"/>
+                <w:lang w:val="es-CO"/>
+              </w:rPr>
+              <w:t xml:space="preserve">resupuestal de </w:t>
+            </w:r>
+            <w:r>
+              <w:rPr>
+                <w:rFonts w:ascii="Arial" w:hAnsi="Arial" w:cs="Arial"/>
+                <w:color w:val="000000"/>
+                <w:sz w:val="24"/>
+                <w:szCs w:val="24"/>
+                <w:lang w:val="es-CO"/>
+              </w:rPr>
+              <w:t>C</w:t>
+            </w:r>
+            <w:r>
+              <w:rPr>
+                <w:rFonts w:ascii="Arial" w:hAnsi="Arial" w:cs="Arial"/>
+                <w:color w:val="000000"/>
+                <w:sz w:val="24"/>
+                <w:szCs w:val="24"/>
+                <w:lang w:val="es-CO"/>
+              </w:rPr>
+              <w:t xml:space="preserve">ompromiso (RPC) No. </w:t>
             </w:r>
             <w:r>
               <w:rPr>
@@ -2498,7 +2567,27 @@
                 <w:szCs w:val="24"/>
                 <w:lang w:val="es-CO"/>
               </w:rPr>
-              <w:t xml:space="preserve"> Se celebró dado que se pudo establecer que el Departamento Administrativo de Gestión Jurídica Pública no cuenta con el personal suficiente que atienda funciones o desarrolle actividades iguales o relacionadas con el objeto del contrato suscrito; tal y como se acreditó con la certificación que en tal sentido expidió el Subdirector de Gestión Estratégica del Talento Humano del Departamento Administrativo de Desarrollo e 'Innovación Institucional de la Alcaldía de Santiago de Cali, </w:t>
+              <w:t xml:space="preserve"> </w:t>
+            </w:r>
+            <w:r>
+              <w:rPr>
+                <w:rFonts w:ascii="Arial" w:hAnsi="Arial" w:cs="Arial"/>
+                <w:color w:val="000000"/>
+                <w:sz w:val="24"/>
+                <w:szCs w:val="24"/>
+                <w:lang w:val="es-CO"/>
+              </w:rPr>
+              <w:t>s</w:t>
+            </w:r>
+            <w:r>
+              <w:rPr>
+                <w:rFonts w:ascii="Arial" w:hAnsi="Arial" w:cs="Arial"/>
+                <w:color w:val="000000"/>
+                <w:sz w:val="24"/>
+                <w:szCs w:val="24"/>
+                <w:lang w:val="es-CO"/>
+              </w:rPr>
+              <w:t xml:space="preserve">e celebró dado que se pudo establecer que el Departamento Administrativo de Gestión Jurídica Pública no cuenta con el personal suficiente que atienda funciones o desarrolle actividades iguales o relacionadas con el objeto del contrato suscrito; tal y como se acreditó con la certificación que en tal sentido expidió el Subdirector de Gestión Estratégica del Talento Humano del Departamento Administrativo de Desarrollo e 'Innovación Institucional de la Alcaldía de Santiago de Cali, </w:t>
             </w:r>
             <w:r>
               <w:rPr>
@@ -3009,8 +3098,6 @@
               </w:rPr>
               <w:t xml:space="preserve"> </w:t>
             </w:r>
-            <w:bookmarkStart w:id="0" w:name="_GoBack"/>
-            <w:bookmarkEnd w:id="0"/>
             <w:r>
               <w:rPr>
                 <w:rFonts w:ascii="Arial" w:hAnsi="Arial" w:cs="Arial"/>
@@ -3191,7 +3278,27 @@
                 <w:szCs w:val="24"/>
                 <w:lang w:val="es-CO"/>
               </w:rPr>
-              <w:t xml:space="preserve">, por de </w:t>
+              <w:t>, por</w:t>
+            </w:r>
+            <w:r>
+              <w:rPr>
+                <w:rFonts w:ascii="Arial" w:hAnsi="Arial" w:cs="Arial"/>
+                <w:color w:val="000000"/>
+                <w:sz w:val="24"/>
+                <w:szCs w:val="24"/>
+                <w:lang w:val="es-CO"/>
+              </w:rPr>
+              <w:t xml:space="preserve"> valor </w:t>
+            </w:r>
+            <w:r>
+              <w:rPr>
+                <w:rFonts w:ascii="Arial" w:hAnsi="Arial" w:cs="Arial"/>
+                <w:color w:val="000000"/>
+                <w:sz w:val="24"/>
+                <w:szCs w:val="24"/>
+                <w:lang w:val="es-CO"/>
+              </w:rPr>
+              <w:t xml:space="preserve">de </w:t>
             </w:r>
             <w:r>
               <w:rPr>
@@ -3503,21 +3610,7 @@
               <w:rPr>
                 <w:rFonts w:ascii="Arial" w:eastAsia="Arial" w:hAnsi="Arial" w:cs="Arial"/>
               </w:rPr>
-              <w:t xml:space="preserve">Así las cosas, es necesario traer a colación la definición del principio de eficacia y economía regulado en el numeral 11 y 12 </w:t>
-            </w:r>
-            <w:proofErr w:type="spellStart"/>
-            <w:r>
-              <w:rPr>
-                <w:rFonts w:ascii="Arial" w:eastAsia="Arial" w:hAnsi="Arial" w:cs="Arial"/>
-              </w:rPr>
-              <w:t>ibidem</w:t>
-            </w:r>
-            <w:proofErr w:type="spellEnd"/>
-            <w:r>
-              <w:rPr>
-                <w:rFonts w:ascii="Arial" w:eastAsia="Arial" w:hAnsi="Arial" w:cs="Arial"/>
-              </w:rPr>
-              <w:t xml:space="preserve">, así: “(…) </w:t>
+              <w:t xml:space="preserve">Así las cosas, es necesario traer a colación la definición del principio de eficacia y economía regulado en el numeral 11 y 12 ibidem, así: “(…) </w:t>
             </w:r>
             <w:r>
               <w:rPr>
@@ -3692,7 +3785,19 @@
               <w:rPr>
                 <w:rFonts w:ascii="Arial" w:eastAsia="Arial" w:hAnsi="Arial" w:cs="Arial"/>
               </w:rPr>
-              <w:t xml:space="preserve">Por lo anteriormente expuesto, se solicita prorrogar el plazo de ejecución del </w:t>
+              <w:t>Por lo anteriormente expuesto, se solicita prorrogar el plazo de ejecución del</w:t>
+            </w:r>
+            <w:r>
+              <w:rPr>
+                <w:rFonts w:ascii="Arial" w:eastAsia="Arial" w:hAnsi="Arial" w:cs="Arial"/>
+              </w:rPr>
+              <w:t xml:space="preserve"> contrato de </w:t>
+            </w:r>
+            <w:r>
+              <w:rPr>
+                <w:rFonts w:ascii="Arial" w:eastAsia="Arial" w:hAnsi="Arial" w:cs="Arial"/>
+              </w:rPr>
+              <w:t xml:space="preserve"> </w:t>
             </w:r>
             <w:r>
               <w:rPr>
@@ -3819,6 +3924,86 @@
                 <w:szCs w:val="20"/>
               </w:rPr>
             </w:pPr>
+          </w:p>
+          <w:p>
+            <w:pPr>
+              <w:jc w:val="both"/>
+              <w:rPr>
+                <w:rFonts w:ascii="Arial" w:eastAsia="Arial" w:hAnsi="Arial" w:cs="Arial"/>
+                <w:sz w:val="20"/>
+                <w:szCs w:val="20"/>
+              </w:rPr>
+            </w:pPr>
+          </w:p>
+          <w:p>
+            <w:pPr>
+              <w:jc w:val="both"/>
+              <w:rPr>
+                <w:rFonts w:ascii="Arial" w:eastAsia="Arial" w:hAnsi="Arial" w:cs="Arial"/>
+                <w:sz w:val="20"/>
+                <w:szCs w:val="20"/>
+              </w:rPr>
+            </w:pPr>
+          </w:p>
+          <w:p>
+            <w:pPr>
+              <w:jc w:val="both"/>
+              <w:rPr>
+                <w:rFonts w:ascii="Arial" w:eastAsia="Arial" w:hAnsi="Arial" w:cs="Arial"/>
+                <w:sz w:val="20"/>
+                <w:szCs w:val="20"/>
+              </w:rPr>
+            </w:pPr>
+          </w:p>
+          <w:p>
+            <w:pPr>
+              <w:jc w:val="both"/>
+              <w:rPr>
+                <w:rFonts w:ascii="Arial" w:eastAsia="Arial" w:hAnsi="Arial" w:cs="Arial"/>
+                <w:sz w:val="20"/>
+                <w:szCs w:val="20"/>
+              </w:rPr>
+            </w:pPr>
+          </w:p>
+          <w:p>
+            <w:pPr>
+              <w:jc w:val="both"/>
+              <w:rPr>
+                <w:rFonts w:ascii="Arial" w:eastAsia="Arial" w:hAnsi="Arial" w:cs="Arial"/>
+                <w:sz w:val="20"/>
+                <w:szCs w:val="20"/>
+              </w:rPr>
+            </w:pPr>
+          </w:p>
+          <w:p>
+            <w:pPr>
+              <w:jc w:val="both"/>
+              <w:rPr>
+                <w:rFonts w:ascii="Arial" w:eastAsia="Arial" w:hAnsi="Arial" w:cs="Arial"/>
+                <w:sz w:val="20"/>
+                <w:szCs w:val="20"/>
+              </w:rPr>
+            </w:pPr>
+          </w:p>
+          <w:p>
+            <w:pPr>
+              <w:jc w:val="both"/>
+              <w:rPr>
+                <w:rFonts w:ascii="Arial" w:eastAsia="Arial" w:hAnsi="Arial" w:cs="Arial"/>
+                <w:sz w:val="20"/>
+                <w:szCs w:val="20"/>
+              </w:rPr>
+            </w:pPr>
+          </w:p>
+          <w:p>
+            <w:pPr>
+              <w:jc w:val="both"/>
+              <w:rPr>
+                <w:rFonts w:ascii="Arial" w:eastAsia="Arial" w:hAnsi="Arial" w:cs="Arial"/>
+                <w:sz w:val="20"/>
+                <w:szCs w:val="20"/>
+              </w:rPr>
+            </w:pPr>
             <w:r>
               <w:rPr>
                 <w:rFonts w:ascii="Arial" w:eastAsia="Arial" w:hAnsi="Arial" w:cs="Arial"/>
@@ -3827,15 +4012,6 @@
               </w:rPr>
               <w:t>NOMBRE COMPLETO: {{SUPERVISOR_NOMBRE_COMPLETO}}</w:t>
             </w:r>
-          </w:p>
-          <w:p>
-            <w:pPr>
-              <w:rPr>
-                <w:rFonts w:ascii="Arial" w:eastAsia="Arial" w:hAnsi="Arial" w:cs="Arial"/>
-                <w:sz w:val="20"/>
-                <w:szCs w:val="20"/>
-              </w:rPr>
-            </w:pPr>
           </w:p>
         </w:tc>
       </w:tr>
@@ -3908,8 +4084,8 @@
       </w:pPr>
     </w:p>
     <w:sectPr>
-      <w:headerReference w:type="default" r:id="rId7"/>
-      <w:footerReference w:type="default" r:id="rId8"/>
+      <w:headerReference w:type="default" r:id="rId6"/>
+      <w:footerReference w:type="default" r:id="rId7"/>
       <w:pgSz w:w="12240" w:h="15840"/>
       <w:pgMar w:top="1134" w:right="1134" w:bottom="1701" w:left="1134" w:header="397" w:footer="709" w:gutter="0"/>
       <w:pgNumType w:start="1"/>
@@ -3920,7 +4096,7 @@
 </file>
 
 <file path=word/endnotes.xml><?xml version="1.0" encoding="utf-8"?>
-<w:endnotes xmlns:wpc="http://schemas.microsoft.com/office/word/2010/wordprocessingCanvas" xmlns:mc="http://schemas.openxmlformats.org/markup-compatibility/2006" xmlns:o="urn:schemas-microsoft-com:office:office" xmlns:r="http://schemas.openxmlformats.org/officeDocument/2006/relationships" xmlns:m="http://schemas.openxmlformats.org/officeDocument/2006/math" xmlns:v="urn:schemas-microsoft-com:vml" xmlns:wp14="http://schemas.microsoft.com/office/word/2010/wordprocessingDrawing" xmlns:wp="http://schemas.openxmlformats.org/drawingml/2006/wordprocessingDrawing" xmlns:w10="urn:schemas-microsoft-com:office:word" xmlns:w="http://schemas.openxmlformats.org/wordprocessingml/2006/main" xmlns:w14="http://schemas.microsoft.com/office/word/2010/wordml" xmlns:wpg="http://schemas.microsoft.com/office/word/2010/wordprocessingGroup" xmlns:wpi="http://schemas.microsoft.com/office/word/2010/wordprocessingInk" xmlns:wne="http://schemas.microsoft.com/office/word/2006/wordml" xmlns:wps="http://schemas.microsoft.com/office/word/2010/wordprocessingShape" mc:Ignorable="w14 wp14">
+<w:endnotes xmlns:wpc="http://schemas.microsoft.com/office/word/2010/wordprocessingCanvas" xmlns:cx="http://schemas.microsoft.com/office/drawing/2014/chartex" xmlns:cx1="http://schemas.microsoft.com/office/drawing/2015/9/8/chartex" xmlns:cx2="http://schemas.microsoft.com/office/drawing/2015/10/21/chartex" xmlns:cx3="http://schemas.microsoft.com/office/drawing/2016/5/9/chartex" xmlns:cx4="http://schemas.microsoft.com/office/drawing/2016/5/10/chartex" xmlns:cx5="http://schemas.microsoft.com/office/drawing/2016/5/11/chartex" xmlns:cx6="http://schemas.microsoft.com/office/drawing/2016/5/12/chartex" xmlns:cx7="http://schemas.microsoft.com/office/drawing/2016/5/13/chartex" xmlns:cx8="http://schemas.microsoft.com/office/drawing/2016/5/14/chartex" xmlns:mc="http://schemas.openxmlformats.org/markup-compatibility/2006" xmlns:aink="http://schemas.microsoft.com/office/drawing/2016/ink" xmlns:am3d="http://schemas.microsoft.com/office/drawing/2017/model3d" xmlns:o="urn:schemas-microsoft-com:office:office" xmlns:r="http://schemas.openxmlformats.org/officeDocument/2006/relationships" xmlns:m="http://schemas.openxmlformats.org/officeDocument/2006/math" xmlns:v="urn:schemas-microsoft-com:vml" xmlns:wp14="http://schemas.microsoft.com/office/word/2010/wordprocessingDrawing" xmlns:wp="http://schemas.openxmlformats.org/drawingml/2006/wordprocessingDrawing" xmlns:w10="urn:schemas-microsoft-com:office:word" xmlns:w="http://schemas.openxmlformats.org/wordprocessingml/2006/main" xmlns:w14="http://schemas.microsoft.com/office/word/2010/wordml" xmlns:w15="http://schemas.microsoft.com/office/word/2012/wordml" xmlns:w16cex="http://schemas.microsoft.com/office/word/2018/wordml/cex" xmlns:w16cid="http://schemas.microsoft.com/office/word/2016/wordml/cid" xmlns:w16="http://schemas.microsoft.com/office/word/2018/wordml" xmlns:w16sdtdh="http://schemas.microsoft.com/office/word/2020/wordml/sdtdatahash" xmlns:w16se="http://schemas.microsoft.com/office/word/2015/wordml/symex" xmlns:wpg="http://schemas.microsoft.com/office/word/2010/wordprocessingGroup" xmlns:wpi="http://schemas.microsoft.com/office/word/2010/wordprocessingInk" xmlns:wne="http://schemas.microsoft.com/office/word/2006/wordml" xmlns:wps="http://schemas.microsoft.com/office/word/2010/wordprocessingShape" mc:Ignorable="w14 w15 w16se w16cid w16 w16cex w16sdtdh wp14">
   <w:endnote w:type="separator" w:id="-1">
     <w:p>
       <w:r>
@@ -3939,7 +4115,7 @@
 </file>
 
 <file path=word/footer1.xml><?xml version="1.0" encoding="utf-8"?>
-<w:ftr xmlns:wpc="http://schemas.microsoft.com/office/word/2010/wordprocessingCanvas" xmlns:mc="http://schemas.openxmlformats.org/markup-compatibility/2006" xmlns:o="urn:schemas-microsoft-com:office:office" xmlns:r="http://schemas.openxmlformats.org/officeDocument/2006/relationships" xmlns:m="http://schemas.openxmlformats.org/officeDocument/2006/math" xmlns:v="urn:schemas-microsoft-com:vml" xmlns:wp14="http://schemas.microsoft.com/office/word/2010/wordprocessingDrawing" xmlns:wp="http://schemas.openxmlformats.org/drawingml/2006/wordprocessingDrawing" xmlns:w10="urn:schemas-microsoft-com:office:word" xmlns:w="http://schemas.openxmlformats.org/wordprocessingml/2006/main" xmlns:w14="http://schemas.microsoft.com/office/word/2010/wordml" xmlns:wpg="http://schemas.microsoft.com/office/word/2010/wordprocessingGroup" xmlns:wpi="http://schemas.microsoft.com/office/word/2010/wordprocessingInk" xmlns:wne="http://schemas.microsoft.com/office/word/2006/wordml" xmlns:wps="http://schemas.microsoft.com/office/word/2010/wordprocessingShape" mc:Ignorable="w14 wp14">
+<w:ftr xmlns:wpc="http://schemas.microsoft.com/office/word/2010/wordprocessingCanvas" xmlns:cx="http://schemas.microsoft.com/office/drawing/2014/chartex" xmlns:cx1="http://schemas.microsoft.com/office/drawing/2015/9/8/chartex" xmlns:cx2="http://schemas.microsoft.com/office/drawing/2015/10/21/chartex" xmlns:cx3="http://schemas.microsoft.com/office/drawing/2016/5/9/chartex" xmlns:cx4="http://schemas.microsoft.com/office/drawing/2016/5/10/chartex" xmlns:cx5="http://schemas.microsoft.com/office/drawing/2016/5/11/chartex" xmlns:cx6="http://schemas.microsoft.com/office/drawing/2016/5/12/chartex" xmlns:cx7="http://schemas.microsoft.com/office/drawing/2016/5/13/chartex" xmlns:cx8="http://schemas.microsoft.com/office/drawing/2016/5/14/chartex" xmlns:mc="http://schemas.openxmlformats.org/markup-compatibility/2006" xmlns:aink="http://schemas.microsoft.com/office/drawing/2016/ink" xmlns:am3d="http://schemas.microsoft.com/office/drawing/2017/model3d" xmlns:o="urn:schemas-microsoft-com:office:office" xmlns:r="http://schemas.openxmlformats.org/officeDocument/2006/relationships" xmlns:m="http://schemas.openxmlformats.org/officeDocument/2006/math" xmlns:v="urn:schemas-microsoft-com:vml" xmlns:wp14="http://schemas.microsoft.com/office/word/2010/wordprocessingDrawing" xmlns:wp="http://schemas.openxmlformats.org/drawingml/2006/wordprocessingDrawing" xmlns:w10="urn:schemas-microsoft-com:office:word" xmlns:w="http://schemas.openxmlformats.org/wordprocessingml/2006/main" xmlns:w14="http://schemas.microsoft.com/office/word/2010/wordml" xmlns:w15="http://schemas.microsoft.com/office/word/2012/wordml" xmlns:w16cex="http://schemas.microsoft.com/office/word/2018/wordml/cex" xmlns:w16cid="http://schemas.microsoft.com/office/word/2016/wordml/cid" xmlns:w16="http://schemas.microsoft.com/office/word/2018/wordml" xmlns:w16sdtdh="http://schemas.microsoft.com/office/word/2020/wordml/sdtdatahash" xmlns:w16se="http://schemas.microsoft.com/office/word/2015/wordml/symex" xmlns:wpg="http://schemas.microsoft.com/office/word/2010/wordprocessingGroup" xmlns:wpi="http://schemas.microsoft.com/office/word/2010/wordprocessingInk" xmlns:wne="http://schemas.microsoft.com/office/word/2006/wordml" xmlns:wps="http://schemas.microsoft.com/office/word/2010/wordprocessingShape" mc:Ignorable="w14 w15 w16se w16cid w16 w16cex w16sdtdh wp14">
   <w:p>
     <w:pPr>
       <w:pBdr>
@@ -4161,7 +4337,7 @@
 </file>
 
 <file path=word/footnotes.xml><?xml version="1.0" encoding="utf-8"?>
-<w:footnotes xmlns:wpc="http://schemas.microsoft.com/office/word/2010/wordprocessingCanvas" xmlns:mc="http://schemas.openxmlformats.org/markup-compatibility/2006" xmlns:o="urn:schemas-microsoft-com:office:office" xmlns:r="http://schemas.openxmlformats.org/officeDocument/2006/relationships" xmlns:m="http://schemas.openxmlformats.org/officeDocument/2006/math" xmlns:v="urn:schemas-microsoft-com:vml" xmlns:wp14="http://schemas.microsoft.com/office/word/2010/wordprocessingDrawing" xmlns:wp="http://schemas.openxmlformats.org/drawingml/2006/wordprocessingDrawing" xmlns:w10="urn:schemas-microsoft-com:office:word" xmlns:w="http://schemas.openxmlformats.org/wordprocessingml/2006/main" xmlns:w14="http://schemas.microsoft.com/office/word/2010/wordml" xmlns:wpg="http://schemas.microsoft.com/office/word/2010/wordprocessingGroup" xmlns:wpi="http://schemas.microsoft.com/office/word/2010/wordprocessingInk" xmlns:wne="http://schemas.microsoft.com/office/word/2006/wordml" xmlns:wps="http://schemas.microsoft.com/office/word/2010/wordprocessingShape" mc:Ignorable="w14 wp14">
+<w:footnotes xmlns:wpc="http://schemas.microsoft.com/office/word/2010/wordprocessingCanvas" xmlns:cx="http://schemas.microsoft.com/office/drawing/2014/chartex" xmlns:cx1="http://schemas.microsoft.com/office/drawing/2015/9/8/chartex" xmlns:cx2="http://schemas.microsoft.com/office/drawing/2015/10/21/chartex" xmlns:cx3="http://schemas.microsoft.com/office/drawing/2016/5/9/chartex" xmlns:cx4="http://schemas.microsoft.com/office/drawing/2016/5/10/chartex" xmlns:cx5="http://schemas.microsoft.com/office/drawing/2016/5/11/chartex" xmlns:cx6="http://schemas.microsoft.com/office/drawing/2016/5/12/chartex" xmlns:cx7="http://schemas.microsoft.com/office/drawing/2016/5/13/chartex" xmlns:cx8="http://schemas.microsoft.com/office/drawing/2016/5/14/chartex" xmlns:mc="http://schemas.openxmlformats.org/markup-compatibility/2006" xmlns:aink="http://schemas.microsoft.com/office/drawing/2016/ink" xmlns:am3d="http://schemas.microsoft.com/office/drawing/2017/model3d" xmlns:o="urn:schemas-microsoft-com:office:office" xmlns:r="http://schemas.openxmlformats.org/officeDocument/2006/relationships" xmlns:m="http://schemas.openxmlformats.org/officeDocument/2006/math" xmlns:v="urn:schemas-microsoft-com:vml" xmlns:wp14="http://schemas.microsoft.com/office/word/2010/wordprocessingDrawing" xmlns:wp="http://schemas.openxmlformats.org/drawingml/2006/wordprocessingDrawing" xmlns:w10="urn:schemas-microsoft-com:office:word" xmlns:w="http://schemas.openxmlformats.org/wordprocessingml/2006/main" xmlns:w14="http://schemas.microsoft.com/office/word/2010/wordml" xmlns:w15="http://schemas.microsoft.com/office/word/2012/wordml" xmlns:w16cex="http://schemas.microsoft.com/office/word/2018/wordml/cex" xmlns:w16cid="http://schemas.microsoft.com/office/word/2016/wordml/cid" xmlns:w16="http://schemas.microsoft.com/office/word/2018/wordml" xmlns:w16sdtdh="http://schemas.microsoft.com/office/word/2020/wordml/sdtdatahash" xmlns:w16se="http://schemas.microsoft.com/office/word/2015/wordml/symex" xmlns:wpg="http://schemas.microsoft.com/office/word/2010/wordprocessingGroup" xmlns:wpi="http://schemas.microsoft.com/office/word/2010/wordprocessingInk" xmlns:wne="http://schemas.microsoft.com/office/word/2006/wordml" xmlns:wps="http://schemas.microsoft.com/office/word/2010/wordprocessingShape" mc:Ignorable="w14 w15 w16se w16cid w16 w16cex w16sdtdh wp14">
   <w:footnote w:type="separator" w:id="-1">
     <w:p>
       <w:r>
@@ -4180,7 +4356,7 @@
 </file>
 
 <file path=word/header1.xml><?xml version="1.0" encoding="utf-8"?>
-<w:hdr xmlns:wpc="http://schemas.microsoft.com/office/word/2010/wordprocessingCanvas" xmlns:mc="http://schemas.openxmlformats.org/markup-compatibility/2006" xmlns:o="urn:schemas-microsoft-com:office:office" xmlns:r="http://schemas.openxmlformats.org/officeDocument/2006/relationships" xmlns:m="http://schemas.openxmlformats.org/officeDocument/2006/math" xmlns:v="urn:schemas-microsoft-com:vml" xmlns:wp14="http://schemas.microsoft.com/office/word/2010/wordprocessingDrawing" xmlns:wp="http://schemas.openxmlformats.org/drawingml/2006/wordprocessingDrawing" xmlns:w10="urn:schemas-microsoft-com:office:word" xmlns:w="http://schemas.openxmlformats.org/wordprocessingml/2006/main" xmlns:w14="http://schemas.microsoft.com/office/word/2010/wordml" xmlns:wpg="http://schemas.microsoft.com/office/word/2010/wordprocessingGroup" xmlns:wpi="http://schemas.microsoft.com/office/word/2010/wordprocessingInk" xmlns:wne="http://schemas.microsoft.com/office/word/2006/wordml" xmlns:wps="http://schemas.microsoft.com/office/word/2010/wordprocessingShape" mc:Ignorable="w14 wp14">
+<w:hdr xmlns:wpc="http://schemas.microsoft.com/office/word/2010/wordprocessingCanvas" xmlns:cx="http://schemas.microsoft.com/office/drawing/2014/chartex" xmlns:cx1="http://schemas.microsoft.com/office/drawing/2015/9/8/chartex" xmlns:cx2="http://schemas.microsoft.com/office/drawing/2015/10/21/chartex" xmlns:cx3="http://schemas.microsoft.com/office/drawing/2016/5/9/chartex" xmlns:cx4="http://schemas.microsoft.com/office/drawing/2016/5/10/chartex" xmlns:cx5="http://schemas.microsoft.com/office/drawing/2016/5/11/chartex" xmlns:cx6="http://schemas.microsoft.com/office/drawing/2016/5/12/chartex" xmlns:cx7="http://schemas.microsoft.com/office/drawing/2016/5/13/chartex" xmlns:cx8="http://schemas.microsoft.com/office/drawing/2016/5/14/chartex" xmlns:mc="http://schemas.openxmlformats.org/markup-compatibility/2006" xmlns:aink="http://schemas.microsoft.com/office/drawing/2016/ink" xmlns:am3d="http://schemas.microsoft.com/office/drawing/2017/model3d" xmlns:o="urn:schemas-microsoft-com:office:office" xmlns:r="http://schemas.openxmlformats.org/officeDocument/2006/relationships" xmlns:m="http://schemas.openxmlformats.org/officeDocument/2006/math" xmlns:v="urn:schemas-microsoft-com:vml" xmlns:wp14="http://schemas.microsoft.com/office/word/2010/wordprocessingDrawing" xmlns:wp="http://schemas.openxmlformats.org/drawingml/2006/wordprocessingDrawing" xmlns:w10="urn:schemas-microsoft-com:office:word" xmlns:w="http://schemas.openxmlformats.org/wordprocessingml/2006/main" xmlns:w14="http://schemas.microsoft.com/office/word/2010/wordml" xmlns:w15="http://schemas.microsoft.com/office/word/2012/wordml" xmlns:w16cex="http://schemas.microsoft.com/office/word/2018/wordml/cex" xmlns:w16cid="http://schemas.microsoft.com/office/word/2016/wordml/cid" xmlns:w16="http://schemas.microsoft.com/office/word/2018/wordml" xmlns:w16sdtdh="http://schemas.microsoft.com/office/word/2020/wordml/sdtdatahash" xmlns:w16se="http://schemas.microsoft.com/office/word/2015/wordml/symex" xmlns:wpg="http://schemas.microsoft.com/office/word/2010/wordprocessingGroup" xmlns:wpi="http://schemas.microsoft.com/office/word/2010/wordprocessingInk" xmlns:wne="http://schemas.microsoft.com/office/word/2006/wordml" xmlns:wps="http://schemas.microsoft.com/office/word/2010/wordprocessingShape" mc:Ignorable="w14 w15 w16se w16cid w16 w16cex w16sdtdh wp14">
   <w:p>
     <w:pPr>
       <w:pBdr>
@@ -4558,7 +4734,7 @@
               <w:szCs w:val="24"/>
             </w:rPr>
           </w:pPr>
-          <w:bookmarkStart w:id="1" w:name="_Hlk151385364"/>
+          <w:bookmarkStart w:id="0" w:name="_Hlk151385364"/>
           <w:r>
             <w:rPr>
               <w:rFonts w:ascii="Arial" w:eastAsia="Arial" w:hAnsi="Arial" w:cs="Arial"/>
@@ -4658,7 +4834,7 @@
             </w:rPr>
             <w:t>ORDEN DE COMPRA</w:t>
           </w:r>
-          <w:bookmarkEnd w:id="1"/>
+          <w:bookmarkEnd w:id="0"/>
         </w:p>
       </w:tc>
       <w:tc>
@@ -4852,7 +5028,7 @@
 </file>
 
 <file path=word/styles.xml><?xml version="1.0" encoding="utf-8"?>
-<w:styles xmlns:mc="http://schemas.openxmlformats.org/markup-compatibility/2006" xmlns:r="http://schemas.openxmlformats.org/officeDocument/2006/relationships" xmlns:w="http://schemas.openxmlformats.org/wordprocessingml/2006/main" xmlns:w14="http://schemas.microsoft.com/office/word/2010/wordml" mc:Ignorable="w14">
+<w:styles xmlns:mc="http://schemas.openxmlformats.org/markup-compatibility/2006" xmlns:r="http://schemas.openxmlformats.org/officeDocument/2006/relationships" xmlns:w="http://schemas.openxmlformats.org/wordprocessingml/2006/main" xmlns:w14="http://schemas.microsoft.com/office/word/2010/wordml" xmlns:w15="http://schemas.microsoft.com/office/word/2012/wordml" xmlns:w16cex="http://schemas.microsoft.com/office/word/2018/wordml/cex" xmlns:w16cid="http://schemas.microsoft.com/office/word/2016/wordml/cid" xmlns:w16="http://schemas.microsoft.com/office/word/2018/wordml" xmlns:w16sdtdh="http://schemas.microsoft.com/office/word/2020/wordml/sdtdatahash" xmlns:w16se="http://schemas.microsoft.com/office/word/2015/wordml/symex" mc:Ignorable="w14 w15 w16se w16cid w16 w16cex w16sdtdh">
   <w:docDefaults>
     <w:rPrDefault>
       <w:rPr>
@@ -4864,144 +5040,383 @@
     </w:rPrDefault>
     <w:pPrDefault/>
   </w:docDefaults>
-  <w:latentStyles w:defLockedState="0" w:defUIPriority="99" w:defSemiHidden="1" w:defUnhideWhenUsed="1" w:defQFormat="0" w:count="267">
-    <w:lsdException w:name="Normal" w:semiHidden="0" w:uiPriority="0" w:unhideWhenUsed="0" w:qFormat="1"/>
-    <w:lsdException w:name="heading 1" w:semiHidden="0" w:uiPriority="9" w:unhideWhenUsed="0" w:qFormat="1"/>
-    <w:lsdException w:name="heading 2" w:uiPriority="9" w:qFormat="1"/>
-    <w:lsdException w:name="heading 3" w:uiPriority="9" w:qFormat="1"/>
-    <w:lsdException w:name="heading 4" w:uiPriority="9" w:qFormat="1"/>
-    <w:lsdException w:name="heading 5" w:uiPriority="9" w:qFormat="1"/>
-    <w:lsdException w:name="heading 6" w:uiPriority="9" w:qFormat="1"/>
-    <w:lsdException w:name="heading 7" w:uiPriority="9" w:qFormat="1"/>
-    <w:lsdException w:name="heading 8" w:uiPriority="9" w:qFormat="1"/>
-    <w:lsdException w:name="heading 9" w:uiPriority="9" w:qFormat="1"/>
-    <w:lsdException w:name="toc 1" w:uiPriority="39"/>
-    <w:lsdException w:name="toc 2" w:uiPriority="39"/>
-    <w:lsdException w:name="toc 3" w:uiPriority="39"/>
-    <w:lsdException w:name="toc 4" w:uiPriority="39"/>
-    <w:lsdException w:name="toc 5" w:uiPriority="39"/>
-    <w:lsdException w:name="toc 6" w:uiPriority="39"/>
-    <w:lsdException w:name="toc 7" w:uiPriority="39"/>
-    <w:lsdException w:name="toc 8" w:uiPriority="39"/>
-    <w:lsdException w:name="toc 9" w:uiPriority="39"/>
-    <w:lsdException w:name="caption" w:uiPriority="35" w:qFormat="1"/>
-    <w:lsdException w:name="Title" w:semiHidden="0" w:uiPriority="10" w:unhideWhenUsed="0" w:qFormat="1"/>
-    <w:lsdException w:name="Default Paragraph Font" w:uiPriority="1"/>
-    <w:lsdException w:name="Subtitle" w:semiHidden="0" w:uiPriority="11" w:unhideWhenUsed="0" w:qFormat="1"/>
-    <w:lsdException w:name="Strong" w:semiHidden="0" w:uiPriority="22" w:unhideWhenUsed="0" w:qFormat="1"/>
-    <w:lsdException w:name="Emphasis" w:semiHidden="0" w:uiPriority="20" w:unhideWhenUsed="0" w:qFormat="1"/>
-    <w:lsdException w:name="Table Grid" w:semiHidden="0" w:uiPriority="39" w:unhideWhenUsed="0"/>
-    <w:lsdException w:name="Placeholder Text" w:unhideWhenUsed="0"/>
-    <w:lsdException w:name="No Spacing" w:semiHidden="0" w:uiPriority="1" w:unhideWhenUsed="0" w:qFormat="1"/>
-    <w:lsdException w:name="Light Shading" w:semiHidden="0" w:uiPriority="60" w:unhideWhenUsed="0"/>
-    <w:lsdException w:name="Light List" w:semiHidden="0" w:uiPriority="61" w:unhideWhenUsed="0"/>
-    <w:lsdException w:name="Light Grid" w:semiHidden="0" w:uiPriority="62" w:unhideWhenUsed="0"/>
-    <w:lsdException w:name="Medium Shading 1" w:semiHidden="0" w:uiPriority="63" w:unhideWhenUsed="0"/>
-    <w:lsdException w:name="Medium Shading 2" w:semiHidden="0" w:uiPriority="64" w:unhideWhenUsed="0"/>
-    <w:lsdException w:name="Medium List 1" w:semiHidden="0" w:uiPriority="65" w:unhideWhenUsed="0"/>
-    <w:lsdException w:name="Medium List 2" w:semiHidden="0" w:uiPriority="66" w:unhideWhenUsed="0"/>
-    <w:lsdException w:name="Medium Grid 1" w:semiHidden="0" w:uiPriority="67" w:unhideWhenUsed="0"/>
-    <w:lsdException w:name="Medium Grid 2" w:semiHidden="0" w:uiPriority="68" w:unhideWhenUsed="0"/>
-    <w:lsdException w:name="Medium Grid 3" w:semiHidden="0" w:uiPriority="69" w:unhideWhenUsed="0"/>
-    <w:lsdException w:name="Dark List" w:semiHidden="0" w:uiPriority="70" w:unhideWhenUsed="0"/>
-    <w:lsdException w:name="Colorful Shading" w:semiHidden="0" w:uiPriority="71" w:unhideWhenUsed="0"/>
-    <w:lsdException w:name="Colorful List" w:semiHidden="0" w:uiPriority="72" w:unhideWhenUsed="0"/>
-    <w:lsdException w:name="Colorful Grid" w:semiHidden="0" w:uiPriority="73" w:unhideWhenUsed="0"/>
-    <w:lsdException w:name="Light Shading Accent 1" w:semiHidden="0" w:uiPriority="60" w:unhideWhenUsed="0"/>
-    <w:lsdException w:name="Light List Accent 1" w:semiHidden="0" w:uiPriority="61" w:unhideWhenUsed="0"/>
-    <w:lsdException w:name="Light Grid Accent 1" w:semiHidden="0" w:uiPriority="62" w:unhideWhenUsed="0"/>
-    <w:lsdException w:name="Medium Shading 1 Accent 1" w:semiHidden="0" w:uiPriority="63" w:unhideWhenUsed="0"/>
-    <w:lsdException w:name="Medium Shading 2 Accent 1" w:semiHidden="0" w:uiPriority="64" w:unhideWhenUsed="0"/>
-    <w:lsdException w:name="Medium List 1 Accent 1" w:semiHidden="0" w:uiPriority="65" w:unhideWhenUsed="0"/>
-    <w:lsdException w:name="Revision" w:unhideWhenUsed="0"/>
-    <w:lsdException w:name="List Paragraph" w:semiHidden="0" w:uiPriority="34" w:unhideWhenUsed="0" w:qFormat="1"/>
-    <w:lsdException w:name="Quote" w:semiHidden="0" w:uiPriority="29" w:unhideWhenUsed="0" w:qFormat="1"/>
-    <w:lsdException w:name="Intense Quote" w:semiHidden="0" w:uiPriority="30" w:unhideWhenUsed="0" w:qFormat="1"/>
-    <w:lsdException w:name="Medium List 2 Accent 1" w:semiHidden="0" w:uiPriority="66" w:unhideWhenUsed="0"/>
-    <w:lsdException w:name="Medium Grid 1 Accent 1" w:semiHidden="0" w:uiPriority="67" w:unhideWhenUsed="0"/>
-    <w:lsdException w:name="Medium Grid 2 Accent 1" w:semiHidden="0" w:uiPriority="68" w:unhideWhenUsed="0"/>
-    <w:lsdException w:name="Medium Grid 3 Accent 1" w:semiHidden="0" w:uiPriority="69" w:unhideWhenUsed="0"/>
-    <w:lsdException w:name="Dark List Accent 1" w:semiHidden="0" w:uiPriority="70" w:unhideWhenUsed="0"/>
-    <w:lsdException w:name="Colorful Shading Accent 1" w:semiHidden="0" w:uiPriority="71" w:unhideWhenUsed="0"/>
-    <w:lsdException w:name="Colorful List Accent 1" w:semiHidden="0" w:uiPriority="72" w:unhideWhenUsed="0"/>
-    <w:lsdException w:name="Colorful Grid Accent 1" w:semiHidden="0" w:uiPriority="73" w:unhideWhenUsed="0"/>
-    <w:lsdException w:name="Light Shading Accent 2" w:semiHidden="0" w:uiPriority="60" w:unhideWhenUsed="0"/>
-    <w:lsdException w:name="Light List Accent 2" w:semiHidden="0" w:uiPriority="61" w:unhideWhenUsed="0"/>
-    <w:lsdException w:name="Light Grid Accent 2" w:semiHidden="0" w:uiPriority="62" w:unhideWhenUsed="0"/>
-    <w:lsdException w:name="Medium Shading 1 Accent 2" w:semiHidden="0" w:uiPriority="63" w:unhideWhenUsed="0"/>
-    <w:lsdException w:name="Medium Shading 2 Accent 2" w:semiHidden="0" w:uiPriority="64" w:unhideWhenUsed="0"/>
-    <w:lsdException w:name="Medium List 1 Accent 2" w:semiHidden="0" w:uiPriority="65" w:unhideWhenUsed="0"/>
-    <w:lsdException w:name="Medium List 2 Accent 2" w:semiHidden="0" w:uiPriority="66" w:unhideWhenUsed="0"/>
-    <w:lsdException w:name="Medium Grid 1 Accent 2" w:semiHidden="0" w:uiPriority="67" w:unhideWhenUsed="0"/>
-    <w:lsdException w:name="Medium Grid 2 Accent 2" w:semiHidden="0" w:uiPriority="68" w:unhideWhenUsed="0"/>
-    <w:lsdException w:name="Medium Grid 3 Accent 2" w:semiHidden="0" w:uiPriority="69" w:unhideWhenUsed="0"/>
-    <w:lsdException w:name="Dark List Accent 2" w:semiHidden="0" w:uiPriority="70" w:unhideWhenUsed="0"/>
-    <w:lsdException w:name="Colorful Shading Accent 2" w:semiHidden="0" w:uiPriority="71" w:unhideWhenUsed="0"/>
-    <w:lsdException w:name="Colorful List Accent 2" w:semiHidden="0" w:uiPriority="72" w:unhideWhenUsed="0"/>
-    <w:lsdException w:name="Colorful Grid Accent 2" w:semiHidden="0" w:uiPriority="73" w:unhideWhenUsed="0"/>
-    <w:lsdException w:name="Light Shading Accent 3" w:semiHidden="0" w:uiPriority="60" w:unhideWhenUsed="0"/>
-    <w:lsdException w:name="Light List Accent 3" w:semiHidden="0" w:uiPriority="61" w:unhideWhenUsed="0"/>
-    <w:lsdException w:name="Light Grid Accent 3" w:semiHidden="0" w:uiPriority="62" w:unhideWhenUsed="0"/>
-    <w:lsdException w:name="Medium Shading 1 Accent 3" w:semiHidden="0" w:uiPriority="63" w:unhideWhenUsed="0"/>
-    <w:lsdException w:name="Medium Shading 2 Accent 3" w:semiHidden="0" w:uiPriority="64" w:unhideWhenUsed="0"/>
-    <w:lsdException w:name="Medium List 1 Accent 3" w:semiHidden="0" w:uiPriority="65" w:unhideWhenUsed="0"/>
-    <w:lsdException w:name="Medium List 2 Accent 3" w:semiHidden="0" w:uiPriority="66" w:unhideWhenUsed="0"/>
-    <w:lsdException w:name="Medium Grid 1 Accent 3" w:semiHidden="0" w:uiPriority="67" w:unhideWhenUsed="0"/>
-    <w:lsdException w:name="Medium Grid 2 Accent 3" w:semiHidden="0" w:uiPriority="68" w:unhideWhenUsed="0"/>
-    <w:lsdException w:name="Medium Grid 3 Accent 3" w:semiHidden="0" w:uiPriority="69" w:unhideWhenUsed="0"/>
-    <w:lsdException w:name="Dark List Accent 3" w:semiHidden="0" w:uiPriority="70" w:unhideWhenUsed="0"/>
-    <w:lsdException w:name="Colorful Shading Accent 3" w:semiHidden="0" w:uiPriority="71" w:unhideWhenUsed="0"/>
-    <w:lsdException w:name="Colorful List Accent 3" w:semiHidden="0" w:uiPriority="72" w:unhideWhenUsed="0"/>
-    <w:lsdException w:name="Colorful Grid Accent 3" w:semiHidden="0" w:uiPriority="73" w:unhideWhenUsed="0"/>
-    <w:lsdException w:name="Light Shading Accent 4" w:semiHidden="0" w:uiPriority="60" w:unhideWhenUsed="0"/>
-    <w:lsdException w:name="Light List Accent 4" w:semiHidden="0" w:uiPriority="61" w:unhideWhenUsed="0"/>
-    <w:lsdException w:name="Light Grid Accent 4" w:semiHidden="0" w:uiPriority="62" w:unhideWhenUsed="0"/>
-    <w:lsdException w:name="Medium Shading 1 Accent 4" w:semiHidden="0" w:uiPriority="63" w:unhideWhenUsed="0"/>
-    <w:lsdException w:name="Medium Shading 2 Accent 4" w:semiHidden="0" w:uiPriority="64" w:unhideWhenUsed="0"/>
-    <w:lsdException w:name="Medium List 1 Accent 4" w:semiHidden="0" w:uiPriority="65" w:unhideWhenUsed="0"/>
-    <w:lsdException w:name="Medium List 2 Accent 4" w:semiHidden="0" w:uiPriority="66" w:unhideWhenUsed="0"/>
-    <w:lsdException w:name="Medium Grid 1 Accent 4" w:semiHidden="0" w:uiPriority="67" w:unhideWhenUsed="0"/>
-    <w:lsdException w:name="Medium Grid 2 Accent 4" w:semiHidden="0" w:uiPriority="68" w:unhideWhenUsed="0"/>
-    <w:lsdException w:name="Medium Grid 3 Accent 4" w:semiHidden="0" w:uiPriority="69" w:unhideWhenUsed="0"/>
-    <w:lsdException w:name="Dark List Accent 4" w:semiHidden="0" w:uiPriority="70" w:unhideWhenUsed="0"/>
-    <w:lsdException w:name="Colorful Shading Accent 4" w:semiHidden="0" w:uiPriority="71" w:unhideWhenUsed="0"/>
-    <w:lsdException w:name="Colorful List Accent 4" w:semiHidden="0" w:uiPriority="72" w:unhideWhenUsed="0"/>
-    <w:lsdException w:name="Colorful Grid Accent 4" w:semiHidden="0" w:uiPriority="73" w:unhideWhenUsed="0"/>
-    <w:lsdException w:name="Light Shading Accent 5" w:semiHidden="0" w:uiPriority="60" w:unhideWhenUsed="0"/>
-    <w:lsdException w:name="Light List Accent 5" w:semiHidden="0" w:uiPriority="61" w:unhideWhenUsed="0"/>
-    <w:lsdException w:name="Light Grid Accent 5" w:semiHidden="0" w:uiPriority="62" w:unhideWhenUsed="0"/>
-    <w:lsdException w:name="Medium Shading 1 Accent 5" w:semiHidden="0" w:uiPriority="63" w:unhideWhenUsed="0"/>
-    <w:lsdException w:name="Medium Shading 2 Accent 5" w:semiHidden="0" w:uiPriority="64" w:unhideWhenUsed="0"/>
-    <w:lsdException w:name="Medium List 1 Accent 5" w:semiHidden="0" w:uiPriority="65" w:unhideWhenUsed="0"/>
-    <w:lsdException w:name="Medium List 2 Accent 5" w:semiHidden="0" w:uiPriority="66" w:unhideWhenUsed="0"/>
-    <w:lsdException w:name="Medium Grid 1 Accent 5" w:semiHidden="0" w:uiPriority="67" w:unhideWhenUsed="0"/>
-    <w:lsdException w:name="Medium Grid 2 Accent 5" w:semiHidden="0" w:uiPriority="68" w:unhideWhenUsed="0"/>
-    <w:lsdException w:name="Medium Grid 3 Accent 5" w:semiHidden="0" w:uiPriority="69" w:unhideWhenUsed="0"/>
-    <w:lsdException w:name="Dark List Accent 5" w:semiHidden="0" w:uiPriority="70" w:unhideWhenUsed="0"/>
-    <w:lsdException w:name="Colorful Shading Accent 5" w:semiHidden="0" w:uiPriority="71" w:unhideWhenUsed="0"/>
-    <w:lsdException w:name="Colorful List Accent 5" w:semiHidden="0" w:uiPriority="72" w:unhideWhenUsed="0"/>
-    <w:lsdException w:name="Colorful Grid Accent 5" w:semiHidden="0" w:uiPriority="73" w:unhideWhenUsed="0"/>
-    <w:lsdException w:name="Light Shading Accent 6" w:semiHidden="0" w:uiPriority="60" w:unhideWhenUsed="0"/>
-    <w:lsdException w:name="Light List Accent 6" w:semiHidden="0" w:uiPriority="61" w:unhideWhenUsed="0"/>
-    <w:lsdException w:name="Light Grid Accent 6" w:semiHidden="0" w:uiPriority="62" w:unhideWhenUsed="0"/>
-    <w:lsdException w:name="Medium Shading 1 Accent 6" w:semiHidden="0" w:uiPriority="63" w:unhideWhenUsed="0"/>
-    <w:lsdException w:name="Medium Shading 2 Accent 6" w:semiHidden="0" w:uiPriority="64" w:unhideWhenUsed="0"/>
-    <w:lsdException w:name="Medium List 1 Accent 6" w:semiHidden="0" w:uiPriority="65" w:unhideWhenUsed="0"/>
-    <w:lsdException w:name="Medium List 2 Accent 6" w:semiHidden="0" w:uiPriority="66" w:unhideWhenUsed="0"/>
-    <w:lsdException w:name="Medium Grid 1 Accent 6" w:semiHidden="0" w:uiPriority="67" w:unhideWhenUsed="0"/>
-    <w:lsdException w:name="Medium Grid 2 Accent 6" w:semiHidden="0" w:uiPriority="68" w:unhideWhenUsed="0"/>
-    <w:lsdException w:name="Medium Grid 3 Accent 6" w:semiHidden="0" w:uiPriority="69" w:unhideWhenUsed="0"/>
-    <w:lsdException w:name="Dark List Accent 6" w:semiHidden="0" w:uiPriority="70" w:unhideWhenUsed="0"/>
-    <w:lsdException w:name="Colorful Shading Accent 6" w:semiHidden="0" w:uiPriority="71" w:unhideWhenUsed="0"/>
-    <w:lsdException w:name="Colorful List Accent 6" w:semiHidden="0" w:uiPriority="72" w:unhideWhenUsed="0"/>
-    <w:lsdException w:name="Colorful Grid Accent 6" w:semiHidden="0" w:uiPriority="73" w:unhideWhenUsed="0"/>
-    <w:lsdException w:name="Subtle Emphasis" w:semiHidden="0" w:uiPriority="19" w:unhideWhenUsed="0" w:qFormat="1"/>
-    <w:lsdException w:name="Intense Emphasis" w:semiHidden="0" w:uiPriority="21" w:unhideWhenUsed="0" w:qFormat="1"/>
-    <w:lsdException w:name="Subtle Reference" w:semiHidden="0" w:uiPriority="31" w:unhideWhenUsed="0" w:qFormat="1"/>
-    <w:lsdException w:name="Intense Reference" w:semiHidden="0" w:uiPriority="32" w:unhideWhenUsed="0" w:qFormat="1"/>
-    <w:lsdException w:name="Book Title" w:semiHidden="0" w:uiPriority="33" w:unhideWhenUsed="0" w:qFormat="1"/>
-    <w:lsdException w:name="Bibliography" w:uiPriority="37"/>
-    <w:lsdException w:name="TOC Heading" w:uiPriority="39" w:qFormat="1"/>
+  <w:latentStyles w:defLockedState="0" w:defUIPriority="99" w:defSemiHidden="0" w:defUnhideWhenUsed="0" w:defQFormat="0" w:count="376">
+    <w:lsdException w:name="Normal" w:uiPriority="0" w:qFormat="1"/>
+    <w:lsdException w:name="heading 1" w:uiPriority="9" w:qFormat="1"/>
+    <w:lsdException w:name="heading 2" w:semiHidden="1" w:uiPriority="9" w:unhideWhenUsed="1" w:qFormat="1"/>
+    <w:lsdException w:name="heading 3" w:semiHidden="1" w:uiPriority="9" w:unhideWhenUsed="1" w:qFormat="1"/>
+    <w:lsdException w:name="heading 4" w:semiHidden="1" w:uiPriority="9" w:unhideWhenUsed="1" w:qFormat="1"/>
+    <w:lsdException w:name="heading 5" w:semiHidden="1" w:uiPriority="9" w:unhideWhenUsed="1" w:qFormat="1"/>
+    <w:lsdException w:name="heading 6" w:semiHidden="1" w:uiPriority="9" w:unhideWhenUsed="1" w:qFormat="1"/>
+    <w:lsdException w:name="heading 7" w:semiHidden="1" w:uiPriority="9" w:unhideWhenUsed="1" w:qFormat="1"/>
+    <w:lsdException w:name="heading 8" w:semiHidden="1" w:uiPriority="9" w:unhideWhenUsed="1" w:qFormat="1"/>
+    <w:lsdException w:name="heading 9" w:semiHidden="1" w:uiPriority="9" w:unhideWhenUsed="1" w:qFormat="1"/>
+    <w:lsdException w:name="index 1" w:semiHidden="1" w:unhideWhenUsed="1"/>
+    <w:lsdException w:name="index 2" w:semiHidden="1" w:unhideWhenUsed="1"/>
+    <w:lsdException w:name="index 3" w:semiHidden="1" w:unhideWhenUsed="1"/>
+    <w:lsdException w:name="index 4" w:semiHidden="1" w:unhideWhenUsed="1"/>
+    <w:lsdException w:name="index 5" w:semiHidden="1" w:unhideWhenUsed="1"/>
+    <w:lsdException w:name="index 6" w:semiHidden="1" w:unhideWhenUsed="1"/>
+    <w:lsdException w:name="index 7" w:semiHidden="1" w:unhideWhenUsed="1"/>
+    <w:lsdException w:name="index 8" w:semiHidden="1" w:unhideWhenUsed="1"/>
+    <w:lsdException w:name="index 9" w:semiHidden="1" w:unhideWhenUsed="1"/>
+    <w:lsdException w:name="toc 1" w:semiHidden="1" w:uiPriority="39" w:unhideWhenUsed="1"/>
+    <w:lsdException w:name="toc 2" w:semiHidden="1" w:uiPriority="39" w:unhideWhenUsed="1"/>
+    <w:lsdException w:name="toc 3" w:semiHidden="1" w:uiPriority="39" w:unhideWhenUsed="1"/>
+    <w:lsdException w:name="toc 4" w:semiHidden="1" w:uiPriority="39" w:unhideWhenUsed="1"/>
+    <w:lsdException w:name="toc 5" w:semiHidden="1" w:uiPriority="39" w:unhideWhenUsed="1"/>
+    <w:lsdException w:name="toc 6" w:semiHidden="1" w:uiPriority="39" w:unhideWhenUsed="1"/>
+    <w:lsdException w:name="toc 7" w:semiHidden="1" w:uiPriority="39" w:unhideWhenUsed="1"/>
+    <w:lsdException w:name="toc 8" w:semiHidden="1" w:uiPriority="39" w:unhideWhenUsed="1"/>
+    <w:lsdException w:name="toc 9" w:semiHidden="1" w:uiPriority="39" w:unhideWhenUsed="1"/>
+    <w:lsdException w:name="Normal Indent" w:semiHidden="1" w:unhideWhenUsed="1"/>
+    <w:lsdException w:name="footnote text" w:semiHidden="1" w:unhideWhenUsed="1"/>
+    <w:lsdException w:name="annotation text" w:semiHidden="1" w:unhideWhenUsed="1"/>
+    <w:lsdException w:name="header" w:semiHidden="1" w:unhideWhenUsed="1"/>
+    <w:lsdException w:name="footer" w:semiHidden="1" w:unhideWhenUsed="1"/>
+    <w:lsdException w:name="index heading" w:semiHidden="1" w:unhideWhenUsed="1"/>
+    <w:lsdException w:name="caption" w:semiHidden="1" w:uiPriority="35" w:unhideWhenUsed="1" w:qFormat="1"/>
+    <w:lsdException w:name="table of figures" w:semiHidden="1" w:unhideWhenUsed="1"/>
+    <w:lsdException w:name="envelope address" w:semiHidden="1" w:unhideWhenUsed="1"/>
+    <w:lsdException w:name="envelope return" w:semiHidden="1" w:unhideWhenUsed="1"/>
+    <w:lsdException w:name="footnote reference" w:semiHidden="1" w:unhideWhenUsed="1"/>
+    <w:lsdException w:name="annotation reference" w:semiHidden="1" w:unhideWhenUsed="1"/>
+    <w:lsdException w:name="line number" w:semiHidden="1" w:unhideWhenUsed="1"/>
+    <w:lsdException w:name="page number" w:semiHidden="1" w:unhideWhenUsed="1"/>
+    <w:lsdException w:name="endnote reference" w:semiHidden="1" w:unhideWhenUsed="1"/>
+    <w:lsdException w:name="endnote text" w:semiHidden="1" w:unhideWhenUsed="1"/>
+    <w:lsdException w:name="table of authorities" w:semiHidden="1" w:unhideWhenUsed="1"/>
+    <w:lsdException w:name="macro" w:semiHidden="1" w:unhideWhenUsed="1"/>
+    <w:lsdException w:name="toa heading" w:semiHidden="1" w:unhideWhenUsed="1"/>
+    <w:lsdException w:name="List" w:semiHidden="1" w:unhideWhenUsed="1"/>
+    <w:lsdException w:name="List Bullet" w:semiHidden="1" w:unhideWhenUsed="1"/>
+    <w:lsdException w:name="List Number" w:semiHidden="1" w:unhideWhenUsed="1"/>
+    <w:lsdException w:name="List 2" w:semiHidden="1" w:unhideWhenUsed="1"/>
+    <w:lsdException w:name="List 3" w:semiHidden="1" w:unhideWhenUsed="1"/>
+    <w:lsdException w:name="List 4" w:semiHidden="1" w:unhideWhenUsed="1"/>
+    <w:lsdException w:name="List 5" w:semiHidden="1" w:unhideWhenUsed="1"/>
+    <w:lsdException w:name="List Bullet 2" w:semiHidden="1" w:unhideWhenUsed="1"/>
+    <w:lsdException w:name="List Bullet 3" w:semiHidden="1" w:unhideWhenUsed="1"/>
+    <w:lsdException w:name="List Bullet 4" w:semiHidden="1" w:unhideWhenUsed="1"/>
+    <w:lsdException w:name="List Bullet 5" w:semiHidden="1" w:unhideWhenUsed="1"/>
+    <w:lsdException w:name="List Number 2" w:semiHidden="1" w:unhideWhenUsed="1"/>
+    <w:lsdException w:name="List Number 3" w:semiHidden="1" w:unhideWhenUsed="1"/>
+    <w:lsdException w:name="List Number 4" w:semiHidden="1" w:unhideWhenUsed="1"/>
+    <w:lsdException w:name="List Number 5" w:semiHidden="1" w:unhideWhenUsed="1"/>
+    <w:lsdException w:name="Title" w:uiPriority="10" w:qFormat="1"/>
+    <w:lsdException w:name="Closing" w:semiHidden="1" w:unhideWhenUsed="1"/>
+    <w:lsdException w:name="Signature" w:semiHidden="1" w:unhideWhenUsed="1"/>
+    <w:lsdException w:name="Default Paragraph Font" w:semiHidden="1" w:uiPriority="1" w:unhideWhenUsed="1"/>
+    <w:lsdException w:name="Body Text" w:semiHidden="1" w:unhideWhenUsed="1"/>
+    <w:lsdException w:name="Body Text Indent" w:semiHidden="1" w:unhideWhenUsed="1"/>
+    <w:lsdException w:name="List Continue" w:semiHidden="1" w:unhideWhenUsed="1"/>
+    <w:lsdException w:name="List Continue 2" w:semiHidden="1" w:unhideWhenUsed="1"/>
+    <w:lsdException w:name="List Continue 3" w:semiHidden="1" w:unhideWhenUsed="1"/>
+    <w:lsdException w:name="List Continue 4" w:semiHidden="1" w:unhideWhenUsed="1"/>
+    <w:lsdException w:name="List Continue 5" w:semiHidden="1" w:unhideWhenUsed="1"/>
+    <w:lsdException w:name="Message Header" w:semiHidden="1" w:unhideWhenUsed="1"/>
+    <w:lsdException w:name="Subtitle" w:uiPriority="11" w:qFormat="1"/>
+    <w:lsdException w:name="Salutation" w:semiHidden="1" w:unhideWhenUsed="1"/>
+    <w:lsdException w:name="Date" w:semiHidden="1" w:unhideWhenUsed="1"/>
+    <w:lsdException w:name="Body Text First Indent" w:semiHidden="1" w:unhideWhenUsed="1"/>
+    <w:lsdException w:name="Body Text First Indent 2" w:semiHidden="1" w:unhideWhenUsed="1"/>
+    <w:lsdException w:name="Note Heading" w:semiHidden="1" w:unhideWhenUsed="1"/>
+    <w:lsdException w:name="Body Text 2" w:semiHidden="1" w:unhideWhenUsed="1"/>
+    <w:lsdException w:name="Body Text 3" w:semiHidden="1" w:unhideWhenUsed="1"/>
+    <w:lsdException w:name="Body Text Indent 2" w:semiHidden="1" w:unhideWhenUsed="1"/>
+    <w:lsdException w:name="Body Text Indent 3" w:semiHidden="1" w:unhideWhenUsed="1"/>
+    <w:lsdException w:name="Block Text" w:semiHidden="1" w:unhideWhenUsed="1"/>
+    <w:lsdException w:name="Hyperlink" w:semiHidden="1" w:unhideWhenUsed="1"/>
+    <w:lsdException w:name="FollowedHyperlink" w:semiHidden="1" w:unhideWhenUsed="1"/>
+    <w:lsdException w:name="Strong" w:uiPriority="22" w:qFormat="1"/>
+    <w:lsdException w:name="Emphasis" w:uiPriority="20" w:qFormat="1"/>
+    <w:lsdException w:name="Document Map" w:semiHidden="1" w:unhideWhenUsed="1"/>
+    <w:lsdException w:name="Plain Text" w:semiHidden="1" w:unhideWhenUsed="1"/>
+    <w:lsdException w:name="E-mail Signature" w:semiHidden="1" w:unhideWhenUsed="1"/>
+    <w:lsdException w:name="HTML Top of Form" w:semiHidden="1" w:unhideWhenUsed="1"/>
+    <w:lsdException w:name="HTML Bottom of Form" w:semiHidden="1" w:unhideWhenUsed="1"/>
+    <w:lsdException w:name="Normal (Web)" w:semiHidden="1" w:unhideWhenUsed="1"/>
+    <w:lsdException w:name="HTML Acronym" w:semiHidden="1" w:unhideWhenUsed="1"/>
+    <w:lsdException w:name="HTML Address" w:semiHidden="1" w:unhideWhenUsed="1"/>
+    <w:lsdException w:name="HTML Cite" w:semiHidden="1" w:unhideWhenUsed="1"/>
+    <w:lsdException w:name="HTML Code" w:semiHidden="1" w:unhideWhenUsed="1"/>
+    <w:lsdException w:name="HTML Definition" w:semiHidden="1" w:unhideWhenUsed="1"/>
+    <w:lsdException w:name="HTML Keyboard" w:semiHidden="1" w:unhideWhenUsed="1"/>
+    <w:lsdException w:name="HTML Preformatted" w:semiHidden="1" w:unhideWhenUsed="1"/>
+    <w:lsdException w:name="HTML Sample" w:semiHidden="1" w:unhideWhenUsed="1"/>
+    <w:lsdException w:name="HTML Typewriter" w:semiHidden="1" w:unhideWhenUsed="1"/>
+    <w:lsdException w:name="HTML Variable" w:semiHidden="1" w:unhideWhenUsed="1"/>
+    <w:lsdException w:name="Normal Table" w:semiHidden="1" w:unhideWhenUsed="1"/>
+    <w:lsdException w:name="annotation subject" w:semiHidden="1" w:unhideWhenUsed="1"/>
+    <w:lsdException w:name="No List" w:semiHidden="1" w:unhideWhenUsed="1"/>
+    <w:lsdException w:name="Outline List 1" w:semiHidden="1" w:unhideWhenUsed="1"/>
+    <w:lsdException w:name="Outline List 2" w:semiHidden="1" w:unhideWhenUsed="1"/>
+    <w:lsdException w:name="Outline List 3" w:semiHidden="1" w:unhideWhenUsed="1"/>
+    <w:lsdException w:name="Table Simple 1" w:semiHidden="1" w:unhideWhenUsed="1"/>
+    <w:lsdException w:name="Table Simple 2" w:semiHidden="1" w:unhideWhenUsed="1"/>
+    <w:lsdException w:name="Table Simple 3" w:semiHidden="1" w:unhideWhenUsed="1"/>
+    <w:lsdException w:name="Table Classic 1" w:semiHidden="1" w:unhideWhenUsed="1"/>
+    <w:lsdException w:name="Table Classic 2" w:semiHidden="1" w:unhideWhenUsed="1"/>
+    <w:lsdException w:name="Table Classic 3" w:semiHidden="1" w:unhideWhenUsed="1"/>
+    <w:lsdException w:name="Table Classic 4" w:semiHidden="1" w:unhideWhenUsed="1"/>
+    <w:lsdException w:name="Table Colorful 1" w:semiHidden="1" w:unhideWhenUsed="1"/>
+    <w:lsdException w:name="Table Colorful 2" w:semiHidden="1" w:unhideWhenUsed="1"/>
+    <w:lsdException w:name="Table Colorful 3" w:semiHidden="1" w:unhideWhenUsed="1"/>
+    <w:lsdException w:name="Table Columns 1" w:semiHidden="1" w:unhideWhenUsed="1"/>
+    <w:lsdException w:name="Table Columns 2" w:semiHidden="1" w:unhideWhenUsed="1"/>
+    <w:lsdException w:name="Table Columns 3" w:semiHidden="1" w:unhideWhenUsed="1"/>
+    <w:lsdException w:name="Table Columns 4" w:semiHidden="1" w:unhideWhenUsed="1"/>
+    <w:lsdException w:name="Table Columns 5" w:semiHidden="1" w:unhideWhenUsed="1"/>
+    <w:lsdException w:name="Table Grid 1" w:semiHidden="1" w:unhideWhenUsed="1"/>
+    <w:lsdException w:name="Table Grid 2" w:semiHidden="1" w:unhideWhenUsed="1"/>
+    <w:lsdException w:name="Table Grid 3" w:semiHidden="1" w:unhideWhenUsed="1"/>
+    <w:lsdException w:name="Table Grid 4" w:semiHidden="1" w:unhideWhenUsed="1"/>
+    <w:lsdException w:name="Table Grid 5" w:semiHidden="1" w:unhideWhenUsed="1"/>
+    <w:lsdException w:name="Table Grid 6" w:semiHidden="1" w:unhideWhenUsed="1"/>
+    <w:lsdException w:name="Table Grid 7" w:semiHidden="1" w:unhideWhenUsed="1"/>
+    <w:lsdException w:name="Table Grid 8" w:semiHidden="1" w:unhideWhenUsed="1"/>
+    <w:lsdException w:name="Table List 1" w:semiHidden="1" w:unhideWhenUsed="1"/>
+    <w:lsdException w:name="Table List 2" w:semiHidden="1" w:unhideWhenUsed="1"/>
+    <w:lsdException w:name="Table List 3" w:semiHidden="1" w:unhideWhenUsed="1"/>
+    <w:lsdException w:name="Table List 4" w:semiHidden="1" w:unhideWhenUsed="1"/>
+    <w:lsdException w:name="Table List 5" w:semiHidden="1" w:unhideWhenUsed="1"/>
+    <w:lsdException w:name="Table List 6" w:semiHidden="1" w:unhideWhenUsed="1"/>
+    <w:lsdException w:name="Table List 7" w:semiHidden="1" w:unhideWhenUsed="1"/>
+    <w:lsdException w:name="Table List 8" w:semiHidden="1" w:unhideWhenUsed="1"/>
+    <w:lsdException w:name="Table 3D effects 1" w:semiHidden="1" w:unhideWhenUsed="1"/>
+    <w:lsdException w:name="Table 3D effects 2" w:semiHidden="1" w:unhideWhenUsed="1"/>
+    <w:lsdException w:name="Table 3D effects 3" w:semiHidden="1" w:unhideWhenUsed="1"/>
+    <w:lsdException w:name="Table Contemporary" w:semiHidden="1" w:unhideWhenUsed="1"/>
+    <w:lsdException w:name="Table Elegant" w:semiHidden="1" w:unhideWhenUsed="1"/>
+    <w:lsdException w:name="Table Professional" w:semiHidden="1" w:unhideWhenUsed="1"/>
+    <w:lsdException w:name="Table Subtle 1" w:semiHidden="1" w:unhideWhenUsed="1"/>
+    <w:lsdException w:name="Table Subtle 2" w:semiHidden="1" w:unhideWhenUsed="1"/>
+    <w:lsdException w:name="Table Web 1" w:semiHidden="1" w:unhideWhenUsed="1"/>
+    <w:lsdException w:name="Table Web 2" w:semiHidden="1" w:unhideWhenUsed="1"/>
+    <w:lsdException w:name="Table Web 3" w:semiHidden="1" w:unhideWhenUsed="1"/>
+    <w:lsdException w:name="Balloon Text" w:semiHidden="1" w:unhideWhenUsed="1"/>
+    <w:lsdException w:name="Table Grid" w:semiHidden="1" w:uiPriority="39" w:unhideWhenUsed="1"/>
+    <w:lsdException w:name="Table Theme" w:semiHidden="1" w:unhideWhenUsed="1"/>
+    <w:lsdException w:name="Placeholder Text" w:semiHidden="1"/>
+    <w:lsdException w:name="No Spacing" w:uiPriority="1" w:qFormat="1"/>
+    <w:lsdException w:name="Light Shading" w:uiPriority="60"/>
+    <w:lsdException w:name="Light List" w:uiPriority="61"/>
+    <w:lsdException w:name="Light Grid" w:uiPriority="62"/>
+    <w:lsdException w:name="Medium Shading 1" w:uiPriority="63"/>
+    <w:lsdException w:name="Medium Shading 2" w:uiPriority="64"/>
+    <w:lsdException w:name="Medium List 1" w:uiPriority="65"/>
+    <w:lsdException w:name="Medium List 2" w:uiPriority="66"/>
+    <w:lsdException w:name="Medium Grid 1" w:uiPriority="67"/>
+    <w:lsdException w:name="Medium Grid 2" w:uiPriority="68"/>
+    <w:lsdException w:name="Medium Grid 3" w:uiPriority="69"/>
+    <w:lsdException w:name="Dark List" w:uiPriority="70"/>
+    <w:lsdException w:name="Colorful Shading" w:uiPriority="71"/>
+    <w:lsdException w:name="Colorful List" w:uiPriority="72"/>
+    <w:lsdException w:name="Colorful Grid" w:uiPriority="73"/>
+    <w:lsdException w:name="Light Shading Accent 1" w:uiPriority="60"/>
+    <w:lsdException w:name="Light List Accent 1" w:uiPriority="61"/>
+    <w:lsdException w:name="Light Grid Accent 1" w:uiPriority="62"/>
+    <w:lsdException w:name="Medium Shading 1 Accent 1" w:uiPriority="63"/>
+    <w:lsdException w:name="Medium Shading 2 Accent 1" w:uiPriority="64"/>
+    <w:lsdException w:name="Medium List 1 Accent 1" w:uiPriority="65"/>
+    <w:lsdException w:name="Revision" w:semiHidden="1"/>
+    <w:lsdException w:name="List Paragraph" w:uiPriority="34" w:qFormat="1"/>
+    <w:lsdException w:name="Quote" w:uiPriority="29" w:qFormat="1"/>
+    <w:lsdException w:name="Intense Quote" w:uiPriority="30" w:qFormat="1"/>
+    <w:lsdException w:name="Medium List 2 Accent 1" w:uiPriority="66"/>
+    <w:lsdException w:name="Medium Grid 1 Accent 1" w:uiPriority="67"/>
+    <w:lsdException w:name="Medium Grid 2 Accent 1" w:uiPriority="68"/>
+    <w:lsdException w:name="Medium Grid 3 Accent 1" w:uiPriority="69"/>
+    <w:lsdException w:name="Dark List Accent 1" w:uiPriority="70"/>
+    <w:lsdException w:name="Colorful Shading Accent 1" w:uiPriority="71"/>
+    <w:lsdException w:name="Colorful List Accent 1" w:uiPriority="72"/>
+    <w:lsdException w:name="Colorful Grid Accent 1" w:uiPriority="73"/>
+    <w:lsdException w:name="Light Shading Accent 2" w:uiPriority="60"/>
+    <w:lsdException w:name="Light List Accent 2" w:uiPriority="61"/>
+    <w:lsdException w:name="Light Grid Accent 2" w:uiPriority="62"/>
+    <w:lsdException w:name="Medium Shading 1 Accent 2" w:uiPriority="63"/>
+    <w:lsdException w:name="Medium Shading 2 Accent 2" w:uiPriority="64"/>
+    <w:lsdException w:name="Medium List 1 Accent 2" w:uiPriority="65"/>
+    <w:lsdException w:name="Medium List 2 Accent 2" w:uiPriority="66"/>
+    <w:lsdException w:name="Medium Grid 1 Accent 2" w:uiPriority="67"/>
+    <w:lsdException w:name="Medium Grid 2 Accent 2" w:uiPriority="68"/>
+    <w:lsdException w:name="Medium Grid 3 Accent 2" w:uiPriority="69"/>
+    <w:lsdException w:name="Dark List Accent 2" w:uiPriority="70"/>
+    <w:lsdException w:name="Colorful Shading Accent 2" w:uiPriority="71"/>
+    <w:lsdException w:name="Colorful List Accent 2" w:uiPriority="72"/>
+    <w:lsdException w:name="Colorful Grid Accent 2" w:uiPriority="73"/>
+    <w:lsdException w:name="Light Shading Accent 3" w:uiPriority="60"/>
+    <w:lsdException w:name="Light List Accent 3" w:uiPriority="61"/>
+    <w:lsdException w:name="Light Grid Accent 3" w:uiPriority="62"/>
+    <w:lsdException w:name="Medium Shading 1 Accent 3" w:uiPriority="63"/>
+    <w:lsdException w:name="Medium Shading 2 Accent 3" w:uiPriority="64"/>
+    <w:lsdException w:name="Medium List 1 Accent 3" w:uiPriority="65"/>
+    <w:lsdException w:name="Medium List 2 Accent 3" w:uiPriority="66"/>
+    <w:lsdException w:name="Medium Grid 1 Accent 3" w:uiPriority="67"/>
+    <w:lsdException w:name="Medium Grid 2 Accent 3" w:uiPriority="68"/>
+    <w:lsdException w:name="Medium Grid 3 Accent 3" w:uiPriority="69"/>
+    <w:lsdException w:name="Dark List Accent 3" w:uiPriority="70"/>
+    <w:lsdException w:name="Colorful Shading Accent 3" w:uiPriority="71"/>
+    <w:lsdException w:name="Colorful List Accent 3" w:uiPriority="72"/>
+    <w:lsdException w:name="Colorful Grid Accent 3" w:uiPriority="73"/>
+    <w:lsdException w:name="Light Shading Accent 4" w:uiPriority="60"/>
+    <w:lsdException w:name="Light List Accent 4" w:uiPriority="61"/>
+    <w:lsdException w:name="Light Grid Accent 4" w:uiPriority="62"/>
+    <w:lsdException w:name="Medium Shading 1 Accent 4" w:uiPriority="63"/>
+    <w:lsdException w:name="Medium Shading 2 Accent 4" w:uiPriority="64"/>
+    <w:lsdException w:name="Medium List 1 Accent 4" w:uiPriority="65"/>
+    <w:lsdException w:name="Medium List 2 Accent 4" w:uiPriority="66"/>
+    <w:lsdException w:name="Medium Grid 1 Accent 4" w:uiPriority="67"/>
+    <w:lsdException w:name="Medium Grid 2 Accent 4" w:uiPriority="68"/>
+    <w:lsdException w:name="Medium Grid 3 Accent 4" w:uiPriority="69"/>
+    <w:lsdException w:name="Dark List Accent 4" w:uiPriority="70"/>
+    <w:lsdException w:name="Colorful Shading Accent 4" w:uiPriority="71"/>
+    <w:lsdException w:name="Colorful List Accent 4" w:uiPriority="72"/>
+    <w:lsdException w:name="Colorful Grid Accent 4" w:uiPriority="73"/>
+    <w:lsdException w:name="Light Shading Accent 5" w:uiPriority="60"/>
+    <w:lsdException w:name="Light List Accent 5" w:uiPriority="61"/>
+    <w:lsdException w:name="Light Grid Accent 5" w:uiPriority="62"/>
+    <w:lsdException w:name="Medium Shading 1 Accent 5" w:uiPriority="63"/>
+    <w:lsdException w:name="Medium Shading 2 Accent 5" w:uiPriority="64"/>
+    <w:lsdException w:name="Medium List 1 Accent 5" w:uiPriority="65"/>
+    <w:lsdException w:name="Medium List 2 Accent 5" w:uiPriority="66"/>
+    <w:lsdException w:name="Medium Grid 1 Accent 5" w:uiPriority="67"/>
+    <w:lsdException w:name="Medium Grid 2 Accent 5" w:uiPriority="68"/>
+    <w:lsdException w:name="Medium Grid 3 Accent 5" w:uiPriority="69"/>
+    <w:lsdException w:name="Dark List Accent 5" w:uiPriority="70"/>
+    <w:lsdException w:name="Colorful Shading Accent 5" w:uiPriority="71"/>
+    <w:lsdException w:name="Colorful List Accent 5" w:uiPriority="72"/>
+    <w:lsdException w:name="Colorful Grid Accent 5" w:uiPriority="73"/>
+    <w:lsdException w:name="Light Shading Accent 6" w:uiPriority="60"/>
+    <w:lsdException w:name="Light List Accent 6" w:uiPriority="61"/>
+    <w:lsdException w:name="Light Grid Accent 6" w:uiPriority="62"/>
+    <w:lsdException w:name="Medium Shading 1 Accent 6" w:uiPriority="63"/>
+    <w:lsdException w:name="Medium Shading 2 Accent 6" w:uiPriority="64"/>
+    <w:lsdException w:name="Medium List 1 Accent 6" w:uiPriority="65"/>
+    <w:lsdException w:name="Medium List 2 Accent 6" w:uiPriority="66"/>
+    <w:lsdException w:name="Medium Grid 1 Accent 6" w:uiPriority="67"/>
+    <w:lsdException w:name="Medium Grid 2 Accent 6" w:uiPriority="68"/>
+    <w:lsdException w:name="Medium Grid 3 Accent 6" w:uiPriority="69"/>
+    <w:lsdException w:name="Dark List Accent 6" w:uiPriority="70"/>
+    <w:lsdException w:name="Colorful Shading Accent 6" w:uiPriority="71"/>
+    <w:lsdException w:name="Colorful List Accent 6" w:uiPriority="72"/>
+    <w:lsdException w:name="Colorful Grid Accent 6" w:uiPriority="73"/>
+    <w:lsdException w:name="Subtle Emphasis" w:uiPriority="19" w:qFormat="1"/>
+    <w:lsdException w:name="Intense Emphasis" w:uiPriority="21" w:qFormat="1"/>
+    <w:lsdException w:name="Subtle Reference" w:uiPriority="31" w:qFormat="1"/>
+    <w:lsdException w:name="Intense Reference" w:uiPriority="32" w:qFormat="1"/>
+    <w:lsdException w:name="Book Title" w:uiPriority="33" w:qFormat="1"/>
+    <w:lsdException w:name="Bibliography" w:semiHidden="1" w:uiPriority="37" w:unhideWhenUsed="1"/>
+    <w:lsdException w:name="TOC Heading" w:semiHidden="1" w:uiPriority="39" w:unhideWhenUsed="1" w:qFormat="1"/>
+    <w:lsdException w:name="Plain Table 1" w:uiPriority="41"/>
+    <w:lsdException w:name="Plain Table 2" w:uiPriority="42"/>
+    <w:lsdException w:name="Plain Table 3" w:uiPriority="43"/>
+    <w:lsdException w:name="Plain Table 4" w:uiPriority="44"/>
+    <w:lsdException w:name="Plain Table 5" w:uiPriority="45"/>
+    <w:lsdException w:name="Grid Table Light" w:uiPriority="40"/>
+    <w:lsdException w:name="Grid Table 1 Light" w:uiPriority="46"/>
+    <w:lsdException w:name="Grid Table 2" w:uiPriority="47"/>
+    <w:lsdException w:name="Grid Table 3" w:uiPriority="48"/>
+    <w:lsdException w:name="Grid Table 4" w:uiPriority="49"/>
+    <w:lsdException w:name="Grid Table 5 Dark" w:uiPriority="50"/>
+    <w:lsdException w:name="Grid Table 6 Colorful" w:uiPriority="51"/>
+    <w:lsdException w:name="Grid Table 7 Colorful" w:uiPriority="52"/>
+    <w:lsdException w:name="Grid Table 1 Light Accent 1" w:uiPriority="46"/>
+    <w:lsdException w:name="Grid Table 2 Accent 1" w:uiPriority="47"/>
+    <w:lsdException w:name="Grid Table 3 Accent 1" w:uiPriority="48"/>
+    <w:lsdException w:name="Grid Table 4 Accent 1" w:uiPriority="49"/>
+    <w:lsdException w:name="Grid Table 5 Dark Accent 1" w:uiPriority="50"/>
+    <w:lsdException w:name="Grid Table 6 Colorful Accent 1" w:uiPriority="51"/>
+    <w:lsdException w:name="Grid Table 7 Colorful Accent 1" w:uiPriority="52"/>
+    <w:lsdException w:name="Grid Table 1 Light Accent 2" w:uiPriority="46"/>
+    <w:lsdException w:name="Grid Table 2 Accent 2" w:uiPriority="47"/>
+    <w:lsdException w:name="Grid Table 3 Accent 2" w:uiPriority="48"/>
+    <w:lsdException w:name="Grid Table 4 Accent 2" w:uiPriority="49"/>
+    <w:lsdException w:name="Grid Table 5 Dark Accent 2" w:uiPriority="50"/>
+    <w:lsdException w:name="Grid Table 6 Colorful Accent 2" w:uiPriority="51"/>
+    <w:lsdException w:name="Grid Table 7 Colorful Accent 2" w:uiPriority="52"/>
+    <w:lsdException w:name="Grid Table 1 Light Accent 3" w:uiPriority="46"/>
+    <w:lsdException w:name="Grid Table 2 Accent 3" w:uiPriority="47"/>
+    <w:lsdException w:name="Grid Table 3 Accent 3" w:uiPriority="48"/>
+    <w:lsdException w:name="Grid Table 4 Accent 3" w:uiPriority="49"/>
+    <w:lsdException w:name="Grid Table 5 Dark Accent 3" w:uiPriority="50"/>
+    <w:lsdException w:name="Grid Table 6 Colorful Accent 3" w:uiPriority="51"/>
+    <w:lsdException w:name="Grid Table 7 Colorful Accent 3" w:uiPriority="52"/>
+    <w:lsdException w:name="Grid Table 1 Light Accent 4" w:uiPriority="46"/>
+    <w:lsdException w:name="Grid Table 2 Accent 4" w:uiPriority="47"/>
+    <w:lsdException w:name="Grid Table 3 Accent 4" w:uiPriority="48"/>
+    <w:lsdException w:name="Grid Table 4 Accent 4" w:uiPriority="49"/>
+    <w:lsdException w:name="Grid Table 5 Dark Accent 4" w:uiPriority="50"/>
+    <w:lsdException w:name="Grid Table 6 Colorful Accent 4" w:uiPriority="51"/>
+    <w:lsdException w:name="Grid Table 7 Colorful Accent 4" w:uiPriority="52"/>
+    <w:lsdException w:name="Grid Table 1 Light Accent 5" w:uiPriority="46"/>
+    <w:lsdException w:name="Grid Table 2 Accent 5" w:uiPriority="47"/>
+    <w:lsdException w:name="Grid Table 3 Accent 5" w:uiPriority="48"/>
+    <w:lsdException w:name="Grid Table 4 Accent 5" w:uiPriority="49"/>
+    <w:lsdException w:name="Grid Table 5 Dark Accent 5" w:uiPriority="50"/>
+    <w:lsdException w:name="Grid Table 6 Colorful Accent 5" w:uiPriority="51"/>
+    <w:lsdException w:name="Grid Table 7 Colorful Accent 5" w:uiPriority="52"/>
+    <w:lsdException w:name="Grid Table 1 Light Accent 6" w:uiPriority="46"/>
+    <w:lsdException w:name="Grid Table 2 Accent 6" w:uiPriority="47"/>
+    <w:lsdException w:name="Grid Table 3 Accent 6" w:uiPriority="48"/>
+    <w:lsdException w:name="Grid Table 4 Accent 6" w:uiPriority="49"/>
+    <w:lsdException w:name="Grid Table 5 Dark Accent 6" w:uiPriority="50"/>
+    <w:lsdException w:name="Grid Table 6 Colorful Accent 6" w:uiPriority="51"/>
+    <w:lsdException w:name="Grid Table 7 Colorful Accent 6" w:uiPriority="52"/>
+    <w:lsdException w:name="List Table 1 Light" w:uiPriority="46"/>
+    <w:lsdException w:name="List Table 2" w:uiPriority="47"/>
+    <w:lsdException w:name="List Table 3" w:uiPriority="48"/>
+    <w:lsdException w:name="List Table 4" w:uiPriority="49"/>
+    <w:lsdException w:name="List Table 5 Dark" w:uiPriority="50"/>
+    <w:lsdException w:name="List Table 6 Colorful" w:uiPriority="51"/>
+    <w:lsdException w:name="List Table 7 Colorful" w:uiPriority="52"/>
+    <w:lsdException w:name="List Table 1 Light Accent 1" w:uiPriority="46"/>
+    <w:lsdException w:name="List Table 2 Accent 1" w:uiPriority="47"/>
+    <w:lsdException w:name="List Table 3 Accent 1" w:uiPriority="48"/>
+    <w:lsdException w:name="List Table 4 Accent 1" w:uiPriority="49"/>
+    <w:lsdException w:name="List Table 5 Dark Accent 1" w:uiPriority="50"/>
+    <w:lsdException w:name="List Table 6 Colorful Accent 1" w:uiPriority="51"/>
+    <w:lsdException w:name="List Table 7 Colorful Accent 1" w:uiPriority="52"/>
+    <w:lsdException w:name="List Table 1 Light Accent 2" w:uiPriority="46"/>
+    <w:lsdException w:name="List Table 2 Accent 2" w:uiPriority="47"/>
+    <w:lsdException w:name="List Table 3 Accent 2" w:uiPriority="48"/>
+    <w:lsdException w:name="List Table 4 Accent 2" w:uiPriority="49"/>
+    <w:lsdException w:name="List Table 5 Dark Accent 2" w:uiPriority="50"/>
+    <w:lsdException w:name="List Table 6 Colorful Accent 2" w:uiPriority="51"/>
+    <w:lsdException w:name="List Table 7 Colorful Accent 2" w:uiPriority="52"/>
+    <w:lsdException w:name="List Table 1 Light Accent 3" w:uiPriority="46"/>
+    <w:lsdException w:name="List Table 2 Accent 3" w:uiPriority="47"/>
+    <w:lsdException w:name="List Table 3 Accent 3" w:uiPriority="48"/>
+    <w:lsdException w:name="List Table 4 Accent 3" w:uiPriority="49"/>
+    <w:lsdException w:name="List Table 5 Dark Accent 3" w:uiPriority="50"/>
+    <w:lsdException w:name="List Table 6 Colorful Accent 3" w:uiPriority="51"/>
+    <w:lsdException w:name="List Table 7 Colorful Accent 3" w:uiPriority="52"/>
+    <w:lsdException w:name="List Table 1 Light Accent 4" w:uiPriority="46"/>
+    <w:lsdException w:name="List Table 2 Accent 4" w:uiPriority="47"/>
+    <w:lsdException w:name="List Table 3 Accent 4" w:uiPriority="48"/>
+    <w:lsdException w:name="List Table 4 Accent 4" w:uiPriority="49"/>
+    <w:lsdException w:name="List Table 5 Dark Accent 4" w:uiPriority="50"/>
+    <w:lsdException w:name="List Table 6 Colorful Accent 4" w:uiPriority="51"/>
+    <w:lsdException w:name="List Table 7 Colorful Accent 4" w:uiPriority="52"/>
+    <w:lsdException w:name="List Table 1 Light Accent 5" w:uiPriority="46"/>
+    <w:lsdException w:name="List Table 2 Accent 5" w:uiPriority="47"/>
+    <w:lsdException w:name="List Table 3 Accent 5" w:uiPriority="48"/>
+    <w:lsdException w:name="List Table 4 Accent 5" w:uiPriority="49"/>
+    <w:lsdException w:name="List Table 5 Dark Accent 5" w:uiPriority="50"/>
+    <w:lsdException w:name="List Table 6 Colorful Accent 5" w:uiPriority="51"/>
+    <w:lsdException w:name="List Table 7 Colorful Accent 5" w:uiPriority="52"/>
+    <w:lsdException w:name="List Table 1 Light Accent 6" w:uiPriority="46"/>
+    <w:lsdException w:name="List Table 2 Accent 6" w:uiPriority="47"/>
+    <w:lsdException w:name="List Table 3 Accent 6" w:uiPriority="48"/>
+    <w:lsdException w:name="List Table 4 Accent 6" w:uiPriority="49"/>
+    <w:lsdException w:name="List Table 5 Dark Accent 6" w:uiPriority="50"/>
+    <w:lsdException w:name="List Table 6 Colorful Accent 6" w:uiPriority="51"/>
+    <w:lsdException w:name="List Table 7 Colorful Accent 6" w:uiPriority="52"/>
+    <w:lsdException w:name="Mention" w:semiHidden="1" w:unhideWhenUsed="1"/>
+    <w:lsdException w:name="Smart Hyperlink" w:semiHidden="1" w:unhideWhenUsed="1"/>
+    <w:lsdException w:name="Hashtag" w:semiHidden="1" w:unhideWhenUsed="1"/>
+    <w:lsdException w:name="Unresolved Mention" w:semiHidden="1" w:unhideWhenUsed="1"/>
+    <w:lsdException w:name="Smart Link" w:semiHidden="1" w:unhideWhenUsed="1"/>
   </w:latentStyles>
   <w:style w:type="paragraph" w:default="1" w:styleId="Normal">
     <w:name w:val="Normal"/>
@@ -5226,9 +5641,7 @@
       <w:tblStyleRowBandSize w:val="1"/>
       <w:tblStyleColBandSize w:val="1"/>
       <w:tblCellMar>
-        <w:top w:w="0" w:type="dxa"/>
         <w:left w:w="108" w:type="dxa"/>
-        <w:bottom w:w="0" w:type="dxa"/>
         <w:right w:w="108" w:type="dxa"/>
       </w:tblCellMar>
     </w:tblPr>
@@ -5242,9 +5655,7 @@
       <w:tblStyleRowBandSize w:val="1"/>
       <w:tblStyleColBandSize w:val="1"/>
       <w:tblCellMar>
-        <w:top w:w="0" w:type="dxa"/>
         <w:left w:w="108" w:type="dxa"/>
-        <w:bottom w:w="0" w:type="dxa"/>
         <w:right w:w="108" w:type="dxa"/>
       </w:tblCellMar>
     </w:tblPr>
@@ -5255,9 +5666,7 @@
       <w:tblStyleRowBandSize w:val="1"/>
       <w:tblStyleColBandSize w:val="1"/>
       <w:tblCellMar>
-        <w:top w:w="0" w:type="dxa"/>
         <w:left w:w="115" w:type="dxa"/>
-        <w:bottom w:w="0" w:type="dxa"/>
         <w:right w:w="115" w:type="dxa"/>
       </w:tblCellMar>
     </w:tblPr>
@@ -5268,9 +5677,7 @@
       <w:tblStyleRowBandSize w:val="1"/>
       <w:tblStyleColBandSize w:val="1"/>
       <w:tblCellMar>
-        <w:top w:w="0" w:type="dxa"/>
         <w:left w:w="115" w:type="dxa"/>
-        <w:bottom w:w="0" w:type="dxa"/>
         <w:right w:w="115" w:type="dxa"/>
       </w:tblCellMar>
     </w:tblPr>
@@ -5323,7 +5730,6 @@
     <w:uiPriority w:val="39"/>
     <w:rsid w:val="00AB773A"/>
     <w:tblPr>
-      <w:tblInd w:w="0" w:type="dxa"/>
       <w:tblBorders>
         <w:top w:val="single" w:sz="4" w:space="0" w:color="auto"/>
         <w:left w:val="single" w:sz="4" w:space="0" w:color="auto"/>
@@ -5332,620 +5738,6 @@
         <w:insideH w:val="single" w:sz="4" w:space="0" w:color="auto"/>
         <w:insideV w:val="single" w:sz="4" w:space="0" w:color="auto"/>
       </w:tblBorders>
-      <w:tblCellMar>
-        <w:top w:w="0" w:type="dxa"/>
-        <w:left w:w="108" w:type="dxa"/>
-        <w:bottom w:w="0" w:type="dxa"/>
-        <w:right w:w="108" w:type="dxa"/>
-      </w:tblCellMar>
-    </w:tblPr>
-  </w:style>
-  <w:style w:type="paragraph" w:styleId="Textodeglobo">
-    <w:name w:val="Balloon Text"/>
-    <w:basedOn w:val="Normal"/>
-    <w:link w:val="TextodegloboCar"/>
-    <w:uiPriority w:val="99"/>
-    <w:semiHidden/>
-    <w:unhideWhenUsed/>
-    <w:rsid w:val="003A0A20"/>
-    <w:rPr>
-      <w:rFonts w:ascii="Segoe UI" w:hAnsi="Segoe UI" w:cs="Segoe UI"/>
-      <w:sz w:val="18"/>
-      <w:szCs w:val="18"/>
-    </w:rPr>
-  </w:style>
-  <w:style w:type="character" w:customStyle="1" w:styleId="TextodegloboCar">
-    <w:name w:val="Texto de globo Car"/>
-    <w:basedOn w:val="Fuentedeprrafopredeter"/>
-    <w:link w:val="Textodeglobo"/>
-    <w:uiPriority w:val="99"/>
-    <w:semiHidden/>
-    <w:rsid w:val="003A0A20"/>
-    <w:rPr>
-      <w:rFonts w:ascii="Segoe UI" w:hAnsi="Segoe UI" w:cs="Segoe UI"/>
-      <w:sz w:val="18"/>
-      <w:szCs w:val="18"/>
-    </w:rPr>
-  </w:style>
-  <w:style w:type="character" w:styleId="Refdecomentario">
-    <w:name w:val="annotation reference"/>
-    <w:basedOn w:val="Fuentedeprrafopredeter"/>
-    <w:uiPriority w:val="99"/>
-    <w:semiHidden/>
-    <w:unhideWhenUsed/>
-    <w:rsid w:val="00FE2FED"/>
-    <w:rPr>
-      <w:sz w:val="16"/>
-      <w:szCs w:val="16"/>
-    </w:rPr>
-  </w:style>
-  <w:style w:type="paragraph" w:styleId="Textocomentario">
-    <w:name w:val="annotation text"/>
-    <w:basedOn w:val="Normal"/>
-    <w:link w:val="TextocomentarioCar"/>
-    <w:uiPriority w:val="99"/>
-    <w:semiHidden/>
-    <w:unhideWhenUsed/>
-    <w:rsid w:val="00FE2FED"/>
-    <w:rPr>
-      <w:sz w:val="20"/>
-      <w:szCs w:val="20"/>
-    </w:rPr>
-  </w:style>
-  <w:style w:type="character" w:customStyle="1" w:styleId="TextocomentarioCar">
-    <w:name w:val="Texto comentario Car"/>
-    <w:basedOn w:val="Fuentedeprrafopredeter"/>
-    <w:link w:val="Textocomentario"/>
-    <w:uiPriority w:val="99"/>
-    <w:semiHidden/>
-    <w:rsid w:val="00FE2FED"/>
-    <w:rPr>
-      <w:sz w:val="20"/>
-      <w:szCs w:val="20"/>
-    </w:rPr>
-  </w:style>
-  <w:style w:type="paragraph" w:styleId="Asuntodelcomentario">
-    <w:name w:val="annotation subject"/>
-    <w:basedOn w:val="Textocomentario"/>
-    <w:next w:val="Textocomentario"/>
-    <w:link w:val="AsuntodelcomentarioCar"/>
-    <w:uiPriority w:val="99"/>
-    <w:semiHidden/>
-    <w:unhideWhenUsed/>
-    <w:rsid w:val="00FE2FED"/>
-    <w:rPr>
-      <w:b/>
-      <w:bCs/>
-    </w:rPr>
-  </w:style>
-  <w:style w:type="character" w:customStyle="1" w:styleId="AsuntodelcomentarioCar">
-    <w:name w:val="Asunto del comentario Car"/>
-    <w:basedOn w:val="TextocomentarioCar"/>
-    <w:link w:val="Asuntodelcomentario"/>
-    <w:uiPriority w:val="99"/>
-    <w:semiHidden/>
-    <w:rsid w:val="00FE2FED"/>
-    <w:rPr>
-      <w:b/>
-      <w:bCs/>
-      <w:sz w:val="20"/>
-      <w:szCs w:val="20"/>
-    </w:rPr>
-  </w:style>
-  <w:style w:type="paragraph" w:styleId="Revisin">
-    <w:name w:val="Revision"/>
-    <w:hidden/>
-    <w:uiPriority w:val="99"/>
-    <w:semiHidden/>
-    <w:rsid w:val="00FE2FED"/>
-  </w:style>
-  <w:style w:type="paragraph" w:styleId="NormalWeb">
-    <w:name w:val="Normal (Web)"/>
-    <w:basedOn w:val="Normal"/>
-    <w:uiPriority w:val="99"/>
-    <w:semiHidden/>
-    <w:unhideWhenUsed/>
-    <w:rsid w:val="005436A4"/>
-    <w:pPr>
-      <w:spacing w:before="100" w:beforeAutospacing="1" w:after="100" w:afterAutospacing="1"/>
-    </w:pPr>
-    <w:rPr>
-      <w:rFonts w:ascii="Times New Roman" w:eastAsia="Times New Roman" w:hAnsi="Times New Roman" w:cs="Times New Roman"/>
-      <w:sz w:val="24"/>
-      <w:szCs w:val="24"/>
-      <w:lang w:val="es-CO"/>
-    </w:rPr>
-  </w:style>
-</w:styles>
-</file>
-
-<file path=word/stylesWithEffects.xml><?xml version="1.0" encoding="utf-8"?>
-<w:styles xmlns:wpc="http://schemas.microsoft.com/office/word/2010/wordprocessingCanvas" xmlns:mc="http://schemas.openxmlformats.org/markup-compatibility/2006" xmlns:o="urn:schemas-microsoft-com:office:office" xmlns:r="http://schemas.openxmlformats.org/officeDocument/2006/relationships" xmlns:m="http://schemas.openxmlformats.org/officeDocument/2006/math" xmlns:v="urn:schemas-microsoft-com:vml" xmlns:wp14="http://schemas.microsoft.com/office/word/2010/wordprocessingDrawing" xmlns:wp="http://schemas.openxmlformats.org/drawingml/2006/wordprocessingDrawing" xmlns:w10="urn:schemas-microsoft-com:office:word" xmlns:w="http://schemas.openxmlformats.org/wordprocessingml/2006/main" xmlns:w14="http://schemas.microsoft.com/office/word/2010/wordml" xmlns:wpg="http://schemas.microsoft.com/office/word/2010/wordprocessingGroup" xmlns:wpi="http://schemas.microsoft.com/office/word/2010/wordprocessingInk" xmlns:wne="http://schemas.microsoft.com/office/word/2006/wordml" xmlns:wps="http://schemas.microsoft.com/office/word/2010/wordprocessingShape" mc:Ignorable="w14 wp14">
-  <w:docDefaults>
-    <w:rPrDefault>
-      <w:rPr>
-        <w:rFonts w:ascii="Calibri" w:eastAsia="Calibri" w:hAnsi="Calibri" w:cs="Calibri"/>
-        <w:sz w:val="22"/>
-        <w:szCs w:val="22"/>
-        <w:lang w:val="es-ES" w:eastAsia="es-CO" w:bidi="ar-SA"/>
-      </w:rPr>
-    </w:rPrDefault>
-    <w:pPrDefault/>
-  </w:docDefaults>
-  <w:latentStyles w:defLockedState="0" w:defUIPriority="99" w:defSemiHidden="1" w:defUnhideWhenUsed="1" w:defQFormat="0" w:count="267">
-    <w:lsdException w:name="Normal" w:semiHidden="0" w:uiPriority="0" w:unhideWhenUsed="0" w:qFormat="1"/>
-    <w:lsdException w:name="heading 1" w:semiHidden="0" w:uiPriority="9" w:unhideWhenUsed="0" w:qFormat="1"/>
-    <w:lsdException w:name="heading 2" w:uiPriority="9" w:qFormat="1"/>
-    <w:lsdException w:name="heading 3" w:uiPriority="9" w:qFormat="1"/>
-    <w:lsdException w:name="heading 4" w:uiPriority="9" w:qFormat="1"/>
-    <w:lsdException w:name="heading 5" w:uiPriority="9" w:qFormat="1"/>
-    <w:lsdException w:name="heading 6" w:uiPriority="9" w:qFormat="1"/>
-    <w:lsdException w:name="heading 7" w:uiPriority="9" w:qFormat="1"/>
-    <w:lsdException w:name="heading 8" w:uiPriority="9" w:qFormat="1"/>
-    <w:lsdException w:name="heading 9" w:uiPriority="9" w:qFormat="1"/>
-    <w:lsdException w:name="toc 1" w:uiPriority="39"/>
-    <w:lsdException w:name="toc 2" w:uiPriority="39"/>
-    <w:lsdException w:name="toc 3" w:uiPriority="39"/>
-    <w:lsdException w:name="toc 4" w:uiPriority="39"/>
-    <w:lsdException w:name="toc 5" w:uiPriority="39"/>
-    <w:lsdException w:name="toc 6" w:uiPriority="39"/>
-    <w:lsdException w:name="toc 7" w:uiPriority="39"/>
-    <w:lsdException w:name="toc 8" w:uiPriority="39"/>
-    <w:lsdException w:name="toc 9" w:uiPriority="39"/>
-    <w:lsdException w:name="caption" w:uiPriority="35" w:qFormat="1"/>
-    <w:lsdException w:name="Title" w:semiHidden="0" w:uiPriority="10" w:unhideWhenUsed="0" w:qFormat="1"/>
-    <w:lsdException w:name="Default Paragraph Font" w:uiPriority="1"/>
-    <w:lsdException w:name="Subtitle" w:semiHidden="0" w:uiPriority="11" w:unhideWhenUsed="0" w:qFormat="1"/>
-    <w:lsdException w:name="Strong" w:semiHidden="0" w:uiPriority="22" w:unhideWhenUsed="0" w:qFormat="1"/>
-    <w:lsdException w:name="Emphasis" w:semiHidden="0" w:uiPriority="20" w:unhideWhenUsed="0" w:qFormat="1"/>
-    <w:lsdException w:name="Table Grid" w:semiHidden="0" w:uiPriority="39" w:unhideWhenUsed="0"/>
-    <w:lsdException w:name="Placeholder Text" w:unhideWhenUsed="0"/>
-    <w:lsdException w:name="No Spacing" w:semiHidden="0" w:uiPriority="1" w:unhideWhenUsed="0" w:qFormat="1"/>
-    <w:lsdException w:name="Light Shading" w:semiHidden="0" w:uiPriority="60" w:unhideWhenUsed="0"/>
-    <w:lsdException w:name="Light List" w:semiHidden="0" w:uiPriority="61" w:unhideWhenUsed="0"/>
-    <w:lsdException w:name="Light Grid" w:semiHidden="0" w:uiPriority="62" w:unhideWhenUsed="0"/>
-    <w:lsdException w:name="Medium Shading 1" w:semiHidden="0" w:uiPriority="63" w:unhideWhenUsed="0"/>
-    <w:lsdException w:name="Medium Shading 2" w:semiHidden="0" w:uiPriority="64" w:unhideWhenUsed="0"/>
-    <w:lsdException w:name="Medium List 1" w:semiHidden="0" w:uiPriority="65" w:unhideWhenUsed="0"/>
-    <w:lsdException w:name="Medium List 2" w:semiHidden="0" w:uiPriority="66" w:unhideWhenUsed="0"/>
-    <w:lsdException w:name="Medium Grid 1" w:semiHidden="0" w:uiPriority="67" w:unhideWhenUsed="0"/>
-    <w:lsdException w:name="Medium Grid 2" w:semiHidden="0" w:uiPriority="68" w:unhideWhenUsed="0"/>
-    <w:lsdException w:name="Medium Grid 3" w:semiHidden="0" w:uiPriority="69" w:unhideWhenUsed="0"/>
-    <w:lsdException w:name="Dark List" w:semiHidden="0" w:uiPriority="70" w:unhideWhenUsed="0"/>
-    <w:lsdException w:name="Colorful Shading" w:semiHidden="0" w:uiPriority="71" w:unhideWhenUsed="0"/>
-    <w:lsdException w:name="Colorful List" w:semiHidden="0" w:uiPriority="72" w:unhideWhenUsed="0"/>
-    <w:lsdException w:name="Colorful Grid" w:semiHidden="0" w:uiPriority="73" w:unhideWhenUsed="0"/>
-    <w:lsdException w:name="Light Shading Accent 1" w:semiHidden="0" w:uiPriority="60" w:unhideWhenUsed="0"/>
-    <w:lsdException w:name="Light List Accent 1" w:semiHidden="0" w:uiPriority="61" w:unhideWhenUsed="0"/>
-    <w:lsdException w:name="Light Grid Accent 1" w:semiHidden="0" w:uiPriority="62" w:unhideWhenUsed="0"/>
-    <w:lsdException w:name="Medium Shading 1 Accent 1" w:semiHidden="0" w:uiPriority="63" w:unhideWhenUsed="0"/>
-    <w:lsdException w:name="Medium Shading 2 Accent 1" w:semiHidden="0" w:uiPriority="64" w:unhideWhenUsed="0"/>
-    <w:lsdException w:name="Medium List 1 Accent 1" w:semiHidden="0" w:uiPriority="65" w:unhideWhenUsed="0"/>
-    <w:lsdException w:name="Revision" w:unhideWhenUsed="0"/>
-    <w:lsdException w:name="List Paragraph" w:semiHidden="0" w:uiPriority="34" w:unhideWhenUsed="0" w:qFormat="1"/>
-    <w:lsdException w:name="Quote" w:semiHidden="0" w:uiPriority="29" w:unhideWhenUsed="0" w:qFormat="1"/>
-    <w:lsdException w:name="Intense Quote" w:semiHidden="0" w:uiPriority="30" w:unhideWhenUsed="0" w:qFormat="1"/>
-    <w:lsdException w:name="Medium List 2 Accent 1" w:semiHidden="0" w:uiPriority="66" w:unhideWhenUsed="0"/>
-    <w:lsdException w:name="Medium Grid 1 Accent 1" w:semiHidden="0" w:uiPriority="67" w:unhideWhenUsed="0"/>
-    <w:lsdException w:name="Medium Grid 2 Accent 1" w:semiHidden="0" w:uiPriority="68" w:unhideWhenUsed="0"/>
-    <w:lsdException w:name="Medium Grid 3 Accent 1" w:semiHidden="0" w:uiPriority="69" w:unhideWhenUsed="0"/>
-    <w:lsdException w:name="Dark List Accent 1" w:semiHidden="0" w:uiPriority="70" w:unhideWhenUsed="0"/>
-    <w:lsdException w:name="Colorful Shading Accent 1" w:semiHidden="0" w:uiPriority="71" w:unhideWhenUsed="0"/>
-    <w:lsdException w:name="Colorful List Accent 1" w:semiHidden="0" w:uiPriority="72" w:unhideWhenUsed="0"/>
-    <w:lsdException w:name="Colorful Grid Accent 1" w:semiHidden="0" w:uiPriority="73" w:unhideWhenUsed="0"/>
-    <w:lsdException w:name="Light Shading Accent 2" w:semiHidden="0" w:uiPriority="60" w:unhideWhenUsed="0"/>
-    <w:lsdException w:name="Light List Accent 2" w:semiHidden="0" w:uiPriority="61" w:unhideWhenUsed="0"/>
-    <w:lsdException w:name="Light Grid Accent 2" w:semiHidden="0" w:uiPriority="62" w:unhideWhenUsed="0"/>
-    <w:lsdException w:name="Medium Shading 1 Accent 2" w:semiHidden="0" w:uiPriority="63" w:unhideWhenUsed="0"/>
-    <w:lsdException w:name="Medium Shading 2 Accent 2" w:semiHidden="0" w:uiPriority="64" w:unhideWhenUsed="0"/>
-    <w:lsdException w:name="Medium List 1 Accent 2" w:semiHidden="0" w:uiPriority="65" w:unhideWhenUsed="0"/>
-    <w:lsdException w:name="Medium List 2 Accent 2" w:semiHidden="0" w:uiPriority="66" w:unhideWhenUsed="0"/>
-    <w:lsdException w:name="Medium Grid 1 Accent 2" w:semiHidden="0" w:uiPriority="67" w:unhideWhenUsed="0"/>
-    <w:lsdException w:name="Medium Grid 2 Accent 2" w:semiHidden="0" w:uiPriority="68" w:unhideWhenUsed="0"/>
-    <w:lsdException w:name="Medium Grid 3 Accent 2" w:semiHidden="0" w:uiPriority="69" w:unhideWhenUsed="0"/>
-    <w:lsdException w:name="Dark List Accent 2" w:semiHidden="0" w:uiPriority="70" w:unhideWhenUsed="0"/>
-    <w:lsdException w:name="Colorful Shading Accent 2" w:semiHidden="0" w:uiPriority="71" w:unhideWhenUsed="0"/>
-    <w:lsdException w:name="Colorful List Accent 2" w:semiHidden="0" w:uiPriority="72" w:unhideWhenUsed="0"/>
-    <w:lsdException w:name="Colorful Grid Accent 2" w:semiHidden="0" w:uiPriority="73" w:unhideWhenUsed="0"/>
-    <w:lsdException w:name="Light Shading Accent 3" w:semiHidden="0" w:uiPriority="60" w:unhideWhenUsed="0"/>
-    <w:lsdException w:name="Light List Accent 3" w:semiHidden="0" w:uiPriority="61" w:unhideWhenUsed="0"/>
-    <w:lsdException w:name="Light Grid Accent 3" w:semiHidden="0" w:uiPriority="62" w:unhideWhenUsed="0"/>
-    <w:lsdException w:name="Medium Shading 1 Accent 3" w:semiHidden="0" w:uiPriority="63" w:unhideWhenUsed="0"/>
-    <w:lsdException w:name="Medium Shading 2 Accent 3" w:semiHidden="0" w:uiPriority="64" w:unhideWhenUsed="0"/>
-    <w:lsdException w:name="Medium List 1 Accent 3" w:semiHidden="0" w:uiPriority="65" w:unhideWhenUsed="0"/>
-    <w:lsdException w:name="Medium List 2 Accent 3" w:semiHidden="0" w:uiPriority="66" w:unhideWhenUsed="0"/>
-    <w:lsdException w:name="Medium Grid 1 Accent 3" w:semiHidden="0" w:uiPriority="67" w:unhideWhenUsed="0"/>
-    <w:lsdException w:name="Medium Grid 2 Accent 3" w:semiHidden="0" w:uiPriority="68" w:unhideWhenUsed="0"/>
-    <w:lsdException w:name="Medium Grid 3 Accent 3" w:semiHidden="0" w:uiPriority="69" w:unhideWhenUsed="0"/>
-    <w:lsdException w:name="Dark List Accent 3" w:semiHidden="0" w:uiPriority="70" w:unhideWhenUsed="0"/>
-    <w:lsdException w:name="Colorful Shading Accent 3" w:semiHidden="0" w:uiPriority="71" w:unhideWhenUsed="0"/>
-    <w:lsdException w:name="Colorful List Accent 3" w:semiHidden="0" w:uiPriority="72" w:unhideWhenUsed="0"/>
-    <w:lsdException w:name="Colorful Grid Accent 3" w:semiHidden="0" w:uiPriority="73" w:unhideWhenUsed="0"/>
-    <w:lsdException w:name="Light Shading Accent 4" w:semiHidden="0" w:uiPriority="60" w:unhideWhenUsed="0"/>
-    <w:lsdException w:name="Light List Accent 4" w:semiHidden="0" w:uiPriority="61" w:unhideWhenUsed="0"/>
-    <w:lsdException w:name="Light Grid Accent 4" w:semiHidden="0" w:uiPriority="62" w:unhideWhenUsed="0"/>
-    <w:lsdException w:name="Medium Shading 1 Accent 4" w:semiHidden="0" w:uiPriority="63" w:unhideWhenUsed="0"/>
-    <w:lsdException w:name="Medium Shading 2 Accent 4" w:semiHidden="0" w:uiPriority="64" w:unhideWhenUsed="0"/>
-    <w:lsdException w:name="Medium List 1 Accent 4" w:semiHidden="0" w:uiPriority="65" w:unhideWhenUsed="0"/>
-    <w:lsdException w:name="Medium List 2 Accent 4" w:semiHidden="0" w:uiPriority="66" w:unhideWhenUsed="0"/>
-    <w:lsdException w:name="Medium Grid 1 Accent 4" w:semiHidden="0" w:uiPriority="67" w:unhideWhenUsed="0"/>
-    <w:lsdException w:name="Medium Grid 2 Accent 4" w:semiHidden="0" w:uiPriority="68" w:unhideWhenUsed="0"/>
-    <w:lsdException w:name="Medium Grid 3 Accent 4" w:semiHidden="0" w:uiPriority="69" w:unhideWhenUsed="0"/>
-    <w:lsdException w:name="Dark List Accent 4" w:semiHidden="0" w:uiPriority="70" w:unhideWhenUsed="0"/>
-    <w:lsdException w:name="Colorful Shading Accent 4" w:semiHidden="0" w:uiPriority="71" w:unhideWhenUsed="0"/>
-    <w:lsdException w:name="Colorful List Accent 4" w:semiHidden="0" w:uiPriority="72" w:unhideWhenUsed="0"/>
-    <w:lsdException w:name="Colorful Grid Accent 4" w:semiHidden="0" w:uiPriority="73" w:unhideWhenUsed="0"/>
-    <w:lsdException w:name="Light Shading Accent 5" w:semiHidden="0" w:uiPriority="60" w:unhideWhenUsed="0"/>
-    <w:lsdException w:name="Light List Accent 5" w:semiHidden="0" w:uiPriority="61" w:unhideWhenUsed="0"/>
-    <w:lsdException w:name="Light Grid Accent 5" w:semiHidden="0" w:uiPriority="62" w:unhideWhenUsed="0"/>
-    <w:lsdException w:name="Medium Shading 1 Accent 5" w:semiHidden="0" w:uiPriority="63" w:unhideWhenUsed="0"/>
-    <w:lsdException w:name="Medium Shading 2 Accent 5" w:semiHidden="0" w:uiPriority="64" w:unhideWhenUsed="0"/>
-    <w:lsdException w:name="Medium List 1 Accent 5" w:semiHidden="0" w:uiPriority="65" w:unhideWhenUsed="0"/>
-    <w:lsdException w:name="Medium List 2 Accent 5" w:semiHidden="0" w:uiPriority="66" w:unhideWhenUsed="0"/>
-    <w:lsdException w:name="Medium Grid 1 Accent 5" w:semiHidden="0" w:uiPriority="67" w:unhideWhenUsed="0"/>
-    <w:lsdException w:name="Medium Grid 2 Accent 5" w:semiHidden="0" w:uiPriority="68" w:unhideWhenUsed="0"/>
-    <w:lsdException w:name="Medium Grid 3 Accent 5" w:semiHidden="0" w:uiPriority="69" w:unhideWhenUsed="0"/>
-    <w:lsdException w:name="Dark List Accent 5" w:semiHidden="0" w:uiPriority="70" w:unhideWhenUsed="0"/>
-    <w:lsdException w:name="Colorful Shading Accent 5" w:semiHidden="0" w:uiPriority="71" w:unhideWhenUsed="0"/>
-    <w:lsdException w:name="Colorful List Accent 5" w:semiHidden="0" w:uiPriority="72" w:unhideWhenUsed="0"/>
-    <w:lsdException w:name="Colorful Grid Accent 5" w:semiHidden="0" w:uiPriority="73" w:unhideWhenUsed="0"/>
-    <w:lsdException w:name="Light Shading Accent 6" w:semiHidden="0" w:uiPriority="60" w:unhideWhenUsed="0"/>
-    <w:lsdException w:name="Light List Accent 6" w:semiHidden="0" w:uiPriority="61" w:unhideWhenUsed="0"/>
-    <w:lsdException w:name="Light Grid Accent 6" w:semiHidden="0" w:uiPriority="62" w:unhideWhenUsed="0"/>
-    <w:lsdException w:name="Medium Shading 1 Accent 6" w:semiHidden="0" w:uiPriority="63" w:unhideWhenUsed="0"/>
-    <w:lsdException w:name="Medium Shading 2 Accent 6" w:semiHidden="0" w:uiPriority="64" w:unhideWhenUsed="0"/>
-    <w:lsdException w:name="Medium List 1 Accent 6" w:semiHidden="0" w:uiPriority="65" w:unhideWhenUsed="0"/>
-    <w:lsdException w:name="Medium List 2 Accent 6" w:semiHidden="0" w:uiPriority="66" w:unhideWhenUsed="0"/>
-    <w:lsdException w:name="Medium Grid 1 Accent 6" w:semiHidden="0" w:uiPriority="67" w:unhideWhenUsed="0"/>
-    <w:lsdException w:name="Medium Grid 2 Accent 6" w:semiHidden="0" w:uiPriority="68" w:unhideWhenUsed="0"/>
-    <w:lsdException w:name="Medium Grid 3 Accent 6" w:semiHidden="0" w:uiPriority="69" w:unhideWhenUsed="0"/>
-    <w:lsdException w:name="Dark List Accent 6" w:semiHidden="0" w:uiPriority="70" w:unhideWhenUsed="0"/>
-    <w:lsdException w:name="Colorful Shading Accent 6" w:semiHidden="0" w:uiPriority="71" w:unhideWhenUsed="0"/>
-    <w:lsdException w:name="Colorful List Accent 6" w:semiHidden="0" w:uiPriority="72" w:unhideWhenUsed="0"/>
-    <w:lsdException w:name="Colorful Grid Accent 6" w:semiHidden="0" w:uiPriority="73" w:unhideWhenUsed="0"/>
-    <w:lsdException w:name="Subtle Emphasis" w:semiHidden="0" w:uiPriority="19" w:unhideWhenUsed="0" w:qFormat="1"/>
-    <w:lsdException w:name="Intense Emphasis" w:semiHidden="0" w:uiPriority="21" w:unhideWhenUsed="0" w:qFormat="1"/>
-    <w:lsdException w:name="Subtle Reference" w:semiHidden="0" w:uiPriority="31" w:unhideWhenUsed="0" w:qFormat="1"/>
-    <w:lsdException w:name="Intense Reference" w:semiHidden="0" w:uiPriority="32" w:unhideWhenUsed="0" w:qFormat="1"/>
-    <w:lsdException w:name="Book Title" w:semiHidden="0" w:uiPriority="33" w:unhideWhenUsed="0" w:qFormat="1"/>
-    <w:lsdException w:name="Bibliography" w:uiPriority="37"/>
-    <w:lsdException w:name="TOC Heading" w:uiPriority="39" w:qFormat="1"/>
-  </w:latentStyles>
-  <w:style w:type="paragraph" w:default="1" w:styleId="Normal">
-    <w:name w:val="Normal"/>
-    <w:qFormat/>
-  </w:style>
-  <w:style w:type="paragraph" w:styleId="Ttulo1">
-    <w:name w:val="heading 1"/>
-    <w:basedOn w:val="Normal"/>
-    <w:next w:val="Normal"/>
-    <w:uiPriority w:val="9"/>
-    <w:qFormat/>
-    <w:pPr>
-      <w:keepNext/>
-      <w:ind w:left="502" w:hanging="360"/>
-      <w:jc w:val="both"/>
-      <w:outlineLvl w:val="0"/>
-    </w:pPr>
-    <w:rPr>
-      <w:rFonts w:ascii="Arial" w:eastAsia="Arial" w:hAnsi="Arial" w:cs="Arial"/>
-      <w:b/>
-      <w:sz w:val="24"/>
-      <w:szCs w:val="24"/>
-    </w:rPr>
-  </w:style>
-  <w:style w:type="paragraph" w:styleId="Ttulo2">
-    <w:name w:val="heading 2"/>
-    <w:basedOn w:val="Normal"/>
-    <w:next w:val="Normal"/>
-    <w:uiPriority w:val="9"/>
-    <w:semiHidden/>
-    <w:unhideWhenUsed/>
-    <w:qFormat/>
-    <w:pPr>
-      <w:keepNext/>
-      <w:widowControl w:val="0"/>
-      <w:tabs>
-        <w:tab w:val="left" w:pos="0"/>
-        <w:tab w:val="center" w:pos="4680"/>
-      </w:tabs>
-      <w:ind w:left="142"/>
-      <w:outlineLvl w:val="1"/>
-    </w:pPr>
-    <w:rPr>
-      <w:rFonts w:ascii="Arial" w:eastAsia="Arial" w:hAnsi="Arial" w:cs="Arial"/>
-      <w:sz w:val="26"/>
-      <w:szCs w:val="26"/>
-    </w:rPr>
-  </w:style>
-  <w:style w:type="paragraph" w:styleId="Ttulo3">
-    <w:name w:val="heading 3"/>
-    <w:basedOn w:val="Normal"/>
-    <w:next w:val="Normal"/>
-    <w:uiPriority w:val="9"/>
-    <w:semiHidden/>
-    <w:unhideWhenUsed/>
-    <w:qFormat/>
-    <w:pPr>
-      <w:keepNext/>
-      <w:widowControl w:val="0"/>
-      <w:tabs>
-        <w:tab w:val="left" w:pos="0"/>
-      </w:tabs>
-      <w:ind w:left="567"/>
-      <w:jc w:val="both"/>
-      <w:outlineLvl w:val="2"/>
-    </w:pPr>
-    <w:rPr>
-      <w:rFonts w:ascii="Arial" w:eastAsia="Arial" w:hAnsi="Arial" w:cs="Arial"/>
-      <w:sz w:val="26"/>
-      <w:szCs w:val="26"/>
-    </w:rPr>
-  </w:style>
-  <w:style w:type="paragraph" w:styleId="Ttulo4">
-    <w:name w:val="heading 4"/>
-    <w:basedOn w:val="Normal"/>
-    <w:next w:val="Normal"/>
-    <w:uiPriority w:val="9"/>
-    <w:semiHidden/>
-    <w:unhideWhenUsed/>
-    <w:qFormat/>
-    <w:pPr>
-      <w:keepNext/>
-      <w:tabs>
-        <w:tab w:val="left" w:pos="0"/>
-        <w:tab w:val="left" w:pos="1134"/>
-      </w:tabs>
-      <w:ind w:left="2662" w:hanging="360"/>
-      <w:jc w:val="both"/>
-      <w:outlineLvl w:val="3"/>
-    </w:pPr>
-    <w:rPr>
-      <w:rFonts w:ascii="Times New Roman" w:eastAsia="Times New Roman" w:hAnsi="Times New Roman" w:cs="Times New Roman"/>
-      <w:sz w:val="24"/>
-      <w:szCs w:val="24"/>
-    </w:rPr>
-  </w:style>
-  <w:style w:type="paragraph" w:styleId="Ttulo5">
-    <w:name w:val="heading 5"/>
-    <w:basedOn w:val="Normal"/>
-    <w:next w:val="Normal"/>
-    <w:uiPriority w:val="9"/>
-    <w:semiHidden/>
-    <w:unhideWhenUsed/>
-    <w:qFormat/>
-    <w:pPr>
-      <w:keepNext/>
-      <w:tabs>
-        <w:tab w:val="left" w:pos="0"/>
-      </w:tabs>
-      <w:spacing w:line="480" w:lineRule="auto"/>
-      <w:ind w:left="3382" w:hanging="360"/>
-      <w:jc w:val="both"/>
-      <w:outlineLvl w:val="4"/>
-    </w:pPr>
-    <w:rPr>
-      <w:rFonts w:ascii="Arial" w:eastAsia="Arial" w:hAnsi="Arial" w:cs="Arial"/>
-      <w:i/>
-      <w:sz w:val="28"/>
-      <w:szCs w:val="28"/>
-    </w:rPr>
-  </w:style>
-  <w:style w:type="paragraph" w:styleId="Ttulo6">
-    <w:name w:val="heading 6"/>
-    <w:basedOn w:val="Normal"/>
-    <w:next w:val="Normal"/>
-    <w:uiPriority w:val="9"/>
-    <w:semiHidden/>
-    <w:unhideWhenUsed/>
-    <w:qFormat/>
-    <w:pPr>
-      <w:spacing w:before="240" w:after="60"/>
-      <w:ind w:left="4102" w:hanging="180"/>
-      <w:outlineLvl w:val="5"/>
-    </w:pPr>
-    <w:rPr>
-      <w:rFonts w:ascii="Times New Roman" w:eastAsia="Times New Roman" w:hAnsi="Times New Roman" w:cs="Times New Roman"/>
-      <w:b/>
-      <w:sz w:val="20"/>
-      <w:szCs w:val="20"/>
-    </w:rPr>
-  </w:style>
-  <w:style w:type="character" w:default="1" w:styleId="Fuentedeprrafopredeter">
-    <w:name w:val="Default Paragraph Font"/>
-    <w:uiPriority w:val="1"/>
-    <w:semiHidden/>
-    <w:unhideWhenUsed/>
-  </w:style>
-  <w:style w:type="table" w:default="1" w:styleId="Tablanormal">
-    <w:name w:val="Normal Table"/>
-    <w:uiPriority w:val="99"/>
-    <w:semiHidden/>
-    <w:unhideWhenUsed/>
-    <w:tblPr>
-      <w:tblInd w:w="0" w:type="dxa"/>
-      <w:tblCellMar>
-        <w:top w:w="0" w:type="dxa"/>
-        <w:left w:w="108" w:type="dxa"/>
-        <w:bottom w:w="0" w:type="dxa"/>
-        <w:right w:w="108" w:type="dxa"/>
-      </w:tblCellMar>
-    </w:tblPr>
-  </w:style>
-  <w:style w:type="numbering" w:default="1" w:styleId="Sinlista">
-    <w:name w:val="No List"/>
-    <w:uiPriority w:val="99"/>
-    <w:semiHidden/>
-    <w:unhideWhenUsed/>
-  </w:style>
-  <w:style w:type="table" w:customStyle="1" w:styleId="TableNormal">
-    <w:name w:val="Table Normal"/>
-    <w:tblPr>
-      <w:tblCellMar>
-        <w:top w:w="0" w:type="dxa"/>
-        <w:left w:w="0" w:type="dxa"/>
-        <w:bottom w:w="0" w:type="dxa"/>
-        <w:right w:w="0" w:type="dxa"/>
-      </w:tblCellMar>
-    </w:tblPr>
-  </w:style>
-  <w:style w:type="paragraph" w:styleId="Ttulo">
-    <w:name w:val="Title"/>
-    <w:basedOn w:val="Normal"/>
-    <w:next w:val="Normal"/>
-    <w:uiPriority w:val="10"/>
-    <w:qFormat/>
-    <w:pPr>
-      <w:keepNext/>
-      <w:keepLines/>
-      <w:spacing w:before="480" w:after="120"/>
-    </w:pPr>
-    <w:rPr>
-      <w:b/>
-      <w:sz w:val="72"/>
-      <w:szCs w:val="72"/>
-    </w:rPr>
-  </w:style>
-  <w:style w:type="paragraph" w:styleId="Subttulo">
-    <w:name w:val="Subtitle"/>
-    <w:basedOn w:val="Normal"/>
-    <w:next w:val="Normal"/>
-    <w:uiPriority w:val="11"/>
-    <w:qFormat/>
-    <w:pPr>
-      <w:keepNext/>
-      <w:keepLines/>
-      <w:spacing w:before="360" w:after="80"/>
-    </w:pPr>
-    <w:rPr>
-      <w:rFonts w:ascii="Georgia" w:eastAsia="Georgia" w:hAnsi="Georgia" w:cs="Georgia"/>
-      <w:i/>
-      <w:color w:val="666666"/>
-      <w:sz w:val="48"/>
-      <w:szCs w:val="48"/>
-    </w:rPr>
-  </w:style>
-  <w:style w:type="table" w:customStyle="1" w:styleId="a">
-    <w:basedOn w:val="TableNormal"/>
-    <w:rPr>
-      <w:rFonts w:ascii="Times New Roman" w:eastAsia="Times New Roman" w:hAnsi="Times New Roman" w:cs="Times New Roman"/>
-    </w:rPr>
-    <w:tblPr>
-      <w:tblStyleRowBandSize w:val="1"/>
-      <w:tblStyleColBandSize w:val="1"/>
-      <w:tblCellMar>
-        <w:top w:w="0" w:type="dxa"/>
-        <w:left w:w="108" w:type="dxa"/>
-        <w:bottom w:w="0" w:type="dxa"/>
-        <w:right w:w="108" w:type="dxa"/>
-      </w:tblCellMar>
-    </w:tblPr>
-  </w:style>
-  <w:style w:type="table" w:customStyle="1" w:styleId="a0">
-    <w:basedOn w:val="TableNormal"/>
-    <w:rPr>
-      <w:rFonts w:ascii="Times New Roman" w:eastAsia="Times New Roman" w:hAnsi="Times New Roman" w:cs="Times New Roman"/>
-    </w:rPr>
-    <w:tblPr>
-      <w:tblStyleRowBandSize w:val="1"/>
-      <w:tblStyleColBandSize w:val="1"/>
-      <w:tblCellMar>
-        <w:top w:w="0" w:type="dxa"/>
-        <w:left w:w="108" w:type="dxa"/>
-        <w:bottom w:w="0" w:type="dxa"/>
-        <w:right w:w="108" w:type="dxa"/>
-      </w:tblCellMar>
-    </w:tblPr>
-  </w:style>
-  <w:style w:type="table" w:customStyle="1" w:styleId="a1">
-    <w:basedOn w:val="TableNormal"/>
-    <w:tblPr>
-      <w:tblStyleRowBandSize w:val="1"/>
-      <w:tblStyleColBandSize w:val="1"/>
-      <w:tblCellMar>
-        <w:top w:w="0" w:type="dxa"/>
-        <w:left w:w="115" w:type="dxa"/>
-        <w:bottom w:w="0" w:type="dxa"/>
-        <w:right w:w="115" w:type="dxa"/>
-      </w:tblCellMar>
-    </w:tblPr>
-  </w:style>
-  <w:style w:type="table" w:customStyle="1" w:styleId="a2">
-    <w:basedOn w:val="TableNormal"/>
-    <w:tblPr>
-      <w:tblStyleRowBandSize w:val="1"/>
-      <w:tblStyleColBandSize w:val="1"/>
-      <w:tblCellMar>
-        <w:top w:w="0" w:type="dxa"/>
-        <w:left w:w="115" w:type="dxa"/>
-        <w:bottom w:w="0" w:type="dxa"/>
-        <w:right w:w="115" w:type="dxa"/>
-      </w:tblCellMar>
-    </w:tblPr>
-  </w:style>
-  <w:style w:type="paragraph" w:styleId="Encabezado">
-    <w:name w:val="header"/>
-    <w:basedOn w:val="Normal"/>
-    <w:link w:val="EncabezadoCar"/>
-    <w:uiPriority w:val="99"/>
-    <w:unhideWhenUsed/>
-    <w:rsid w:val="005D2878"/>
-    <w:pPr>
-      <w:tabs>
-        <w:tab w:val="center" w:pos="4419"/>
-        <w:tab w:val="right" w:pos="8838"/>
-      </w:tabs>
-    </w:pPr>
-  </w:style>
-  <w:style w:type="character" w:customStyle="1" w:styleId="EncabezadoCar">
-    <w:name w:val="Encabezado Car"/>
-    <w:basedOn w:val="Fuentedeprrafopredeter"/>
-    <w:link w:val="Encabezado"/>
-    <w:uiPriority w:val="99"/>
-    <w:rsid w:val="005D2878"/>
-  </w:style>
-  <w:style w:type="paragraph" w:styleId="Piedepgina">
-    <w:name w:val="footer"/>
-    <w:basedOn w:val="Normal"/>
-    <w:link w:val="PiedepginaCar"/>
-    <w:uiPriority w:val="99"/>
-    <w:unhideWhenUsed/>
-    <w:rsid w:val="005D2878"/>
-    <w:pPr>
-      <w:tabs>
-        <w:tab w:val="center" w:pos="4419"/>
-        <w:tab w:val="right" w:pos="8838"/>
-      </w:tabs>
-    </w:pPr>
-  </w:style>
-  <w:style w:type="character" w:customStyle="1" w:styleId="PiedepginaCar">
-    <w:name w:val="Pie de página Car"/>
-    <w:basedOn w:val="Fuentedeprrafopredeter"/>
-    <w:link w:val="Piedepgina"/>
-    <w:uiPriority w:val="99"/>
-    <w:rsid w:val="005D2878"/>
-  </w:style>
-  <w:style w:type="table" w:styleId="Tablaconcuadrcula">
-    <w:name w:val="Table Grid"/>
-    <w:basedOn w:val="Tablanormal"/>
-    <w:uiPriority w:val="39"/>
-    <w:rsid w:val="00AB773A"/>
-    <w:tblPr>
-      <w:tblInd w:w="0" w:type="dxa"/>
-      <w:tblBorders>
-        <w:top w:val="single" w:sz="4" w:space="0" w:color="auto"/>
-        <w:left w:val="single" w:sz="4" w:space="0" w:color="auto"/>
-        <w:bottom w:val="single" w:sz="4" w:space="0" w:color="auto"/>
-        <w:right w:val="single" w:sz="4" w:space="0" w:color="auto"/>
-        <w:insideH w:val="single" w:sz="4" w:space="0" w:color="auto"/>
-        <w:insideV w:val="single" w:sz="4" w:space="0" w:color="auto"/>
-      </w:tblBorders>
-      <w:tblCellMar>
-        <w:top w:w="0" w:type="dxa"/>
-        <w:left w:w="108" w:type="dxa"/>
-        <w:bottom w:w="0" w:type="dxa"/>
-        <w:right w:w="108" w:type="dxa"/>
-      </w:tblCellMar>
     </w:tblPr>
   </w:style>
   <w:style w:type="paragraph" w:styleId="Textodeglobo">

</xml_diff>

<commit_message>
Actualizacion de plantillas de modificacion y limpieza de temporales
</commit_message>
<xml_diff>
--- a/plantillas/MODIFICACION_1_JUSTIFICACION.docx
+++ b/plantillas/MODIFICACION_1_JUSTIFICACION.docx
@@ -1,6 +1,6 @@
 
 <file path=word/document.xml><?xml version="1.0" encoding="utf-8"?>
-<w:document xmlns:wpc="http://schemas.microsoft.com/office/word/2010/wordprocessingCanvas" xmlns:cx="http://schemas.microsoft.com/office/drawing/2014/chartex" xmlns:cx1="http://schemas.microsoft.com/office/drawing/2015/9/8/chartex" xmlns:cx2="http://schemas.microsoft.com/office/drawing/2015/10/21/chartex" xmlns:cx3="http://schemas.microsoft.com/office/drawing/2016/5/9/chartex" xmlns:cx4="http://schemas.microsoft.com/office/drawing/2016/5/10/chartex" xmlns:cx5="http://schemas.microsoft.com/office/drawing/2016/5/11/chartex" xmlns:cx6="http://schemas.microsoft.com/office/drawing/2016/5/12/chartex" xmlns:cx7="http://schemas.microsoft.com/office/drawing/2016/5/13/chartex" xmlns:cx8="http://schemas.microsoft.com/office/drawing/2016/5/14/chartex" xmlns:mc="http://schemas.openxmlformats.org/markup-compatibility/2006" xmlns:aink="http://schemas.microsoft.com/office/drawing/2016/ink" xmlns:am3d="http://schemas.microsoft.com/office/drawing/2017/model3d" xmlns:o="urn:schemas-microsoft-com:office:office" xmlns:r="http://schemas.openxmlformats.org/officeDocument/2006/relationships" xmlns:m="http://schemas.openxmlformats.org/officeDocument/2006/math" xmlns:v="urn:schemas-microsoft-com:vml" xmlns:wp14="http://schemas.microsoft.com/office/word/2010/wordprocessingDrawing" xmlns:wp="http://schemas.openxmlformats.org/drawingml/2006/wordprocessingDrawing" xmlns:w10="urn:schemas-microsoft-com:office:word" xmlns:w="http://schemas.openxmlformats.org/wordprocessingml/2006/main" xmlns:w14="http://schemas.microsoft.com/office/word/2010/wordml" xmlns:w15="http://schemas.microsoft.com/office/word/2012/wordml" xmlns:w16cex="http://schemas.microsoft.com/office/word/2018/wordml/cex" xmlns:w16cid="http://schemas.microsoft.com/office/word/2016/wordml/cid" xmlns:w16="http://schemas.microsoft.com/office/word/2018/wordml" xmlns:w16sdtdh="http://schemas.microsoft.com/office/word/2020/wordml/sdtdatahash" xmlns:w16se="http://schemas.microsoft.com/office/word/2015/wordml/symex" xmlns:wpg="http://schemas.microsoft.com/office/word/2010/wordprocessingGroup" xmlns:wpi="http://schemas.microsoft.com/office/word/2010/wordprocessingInk" xmlns:wne="http://schemas.microsoft.com/office/word/2006/wordml" xmlns:wps="http://schemas.microsoft.com/office/word/2010/wordprocessingShape" mc:Ignorable="w14 w15 w16se w16cid w16 w16cex w16sdtdh wp14">
+<w:document xmlns:wpc="http://schemas.microsoft.com/office/word/2010/wordprocessingCanvas" xmlns:cx="http://schemas.microsoft.com/office/drawing/2014/chartex" xmlns:cx1="http://schemas.microsoft.com/office/drawing/2015/9/8/chartex" xmlns:cx2="http://schemas.microsoft.com/office/drawing/2015/10/21/chartex" xmlns:cx3="http://schemas.microsoft.com/office/drawing/2016/5/9/chartex" xmlns:cx4="http://schemas.microsoft.com/office/drawing/2016/5/10/chartex" xmlns:cx5="http://schemas.microsoft.com/office/drawing/2016/5/11/chartex" xmlns:cx6="http://schemas.microsoft.com/office/drawing/2016/5/12/chartex" xmlns:cx7="http://schemas.microsoft.com/office/drawing/2016/5/13/chartex" xmlns:cx8="http://schemas.microsoft.com/office/drawing/2016/5/14/chartex" xmlns:mc="http://schemas.openxmlformats.org/markup-compatibility/2006" xmlns:aink="http://schemas.microsoft.com/office/drawing/2016/ink" xmlns:am3d="http://schemas.microsoft.com/office/drawing/2017/model3d" xmlns:o="urn:schemas-microsoft-com:office:office" xmlns:oel="http://schemas.microsoft.com/office/2019/extlst" xmlns:r="http://schemas.openxmlformats.org/officeDocument/2006/relationships" xmlns:m="http://schemas.openxmlformats.org/officeDocument/2006/math" xmlns:v="urn:schemas-microsoft-com:vml" xmlns:wp14="http://schemas.microsoft.com/office/word/2010/wordprocessingDrawing" xmlns:wp="http://schemas.openxmlformats.org/drawingml/2006/wordprocessingDrawing" xmlns:w10="urn:schemas-microsoft-com:office:word" xmlns:w="http://schemas.openxmlformats.org/wordprocessingml/2006/main" xmlns:w14="http://schemas.microsoft.com/office/word/2010/wordml" xmlns:w15="http://schemas.microsoft.com/office/word/2012/wordml" xmlns:w16cex="http://schemas.microsoft.com/office/word/2018/wordml/cex" xmlns:w16cid="http://schemas.microsoft.com/office/word/2016/wordml/cid" xmlns:w16="http://schemas.microsoft.com/office/word/2018/wordml" xmlns:w16du="http://schemas.microsoft.com/office/word/2023/wordml/word16du" xmlns:w16sdtdh="http://schemas.microsoft.com/office/word/2020/wordml/sdtdatahash" xmlns:w16sdtfl="http://schemas.microsoft.com/office/word/2024/wordml/sdtformatlock" xmlns:w16se="http://schemas.microsoft.com/office/word/2015/wordml/symex" xmlns:wpg="http://schemas.microsoft.com/office/word/2010/wordprocessingGroup" xmlns:wpi="http://schemas.microsoft.com/office/word/2010/wordprocessingInk" xmlns:wne="http://schemas.microsoft.com/office/word/2006/wordml" xmlns:wps="http://schemas.microsoft.com/office/word/2010/wordprocessingShape" mc:Ignorable="w14 w15 w16se w16cid w16 w16cex w16sdtdh w16sdtfl w16du wp14">
   <w:body>
     <w:tbl>
       <w:tblPr>
@@ -2826,7 +2826,27 @@
                 <w:szCs w:val="24"/>
                 <w:lang w:val="es-CO"/>
               </w:rPr>
-              <w:t xml:space="preserve"> y en consecuencia adicionar el valor del mismo por la suma </w:t>
+              <w:t xml:space="preserve"> y en consecuencia adicionar el valor del mismo por la suma</w:t>
+            </w:r>
+            <w:r>
+              <w:rPr>
+                <w:rFonts w:ascii="Arial" w:hAnsi="Arial" w:cs="Arial"/>
+                <w:color w:val="000000"/>
+                <w:sz w:val="24"/>
+                <w:szCs w:val="24"/>
+                <w:lang w:val="es-CO"/>
+              </w:rPr>
+              <w:t xml:space="preserve"> de</w:t>
+            </w:r>
+            <w:r>
+              <w:rPr>
+                <w:rFonts w:ascii="Arial" w:hAnsi="Arial" w:cs="Arial"/>
+                <w:color w:val="000000"/>
+                <w:sz w:val="24"/>
+                <w:szCs w:val="24"/>
+                <w:lang w:val="es-CO"/>
+              </w:rPr>
+              <w:t xml:space="preserve"> </w:t>
             </w:r>
             <w:r>
               <w:rPr>
@@ -2880,7 +2900,7 @@
                 <w:szCs w:val="24"/>
                 <w:lang w:val="es-CO"/>
               </w:rPr>
-              <w:t xml:space="preserve"> suma que </w:t>
+              <w:t xml:space="preserve"> suma </w:t>
             </w:r>
             <w:r>
               <w:rPr>
@@ -2891,7 +2911,7 @@
                 <w:lang w:val="es-CO"/>
               </w:rPr>
               <w:lastRenderedPageBreak/>
-              <w:t>no excede el 50% del valor inicial del: contrato, en cumplimiento del parágrafo del Artículo 40 de la Ley 80 de 1993, que establece la posibilidad de adicionar los contratos sin exceder el cincuenta por ciento (50%) del valor del contrato inicial.</w:t>
+              <w:t>que no excede el 50% del valor inicial del: contrato, en cumplimiento del parágrafo del Artículo 40 de la Ley 80 de 1993, que establece la posibilidad de adicionar los contratos sin exceder el cincuenta por ciento (50%) del valor del contrato inicial.</w:t>
             </w:r>
           </w:p>
           <w:p>
@@ -3791,7 +3811,14 @@
               <w:rPr>
                 <w:rFonts w:ascii="Arial" w:eastAsia="Arial" w:hAnsi="Arial" w:cs="Arial"/>
               </w:rPr>
-              <w:t xml:space="preserve"> contrato de </w:t>
+              <w:t xml:space="preserve"> contrato </w:t>
+            </w:r>
+            <w:proofErr w:type="gramStart"/>
+            <w:r>
+              <w:rPr>
+                <w:rFonts w:ascii="Arial" w:eastAsia="Arial" w:hAnsi="Arial" w:cs="Arial"/>
+              </w:rPr>
+              <w:t xml:space="preserve">de </w:t>
             </w:r>
             <w:r>
               <w:rPr>
@@ -3804,7 +3831,15 @@
                 <w:rFonts w:ascii="Arial" w:eastAsia="Arial" w:hAnsi="Arial" w:cs="Arial"/>
                 <w:highlight w:val="yellow"/>
               </w:rPr>
-              <w:t>{{TIPO_CONTRATO}}</w:t>
+              <w:t>{</w:t>
+            </w:r>
+            <w:proofErr w:type="gramEnd"/>
+            <w:r>
+              <w:rPr>
+                <w:rFonts w:ascii="Arial" w:eastAsia="Arial" w:hAnsi="Arial" w:cs="Arial"/>
+                <w:highlight w:val="yellow"/>
+              </w:rPr>
+              <w:t>{TIPO_CONTRATO}}</w:t>
             </w:r>
             <w:r>
               <w:rPr>
@@ -3842,6 +3877,12 @@
                 <w:rFonts w:ascii="Arial" w:eastAsia="Arial" w:hAnsi="Arial" w:cs="Arial"/>
               </w:rPr>
               <w:t xml:space="preserve"> y en consecuencia adicionar el valor del mismo por la suma</w:t>
+            </w:r>
+            <w:r>
+              <w:rPr>
+                <w:rFonts w:ascii="Arial" w:eastAsia="Arial" w:hAnsi="Arial" w:cs="Arial"/>
+              </w:rPr>
+              <w:t xml:space="preserve"> de</w:t>
             </w:r>
             <w:r>
               <w:rPr>
@@ -4096,7 +4137,7 @@
 </file>
 
 <file path=word/endnotes.xml><?xml version="1.0" encoding="utf-8"?>
-<w:endnotes xmlns:wpc="http://schemas.microsoft.com/office/word/2010/wordprocessingCanvas" xmlns:cx="http://schemas.microsoft.com/office/drawing/2014/chartex" xmlns:cx1="http://schemas.microsoft.com/office/drawing/2015/9/8/chartex" xmlns:cx2="http://schemas.microsoft.com/office/drawing/2015/10/21/chartex" xmlns:cx3="http://schemas.microsoft.com/office/drawing/2016/5/9/chartex" xmlns:cx4="http://schemas.microsoft.com/office/drawing/2016/5/10/chartex" xmlns:cx5="http://schemas.microsoft.com/office/drawing/2016/5/11/chartex" xmlns:cx6="http://schemas.microsoft.com/office/drawing/2016/5/12/chartex" xmlns:cx7="http://schemas.microsoft.com/office/drawing/2016/5/13/chartex" xmlns:cx8="http://schemas.microsoft.com/office/drawing/2016/5/14/chartex" xmlns:mc="http://schemas.openxmlformats.org/markup-compatibility/2006" xmlns:aink="http://schemas.microsoft.com/office/drawing/2016/ink" xmlns:am3d="http://schemas.microsoft.com/office/drawing/2017/model3d" xmlns:o="urn:schemas-microsoft-com:office:office" xmlns:r="http://schemas.openxmlformats.org/officeDocument/2006/relationships" xmlns:m="http://schemas.openxmlformats.org/officeDocument/2006/math" xmlns:v="urn:schemas-microsoft-com:vml" xmlns:wp14="http://schemas.microsoft.com/office/word/2010/wordprocessingDrawing" xmlns:wp="http://schemas.openxmlformats.org/drawingml/2006/wordprocessingDrawing" xmlns:w10="urn:schemas-microsoft-com:office:word" xmlns:w="http://schemas.openxmlformats.org/wordprocessingml/2006/main" xmlns:w14="http://schemas.microsoft.com/office/word/2010/wordml" xmlns:w15="http://schemas.microsoft.com/office/word/2012/wordml" xmlns:w16cex="http://schemas.microsoft.com/office/word/2018/wordml/cex" xmlns:w16cid="http://schemas.microsoft.com/office/word/2016/wordml/cid" xmlns:w16="http://schemas.microsoft.com/office/word/2018/wordml" xmlns:w16sdtdh="http://schemas.microsoft.com/office/word/2020/wordml/sdtdatahash" xmlns:w16se="http://schemas.microsoft.com/office/word/2015/wordml/symex" xmlns:wpg="http://schemas.microsoft.com/office/word/2010/wordprocessingGroup" xmlns:wpi="http://schemas.microsoft.com/office/word/2010/wordprocessingInk" xmlns:wne="http://schemas.microsoft.com/office/word/2006/wordml" xmlns:wps="http://schemas.microsoft.com/office/word/2010/wordprocessingShape" mc:Ignorable="w14 w15 w16se w16cid w16 w16cex w16sdtdh wp14">
+<w:endnotes xmlns:wpc="http://schemas.microsoft.com/office/word/2010/wordprocessingCanvas" xmlns:cx="http://schemas.microsoft.com/office/drawing/2014/chartex" xmlns:cx1="http://schemas.microsoft.com/office/drawing/2015/9/8/chartex" xmlns:cx2="http://schemas.microsoft.com/office/drawing/2015/10/21/chartex" xmlns:cx3="http://schemas.microsoft.com/office/drawing/2016/5/9/chartex" xmlns:cx4="http://schemas.microsoft.com/office/drawing/2016/5/10/chartex" xmlns:cx5="http://schemas.microsoft.com/office/drawing/2016/5/11/chartex" xmlns:cx6="http://schemas.microsoft.com/office/drawing/2016/5/12/chartex" xmlns:cx7="http://schemas.microsoft.com/office/drawing/2016/5/13/chartex" xmlns:cx8="http://schemas.microsoft.com/office/drawing/2016/5/14/chartex" xmlns:mc="http://schemas.openxmlformats.org/markup-compatibility/2006" xmlns:aink="http://schemas.microsoft.com/office/drawing/2016/ink" xmlns:am3d="http://schemas.microsoft.com/office/drawing/2017/model3d" xmlns:o="urn:schemas-microsoft-com:office:office" xmlns:oel="http://schemas.microsoft.com/office/2019/extlst" xmlns:r="http://schemas.openxmlformats.org/officeDocument/2006/relationships" xmlns:m="http://schemas.openxmlformats.org/officeDocument/2006/math" xmlns:v="urn:schemas-microsoft-com:vml" xmlns:wp14="http://schemas.microsoft.com/office/word/2010/wordprocessingDrawing" xmlns:wp="http://schemas.openxmlformats.org/drawingml/2006/wordprocessingDrawing" xmlns:w10="urn:schemas-microsoft-com:office:word" xmlns:w="http://schemas.openxmlformats.org/wordprocessingml/2006/main" xmlns:w14="http://schemas.microsoft.com/office/word/2010/wordml" xmlns:w15="http://schemas.microsoft.com/office/word/2012/wordml" xmlns:w16cex="http://schemas.microsoft.com/office/word/2018/wordml/cex" xmlns:w16cid="http://schemas.microsoft.com/office/word/2016/wordml/cid" xmlns:w16="http://schemas.microsoft.com/office/word/2018/wordml" xmlns:w16du="http://schemas.microsoft.com/office/word/2023/wordml/word16du" xmlns:w16sdtdh="http://schemas.microsoft.com/office/word/2020/wordml/sdtdatahash" xmlns:w16sdtfl="http://schemas.microsoft.com/office/word/2024/wordml/sdtformatlock" xmlns:w16se="http://schemas.microsoft.com/office/word/2015/wordml/symex" xmlns:wpg="http://schemas.microsoft.com/office/word/2010/wordprocessingGroup" xmlns:wpi="http://schemas.microsoft.com/office/word/2010/wordprocessingInk" xmlns:wne="http://schemas.microsoft.com/office/word/2006/wordml" xmlns:wps="http://schemas.microsoft.com/office/word/2010/wordprocessingShape" mc:Ignorable="w14 w15 w16se w16cid w16 w16cex w16sdtdh w16sdtfl w16du wp14">
   <w:endnote w:type="separator" w:id="-1">
     <w:p>
       <w:r>
@@ -4115,7 +4156,7 @@
 </file>
 
 <file path=word/footer1.xml><?xml version="1.0" encoding="utf-8"?>
-<w:ftr xmlns:wpc="http://schemas.microsoft.com/office/word/2010/wordprocessingCanvas" xmlns:cx="http://schemas.microsoft.com/office/drawing/2014/chartex" xmlns:cx1="http://schemas.microsoft.com/office/drawing/2015/9/8/chartex" xmlns:cx2="http://schemas.microsoft.com/office/drawing/2015/10/21/chartex" xmlns:cx3="http://schemas.microsoft.com/office/drawing/2016/5/9/chartex" xmlns:cx4="http://schemas.microsoft.com/office/drawing/2016/5/10/chartex" xmlns:cx5="http://schemas.microsoft.com/office/drawing/2016/5/11/chartex" xmlns:cx6="http://schemas.microsoft.com/office/drawing/2016/5/12/chartex" xmlns:cx7="http://schemas.microsoft.com/office/drawing/2016/5/13/chartex" xmlns:cx8="http://schemas.microsoft.com/office/drawing/2016/5/14/chartex" xmlns:mc="http://schemas.openxmlformats.org/markup-compatibility/2006" xmlns:aink="http://schemas.microsoft.com/office/drawing/2016/ink" xmlns:am3d="http://schemas.microsoft.com/office/drawing/2017/model3d" xmlns:o="urn:schemas-microsoft-com:office:office" xmlns:r="http://schemas.openxmlformats.org/officeDocument/2006/relationships" xmlns:m="http://schemas.openxmlformats.org/officeDocument/2006/math" xmlns:v="urn:schemas-microsoft-com:vml" xmlns:wp14="http://schemas.microsoft.com/office/word/2010/wordprocessingDrawing" xmlns:wp="http://schemas.openxmlformats.org/drawingml/2006/wordprocessingDrawing" xmlns:w10="urn:schemas-microsoft-com:office:word" xmlns:w="http://schemas.openxmlformats.org/wordprocessingml/2006/main" xmlns:w14="http://schemas.microsoft.com/office/word/2010/wordml" xmlns:w15="http://schemas.microsoft.com/office/word/2012/wordml" xmlns:w16cex="http://schemas.microsoft.com/office/word/2018/wordml/cex" xmlns:w16cid="http://schemas.microsoft.com/office/word/2016/wordml/cid" xmlns:w16="http://schemas.microsoft.com/office/word/2018/wordml" xmlns:w16sdtdh="http://schemas.microsoft.com/office/word/2020/wordml/sdtdatahash" xmlns:w16se="http://schemas.microsoft.com/office/word/2015/wordml/symex" xmlns:wpg="http://schemas.microsoft.com/office/word/2010/wordprocessingGroup" xmlns:wpi="http://schemas.microsoft.com/office/word/2010/wordprocessingInk" xmlns:wne="http://schemas.microsoft.com/office/word/2006/wordml" xmlns:wps="http://schemas.microsoft.com/office/word/2010/wordprocessingShape" mc:Ignorable="w14 w15 w16se w16cid w16 w16cex w16sdtdh wp14">
+<w:ftr xmlns:wpc="http://schemas.microsoft.com/office/word/2010/wordprocessingCanvas" xmlns:cx="http://schemas.microsoft.com/office/drawing/2014/chartex" xmlns:cx1="http://schemas.microsoft.com/office/drawing/2015/9/8/chartex" xmlns:cx2="http://schemas.microsoft.com/office/drawing/2015/10/21/chartex" xmlns:cx3="http://schemas.microsoft.com/office/drawing/2016/5/9/chartex" xmlns:cx4="http://schemas.microsoft.com/office/drawing/2016/5/10/chartex" xmlns:cx5="http://schemas.microsoft.com/office/drawing/2016/5/11/chartex" xmlns:cx6="http://schemas.microsoft.com/office/drawing/2016/5/12/chartex" xmlns:cx7="http://schemas.microsoft.com/office/drawing/2016/5/13/chartex" xmlns:cx8="http://schemas.microsoft.com/office/drawing/2016/5/14/chartex" xmlns:mc="http://schemas.openxmlformats.org/markup-compatibility/2006" xmlns:aink="http://schemas.microsoft.com/office/drawing/2016/ink" xmlns:am3d="http://schemas.microsoft.com/office/drawing/2017/model3d" xmlns:o="urn:schemas-microsoft-com:office:office" xmlns:oel="http://schemas.microsoft.com/office/2019/extlst" xmlns:r="http://schemas.openxmlformats.org/officeDocument/2006/relationships" xmlns:m="http://schemas.openxmlformats.org/officeDocument/2006/math" xmlns:v="urn:schemas-microsoft-com:vml" xmlns:wp14="http://schemas.microsoft.com/office/word/2010/wordprocessingDrawing" xmlns:wp="http://schemas.openxmlformats.org/drawingml/2006/wordprocessingDrawing" xmlns:w10="urn:schemas-microsoft-com:office:word" xmlns:w="http://schemas.openxmlformats.org/wordprocessingml/2006/main" xmlns:w14="http://schemas.microsoft.com/office/word/2010/wordml" xmlns:w15="http://schemas.microsoft.com/office/word/2012/wordml" xmlns:w16cex="http://schemas.microsoft.com/office/word/2018/wordml/cex" xmlns:w16cid="http://schemas.microsoft.com/office/word/2016/wordml/cid" xmlns:w16="http://schemas.microsoft.com/office/word/2018/wordml" xmlns:w16du="http://schemas.microsoft.com/office/word/2023/wordml/word16du" xmlns:w16sdtdh="http://schemas.microsoft.com/office/word/2020/wordml/sdtdatahash" xmlns:w16sdtfl="http://schemas.microsoft.com/office/word/2024/wordml/sdtformatlock" xmlns:w16se="http://schemas.microsoft.com/office/word/2015/wordml/symex" xmlns:wpg="http://schemas.microsoft.com/office/word/2010/wordprocessingGroup" xmlns:wpi="http://schemas.microsoft.com/office/word/2010/wordprocessingInk" xmlns:wne="http://schemas.microsoft.com/office/word/2006/wordml" xmlns:wps="http://schemas.microsoft.com/office/word/2010/wordprocessingShape" mc:Ignorable="w14 w15 w16se w16cid w16 w16cex w16sdtdh w16sdtfl w16du wp14">
   <w:p>
     <w:pPr>
       <w:pBdr>
@@ -4180,7 +4221,27 @@
         <w:sz w:val="16"/>
         <w:szCs w:val="16"/>
       </w:rPr>
-      <w:t xml:space="preserve"> por cualquier medio, sin previa autorización del Alcalde.</w:t>
+      <w:t xml:space="preserve"> por cualquier medio, sin previa autorización del </w:t>
+    </w:r>
+    <w:proofErr w:type="gramStart"/>
+    <w:r>
+      <w:rPr>
+        <w:rFonts w:ascii="Arial" w:eastAsia="Arial" w:hAnsi="Arial" w:cs="Arial"/>
+        <w:color w:val="000000"/>
+        <w:sz w:val="16"/>
+        <w:szCs w:val="16"/>
+      </w:rPr>
+      <w:t>Alcalde</w:t>
+    </w:r>
+    <w:proofErr w:type="gramEnd"/>
+    <w:r>
+      <w:rPr>
+        <w:rFonts w:ascii="Arial" w:eastAsia="Arial" w:hAnsi="Arial" w:cs="Arial"/>
+        <w:color w:val="000000"/>
+        <w:sz w:val="16"/>
+        <w:szCs w:val="16"/>
+      </w:rPr>
+      <w:t>.</w:t>
     </w:r>
   </w:p>
   <w:p>
@@ -4337,7 +4398,7 @@
 </file>
 
 <file path=word/footnotes.xml><?xml version="1.0" encoding="utf-8"?>
-<w:footnotes xmlns:wpc="http://schemas.microsoft.com/office/word/2010/wordprocessingCanvas" xmlns:cx="http://schemas.microsoft.com/office/drawing/2014/chartex" xmlns:cx1="http://schemas.microsoft.com/office/drawing/2015/9/8/chartex" xmlns:cx2="http://schemas.microsoft.com/office/drawing/2015/10/21/chartex" xmlns:cx3="http://schemas.microsoft.com/office/drawing/2016/5/9/chartex" xmlns:cx4="http://schemas.microsoft.com/office/drawing/2016/5/10/chartex" xmlns:cx5="http://schemas.microsoft.com/office/drawing/2016/5/11/chartex" xmlns:cx6="http://schemas.microsoft.com/office/drawing/2016/5/12/chartex" xmlns:cx7="http://schemas.microsoft.com/office/drawing/2016/5/13/chartex" xmlns:cx8="http://schemas.microsoft.com/office/drawing/2016/5/14/chartex" xmlns:mc="http://schemas.openxmlformats.org/markup-compatibility/2006" xmlns:aink="http://schemas.microsoft.com/office/drawing/2016/ink" xmlns:am3d="http://schemas.microsoft.com/office/drawing/2017/model3d" xmlns:o="urn:schemas-microsoft-com:office:office" xmlns:r="http://schemas.openxmlformats.org/officeDocument/2006/relationships" xmlns:m="http://schemas.openxmlformats.org/officeDocument/2006/math" xmlns:v="urn:schemas-microsoft-com:vml" xmlns:wp14="http://schemas.microsoft.com/office/word/2010/wordprocessingDrawing" xmlns:wp="http://schemas.openxmlformats.org/drawingml/2006/wordprocessingDrawing" xmlns:w10="urn:schemas-microsoft-com:office:word" xmlns:w="http://schemas.openxmlformats.org/wordprocessingml/2006/main" xmlns:w14="http://schemas.microsoft.com/office/word/2010/wordml" xmlns:w15="http://schemas.microsoft.com/office/word/2012/wordml" xmlns:w16cex="http://schemas.microsoft.com/office/word/2018/wordml/cex" xmlns:w16cid="http://schemas.microsoft.com/office/word/2016/wordml/cid" xmlns:w16="http://schemas.microsoft.com/office/word/2018/wordml" xmlns:w16sdtdh="http://schemas.microsoft.com/office/word/2020/wordml/sdtdatahash" xmlns:w16se="http://schemas.microsoft.com/office/word/2015/wordml/symex" xmlns:wpg="http://schemas.microsoft.com/office/word/2010/wordprocessingGroup" xmlns:wpi="http://schemas.microsoft.com/office/word/2010/wordprocessingInk" xmlns:wne="http://schemas.microsoft.com/office/word/2006/wordml" xmlns:wps="http://schemas.microsoft.com/office/word/2010/wordprocessingShape" mc:Ignorable="w14 w15 w16se w16cid w16 w16cex w16sdtdh wp14">
+<w:footnotes xmlns:wpc="http://schemas.microsoft.com/office/word/2010/wordprocessingCanvas" xmlns:cx="http://schemas.microsoft.com/office/drawing/2014/chartex" xmlns:cx1="http://schemas.microsoft.com/office/drawing/2015/9/8/chartex" xmlns:cx2="http://schemas.microsoft.com/office/drawing/2015/10/21/chartex" xmlns:cx3="http://schemas.microsoft.com/office/drawing/2016/5/9/chartex" xmlns:cx4="http://schemas.microsoft.com/office/drawing/2016/5/10/chartex" xmlns:cx5="http://schemas.microsoft.com/office/drawing/2016/5/11/chartex" xmlns:cx6="http://schemas.microsoft.com/office/drawing/2016/5/12/chartex" xmlns:cx7="http://schemas.microsoft.com/office/drawing/2016/5/13/chartex" xmlns:cx8="http://schemas.microsoft.com/office/drawing/2016/5/14/chartex" xmlns:mc="http://schemas.openxmlformats.org/markup-compatibility/2006" xmlns:aink="http://schemas.microsoft.com/office/drawing/2016/ink" xmlns:am3d="http://schemas.microsoft.com/office/drawing/2017/model3d" xmlns:o="urn:schemas-microsoft-com:office:office" xmlns:oel="http://schemas.microsoft.com/office/2019/extlst" xmlns:r="http://schemas.openxmlformats.org/officeDocument/2006/relationships" xmlns:m="http://schemas.openxmlformats.org/officeDocument/2006/math" xmlns:v="urn:schemas-microsoft-com:vml" xmlns:wp14="http://schemas.microsoft.com/office/word/2010/wordprocessingDrawing" xmlns:wp="http://schemas.openxmlformats.org/drawingml/2006/wordprocessingDrawing" xmlns:w10="urn:schemas-microsoft-com:office:word" xmlns:w="http://schemas.openxmlformats.org/wordprocessingml/2006/main" xmlns:w14="http://schemas.microsoft.com/office/word/2010/wordml" xmlns:w15="http://schemas.microsoft.com/office/word/2012/wordml" xmlns:w16cex="http://schemas.microsoft.com/office/word/2018/wordml/cex" xmlns:w16cid="http://schemas.microsoft.com/office/word/2016/wordml/cid" xmlns:w16="http://schemas.microsoft.com/office/word/2018/wordml" xmlns:w16du="http://schemas.microsoft.com/office/word/2023/wordml/word16du" xmlns:w16sdtdh="http://schemas.microsoft.com/office/word/2020/wordml/sdtdatahash" xmlns:w16sdtfl="http://schemas.microsoft.com/office/word/2024/wordml/sdtformatlock" xmlns:w16se="http://schemas.microsoft.com/office/word/2015/wordml/symex" xmlns:wpg="http://schemas.microsoft.com/office/word/2010/wordprocessingGroup" xmlns:wpi="http://schemas.microsoft.com/office/word/2010/wordprocessingInk" xmlns:wne="http://schemas.microsoft.com/office/word/2006/wordml" xmlns:wps="http://schemas.microsoft.com/office/word/2010/wordprocessingShape" mc:Ignorable="w14 w15 w16se w16cid w16 w16cex w16sdtdh w16sdtfl w16du wp14">
   <w:footnote w:type="separator" w:id="-1">
     <w:p>
       <w:r>
@@ -4356,7 +4417,7 @@
 </file>
 
 <file path=word/header1.xml><?xml version="1.0" encoding="utf-8"?>
-<w:hdr xmlns:wpc="http://schemas.microsoft.com/office/word/2010/wordprocessingCanvas" xmlns:cx="http://schemas.microsoft.com/office/drawing/2014/chartex" xmlns:cx1="http://schemas.microsoft.com/office/drawing/2015/9/8/chartex" xmlns:cx2="http://schemas.microsoft.com/office/drawing/2015/10/21/chartex" xmlns:cx3="http://schemas.microsoft.com/office/drawing/2016/5/9/chartex" xmlns:cx4="http://schemas.microsoft.com/office/drawing/2016/5/10/chartex" xmlns:cx5="http://schemas.microsoft.com/office/drawing/2016/5/11/chartex" xmlns:cx6="http://schemas.microsoft.com/office/drawing/2016/5/12/chartex" xmlns:cx7="http://schemas.microsoft.com/office/drawing/2016/5/13/chartex" xmlns:cx8="http://schemas.microsoft.com/office/drawing/2016/5/14/chartex" xmlns:mc="http://schemas.openxmlformats.org/markup-compatibility/2006" xmlns:aink="http://schemas.microsoft.com/office/drawing/2016/ink" xmlns:am3d="http://schemas.microsoft.com/office/drawing/2017/model3d" xmlns:o="urn:schemas-microsoft-com:office:office" xmlns:r="http://schemas.openxmlformats.org/officeDocument/2006/relationships" xmlns:m="http://schemas.openxmlformats.org/officeDocument/2006/math" xmlns:v="urn:schemas-microsoft-com:vml" xmlns:wp14="http://schemas.microsoft.com/office/word/2010/wordprocessingDrawing" xmlns:wp="http://schemas.openxmlformats.org/drawingml/2006/wordprocessingDrawing" xmlns:w10="urn:schemas-microsoft-com:office:word" xmlns:w="http://schemas.openxmlformats.org/wordprocessingml/2006/main" xmlns:w14="http://schemas.microsoft.com/office/word/2010/wordml" xmlns:w15="http://schemas.microsoft.com/office/word/2012/wordml" xmlns:w16cex="http://schemas.microsoft.com/office/word/2018/wordml/cex" xmlns:w16cid="http://schemas.microsoft.com/office/word/2016/wordml/cid" xmlns:w16="http://schemas.microsoft.com/office/word/2018/wordml" xmlns:w16sdtdh="http://schemas.microsoft.com/office/word/2020/wordml/sdtdatahash" xmlns:w16se="http://schemas.microsoft.com/office/word/2015/wordml/symex" xmlns:wpg="http://schemas.microsoft.com/office/word/2010/wordprocessingGroup" xmlns:wpi="http://schemas.microsoft.com/office/word/2010/wordprocessingInk" xmlns:wne="http://schemas.microsoft.com/office/word/2006/wordml" xmlns:wps="http://schemas.microsoft.com/office/word/2010/wordprocessingShape" mc:Ignorable="w14 w15 w16se w16cid w16 w16cex w16sdtdh wp14">
+<w:hdr xmlns:wpc="http://schemas.microsoft.com/office/word/2010/wordprocessingCanvas" xmlns:cx="http://schemas.microsoft.com/office/drawing/2014/chartex" xmlns:cx1="http://schemas.microsoft.com/office/drawing/2015/9/8/chartex" xmlns:cx2="http://schemas.microsoft.com/office/drawing/2015/10/21/chartex" xmlns:cx3="http://schemas.microsoft.com/office/drawing/2016/5/9/chartex" xmlns:cx4="http://schemas.microsoft.com/office/drawing/2016/5/10/chartex" xmlns:cx5="http://schemas.microsoft.com/office/drawing/2016/5/11/chartex" xmlns:cx6="http://schemas.microsoft.com/office/drawing/2016/5/12/chartex" xmlns:cx7="http://schemas.microsoft.com/office/drawing/2016/5/13/chartex" xmlns:cx8="http://schemas.microsoft.com/office/drawing/2016/5/14/chartex" xmlns:mc="http://schemas.openxmlformats.org/markup-compatibility/2006" xmlns:aink="http://schemas.microsoft.com/office/drawing/2016/ink" xmlns:am3d="http://schemas.microsoft.com/office/drawing/2017/model3d" xmlns:o="urn:schemas-microsoft-com:office:office" xmlns:oel="http://schemas.microsoft.com/office/2019/extlst" xmlns:r="http://schemas.openxmlformats.org/officeDocument/2006/relationships" xmlns:m="http://schemas.openxmlformats.org/officeDocument/2006/math" xmlns:v="urn:schemas-microsoft-com:vml" xmlns:wp14="http://schemas.microsoft.com/office/word/2010/wordprocessingDrawing" xmlns:wp="http://schemas.openxmlformats.org/drawingml/2006/wordprocessingDrawing" xmlns:w10="urn:schemas-microsoft-com:office:word" xmlns:w="http://schemas.openxmlformats.org/wordprocessingml/2006/main" xmlns:w14="http://schemas.microsoft.com/office/word/2010/wordml" xmlns:w15="http://schemas.microsoft.com/office/word/2012/wordml" xmlns:w16cex="http://schemas.microsoft.com/office/word/2018/wordml/cex" xmlns:w16cid="http://schemas.microsoft.com/office/word/2016/wordml/cid" xmlns:w16="http://schemas.microsoft.com/office/word/2018/wordml" xmlns:w16du="http://schemas.microsoft.com/office/word/2023/wordml/word16du" xmlns:w16sdtdh="http://schemas.microsoft.com/office/word/2020/wordml/sdtdatahash" xmlns:w16sdtfl="http://schemas.microsoft.com/office/word/2024/wordml/sdtformatlock" xmlns:w16se="http://schemas.microsoft.com/office/word/2015/wordml/symex" xmlns:wpg="http://schemas.microsoft.com/office/word/2010/wordprocessingGroup" xmlns:wpi="http://schemas.microsoft.com/office/word/2010/wordprocessingInk" xmlns:wne="http://schemas.microsoft.com/office/word/2006/wordml" xmlns:wps="http://schemas.microsoft.com/office/word/2010/wordprocessingShape" mc:Ignorable="w14 w15 w16se w16cid w16 w16cex w16sdtdh w16sdtfl w16du wp14">
   <w:p>
     <w:pPr>
       <w:pBdr>
@@ -4861,7 +4922,29 @@
               <w:szCs w:val="20"/>
               <w:shd w:val="clear" w:color="auto" w:fill="FFFFFF"/>
             </w:rPr>
-            <w:t>MAJA01.04.03.P003.F001</w:t>
+            <w:t>MAJA01.04.</w:t>
+          </w:r>
+          <w:proofErr w:type="gramStart"/>
+          <w:r>
+            <w:rPr>
+              <w:rFonts w:ascii="Arial" w:hAnsi="Arial" w:cs="Arial"/>
+              <w:color w:val="000000"/>
+              <w:sz w:val="20"/>
+              <w:szCs w:val="20"/>
+              <w:shd w:val="clear" w:color="auto" w:fill="FFFFFF"/>
+            </w:rPr>
+            <w:t>03.P003.F</w:t>
+          </w:r>
+          <w:proofErr w:type="gramEnd"/>
+          <w:r>
+            <w:rPr>
+              <w:rFonts w:ascii="Arial" w:hAnsi="Arial" w:cs="Arial"/>
+              <w:color w:val="000000"/>
+              <w:sz w:val="20"/>
+              <w:szCs w:val="20"/>
+              <w:shd w:val="clear" w:color="auto" w:fill="FFFFFF"/>
+            </w:rPr>
+            <w:t>001</w:t>
           </w:r>
         </w:p>
       </w:tc>
@@ -5028,7 +5111,7 @@
 </file>
 
 <file path=word/styles.xml><?xml version="1.0" encoding="utf-8"?>
-<w:styles xmlns:mc="http://schemas.openxmlformats.org/markup-compatibility/2006" xmlns:r="http://schemas.openxmlformats.org/officeDocument/2006/relationships" xmlns:w="http://schemas.openxmlformats.org/wordprocessingml/2006/main" xmlns:w14="http://schemas.microsoft.com/office/word/2010/wordml" xmlns:w15="http://schemas.microsoft.com/office/word/2012/wordml" xmlns:w16cex="http://schemas.microsoft.com/office/word/2018/wordml/cex" xmlns:w16cid="http://schemas.microsoft.com/office/word/2016/wordml/cid" xmlns:w16="http://schemas.microsoft.com/office/word/2018/wordml" xmlns:w16sdtdh="http://schemas.microsoft.com/office/word/2020/wordml/sdtdatahash" xmlns:w16se="http://schemas.microsoft.com/office/word/2015/wordml/symex" mc:Ignorable="w14 w15 w16se w16cid w16 w16cex w16sdtdh">
+<w:styles xmlns:mc="http://schemas.openxmlformats.org/markup-compatibility/2006" xmlns:r="http://schemas.openxmlformats.org/officeDocument/2006/relationships" xmlns:w="http://schemas.openxmlformats.org/wordprocessingml/2006/main" xmlns:w14="http://schemas.microsoft.com/office/word/2010/wordml" xmlns:w15="http://schemas.microsoft.com/office/word/2012/wordml" xmlns:w16cex="http://schemas.microsoft.com/office/word/2018/wordml/cex" xmlns:w16cid="http://schemas.microsoft.com/office/word/2016/wordml/cid" xmlns:w16="http://schemas.microsoft.com/office/word/2018/wordml" xmlns:w16du="http://schemas.microsoft.com/office/word/2023/wordml/word16du" xmlns:w16sdtdh="http://schemas.microsoft.com/office/word/2020/wordml/sdtdatahash" xmlns:w16sdtfl="http://schemas.microsoft.com/office/word/2024/wordml/sdtformatlock" xmlns:w16se="http://schemas.microsoft.com/office/word/2015/wordml/symex" mc:Ignorable="w14 w15 w16se w16cid w16 w16cex w16sdtdh w16sdtfl w16du">
   <w:docDefaults>
     <w:rPrDefault>
       <w:rPr>
@@ -5195,7 +5278,7 @@
     <w:lsdException w:name="Table Web 2" w:semiHidden="1" w:unhideWhenUsed="1"/>
     <w:lsdException w:name="Table Web 3" w:semiHidden="1" w:unhideWhenUsed="1"/>
     <w:lsdException w:name="Balloon Text" w:semiHidden="1" w:unhideWhenUsed="1"/>
-    <w:lsdException w:name="Table Grid" w:semiHidden="1" w:uiPriority="39" w:unhideWhenUsed="1"/>
+    <w:lsdException w:name="Table Grid" w:uiPriority="39"/>
     <w:lsdException w:name="Table Theme" w:semiHidden="1" w:unhideWhenUsed="1"/>
     <w:lsdException w:name="Placeholder Text" w:semiHidden="1"/>
     <w:lsdException w:name="No Spacing" w:uiPriority="1" w:qFormat="1"/>

</xml_diff>

<commit_message>
Mejora en visualización de informes: nombre de contratista, nuevas columnas en tabla y traducción de DataTables a español
</commit_message>
<xml_diff>
--- a/plantillas/MODIFICACION_1_JUSTIFICACION.docx
+++ b/plantillas/MODIFICACION_1_JUSTIFICACION.docx
@@ -1,6 +1,6 @@
 
 <file path=word/document.xml><?xml version="1.0" encoding="utf-8"?>
-<w:document xmlns:wpc="http://schemas.microsoft.com/office/word/2010/wordprocessingCanvas" xmlns:cx="http://schemas.microsoft.com/office/drawing/2014/chartex" xmlns:cx1="http://schemas.microsoft.com/office/drawing/2015/9/8/chartex" xmlns:cx2="http://schemas.microsoft.com/office/drawing/2015/10/21/chartex" xmlns:cx3="http://schemas.microsoft.com/office/drawing/2016/5/9/chartex" xmlns:cx4="http://schemas.microsoft.com/office/drawing/2016/5/10/chartex" xmlns:cx5="http://schemas.microsoft.com/office/drawing/2016/5/11/chartex" xmlns:cx6="http://schemas.microsoft.com/office/drawing/2016/5/12/chartex" xmlns:cx7="http://schemas.microsoft.com/office/drawing/2016/5/13/chartex" xmlns:cx8="http://schemas.microsoft.com/office/drawing/2016/5/14/chartex" xmlns:mc="http://schemas.openxmlformats.org/markup-compatibility/2006" xmlns:aink="http://schemas.microsoft.com/office/drawing/2016/ink" xmlns:am3d="http://schemas.microsoft.com/office/drawing/2017/model3d" xmlns:o="urn:schemas-microsoft-com:office:office" xmlns:r="http://schemas.openxmlformats.org/officeDocument/2006/relationships" xmlns:m="http://schemas.openxmlformats.org/officeDocument/2006/math" xmlns:v="urn:schemas-microsoft-com:vml" xmlns:wp14="http://schemas.microsoft.com/office/word/2010/wordprocessingDrawing" xmlns:wp="http://schemas.openxmlformats.org/drawingml/2006/wordprocessingDrawing" xmlns:w10="urn:schemas-microsoft-com:office:word" xmlns:w="http://schemas.openxmlformats.org/wordprocessingml/2006/main" xmlns:w14="http://schemas.microsoft.com/office/word/2010/wordml" xmlns:w15="http://schemas.microsoft.com/office/word/2012/wordml" xmlns:w16cex="http://schemas.microsoft.com/office/word/2018/wordml/cex" xmlns:w16cid="http://schemas.microsoft.com/office/word/2016/wordml/cid" xmlns:w16="http://schemas.microsoft.com/office/word/2018/wordml" xmlns:w16sdtdh="http://schemas.microsoft.com/office/word/2020/wordml/sdtdatahash" xmlns:w16se="http://schemas.microsoft.com/office/word/2015/wordml/symex" xmlns:wpg="http://schemas.microsoft.com/office/word/2010/wordprocessingGroup" xmlns:wpi="http://schemas.microsoft.com/office/word/2010/wordprocessingInk" xmlns:wne="http://schemas.microsoft.com/office/word/2006/wordml" xmlns:wps="http://schemas.microsoft.com/office/word/2010/wordprocessingShape" mc:Ignorable="w14 w15 w16se w16cid w16 w16cex w16sdtdh wp14">
+<w:document xmlns:wpc="http://schemas.microsoft.com/office/word/2010/wordprocessingCanvas" xmlns:mc="http://schemas.openxmlformats.org/markup-compatibility/2006" xmlns:o="urn:schemas-microsoft-com:office:office" xmlns:r="http://schemas.openxmlformats.org/officeDocument/2006/relationships" xmlns:m="http://schemas.openxmlformats.org/officeDocument/2006/math" xmlns:v="urn:schemas-microsoft-com:vml" xmlns:wp14="http://schemas.microsoft.com/office/word/2010/wordprocessingDrawing" xmlns:wp="http://schemas.openxmlformats.org/drawingml/2006/wordprocessingDrawing" xmlns:w10="urn:schemas-microsoft-com:office:word" xmlns:w="http://schemas.openxmlformats.org/wordprocessingml/2006/main" xmlns:w14="http://schemas.microsoft.com/office/word/2010/wordml" xmlns:wpg="http://schemas.microsoft.com/office/word/2010/wordprocessingGroup" xmlns:wpi="http://schemas.microsoft.com/office/word/2010/wordprocessingInk" xmlns:wne="http://schemas.microsoft.com/office/word/2006/wordml" xmlns:wps="http://schemas.microsoft.com/office/word/2010/wordprocessingShape" mc:Ignorable="w14 wp14">
   <w:body>
     <w:tbl>
       <w:tblPr>
@@ -3331,8 +3331,32 @@
                 <w:shd w:val="clear" w:color="auto" w:fill="FFFF00"/>
                 <w:lang w:val="es-CO"/>
               </w:rPr>
+              <w:t>(</w:t>
+            </w:r>
+            <w:r>
+              <w:rPr>
+                <w:rFonts w:ascii="Arial" w:hAnsi="Arial" w:cs="Arial"/>
+                <w:color w:val="000000"/>
+                <w:sz w:val="24"/>
+                <w:szCs w:val="24"/>
+                <w:shd w:val="clear" w:color="auto" w:fill="FFFF00"/>
+                <w:lang w:val="es-CO"/>
+              </w:rPr>
               <w:t>{{VALOR_CDP_ADICION}}</w:t>
             </w:r>
+            <w:r>
+              <w:rPr>
+                <w:rFonts w:ascii="Arial" w:hAnsi="Arial" w:cs="Arial"/>
+                <w:color w:val="000000"/>
+                <w:sz w:val="24"/>
+                <w:szCs w:val="24"/>
+                <w:shd w:val="clear" w:color="auto" w:fill="FFFF00"/>
+                <w:lang w:val="es-CO"/>
+              </w:rPr>
+              <w:t>)</w:t>
+            </w:r>
+            <w:bookmarkStart w:id="0" w:name="_GoBack"/>
+            <w:bookmarkEnd w:id="0"/>
             <w:r>
               <w:rPr>
                 <w:rFonts w:ascii="Arial" w:hAnsi="Arial" w:cs="Arial"/>
@@ -4084,8 +4108,8 @@
       </w:pPr>
     </w:p>
     <w:sectPr>
-      <w:headerReference w:type="default" r:id="rId6"/>
-      <w:footerReference w:type="default" r:id="rId7"/>
+      <w:headerReference w:type="default" r:id="rId7"/>
+      <w:footerReference w:type="default" r:id="rId8"/>
       <w:pgSz w:w="12240" w:h="15840"/>
       <w:pgMar w:top="1134" w:right="1134" w:bottom="1701" w:left="1134" w:header="397" w:footer="709" w:gutter="0"/>
       <w:pgNumType w:start="1"/>
@@ -4096,7 +4120,7 @@
 </file>
 
 <file path=word/endnotes.xml><?xml version="1.0" encoding="utf-8"?>
-<w:endnotes xmlns:wpc="http://schemas.microsoft.com/office/word/2010/wordprocessingCanvas" xmlns:cx="http://schemas.microsoft.com/office/drawing/2014/chartex" xmlns:cx1="http://schemas.microsoft.com/office/drawing/2015/9/8/chartex" xmlns:cx2="http://schemas.microsoft.com/office/drawing/2015/10/21/chartex" xmlns:cx3="http://schemas.microsoft.com/office/drawing/2016/5/9/chartex" xmlns:cx4="http://schemas.microsoft.com/office/drawing/2016/5/10/chartex" xmlns:cx5="http://schemas.microsoft.com/office/drawing/2016/5/11/chartex" xmlns:cx6="http://schemas.microsoft.com/office/drawing/2016/5/12/chartex" xmlns:cx7="http://schemas.microsoft.com/office/drawing/2016/5/13/chartex" xmlns:cx8="http://schemas.microsoft.com/office/drawing/2016/5/14/chartex" xmlns:mc="http://schemas.openxmlformats.org/markup-compatibility/2006" xmlns:aink="http://schemas.microsoft.com/office/drawing/2016/ink" xmlns:am3d="http://schemas.microsoft.com/office/drawing/2017/model3d" xmlns:o="urn:schemas-microsoft-com:office:office" xmlns:r="http://schemas.openxmlformats.org/officeDocument/2006/relationships" xmlns:m="http://schemas.openxmlformats.org/officeDocument/2006/math" xmlns:v="urn:schemas-microsoft-com:vml" xmlns:wp14="http://schemas.microsoft.com/office/word/2010/wordprocessingDrawing" xmlns:wp="http://schemas.openxmlformats.org/drawingml/2006/wordprocessingDrawing" xmlns:w10="urn:schemas-microsoft-com:office:word" xmlns:w="http://schemas.openxmlformats.org/wordprocessingml/2006/main" xmlns:w14="http://schemas.microsoft.com/office/word/2010/wordml" xmlns:w15="http://schemas.microsoft.com/office/word/2012/wordml" xmlns:w16cex="http://schemas.microsoft.com/office/word/2018/wordml/cex" xmlns:w16cid="http://schemas.microsoft.com/office/word/2016/wordml/cid" xmlns:w16="http://schemas.microsoft.com/office/word/2018/wordml" xmlns:w16sdtdh="http://schemas.microsoft.com/office/word/2020/wordml/sdtdatahash" xmlns:w16se="http://schemas.microsoft.com/office/word/2015/wordml/symex" xmlns:wpg="http://schemas.microsoft.com/office/word/2010/wordprocessingGroup" xmlns:wpi="http://schemas.microsoft.com/office/word/2010/wordprocessingInk" xmlns:wne="http://schemas.microsoft.com/office/word/2006/wordml" xmlns:wps="http://schemas.microsoft.com/office/word/2010/wordprocessingShape" mc:Ignorable="w14 w15 w16se w16cid w16 w16cex w16sdtdh wp14">
+<w:endnotes xmlns:wpc="http://schemas.microsoft.com/office/word/2010/wordprocessingCanvas" xmlns:mc="http://schemas.openxmlformats.org/markup-compatibility/2006" xmlns:o="urn:schemas-microsoft-com:office:office" xmlns:r="http://schemas.openxmlformats.org/officeDocument/2006/relationships" xmlns:m="http://schemas.openxmlformats.org/officeDocument/2006/math" xmlns:v="urn:schemas-microsoft-com:vml" xmlns:wp14="http://schemas.microsoft.com/office/word/2010/wordprocessingDrawing" xmlns:wp="http://schemas.openxmlformats.org/drawingml/2006/wordprocessingDrawing" xmlns:w10="urn:schemas-microsoft-com:office:word" xmlns:w="http://schemas.openxmlformats.org/wordprocessingml/2006/main" xmlns:w14="http://schemas.microsoft.com/office/word/2010/wordml" xmlns:wpg="http://schemas.microsoft.com/office/word/2010/wordprocessingGroup" xmlns:wpi="http://schemas.microsoft.com/office/word/2010/wordprocessingInk" xmlns:wne="http://schemas.microsoft.com/office/word/2006/wordml" xmlns:wps="http://schemas.microsoft.com/office/word/2010/wordprocessingShape" mc:Ignorable="w14 wp14">
   <w:endnote w:type="separator" w:id="-1">
     <w:p>
       <w:r>
@@ -4115,7 +4139,7 @@
 </file>
 
 <file path=word/footer1.xml><?xml version="1.0" encoding="utf-8"?>
-<w:ftr xmlns:wpc="http://schemas.microsoft.com/office/word/2010/wordprocessingCanvas" xmlns:cx="http://schemas.microsoft.com/office/drawing/2014/chartex" xmlns:cx1="http://schemas.microsoft.com/office/drawing/2015/9/8/chartex" xmlns:cx2="http://schemas.microsoft.com/office/drawing/2015/10/21/chartex" xmlns:cx3="http://schemas.microsoft.com/office/drawing/2016/5/9/chartex" xmlns:cx4="http://schemas.microsoft.com/office/drawing/2016/5/10/chartex" xmlns:cx5="http://schemas.microsoft.com/office/drawing/2016/5/11/chartex" xmlns:cx6="http://schemas.microsoft.com/office/drawing/2016/5/12/chartex" xmlns:cx7="http://schemas.microsoft.com/office/drawing/2016/5/13/chartex" xmlns:cx8="http://schemas.microsoft.com/office/drawing/2016/5/14/chartex" xmlns:mc="http://schemas.openxmlformats.org/markup-compatibility/2006" xmlns:aink="http://schemas.microsoft.com/office/drawing/2016/ink" xmlns:am3d="http://schemas.microsoft.com/office/drawing/2017/model3d" xmlns:o="urn:schemas-microsoft-com:office:office" xmlns:r="http://schemas.openxmlformats.org/officeDocument/2006/relationships" xmlns:m="http://schemas.openxmlformats.org/officeDocument/2006/math" xmlns:v="urn:schemas-microsoft-com:vml" xmlns:wp14="http://schemas.microsoft.com/office/word/2010/wordprocessingDrawing" xmlns:wp="http://schemas.openxmlformats.org/drawingml/2006/wordprocessingDrawing" xmlns:w10="urn:schemas-microsoft-com:office:word" xmlns:w="http://schemas.openxmlformats.org/wordprocessingml/2006/main" xmlns:w14="http://schemas.microsoft.com/office/word/2010/wordml" xmlns:w15="http://schemas.microsoft.com/office/word/2012/wordml" xmlns:w16cex="http://schemas.microsoft.com/office/word/2018/wordml/cex" xmlns:w16cid="http://schemas.microsoft.com/office/word/2016/wordml/cid" xmlns:w16="http://schemas.microsoft.com/office/word/2018/wordml" xmlns:w16sdtdh="http://schemas.microsoft.com/office/word/2020/wordml/sdtdatahash" xmlns:w16se="http://schemas.microsoft.com/office/word/2015/wordml/symex" xmlns:wpg="http://schemas.microsoft.com/office/word/2010/wordprocessingGroup" xmlns:wpi="http://schemas.microsoft.com/office/word/2010/wordprocessingInk" xmlns:wne="http://schemas.microsoft.com/office/word/2006/wordml" xmlns:wps="http://schemas.microsoft.com/office/word/2010/wordprocessingShape" mc:Ignorable="w14 w15 w16se w16cid w16 w16cex w16sdtdh wp14">
+<w:ftr xmlns:wpc="http://schemas.microsoft.com/office/word/2010/wordprocessingCanvas" xmlns:mc="http://schemas.openxmlformats.org/markup-compatibility/2006" xmlns:o="urn:schemas-microsoft-com:office:office" xmlns:r="http://schemas.openxmlformats.org/officeDocument/2006/relationships" xmlns:m="http://schemas.openxmlformats.org/officeDocument/2006/math" xmlns:v="urn:schemas-microsoft-com:vml" xmlns:wp14="http://schemas.microsoft.com/office/word/2010/wordprocessingDrawing" xmlns:wp="http://schemas.openxmlformats.org/drawingml/2006/wordprocessingDrawing" xmlns:w10="urn:schemas-microsoft-com:office:word" xmlns:w="http://schemas.openxmlformats.org/wordprocessingml/2006/main" xmlns:w14="http://schemas.microsoft.com/office/word/2010/wordml" xmlns:wpg="http://schemas.microsoft.com/office/word/2010/wordprocessingGroup" xmlns:wpi="http://schemas.microsoft.com/office/word/2010/wordprocessingInk" xmlns:wne="http://schemas.microsoft.com/office/word/2006/wordml" xmlns:wps="http://schemas.microsoft.com/office/word/2010/wordprocessingShape" mc:Ignorable="w14 wp14">
   <w:p>
     <w:pPr>
       <w:pBdr>
@@ -4337,7 +4361,7 @@
 </file>
 
 <file path=word/footnotes.xml><?xml version="1.0" encoding="utf-8"?>
-<w:footnotes xmlns:wpc="http://schemas.microsoft.com/office/word/2010/wordprocessingCanvas" xmlns:cx="http://schemas.microsoft.com/office/drawing/2014/chartex" xmlns:cx1="http://schemas.microsoft.com/office/drawing/2015/9/8/chartex" xmlns:cx2="http://schemas.microsoft.com/office/drawing/2015/10/21/chartex" xmlns:cx3="http://schemas.microsoft.com/office/drawing/2016/5/9/chartex" xmlns:cx4="http://schemas.microsoft.com/office/drawing/2016/5/10/chartex" xmlns:cx5="http://schemas.microsoft.com/office/drawing/2016/5/11/chartex" xmlns:cx6="http://schemas.microsoft.com/office/drawing/2016/5/12/chartex" xmlns:cx7="http://schemas.microsoft.com/office/drawing/2016/5/13/chartex" xmlns:cx8="http://schemas.microsoft.com/office/drawing/2016/5/14/chartex" xmlns:mc="http://schemas.openxmlformats.org/markup-compatibility/2006" xmlns:aink="http://schemas.microsoft.com/office/drawing/2016/ink" xmlns:am3d="http://schemas.microsoft.com/office/drawing/2017/model3d" xmlns:o="urn:schemas-microsoft-com:office:office" xmlns:r="http://schemas.openxmlformats.org/officeDocument/2006/relationships" xmlns:m="http://schemas.openxmlformats.org/officeDocument/2006/math" xmlns:v="urn:schemas-microsoft-com:vml" xmlns:wp14="http://schemas.microsoft.com/office/word/2010/wordprocessingDrawing" xmlns:wp="http://schemas.openxmlformats.org/drawingml/2006/wordprocessingDrawing" xmlns:w10="urn:schemas-microsoft-com:office:word" xmlns:w="http://schemas.openxmlformats.org/wordprocessingml/2006/main" xmlns:w14="http://schemas.microsoft.com/office/word/2010/wordml" xmlns:w15="http://schemas.microsoft.com/office/word/2012/wordml" xmlns:w16cex="http://schemas.microsoft.com/office/word/2018/wordml/cex" xmlns:w16cid="http://schemas.microsoft.com/office/word/2016/wordml/cid" xmlns:w16="http://schemas.microsoft.com/office/word/2018/wordml" xmlns:w16sdtdh="http://schemas.microsoft.com/office/word/2020/wordml/sdtdatahash" xmlns:w16se="http://schemas.microsoft.com/office/word/2015/wordml/symex" xmlns:wpg="http://schemas.microsoft.com/office/word/2010/wordprocessingGroup" xmlns:wpi="http://schemas.microsoft.com/office/word/2010/wordprocessingInk" xmlns:wne="http://schemas.microsoft.com/office/word/2006/wordml" xmlns:wps="http://schemas.microsoft.com/office/word/2010/wordprocessingShape" mc:Ignorable="w14 w15 w16se w16cid w16 w16cex w16sdtdh wp14">
+<w:footnotes xmlns:wpc="http://schemas.microsoft.com/office/word/2010/wordprocessingCanvas" xmlns:mc="http://schemas.openxmlformats.org/markup-compatibility/2006" xmlns:o="urn:schemas-microsoft-com:office:office" xmlns:r="http://schemas.openxmlformats.org/officeDocument/2006/relationships" xmlns:m="http://schemas.openxmlformats.org/officeDocument/2006/math" xmlns:v="urn:schemas-microsoft-com:vml" xmlns:wp14="http://schemas.microsoft.com/office/word/2010/wordprocessingDrawing" xmlns:wp="http://schemas.openxmlformats.org/drawingml/2006/wordprocessingDrawing" xmlns:w10="urn:schemas-microsoft-com:office:word" xmlns:w="http://schemas.openxmlformats.org/wordprocessingml/2006/main" xmlns:w14="http://schemas.microsoft.com/office/word/2010/wordml" xmlns:wpg="http://schemas.microsoft.com/office/word/2010/wordprocessingGroup" xmlns:wpi="http://schemas.microsoft.com/office/word/2010/wordprocessingInk" xmlns:wne="http://schemas.microsoft.com/office/word/2006/wordml" xmlns:wps="http://schemas.microsoft.com/office/word/2010/wordprocessingShape" mc:Ignorable="w14 wp14">
   <w:footnote w:type="separator" w:id="-1">
     <w:p>
       <w:r>
@@ -4356,7 +4380,7 @@
 </file>
 
 <file path=word/header1.xml><?xml version="1.0" encoding="utf-8"?>
-<w:hdr xmlns:wpc="http://schemas.microsoft.com/office/word/2010/wordprocessingCanvas" xmlns:cx="http://schemas.microsoft.com/office/drawing/2014/chartex" xmlns:cx1="http://schemas.microsoft.com/office/drawing/2015/9/8/chartex" xmlns:cx2="http://schemas.microsoft.com/office/drawing/2015/10/21/chartex" xmlns:cx3="http://schemas.microsoft.com/office/drawing/2016/5/9/chartex" xmlns:cx4="http://schemas.microsoft.com/office/drawing/2016/5/10/chartex" xmlns:cx5="http://schemas.microsoft.com/office/drawing/2016/5/11/chartex" xmlns:cx6="http://schemas.microsoft.com/office/drawing/2016/5/12/chartex" xmlns:cx7="http://schemas.microsoft.com/office/drawing/2016/5/13/chartex" xmlns:cx8="http://schemas.microsoft.com/office/drawing/2016/5/14/chartex" xmlns:mc="http://schemas.openxmlformats.org/markup-compatibility/2006" xmlns:aink="http://schemas.microsoft.com/office/drawing/2016/ink" xmlns:am3d="http://schemas.microsoft.com/office/drawing/2017/model3d" xmlns:o="urn:schemas-microsoft-com:office:office" xmlns:r="http://schemas.openxmlformats.org/officeDocument/2006/relationships" xmlns:m="http://schemas.openxmlformats.org/officeDocument/2006/math" xmlns:v="urn:schemas-microsoft-com:vml" xmlns:wp14="http://schemas.microsoft.com/office/word/2010/wordprocessingDrawing" xmlns:wp="http://schemas.openxmlformats.org/drawingml/2006/wordprocessingDrawing" xmlns:w10="urn:schemas-microsoft-com:office:word" xmlns:w="http://schemas.openxmlformats.org/wordprocessingml/2006/main" xmlns:w14="http://schemas.microsoft.com/office/word/2010/wordml" xmlns:w15="http://schemas.microsoft.com/office/word/2012/wordml" xmlns:w16cex="http://schemas.microsoft.com/office/word/2018/wordml/cex" xmlns:w16cid="http://schemas.microsoft.com/office/word/2016/wordml/cid" xmlns:w16="http://schemas.microsoft.com/office/word/2018/wordml" xmlns:w16sdtdh="http://schemas.microsoft.com/office/word/2020/wordml/sdtdatahash" xmlns:w16se="http://schemas.microsoft.com/office/word/2015/wordml/symex" xmlns:wpg="http://schemas.microsoft.com/office/word/2010/wordprocessingGroup" xmlns:wpi="http://schemas.microsoft.com/office/word/2010/wordprocessingInk" xmlns:wne="http://schemas.microsoft.com/office/word/2006/wordml" xmlns:wps="http://schemas.microsoft.com/office/word/2010/wordprocessingShape" mc:Ignorable="w14 w15 w16se w16cid w16 w16cex w16sdtdh wp14">
+<w:hdr xmlns:wpc="http://schemas.microsoft.com/office/word/2010/wordprocessingCanvas" xmlns:mc="http://schemas.openxmlformats.org/markup-compatibility/2006" xmlns:o="urn:schemas-microsoft-com:office:office" xmlns:r="http://schemas.openxmlformats.org/officeDocument/2006/relationships" xmlns:m="http://schemas.openxmlformats.org/officeDocument/2006/math" xmlns:v="urn:schemas-microsoft-com:vml" xmlns:wp14="http://schemas.microsoft.com/office/word/2010/wordprocessingDrawing" xmlns:wp="http://schemas.openxmlformats.org/drawingml/2006/wordprocessingDrawing" xmlns:w10="urn:schemas-microsoft-com:office:word" xmlns:w="http://schemas.openxmlformats.org/wordprocessingml/2006/main" xmlns:w14="http://schemas.microsoft.com/office/word/2010/wordml" xmlns:wpg="http://schemas.microsoft.com/office/word/2010/wordprocessingGroup" xmlns:wpi="http://schemas.microsoft.com/office/word/2010/wordprocessingInk" xmlns:wne="http://schemas.microsoft.com/office/word/2006/wordml" xmlns:wps="http://schemas.microsoft.com/office/word/2010/wordprocessingShape" mc:Ignorable="w14 wp14">
   <w:p>
     <w:pPr>
       <w:pBdr>
@@ -4734,7 +4758,7 @@
               <w:szCs w:val="24"/>
             </w:rPr>
           </w:pPr>
-          <w:bookmarkStart w:id="0" w:name="_Hlk151385364"/>
+          <w:bookmarkStart w:id="1" w:name="_Hlk151385364"/>
           <w:r>
             <w:rPr>
               <w:rFonts w:ascii="Arial" w:eastAsia="Arial" w:hAnsi="Arial" w:cs="Arial"/>
@@ -4834,7 +4858,7 @@
             </w:rPr>
             <w:t>ORDEN DE COMPRA</w:t>
           </w:r>
-          <w:bookmarkEnd w:id="0"/>
+          <w:bookmarkEnd w:id="1"/>
         </w:p>
       </w:tc>
       <w:tc>
@@ -5028,7 +5052,7 @@
 </file>
 
 <file path=word/styles.xml><?xml version="1.0" encoding="utf-8"?>
-<w:styles xmlns:mc="http://schemas.openxmlformats.org/markup-compatibility/2006" xmlns:r="http://schemas.openxmlformats.org/officeDocument/2006/relationships" xmlns:w="http://schemas.openxmlformats.org/wordprocessingml/2006/main" xmlns:w14="http://schemas.microsoft.com/office/word/2010/wordml" xmlns:w15="http://schemas.microsoft.com/office/word/2012/wordml" xmlns:w16cex="http://schemas.microsoft.com/office/word/2018/wordml/cex" xmlns:w16cid="http://schemas.microsoft.com/office/word/2016/wordml/cid" xmlns:w16="http://schemas.microsoft.com/office/word/2018/wordml" xmlns:w16sdtdh="http://schemas.microsoft.com/office/word/2020/wordml/sdtdatahash" xmlns:w16se="http://schemas.microsoft.com/office/word/2015/wordml/symex" mc:Ignorable="w14 w15 w16se w16cid w16 w16cex w16sdtdh">
+<w:styles xmlns:mc="http://schemas.openxmlformats.org/markup-compatibility/2006" xmlns:r="http://schemas.openxmlformats.org/officeDocument/2006/relationships" xmlns:w="http://schemas.openxmlformats.org/wordprocessingml/2006/main" xmlns:w14="http://schemas.microsoft.com/office/word/2010/wordml" mc:Ignorable="w14">
   <w:docDefaults>
     <w:rPrDefault>
       <w:rPr>
@@ -5040,383 +5064,144 @@
     </w:rPrDefault>
     <w:pPrDefault/>
   </w:docDefaults>
-  <w:latentStyles w:defLockedState="0" w:defUIPriority="99" w:defSemiHidden="0" w:defUnhideWhenUsed="0" w:defQFormat="0" w:count="376">
-    <w:lsdException w:name="Normal" w:uiPriority="0" w:qFormat="1"/>
-    <w:lsdException w:name="heading 1" w:uiPriority="9" w:qFormat="1"/>
-    <w:lsdException w:name="heading 2" w:semiHidden="1" w:uiPriority="9" w:unhideWhenUsed="1" w:qFormat="1"/>
-    <w:lsdException w:name="heading 3" w:semiHidden="1" w:uiPriority="9" w:unhideWhenUsed="1" w:qFormat="1"/>
-    <w:lsdException w:name="heading 4" w:semiHidden="1" w:uiPriority="9" w:unhideWhenUsed="1" w:qFormat="1"/>
-    <w:lsdException w:name="heading 5" w:semiHidden="1" w:uiPriority="9" w:unhideWhenUsed="1" w:qFormat="1"/>
-    <w:lsdException w:name="heading 6" w:semiHidden="1" w:uiPriority="9" w:unhideWhenUsed="1" w:qFormat="1"/>
-    <w:lsdException w:name="heading 7" w:semiHidden="1" w:uiPriority="9" w:unhideWhenUsed="1" w:qFormat="1"/>
-    <w:lsdException w:name="heading 8" w:semiHidden="1" w:uiPriority="9" w:unhideWhenUsed="1" w:qFormat="1"/>
-    <w:lsdException w:name="heading 9" w:semiHidden="1" w:uiPriority="9" w:unhideWhenUsed="1" w:qFormat="1"/>
-    <w:lsdException w:name="index 1" w:semiHidden="1" w:unhideWhenUsed="1"/>
-    <w:lsdException w:name="index 2" w:semiHidden="1" w:unhideWhenUsed="1"/>
-    <w:lsdException w:name="index 3" w:semiHidden="1" w:unhideWhenUsed="1"/>
-    <w:lsdException w:name="index 4" w:semiHidden="1" w:unhideWhenUsed="1"/>
-    <w:lsdException w:name="index 5" w:semiHidden="1" w:unhideWhenUsed="1"/>
-    <w:lsdException w:name="index 6" w:semiHidden="1" w:unhideWhenUsed="1"/>
-    <w:lsdException w:name="index 7" w:semiHidden="1" w:unhideWhenUsed="1"/>
-    <w:lsdException w:name="index 8" w:semiHidden="1" w:unhideWhenUsed="1"/>
-    <w:lsdException w:name="index 9" w:semiHidden="1" w:unhideWhenUsed="1"/>
-    <w:lsdException w:name="toc 1" w:semiHidden="1" w:uiPriority="39" w:unhideWhenUsed="1"/>
-    <w:lsdException w:name="toc 2" w:semiHidden="1" w:uiPriority="39" w:unhideWhenUsed="1"/>
-    <w:lsdException w:name="toc 3" w:semiHidden="1" w:uiPriority="39" w:unhideWhenUsed="1"/>
-    <w:lsdException w:name="toc 4" w:semiHidden="1" w:uiPriority="39" w:unhideWhenUsed="1"/>
-    <w:lsdException w:name="toc 5" w:semiHidden="1" w:uiPriority="39" w:unhideWhenUsed="1"/>
-    <w:lsdException w:name="toc 6" w:semiHidden="1" w:uiPriority="39" w:unhideWhenUsed="1"/>
-    <w:lsdException w:name="toc 7" w:semiHidden="1" w:uiPriority="39" w:unhideWhenUsed="1"/>
-    <w:lsdException w:name="toc 8" w:semiHidden="1" w:uiPriority="39" w:unhideWhenUsed="1"/>
-    <w:lsdException w:name="toc 9" w:semiHidden="1" w:uiPriority="39" w:unhideWhenUsed="1"/>
-    <w:lsdException w:name="Normal Indent" w:semiHidden="1" w:unhideWhenUsed="1"/>
-    <w:lsdException w:name="footnote text" w:semiHidden="1" w:unhideWhenUsed="1"/>
-    <w:lsdException w:name="annotation text" w:semiHidden="1" w:unhideWhenUsed="1"/>
-    <w:lsdException w:name="header" w:semiHidden="1" w:unhideWhenUsed="1"/>
-    <w:lsdException w:name="footer" w:semiHidden="1" w:unhideWhenUsed="1"/>
-    <w:lsdException w:name="index heading" w:semiHidden="1" w:unhideWhenUsed="1"/>
-    <w:lsdException w:name="caption" w:semiHidden="1" w:uiPriority="35" w:unhideWhenUsed="1" w:qFormat="1"/>
-    <w:lsdException w:name="table of figures" w:semiHidden="1" w:unhideWhenUsed="1"/>
-    <w:lsdException w:name="envelope address" w:semiHidden="1" w:unhideWhenUsed="1"/>
-    <w:lsdException w:name="envelope return" w:semiHidden="1" w:unhideWhenUsed="1"/>
-    <w:lsdException w:name="footnote reference" w:semiHidden="1" w:unhideWhenUsed="1"/>
-    <w:lsdException w:name="annotation reference" w:semiHidden="1" w:unhideWhenUsed="1"/>
-    <w:lsdException w:name="line number" w:semiHidden="1" w:unhideWhenUsed="1"/>
-    <w:lsdException w:name="page number" w:semiHidden="1" w:unhideWhenUsed="1"/>
-    <w:lsdException w:name="endnote reference" w:semiHidden="1" w:unhideWhenUsed="1"/>
-    <w:lsdException w:name="endnote text" w:semiHidden="1" w:unhideWhenUsed="1"/>
-    <w:lsdException w:name="table of authorities" w:semiHidden="1" w:unhideWhenUsed="1"/>
-    <w:lsdException w:name="macro" w:semiHidden="1" w:unhideWhenUsed="1"/>
-    <w:lsdException w:name="toa heading" w:semiHidden="1" w:unhideWhenUsed="1"/>
-    <w:lsdException w:name="List" w:semiHidden="1" w:unhideWhenUsed="1"/>
-    <w:lsdException w:name="List Bullet" w:semiHidden="1" w:unhideWhenUsed="1"/>
-    <w:lsdException w:name="List Number" w:semiHidden="1" w:unhideWhenUsed="1"/>
-    <w:lsdException w:name="List 2" w:semiHidden="1" w:unhideWhenUsed="1"/>
-    <w:lsdException w:name="List 3" w:semiHidden="1" w:unhideWhenUsed="1"/>
-    <w:lsdException w:name="List 4" w:semiHidden="1" w:unhideWhenUsed="1"/>
-    <w:lsdException w:name="List 5" w:semiHidden="1" w:unhideWhenUsed="1"/>
-    <w:lsdException w:name="List Bullet 2" w:semiHidden="1" w:unhideWhenUsed="1"/>
-    <w:lsdException w:name="List Bullet 3" w:semiHidden="1" w:unhideWhenUsed="1"/>
-    <w:lsdException w:name="List Bullet 4" w:semiHidden="1" w:unhideWhenUsed="1"/>
-    <w:lsdException w:name="List Bullet 5" w:semiHidden="1" w:unhideWhenUsed="1"/>
-    <w:lsdException w:name="List Number 2" w:semiHidden="1" w:unhideWhenUsed="1"/>
-    <w:lsdException w:name="List Number 3" w:semiHidden="1" w:unhideWhenUsed="1"/>
-    <w:lsdException w:name="List Number 4" w:semiHidden="1" w:unhideWhenUsed="1"/>
-    <w:lsdException w:name="List Number 5" w:semiHidden="1" w:unhideWhenUsed="1"/>
-    <w:lsdException w:name="Title" w:uiPriority="10" w:qFormat="1"/>
-    <w:lsdException w:name="Closing" w:semiHidden="1" w:unhideWhenUsed="1"/>
-    <w:lsdException w:name="Signature" w:semiHidden="1" w:unhideWhenUsed="1"/>
-    <w:lsdException w:name="Default Paragraph Font" w:semiHidden="1" w:uiPriority="1" w:unhideWhenUsed="1"/>
-    <w:lsdException w:name="Body Text" w:semiHidden="1" w:unhideWhenUsed="1"/>
-    <w:lsdException w:name="Body Text Indent" w:semiHidden="1" w:unhideWhenUsed="1"/>
-    <w:lsdException w:name="List Continue" w:semiHidden="1" w:unhideWhenUsed="1"/>
-    <w:lsdException w:name="List Continue 2" w:semiHidden="1" w:unhideWhenUsed="1"/>
-    <w:lsdException w:name="List Continue 3" w:semiHidden="1" w:unhideWhenUsed="1"/>
-    <w:lsdException w:name="List Continue 4" w:semiHidden="1" w:unhideWhenUsed="1"/>
-    <w:lsdException w:name="List Continue 5" w:semiHidden="1" w:unhideWhenUsed="1"/>
-    <w:lsdException w:name="Message Header" w:semiHidden="1" w:unhideWhenUsed="1"/>
-    <w:lsdException w:name="Subtitle" w:uiPriority="11" w:qFormat="1"/>
-    <w:lsdException w:name="Salutation" w:semiHidden="1" w:unhideWhenUsed="1"/>
-    <w:lsdException w:name="Date" w:semiHidden="1" w:unhideWhenUsed="1"/>
-    <w:lsdException w:name="Body Text First Indent" w:semiHidden="1" w:unhideWhenUsed="1"/>
-    <w:lsdException w:name="Body Text First Indent 2" w:semiHidden="1" w:unhideWhenUsed="1"/>
-    <w:lsdException w:name="Note Heading" w:semiHidden="1" w:unhideWhenUsed="1"/>
-    <w:lsdException w:name="Body Text 2" w:semiHidden="1" w:unhideWhenUsed="1"/>
-    <w:lsdException w:name="Body Text 3" w:semiHidden="1" w:unhideWhenUsed="1"/>
-    <w:lsdException w:name="Body Text Indent 2" w:semiHidden="1" w:unhideWhenUsed="1"/>
-    <w:lsdException w:name="Body Text Indent 3" w:semiHidden="1" w:unhideWhenUsed="1"/>
-    <w:lsdException w:name="Block Text" w:semiHidden="1" w:unhideWhenUsed="1"/>
-    <w:lsdException w:name="Hyperlink" w:semiHidden="1" w:unhideWhenUsed="1"/>
-    <w:lsdException w:name="FollowedHyperlink" w:semiHidden="1" w:unhideWhenUsed="1"/>
-    <w:lsdException w:name="Strong" w:uiPriority="22" w:qFormat="1"/>
-    <w:lsdException w:name="Emphasis" w:uiPriority="20" w:qFormat="1"/>
-    <w:lsdException w:name="Document Map" w:semiHidden="1" w:unhideWhenUsed="1"/>
-    <w:lsdException w:name="Plain Text" w:semiHidden="1" w:unhideWhenUsed="1"/>
-    <w:lsdException w:name="E-mail Signature" w:semiHidden="1" w:unhideWhenUsed="1"/>
-    <w:lsdException w:name="HTML Top of Form" w:semiHidden="1" w:unhideWhenUsed="1"/>
-    <w:lsdException w:name="HTML Bottom of Form" w:semiHidden="1" w:unhideWhenUsed="1"/>
-    <w:lsdException w:name="Normal (Web)" w:semiHidden="1" w:unhideWhenUsed="1"/>
-    <w:lsdException w:name="HTML Acronym" w:semiHidden="1" w:unhideWhenUsed="1"/>
-    <w:lsdException w:name="HTML Address" w:semiHidden="1" w:unhideWhenUsed="1"/>
-    <w:lsdException w:name="HTML Cite" w:semiHidden="1" w:unhideWhenUsed="1"/>
-    <w:lsdException w:name="HTML Code" w:semiHidden="1" w:unhideWhenUsed="1"/>
-    <w:lsdException w:name="HTML Definition" w:semiHidden="1" w:unhideWhenUsed="1"/>
-    <w:lsdException w:name="HTML Keyboard" w:semiHidden="1" w:unhideWhenUsed="1"/>
-    <w:lsdException w:name="HTML Preformatted" w:semiHidden="1" w:unhideWhenUsed="1"/>
-    <w:lsdException w:name="HTML Sample" w:semiHidden="1" w:unhideWhenUsed="1"/>
-    <w:lsdException w:name="HTML Typewriter" w:semiHidden="1" w:unhideWhenUsed="1"/>
-    <w:lsdException w:name="HTML Variable" w:semiHidden="1" w:unhideWhenUsed="1"/>
-    <w:lsdException w:name="Normal Table" w:semiHidden="1" w:unhideWhenUsed="1"/>
-    <w:lsdException w:name="annotation subject" w:semiHidden="1" w:unhideWhenUsed="1"/>
-    <w:lsdException w:name="No List" w:semiHidden="1" w:unhideWhenUsed="1"/>
-    <w:lsdException w:name="Outline List 1" w:semiHidden="1" w:unhideWhenUsed="1"/>
-    <w:lsdException w:name="Outline List 2" w:semiHidden="1" w:unhideWhenUsed="1"/>
-    <w:lsdException w:name="Outline List 3" w:semiHidden="1" w:unhideWhenUsed="1"/>
-    <w:lsdException w:name="Table Simple 1" w:semiHidden="1" w:unhideWhenUsed="1"/>
-    <w:lsdException w:name="Table Simple 2" w:semiHidden="1" w:unhideWhenUsed="1"/>
-    <w:lsdException w:name="Table Simple 3" w:semiHidden="1" w:unhideWhenUsed="1"/>
-    <w:lsdException w:name="Table Classic 1" w:semiHidden="1" w:unhideWhenUsed="1"/>
-    <w:lsdException w:name="Table Classic 2" w:semiHidden="1" w:unhideWhenUsed="1"/>
-    <w:lsdException w:name="Table Classic 3" w:semiHidden="1" w:unhideWhenUsed="1"/>
-    <w:lsdException w:name="Table Classic 4" w:semiHidden="1" w:unhideWhenUsed="1"/>
-    <w:lsdException w:name="Table Colorful 1" w:semiHidden="1" w:unhideWhenUsed="1"/>
-    <w:lsdException w:name="Table Colorful 2" w:semiHidden="1" w:unhideWhenUsed="1"/>
-    <w:lsdException w:name="Table Colorful 3" w:semiHidden="1" w:unhideWhenUsed="1"/>
-    <w:lsdException w:name="Table Columns 1" w:semiHidden="1" w:unhideWhenUsed="1"/>
-    <w:lsdException w:name="Table Columns 2" w:semiHidden="1" w:unhideWhenUsed="1"/>
-    <w:lsdException w:name="Table Columns 3" w:semiHidden="1" w:unhideWhenUsed="1"/>
-    <w:lsdException w:name="Table Columns 4" w:semiHidden="1" w:unhideWhenUsed="1"/>
-    <w:lsdException w:name="Table Columns 5" w:semiHidden="1" w:unhideWhenUsed="1"/>
-    <w:lsdException w:name="Table Grid 1" w:semiHidden="1" w:unhideWhenUsed="1"/>
-    <w:lsdException w:name="Table Grid 2" w:semiHidden="1" w:unhideWhenUsed="1"/>
-    <w:lsdException w:name="Table Grid 3" w:semiHidden="1" w:unhideWhenUsed="1"/>
-    <w:lsdException w:name="Table Grid 4" w:semiHidden="1" w:unhideWhenUsed="1"/>
-    <w:lsdException w:name="Table Grid 5" w:semiHidden="1" w:unhideWhenUsed="1"/>
-    <w:lsdException w:name="Table Grid 6" w:semiHidden="1" w:unhideWhenUsed="1"/>
-    <w:lsdException w:name="Table Grid 7" w:semiHidden="1" w:unhideWhenUsed="1"/>
-    <w:lsdException w:name="Table Grid 8" w:semiHidden="1" w:unhideWhenUsed="1"/>
-    <w:lsdException w:name="Table List 1" w:semiHidden="1" w:unhideWhenUsed="1"/>
-    <w:lsdException w:name="Table List 2" w:semiHidden="1" w:unhideWhenUsed="1"/>
-    <w:lsdException w:name="Table List 3" w:semiHidden="1" w:unhideWhenUsed="1"/>
-    <w:lsdException w:name="Table List 4" w:semiHidden="1" w:unhideWhenUsed="1"/>
-    <w:lsdException w:name="Table List 5" w:semiHidden="1" w:unhideWhenUsed="1"/>
-    <w:lsdException w:name="Table List 6" w:semiHidden="1" w:unhideWhenUsed="1"/>
-    <w:lsdException w:name="Table List 7" w:semiHidden="1" w:unhideWhenUsed="1"/>
-    <w:lsdException w:name="Table List 8" w:semiHidden="1" w:unhideWhenUsed="1"/>
-    <w:lsdException w:name="Table 3D effects 1" w:semiHidden="1" w:unhideWhenUsed="1"/>
-    <w:lsdException w:name="Table 3D effects 2" w:semiHidden="1" w:unhideWhenUsed="1"/>
-    <w:lsdException w:name="Table 3D effects 3" w:semiHidden="1" w:unhideWhenUsed="1"/>
-    <w:lsdException w:name="Table Contemporary" w:semiHidden="1" w:unhideWhenUsed="1"/>
-    <w:lsdException w:name="Table Elegant" w:semiHidden="1" w:unhideWhenUsed="1"/>
-    <w:lsdException w:name="Table Professional" w:semiHidden="1" w:unhideWhenUsed="1"/>
-    <w:lsdException w:name="Table Subtle 1" w:semiHidden="1" w:unhideWhenUsed="1"/>
-    <w:lsdException w:name="Table Subtle 2" w:semiHidden="1" w:unhideWhenUsed="1"/>
-    <w:lsdException w:name="Table Web 1" w:semiHidden="1" w:unhideWhenUsed="1"/>
-    <w:lsdException w:name="Table Web 2" w:semiHidden="1" w:unhideWhenUsed="1"/>
-    <w:lsdException w:name="Table Web 3" w:semiHidden="1" w:unhideWhenUsed="1"/>
-    <w:lsdException w:name="Balloon Text" w:semiHidden="1" w:unhideWhenUsed="1"/>
-    <w:lsdException w:name="Table Grid" w:semiHidden="1" w:uiPriority="39" w:unhideWhenUsed="1"/>
-    <w:lsdException w:name="Table Theme" w:semiHidden="1" w:unhideWhenUsed="1"/>
-    <w:lsdException w:name="Placeholder Text" w:semiHidden="1"/>
-    <w:lsdException w:name="No Spacing" w:uiPriority="1" w:qFormat="1"/>
-    <w:lsdException w:name="Light Shading" w:uiPriority="60"/>
-    <w:lsdException w:name="Light List" w:uiPriority="61"/>
-    <w:lsdException w:name="Light Grid" w:uiPriority="62"/>
-    <w:lsdException w:name="Medium Shading 1" w:uiPriority="63"/>
-    <w:lsdException w:name="Medium Shading 2" w:uiPriority="64"/>
-    <w:lsdException w:name="Medium List 1" w:uiPriority="65"/>
-    <w:lsdException w:name="Medium List 2" w:uiPriority="66"/>
-    <w:lsdException w:name="Medium Grid 1" w:uiPriority="67"/>
-    <w:lsdException w:name="Medium Grid 2" w:uiPriority="68"/>
-    <w:lsdException w:name="Medium Grid 3" w:uiPriority="69"/>
-    <w:lsdException w:name="Dark List" w:uiPriority="70"/>
-    <w:lsdException w:name="Colorful Shading" w:uiPriority="71"/>
-    <w:lsdException w:name="Colorful List" w:uiPriority="72"/>
-    <w:lsdException w:name="Colorful Grid" w:uiPriority="73"/>
-    <w:lsdException w:name="Light Shading Accent 1" w:uiPriority="60"/>
-    <w:lsdException w:name="Light List Accent 1" w:uiPriority="61"/>
-    <w:lsdException w:name="Light Grid Accent 1" w:uiPriority="62"/>
-    <w:lsdException w:name="Medium Shading 1 Accent 1" w:uiPriority="63"/>
-    <w:lsdException w:name="Medium Shading 2 Accent 1" w:uiPriority="64"/>
-    <w:lsdException w:name="Medium List 1 Accent 1" w:uiPriority="65"/>
-    <w:lsdException w:name="Revision" w:semiHidden="1"/>
-    <w:lsdException w:name="List Paragraph" w:uiPriority="34" w:qFormat="1"/>
-    <w:lsdException w:name="Quote" w:uiPriority="29" w:qFormat="1"/>
-    <w:lsdException w:name="Intense Quote" w:uiPriority="30" w:qFormat="1"/>
-    <w:lsdException w:name="Medium List 2 Accent 1" w:uiPriority="66"/>
-    <w:lsdException w:name="Medium Grid 1 Accent 1" w:uiPriority="67"/>
-    <w:lsdException w:name="Medium Grid 2 Accent 1" w:uiPriority="68"/>
-    <w:lsdException w:name="Medium Grid 3 Accent 1" w:uiPriority="69"/>
-    <w:lsdException w:name="Dark List Accent 1" w:uiPriority="70"/>
-    <w:lsdException w:name="Colorful Shading Accent 1" w:uiPriority="71"/>
-    <w:lsdException w:name="Colorful List Accent 1" w:uiPriority="72"/>
-    <w:lsdException w:name="Colorful Grid Accent 1" w:uiPriority="73"/>
-    <w:lsdException w:name="Light Shading Accent 2" w:uiPriority="60"/>
-    <w:lsdException w:name="Light List Accent 2" w:uiPriority="61"/>
-    <w:lsdException w:name="Light Grid Accent 2" w:uiPriority="62"/>
-    <w:lsdException w:name="Medium Shading 1 Accent 2" w:uiPriority="63"/>
-    <w:lsdException w:name="Medium Shading 2 Accent 2" w:uiPriority="64"/>
-    <w:lsdException w:name="Medium List 1 Accent 2" w:uiPriority="65"/>
-    <w:lsdException w:name="Medium List 2 Accent 2" w:uiPriority="66"/>
-    <w:lsdException w:name="Medium Grid 1 Accent 2" w:uiPriority="67"/>
-    <w:lsdException w:name="Medium Grid 2 Accent 2" w:uiPriority="68"/>
-    <w:lsdException w:name="Medium Grid 3 Accent 2" w:uiPriority="69"/>
-    <w:lsdException w:name="Dark List Accent 2" w:uiPriority="70"/>
-    <w:lsdException w:name="Colorful Shading Accent 2" w:uiPriority="71"/>
-    <w:lsdException w:name="Colorful List Accent 2" w:uiPriority="72"/>
-    <w:lsdException w:name="Colorful Grid Accent 2" w:uiPriority="73"/>
-    <w:lsdException w:name="Light Shading Accent 3" w:uiPriority="60"/>
-    <w:lsdException w:name="Light List Accent 3" w:uiPriority="61"/>
-    <w:lsdException w:name="Light Grid Accent 3" w:uiPriority="62"/>
-    <w:lsdException w:name="Medium Shading 1 Accent 3" w:uiPriority="63"/>
-    <w:lsdException w:name="Medium Shading 2 Accent 3" w:uiPriority="64"/>
-    <w:lsdException w:name="Medium List 1 Accent 3" w:uiPriority="65"/>
-    <w:lsdException w:name="Medium List 2 Accent 3" w:uiPriority="66"/>
-    <w:lsdException w:name="Medium Grid 1 Accent 3" w:uiPriority="67"/>
-    <w:lsdException w:name="Medium Grid 2 Accent 3" w:uiPriority="68"/>
-    <w:lsdException w:name="Medium Grid 3 Accent 3" w:uiPriority="69"/>
-    <w:lsdException w:name="Dark List Accent 3" w:uiPriority="70"/>
-    <w:lsdException w:name="Colorful Shading Accent 3" w:uiPriority="71"/>
-    <w:lsdException w:name="Colorful List Accent 3" w:uiPriority="72"/>
-    <w:lsdException w:name="Colorful Grid Accent 3" w:uiPriority="73"/>
-    <w:lsdException w:name="Light Shading Accent 4" w:uiPriority="60"/>
-    <w:lsdException w:name="Light List Accent 4" w:uiPriority="61"/>
-    <w:lsdException w:name="Light Grid Accent 4" w:uiPriority="62"/>
-    <w:lsdException w:name="Medium Shading 1 Accent 4" w:uiPriority="63"/>
-    <w:lsdException w:name="Medium Shading 2 Accent 4" w:uiPriority="64"/>
-    <w:lsdException w:name="Medium List 1 Accent 4" w:uiPriority="65"/>
-    <w:lsdException w:name="Medium List 2 Accent 4" w:uiPriority="66"/>
-    <w:lsdException w:name="Medium Grid 1 Accent 4" w:uiPriority="67"/>
-    <w:lsdException w:name="Medium Grid 2 Accent 4" w:uiPriority="68"/>
-    <w:lsdException w:name="Medium Grid 3 Accent 4" w:uiPriority="69"/>
-    <w:lsdException w:name="Dark List Accent 4" w:uiPriority="70"/>
-    <w:lsdException w:name="Colorful Shading Accent 4" w:uiPriority="71"/>
-    <w:lsdException w:name="Colorful List Accent 4" w:uiPriority="72"/>
-    <w:lsdException w:name="Colorful Grid Accent 4" w:uiPriority="73"/>
-    <w:lsdException w:name="Light Shading Accent 5" w:uiPriority="60"/>
-    <w:lsdException w:name="Light List Accent 5" w:uiPriority="61"/>
-    <w:lsdException w:name="Light Grid Accent 5" w:uiPriority="62"/>
-    <w:lsdException w:name="Medium Shading 1 Accent 5" w:uiPriority="63"/>
-    <w:lsdException w:name="Medium Shading 2 Accent 5" w:uiPriority="64"/>
-    <w:lsdException w:name="Medium List 1 Accent 5" w:uiPriority="65"/>
-    <w:lsdException w:name="Medium List 2 Accent 5" w:uiPriority="66"/>
-    <w:lsdException w:name="Medium Grid 1 Accent 5" w:uiPriority="67"/>
-    <w:lsdException w:name="Medium Grid 2 Accent 5" w:uiPriority="68"/>
-    <w:lsdException w:name="Medium Grid 3 Accent 5" w:uiPriority="69"/>
-    <w:lsdException w:name="Dark List Accent 5" w:uiPriority="70"/>
-    <w:lsdException w:name="Colorful Shading Accent 5" w:uiPriority="71"/>
-    <w:lsdException w:name="Colorful List Accent 5" w:uiPriority="72"/>
-    <w:lsdException w:name="Colorful Grid Accent 5" w:uiPriority="73"/>
-    <w:lsdException w:name="Light Shading Accent 6" w:uiPriority="60"/>
-    <w:lsdException w:name="Light List Accent 6" w:uiPriority="61"/>
-    <w:lsdException w:name="Light Grid Accent 6" w:uiPriority="62"/>
-    <w:lsdException w:name="Medium Shading 1 Accent 6" w:uiPriority="63"/>
-    <w:lsdException w:name="Medium Shading 2 Accent 6" w:uiPriority="64"/>
-    <w:lsdException w:name="Medium List 1 Accent 6" w:uiPriority="65"/>
-    <w:lsdException w:name="Medium List 2 Accent 6" w:uiPriority="66"/>
-    <w:lsdException w:name="Medium Grid 1 Accent 6" w:uiPriority="67"/>
-    <w:lsdException w:name="Medium Grid 2 Accent 6" w:uiPriority="68"/>
-    <w:lsdException w:name="Medium Grid 3 Accent 6" w:uiPriority="69"/>
-    <w:lsdException w:name="Dark List Accent 6" w:uiPriority="70"/>
-    <w:lsdException w:name="Colorful Shading Accent 6" w:uiPriority="71"/>
-    <w:lsdException w:name="Colorful List Accent 6" w:uiPriority="72"/>
-    <w:lsdException w:name="Colorful Grid Accent 6" w:uiPriority="73"/>
-    <w:lsdException w:name="Subtle Emphasis" w:uiPriority="19" w:qFormat="1"/>
-    <w:lsdException w:name="Intense Emphasis" w:uiPriority="21" w:qFormat="1"/>
-    <w:lsdException w:name="Subtle Reference" w:uiPriority="31" w:qFormat="1"/>
-    <w:lsdException w:name="Intense Reference" w:uiPriority="32" w:qFormat="1"/>
-    <w:lsdException w:name="Book Title" w:uiPriority="33" w:qFormat="1"/>
-    <w:lsdException w:name="Bibliography" w:semiHidden="1" w:uiPriority="37" w:unhideWhenUsed="1"/>
-    <w:lsdException w:name="TOC Heading" w:semiHidden="1" w:uiPriority="39" w:unhideWhenUsed="1" w:qFormat="1"/>
-    <w:lsdException w:name="Plain Table 1" w:uiPriority="41"/>
-    <w:lsdException w:name="Plain Table 2" w:uiPriority="42"/>
-    <w:lsdException w:name="Plain Table 3" w:uiPriority="43"/>
-    <w:lsdException w:name="Plain Table 4" w:uiPriority="44"/>
-    <w:lsdException w:name="Plain Table 5" w:uiPriority="45"/>
-    <w:lsdException w:name="Grid Table Light" w:uiPriority="40"/>
-    <w:lsdException w:name="Grid Table 1 Light" w:uiPriority="46"/>
-    <w:lsdException w:name="Grid Table 2" w:uiPriority="47"/>
-    <w:lsdException w:name="Grid Table 3" w:uiPriority="48"/>
-    <w:lsdException w:name="Grid Table 4" w:uiPriority="49"/>
-    <w:lsdException w:name="Grid Table 5 Dark" w:uiPriority="50"/>
-    <w:lsdException w:name="Grid Table 6 Colorful" w:uiPriority="51"/>
-    <w:lsdException w:name="Grid Table 7 Colorful" w:uiPriority="52"/>
-    <w:lsdException w:name="Grid Table 1 Light Accent 1" w:uiPriority="46"/>
-    <w:lsdException w:name="Grid Table 2 Accent 1" w:uiPriority="47"/>
-    <w:lsdException w:name="Grid Table 3 Accent 1" w:uiPriority="48"/>
-    <w:lsdException w:name="Grid Table 4 Accent 1" w:uiPriority="49"/>
-    <w:lsdException w:name="Grid Table 5 Dark Accent 1" w:uiPriority="50"/>
-    <w:lsdException w:name="Grid Table 6 Colorful Accent 1" w:uiPriority="51"/>
-    <w:lsdException w:name="Grid Table 7 Colorful Accent 1" w:uiPriority="52"/>
-    <w:lsdException w:name="Grid Table 1 Light Accent 2" w:uiPriority="46"/>
-    <w:lsdException w:name="Grid Table 2 Accent 2" w:uiPriority="47"/>
-    <w:lsdException w:name="Grid Table 3 Accent 2" w:uiPriority="48"/>
-    <w:lsdException w:name="Grid Table 4 Accent 2" w:uiPriority="49"/>
-    <w:lsdException w:name="Grid Table 5 Dark Accent 2" w:uiPriority="50"/>
-    <w:lsdException w:name="Grid Table 6 Colorful Accent 2" w:uiPriority="51"/>
-    <w:lsdException w:name="Grid Table 7 Colorful Accent 2" w:uiPriority="52"/>
-    <w:lsdException w:name="Grid Table 1 Light Accent 3" w:uiPriority="46"/>
-    <w:lsdException w:name="Grid Table 2 Accent 3" w:uiPriority="47"/>
-    <w:lsdException w:name="Grid Table 3 Accent 3" w:uiPriority="48"/>
-    <w:lsdException w:name="Grid Table 4 Accent 3" w:uiPriority="49"/>
-    <w:lsdException w:name="Grid Table 5 Dark Accent 3" w:uiPriority="50"/>
-    <w:lsdException w:name="Grid Table 6 Colorful Accent 3" w:uiPriority="51"/>
-    <w:lsdException w:name="Grid Table 7 Colorful Accent 3" w:uiPriority="52"/>
-    <w:lsdException w:name="Grid Table 1 Light Accent 4" w:uiPriority="46"/>
-    <w:lsdException w:name="Grid Table 2 Accent 4" w:uiPriority="47"/>
-    <w:lsdException w:name="Grid Table 3 Accent 4" w:uiPriority="48"/>
-    <w:lsdException w:name="Grid Table 4 Accent 4" w:uiPriority="49"/>
-    <w:lsdException w:name="Grid Table 5 Dark Accent 4" w:uiPriority="50"/>
-    <w:lsdException w:name="Grid Table 6 Colorful Accent 4" w:uiPriority="51"/>
-    <w:lsdException w:name="Grid Table 7 Colorful Accent 4" w:uiPriority="52"/>
-    <w:lsdException w:name="Grid Table 1 Light Accent 5" w:uiPriority="46"/>
-    <w:lsdException w:name="Grid Table 2 Accent 5" w:uiPriority="47"/>
-    <w:lsdException w:name="Grid Table 3 Accent 5" w:uiPriority="48"/>
-    <w:lsdException w:name="Grid Table 4 Accent 5" w:uiPriority="49"/>
-    <w:lsdException w:name="Grid Table 5 Dark Accent 5" w:uiPriority="50"/>
-    <w:lsdException w:name="Grid Table 6 Colorful Accent 5" w:uiPriority="51"/>
-    <w:lsdException w:name="Grid Table 7 Colorful Accent 5" w:uiPriority="52"/>
-    <w:lsdException w:name="Grid Table 1 Light Accent 6" w:uiPriority="46"/>
-    <w:lsdException w:name="Grid Table 2 Accent 6" w:uiPriority="47"/>
-    <w:lsdException w:name="Grid Table 3 Accent 6" w:uiPriority="48"/>
-    <w:lsdException w:name="Grid Table 4 Accent 6" w:uiPriority="49"/>
-    <w:lsdException w:name="Grid Table 5 Dark Accent 6" w:uiPriority="50"/>
-    <w:lsdException w:name="Grid Table 6 Colorful Accent 6" w:uiPriority="51"/>
-    <w:lsdException w:name="Grid Table 7 Colorful Accent 6" w:uiPriority="52"/>
-    <w:lsdException w:name="List Table 1 Light" w:uiPriority="46"/>
-    <w:lsdException w:name="List Table 2" w:uiPriority="47"/>
-    <w:lsdException w:name="List Table 3" w:uiPriority="48"/>
-    <w:lsdException w:name="List Table 4" w:uiPriority="49"/>
-    <w:lsdException w:name="List Table 5 Dark" w:uiPriority="50"/>
-    <w:lsdException w:name="List Table 6 Colorful" w:uiPriority="51"/>
-    <w:lsdException w:name="List Table 7 Colorful" w:uiPriority="52"/>
-    <w:lsdException w:name="List Table 1 Light Accent 1" w:uiPriority="46"/>
-    <w:lsdException w:name="List Table 2 Accent 1" w:uiPriority="47"/>
-    <w:lsdException w:name="List Table 3 Accent 1" w:uiPriority="48"/>
-    <w:lsdException w:name="List Table 4 Accent 1" w:uiPriority="49"/>
-    <w:lsdException w:name="List Table 5 Dark Accent 1" w:uiPriority="50"/>
-    <w:lsdException w:name="List Table 6 Colorful Accent 1" w:uiPriority="51"/>
-    <w:lsdException w:name="List Table 7 Colorful Accent 1" w:uiPriority="52"/>
-    <w:lsdException w:name="List Table 1 Light Accent 2" w:uiPriority="46"/>
-    <w:lsdException w:name="List Table 2 Accent 2" w:uiPriority="47"/>
-    <w:lsdException w:name="List Table 3 Accent 2" w:uiPriority="48"/>
-    <w:lsdException w:name="List Table 4 Accent 2" w:uiPriority="49"/>
-    <w:lsdException w:name="List Table 5 Dark Accent 2" w:uiPriority="50"/>
-    <w:lsdException w:name="List Table 6 Colorful Accent 2" w:uiPriority="51"/>
-    <w:lsdException w:name="List Table 7 Colorful Accent 2" w:uiPriority="52"/>
-    <w:lsdException w:name="List Table 1 Light Accent 3" w:uiPriority="46"/>
-    <w:lsdException w:name="List Table 2 Accent 3" w:uiPriority="47"/>
-    <w:lsdException w:name="List Table 3 Accent 3" w:uiPriority="48"/>
-    <w:lsdException w:name="List Table 4 Accent 3" w:uiPriority="49"/>
-    <w:lsdException w:name="List Table 5 Dark Accent 3" w:uiPriority="50"/>
-    <w:lsdException w:name="List Table 6 Colorful Accent 3" w:uiPriority="51"/>
-    <w:lsdException w:name="List Table 7 Colorful Accent 3" w:uiPriority="52"/>
-    <w:lsdException w:name="List Table 1 Light Accent 4" w:uiPriority="46"/>
-    <w:lsdException w:name="List Table 2 Accent 4" w:uiPriority="47"/>
-    <w:lsdException w:name="List Table 3 Accent 4" w:uiPriority="48"/>
-    <w:lsdException w:name="List Table 4 Accent 4" w:uiPriority="49"/>
-    <w:lsdException w:name="List Table 5 Dark Accent 4" w:uiPriority="50"/>
-    <w:lsdException w:name="List Table 6 Colorful Accent 4" w:uiPriority="51"/>
-    <w:lsdException w:name="List Table 7 Colorful Accent 4" w:uiPriority="52"/>
-    <w:lsdException w:name="List Table 1 Light Accent 5" w:uiPriority="46"/>
-    <w:lsdException w:name="List Table 2 Accent 5" w:uiPriority="47"/>
-    <w:lsdException w:name="List Table 3 Accent 5" w:uiPriority="48"/>
-    <w:lsdException w:name="List Table 4 Accent 5" w:uiPriority="49"/>
-    <w:lsdException w:name="List Table 5 Dark Accent 5" w:uiPriority="50"/>
-    <w:lsdException w:name="List Table 6 Colorful Accent 5" w:uiPriority="51"/>
-    <w:lsdException w:name="List Table 7 Colorful Accent 5" w:uiPriority="52"/>
-    <w:lsdException w:name="List Table 1 Light Accent 6" w:uiPriority="46"/>
-    <w:lsdException w:name="List Table 2 Accent 6" w:uiPriority="47"/>
-    <w:lsdException w:name="List Table 3 Accent 6" w:uiPriority="48"/>
-    <w:lsdException w:name="List Table 4 Accent 6" w:uiPriority="49"/>
-    <w:lsdException w:name="List Table 5 Dark Accent 6" w:uiPriority="50"/>
-    <w:lsdException w:name="List Table 6 Colorful Accent 6" w:uiPriority="51"/>
-    <w:lsdException w:name="List Table 7 Colorful Accent 6" w:uiPriority="52"/>
-    <w:lsdException w:name="Mention" w:semiHidden="1" w:unhideWhenUsed="1"/>
-    <w:lsdException w:name="Smart Hyperlink" w:semiHidden="1" w:unhideWhenUsed="1"/>
-    <w:lsdException w:name="Hashtag" w:semiHidden="1" w:unhideWhenUsed="1"/>
-    <w:lsdException w:name="Unresolved Mention" w:semiHidden="1" w:unhideWhenUsed="1"/>
-    <w:lsdException w:name="Smart Link" w:semiHidden="1" w:unhideWhenUsed="1"/>
+  <w:latentStyles w:defLockedState="0" w:defUIPriority="99" w:defSemiHidden="1" w:defUnhideWhenUsed="1" w:defQFormat="0" w:count="267">
+    <w:lsdException w:name="Normal" w:semiHidden="0" w:uiPriority="0" w:unhideWhenUsed="0" w:qFormat="1"/>
+    <w:lsdException w:name="heading 1" w:semiHidden="0" w:uiPriority="9" w:unhideWhenUsed="0" w:qFormat="1"/>
+    <w:lsdException w:name="heading 2" w:uiPriority="9" w:qFormat="1"/>
+    <w:lsdException w:name="heading 3" w:uiPriority="9" w:qFormat="1"/>
+    <w:lsdException w:name="heading 4" w:uiPriority="9" w:qFormat="1"/>
+    <w:lsdException w:name="heading 5" w:uiPriority="9" w:qFormat="1"/>
+    <w:lsdException w:name="heading 6" w:uiPriority="9" w:qFormat="1"/>
+    <w:lsdException w:name="heading 7" w:uiPriority="9" w:qFormat="1"/>
+    <w:lsdException w:name="heading 8" w:uiPriority="9" w:qFormat="1"/>
+    <w:lsdException w:name="heading 9" w:uiPriority="9" w:qFormat="1"/>
+    <w:lsdException w:name="toc 1" w:uiPriority="39"/>
+    <w:lsdException w:name="toc 2" w:uiPriority="39"/>
+    <w:lsdException w:name="toc 3" w:uiPriority="39"/>
+    <w:lsdException w:name="toc 4" w:uiPriority="39"/>
+    <w:lsdException w:name="toc 5" w:uiPriority="39"/>
+    <w:lsdException w:name="toc 6" w:uiPriority="39"/>
+    <w:lsdException w:name="toc 7" w:uiPriority="39"/>
+    <w:lsdException w:name="toc 8" w:uiPriority="39"/>
+    <w:lsdException w:name="toc 9" w:uiPriority="39"/>
+    <w:lsdException w:name="caption" w:uiPriority="35" w:qFormat="1"/>
+    <w:lsdException w:name="Title" w:semiHidden="0" w:uiPriority="10" w:unhideWhenUsed="0" w:qFormat="1"/>
+    <w:lsdException w:name="Default Paragraph Font" w:uiPriority="1"/>
+    <w:lsdException w:name="Subtitle" w:semiHidden="0" w:uiPriority="11" w:unhideWhenUsed="0" w:qFormat="1"/>
+    <w:lsdException w:name="Strong" w:semiHidden="0" w:uiPriority="22" w:unhideWhenUsed="0" w:qFormat="1"/>
+    <w:lsdException w:name="Emphasis" w:semiHidden="0" w:uiPriority="20" w:unhideWhenUsed="0" w:qFormat="1"/>
+    <w:lsdException w:name="Table Grid" w:uiPriority="39"/>
+    <w:lsdException w:name="Placeholder Text" w:unhideWhenUsed="0"/>
+    <w:lsdException w:name="No Spacing" w:semiHidden="0" w:uiPriority="1" w:unhideWhenUsed="0" w:qFormat="1"/>
+    <w:lsdException w:name="Light Shading" w:semiHidden="0" w:uiPriority="60" w:unhideWhenUsed="0"/>
+    <w:lsdException w:name="Light List" w:semiHidden="0" w:uiPriority="61" w:unhideWhenUsed="0"/>
+    <w:lsdException w:name="Light Grid" w:semiHidden="0" w:uiPriority="62" w:unhideWhenUsed="0"/>
+    <w:lsdException w:name="Medium Shading 1" w:semiHidden="0" w:uiPriority="63" w:unhideWhenUsed="0"/>
+    <w:lsdException w:name="Medium Shading 2" w:semiHidden="0" w:uiPriority="64" w:unhideWhenUsed="0"/>
+    <w:lsdException w:name="Medium List 1" w:semiHidden="0" w:uiPriority="65" w:unhideWhenUsed="0"/>
+    <w:lsdException w:name="Medium List 2" w:semiHidden="0" w:uiPriority="66" w:unhideWhenUsed="0"/>
+    <w:lsdException w:name="Medium Grid 1" w:semiHidden="0" w:uiPriority="67" w:unhideWhenUsed="0"/>
+    <w:lsdException w:name="Medium Grid 2" w:semiHidden="0" w:uiPriority="68" w:unhideWhenUsed="0"/>
+    <w:lsdException w:name="Medium Grid 3" w:semiHidden="0" w:uiPriority="69" w:unhideWhenUsed="0"/>
+    <w:lsdException w:name="Dark List" w:semiHidden="0" w:uiPriority="70" w:unhideWhenUsed="0"/>
+    <w:lsdException w:name="Colorful Shading" w:semiHidden="0" w:uiPriority="71" w:unhideWhenUsed="0"/>
+    <w:lsdException w:name="Colorful List" w:semiHidden="0" w:uiPriority="72" w:unhideWhenUsed="0"/>
+    <w:lsdException w:name="Colorful Grid" w:semiHidden="0" w:uiPriority="73" w:unhideWhenUsed="0"/>
+    <w:lsdException w:name="Light Shading Accent 1" w:semiHidden="0" w:uiPriority="60" w:unhideWhenUsed="0"/>
+    <w:lsdException w:name="Light List Accent 1" w:semiHidden="0" w:uiPriority="61" w:unhideWhenUsed="0"/>
+    <w:lsdException w:name="Light Grid Accent 1" w:semiHidden="0" w:uiPriority="62" w:unhideWhenUsed="0"/>
+    <w:lsdException w:name="Medium Shading 1 Accent 1" w:semiHidden="0" w:uiPriority="63" w:unhideWhenUsed="0"/>
+    <w:lsdException w:name="Medium Shading 2 Accent 1" w:semiHidden="0" w:uiPriority="64" w:unhideWhenUsed="0"/>
+    <w:lsdException w:name="Medium List 1 Accent 1" w:semiHidden="0" w:uiPriority="65" w:unhideWhenUsed="0"/>
+    <w:lsdException w:name="Revision" w:unhideWhenUsed="0"/>
+    <w:lsdException w:name="List Paragraph" w:semiHidden="0" w:uiPriority="34" w:unhideWhenUsed="0" w:qFormat="1"/>
+    <w:lsdException w:name="Quote" w:semiHidden="0" w:uiPriority="29" w:unhideWhenUsed="0" w:qFormat="1"/>
+    <w:lsdException w:name="Intense Quote" w:semiHidden="0" w:uiPriority="30" w:unhideWhenUsed="0" w:qFormat="1"/>
+    <w:lsdException w:name="Medium List 2 Accent 1" w:semiHidden="0" w:uiPriority="66" w:unhideWhenUsed="0"/>
+    <w:lsdException w:name="Medium Grid 1 Accent 1" w:semiHidden="0" w:uiPriority="67" w:unhideWhenUsed="0"/>
+    <w:lsdException w:name="Medium Grid 2 Accent 1" w:semiHidden="0" w:uiPriority="68" w:unhideWhenUsed="0"/>
+    <w:lsdException w:name="Medium Grid 3 Accent 1" w:semiHidden="0" w:uiPriority="69" w:unhideWhenUsed="0"/>
+    <w:lsdException w:name="Dark List Accent 1" w:semiHidden="0" w:uiPriority="70" w:unhideWhenUsed="0"/>
+    <w:lsdException w:name="Colorful Shading Accent 1" w:semiHidden="0" w:uiPriority="71" w:unhideWhenUsed="0"/>
+    <w:lsdException w:name="Colorful List Accent 1" w:semiHidden="0" w:uiPriority="72" w:unhideWhenUsed="0"/>
+    <w:lsdException w:name="Colorful Grid Accent 1" w:semiHidden="0" w:uiPriority="73" w:unhideWhenUsed="0"/>
+    <w:lsdException w:name="Light Shading Accent 2" w:semiHidden="0" w:uiPriority="60" w:unhideWhenUsed="0"/>
+    <w:lsdException w:name="Light List Accent 2" w:semiHidden="0" w:uiPriority="61" w:unhideWhenUsed="0"/>
+    <w:lsdException w:name="Light Grid Accent 2" w:semiHidden="0" w:uiPriority="62" w:unhideWhenUsed="0"/>
+    <w:lsdException w:name="Medium Shading 1 Accent 2" w:semiHidden="0" w:uiPriority="63" w:unhideWhenUsed="0"/>
+    <w:lsdException w:name="Medium Shading 2 Accent 2" w:semiHidden="0" w:uiPriority="64" w:unhideWhenUsed="0"/>
+    <w:lsdException w:name="Medium List 1 Accent 2" w:semiHidden="0" w:uiPriority="65" w:unhideWhenUsed="0"/>
+    <w:lsdException w:name="Medium List 2 Accent 2" w:semiHidden="0" w:uiPriority="66" w:unhideWhenUsed="0"/>
+    <w:lsdException w:name="Medium Grid 1 Accent 2" w:semiHidden="0" w:uiPriority="67" w:unhideWhenUsed="0"/>
+    <w:lsdException w:name="Medium Grid 2 Accent 2" w:semiHidden="0" w:uiPriority="68" w:unhideWhenUsed="0"/>
+    <w:lsdException w:name="Medium Grid 3 Accent 2" w:semiHidden="0" w:uiPriority="69" w:unhideWhenUsed="0"/>
+    <w:lsdException w:name="Dark List Accent 2" w:semiHidden="0" w:uiPriority="70" w:unhideWhenUsed="0"/>
+    <w:lsdException w:name="Colorful Shading Accent 2" w:semiHidden="0" w:uiPriority="71" w:unhideWhenUsed="0"/>
+    <w:lsdException w:name="Colorful List Accent 2" w:semiHidden="0" w:uiPriority="72" w:unhideWhenUsed="0"/>
+    <w:lsdException w:name="Colorful Grid Accent 2" w:semiHidden="0" w:uiPriority="73" w:unhideWhenUsed="0"/>
+    <w:lsdException w:name="Light Shading Accent 3" w:semiHidden="0" w:uiPriority="60" w:unhideWhenUsed="0"/>
+    <w:lsdException w:name="Light List Accent 3" w:semiHidden="0" w:uiPriority="61" w:unhideWhenUsed="0"/>
+    <w:lsdException w:name="Light Grid Accent 3" w:semiHidden="0" w:uiPriority="62" w:unhideWhenUsed="0"/>
+    <w:lsdException w:name="Medium Shading 1 Accent 3" w:semiHidden="0" w:uiPriority="63" w:unhideWhenUsed="0"/>
+    <w:lsdException w:name="Medium Shading 2 Accent 3" w:semiHidden="0" w:uiPriority="64" w:unhideWhenUsed="0"/>
+    <w:lsdException w:name="Medium List 1 Accent 3" w:semiHidden="0" w:uiPriority="65" w:unhideWhenUsed="0"/>
+    <w:lsdException w:name="Medium List 2 Accent 3" w:semiHidden="0" w:uiPriority="66" w:unhideWhenUsed="0"/>
+    <w:lsdException w:name="Medium Grid 1 Accent 3" w:semiHidden="0" w:uiPriority="67" w:unhideWhenUsed="0"/>
+    <w:lsdException w:name="Medium Grid 2 Accent 3" w:semiHidden="0" w:uiPriority="68" w:unhideWhenUsed="0"/>
+    <w:lsdException w:name="Medium Grid 3 Accent 3" w:semiHidden="0" w:uiPriority="69" w:unhideWhenUsed="0"/>
+    <w:lsdException w:name="Dark List Accent 3" w:semiHidden="0" w:uiPriority="70" w:unhideWhenUsed="0"/>
+    <w:lsdException w:name="Colorful Shading Accent 3" w:semiHidden="0" w:uiPriority="71" w:unhideWhenUsed="0"/>
+    <w:lsdException w:name="Colorful List Accent 3" w:semiHidden="0" w:uiPriority="72" w:unhideWhenUsed="0"/>
+    <w:lsdException w:name="Colorful Grid Accent 3" w:semiHidden="0" w:uiPriority="73" w:unhideWhenUsed="0"/>
+    <w:lsdException w:name="Light Shading Accent 4" w:semiHidden="0" w:uiPriority="60" w:unhideWhenUsed="0"/>
+    <w:lsdException w:name="Light List Accent 4" w:semiHidden="0" w:uiPriority="61" w:unhideWhenUsed="0"/>
+    <w:lsdException w:name="Light Grid Accent 4" w:semiHidden="0" w:uiPriority="62" w:unhideWhenUsed="0"/>
+    <w:lsdException w:name="Medium Shading 1 Accent 4" w:semiHidden="0" w:uiPriority="63" w:unhideWhenUsed="0"/>
+    <w:lsdException w:name="Medium Shading 2 Accent 4" w:semiHidden="0" w:uiPriority="64" w:unhideWhenUsed="0"/>
+    <w:lsdException w:name="Medium List 1 Accent 4" w:semiHidden="0" w:uiPriority="65" w:unhideWhenUsed="0"/>
+    <w:lsdException w:name="Medium List 2 Accent 4" w:semiHidden="0" w:uiPriority="66" w:unhideWhenUsed="0"/>
+    <w:lsdException w:name="Medium Grid 1 Accent 4" w:semiHidden="0" w:uiPriority="67" w:unhideWhenUsed="0"/>
+    <w:lsdException w:name="Medium Grid 2 Accent 4" w:semiHidden="0" w:uiPriority="68" w:unhideWhenUsed="0"/>
+    <w:lsdException w:name="Medium Grid 3 Accent 4" w:semiHidden="0" w:uiPriority="69" w:unhideWhenUsed="0"/>
+    <w:lsdException w:name="Dark List Accent 4" w:semiHidden="0" w:uiPriority="70" w:unhideWhenUsed="0"/>
+    <w:lsdException w:name="Colorful Shading Accent 4" w:semiHidden="0" w:uiPriority="71" w:unhideWhenUsed="0"/>
+    <w:lsdException w:name="Colorful List Accent 4" w:semiHidden="0" w:uiPriority="72" w:unhideWhenUsed="0"/>
+    <w:lsdException w:name="Colorful Grid Accent 4" w:semiHidden="0" w:uiPriority="73" w:unhideWhenUsed="0"/>
+    <w:lsdException w:name="Light Shading Accent 5" w:semiHidden="0" w:uiPriority="60" w:unhideWhenUsed="0"/>
+    <w:lsdException w:name="Light List Accent 5" w:semiHidden="0" w:uiPriority="61" w:unhideWhenUsed="0"/>
+    <w:lsdException w:name="Light Grid Accent 5" w:semiHidden="0" w:uiPriority="62" w:unhideWhenUsed="0"/>
+    <w:lsdException w:name="Medium Shading 1 Accent 5" w:semiHidden="0" w:uiPriority="63" w:unhideWhenUsed="0"/>
+    <w:lsdException w:name="Medium Shading 2 Accent 5" w:semiHidden="0" w:uiPriority="64" w:unhideWhenUsed="0"/>
+    <w:lsdException w:name="Medium List 1 Accent 5" w:semiHidden="0" w:uiPriority="65" w:unhideWhenUsed="0"/>
+    <w:lsdException w:name="Medium List 2 Accent 5" w:semiHidden="0" w:uiPriority="66" w:unhideWhenUsed="0"/>
+    <w:lsdException w:name="Medium Grid 1 Accent 5" w:semiHidden="0" w:uiPriority="67" w:unhideWhenUsed="0"/>
+    <w:lsdException w:name="Medium Grid 2 Accent 5" w:semiHidden="0" w:uiPriority="68" w:unhideWhenUsed="0"/>
+    <w:lsdException w:name="Medium Grid 3 Accent 5" w:semiHidden="0" w:uiPriority="69" w:unhideWhenUsed="0"/>
+    <w:lsdException w:name="Dark List Accent 5" w:semiHidden="0" w:uiPriority="70" w:unhideWhenUsed="0"/>
+    <w:lsdException w:name="Colorful Shading Accent 5" w:semiHidden="0" w:uiPriority="71" w:unhideWhenUsed="0"/>
+    <w:lsdException w:name="Colorful List Accent 5" w:semiHidden="0" w:uiPriority="72" w:unhideWhenUsed="0"/>
+    <w:lsdException w:name="Colorful Grid Accent 5" w:semiHidden="0" w:uiPriority="73" w:unhideWhenUsed="0"/>
+    <w:lsdException w:name="Light Shading Accent 6" w:semiHidden="0" w:uiPriority="60" w:unhideWhenUsed="0"/>
+    <w:lsdException w:name="Light List Accent 6" w:semiHidden="0" w:uiPriority="61" w:unhideWhenUsed="0"/>
+    <w:lsdException w:name="Light Grid Accent 6" w:semiHidden="0" w:uiPriority="62" w:unhideWhenUsed="0"/>
+    <w:lsdException w:name="Medium Shading 1 Accent 6" w:semiHidden="0" w:uiPriority="63" w:unhideWhenUsed="0"/>
+    <w:lsdException w:name="Medium Shading 2 Accent 6" w:semiHidden="0" w:uiPriority="64" w:unhideWhenUsed="0"/>
+    <w:lsdException w:name="Medium List 1 Accent 6" w:semiHidden="0" w:uiPriority="65" w:unhideWhenUsed="0"/>
+    <w:lsdException w:name="Medium List 2 Accent 6" w:semiHidden="0" w:uiPriority="66" w:unhideWhenUsed="0"/>
+    <w:lsdException w:name="Medium Grid 1 Accent 6" w:semiHidden="0" w:uiPriority="67" w:unhideWhenUsed="0"/>
+    <w:lsdException w:name="Medium Grid 2 Accent 6" w:semiHidden="0" w:uiPriority="68" w:unhideWhenUsed="0"/>
+    <w:lsdException w:name="Medium Grid 3 Accent 6" w:semiHidden="0" w:uiPriority="69" w:unhideWhenUsed="0"/>
+    <w:lsdException w:name="Dark List Accent 6" w:semiHidden="0" w:uiPriority="70" w:unhideWhenUsed="0"/>
+    <w:lsdException w:name="Colorful Shading Accent 6" w:semiHidden="0" w:uiPriority="71" w:unhideWhenUsed="0"/>
+    <w:lsdException w:name="Colorful List Accent 6" w:semiHidden="0" w:uiPriority="72" w:unhideWhenUsed="0"/>
+    <w:lsdException w:name="Colorful Grid Accent 6" w:semiHidden="0" w:uiPriority="73" w:unhideWhenUsed="0"/>
+    <w:lsdException w:name="Subtle Emphasis" w:semiHidden="0" w:uiPriority="19" w:unhideWhenUsed="0" w:qFormat="1"/>
+    <w:lsdException w:name="Intense Emphasis" w:semiHidden="0" w:uiPriority="21" w:unhideWhenUsed="0" w:qFormat="1"/>
+    <w:lsdException w:name="Subtle Reference" w:semiHidden="0" w:uiPriority="31" w:unhideWhenUsed="0" w:qFormat="1"/>
+    <w:lsdException w:name="Intense Reference" w:semiHidden="0" w:uiPriority="32" w:unhideWhenUsed="0" w:qFormat="1"/>
+    <w:lsdException w:name="Book Title" w:semiHidden="0" w:uiPriority="33" w:unhideWhenUsed="0" w:qFormat="1"/>
+    <w:lsdException w:name="Bibliography" w:uiPriority="37"/>
+    <w:lsdException w:name="TOC Heading" w:uiPriority="39" w:qFormat="1"/>
   </w:latentStyles>
   <w:style w:type="paragraph" w:default="1" w:styleId="Normal">
     <w:name w:val="Normal"/>
@@ -5641,7 +5426,9 @@
       <w:tblStyleRowBandSize w:val="1"/>
       <w:tblStyleColBandSize w:val="1"/>
       <w:tblCellMar>
+        <w:top w:w="0" w:type="dxa"/>
         <w:left w:w="108" w:type="dxa"/>
+        <w:bottom w:w="0" w:type="dxa"/>
         <w:right w:w="108" w:type="dxa"/>
       </w:tblCellMar>
     </w:tblPr>
@@ -5655,7 +5442,9 @@
       <w:tblStyleRowBandSize w:val="1"/>
       <w:tblStyleColBandSize w:val="1"/>
       <w:tblCellMar>
+        <w:top w:w="0" w:type="dxa"/>
         <w:left w:w="108" w:type="dxa"/>
+        <w:bottom w:w="0" w:type="dxa"/>
         <w:right w:w="108" w:type="dxa"/>
       </w:tblCellMar>
     </w:tblPr>
@@ -5666,7 +5455,9 @@
       <w:tblStyleRowBandSize w:val="1"/>
       <w:tblStyleColBandSize w:val="1"/>
       <w:tblCellMar>
+        <w:top w:w="0" w:type="dxa"/>
         <w:left w:w="115" w:type="dxa"/>
+        <w:bottom w:w="0" w:type="dxa"/>
         <w:right w:w="115" w:type="dxa"/>
       </w:tblCellMar>
     </w:tblPr>
@@ -5677,7 +5468,9 @@
       <w:tblStyleRowBandSize w:val="1"/>
       <w:tblStyleColBandSize w:val="1"/>
       <w:tblCellMar>
+        <w:top w:w="0" w:type="dxa"/>
         <w:left w:w="115" w:type="dxa"/>
+        <w:bottom w:w="0" w:type="dxa"/>
         <w:right w:w="115" w:type="dxa"/>
       </w:tblCellMar>
     </w:tblPr>
@@ -5730,6 +5523,7 @@
     <w:uiPriority w:val="39"/>
     <w:rsid w:val="00AB773A"/>
     <w:tblPr>
+      <w:tblInd w:w="0" w:type="dxa"/>
       <w:tblBorders>
         <w:top w:val="single" w:sz="4" w:space="0" w:color="auto"/>
         <w:left w:val="single" w:sz="4" w:space="0" w:color="auto"/>
@@ -5738,6 +5532,620 @@
         <w:insideH w:val="single" w:sz="4" w:space="0" w:color="auto"/>
         <w:insideV w:val="single" w:sz="4" w:space="0" w:color="auto"/>
       </w:tblBorders>
+      <w:tblCellMar>
+        <w:top w:w="0" w:type="dxa"/>
+        <w:left w:w="108" w:type="dxa"/>
+        <w:bottom w:w="0" w:type="dxa"/>
+        <w:right w:w="108" w:type="dxa"/>
+      </w:tblCellMar>
+    </w:tblPr>
+  </w:style>
+  <w:style w:type="paragraph" w:styleId="Textodeglobo">
+    <w:name w:val="Balloon Text"/>
+    <w:basedOn w:val="Normal"/>
+    <w:link w:val="TextodegloboCar"/>
+    <w:uiPriority w:val="99"/>
+    <w:semiHidden/>
+    <w:unhideWhenUsed/>
+    <w:rsid w:val="003A0A20"/>
+    <w:rPr>
+      <w:rFonts w:ascii="Segoe UI" w:hAnsi="Segoe UI" w:cs="Segoe UI"/>
+      <w:sz w:val="18"/>
+      <w:szCs w:val="18"/>
+    </w:rPr>
+  </w:style>
+  <w:style w:type="character" w:customStyle="1" w:styleId="TextodegloboCar">
+    <w:name w:val="Texto de globo Car"/>
+    <w:basedOn w:val="Fuentedeprrafopredeter"/>
+    <w:link w:val="Textodeglobo"/>
+    <w:uiPriority w:val="99"/>
+    <w:semiHidden/>
+    <w:rsid w:val="003A0A20"/>
+    <w:rPr>
+      <w:rFonts w:ascii="Segoe UI" w:hAnsi="Segoe UI" w:cs="Segoe UI"/>
+      <w:sz w:val="18"/>
+      <w:szCs w:val="18"/>
+    </w:rPr>
+  </w:style>
+  <w:style w:type="character" w:styleId="Refdecomentario">
+    <w:name w:val="annotation reference"/>
+    <w:basedOn w:val="Fuentedeprrafopredeter"/>
+    <w:uiPriority w:val="99"/>
+    <w:semiHidden/>
+    <w:unhideWhenUsed/>
+    <w:rsid w:val="00FE2FED"/>
+    <w:rPr>
+      <w:sz w:val="16"/>
+      <w:szCs w:val="16"/>
+    </w:rPr>
+  </w:style>
+  <w:style w:type="paragraph" w:styleId="Textocomentario">
+    <w:name w:val="annotation text"/>
+    <w:basedOn w:val="Normal"/>
+    <w:link w:val="TextocomentarioCar"/>
+    <w:uiPriority w:val="99"/>
+    <w:semiHidden/>
+    <w:unhideWhenUsed/>
+    <w:rsid w:val="00FE2FED"/>
+    <w:rPr>
+      <w:sz w:val="20"/>
+      <w:szCs w:val="20"/>
+    </w:rPr>
+  </w:style>
+  <w:style w:type="character" w:customStyle="1" w:styleId="TextocomentarioCar">
+    <w:name w:val="Texto comentario Car"/>
+    <w:basedOn w:val="Fuentedeprrafopredeter"/>
+    <w:link w:val="Textocomentario"/>
+    <w:uiPriority w:val="99"/>
+    <w:semiHidden/>
+    <w:rsid w:val="00FE2FED"/>
+    <w:rPr>
+      <w:sz w:val="20"/>
+      <w:szCs w:val="20"/>
+    </w:rPr>
+  </w:style>
+  <w:style w:type="paragraph" w:styleId="Asuntodelcomentario">
+    <w:name w:val="annotation subject"/>
+    <w:basedOn w:val="Textocomentario"/>
+    <w:next w:val="Textocomentario"/>
+    <w:link w:val="AsuntodelcomentarioCar"/>
+    <w:uiPriority w:val="99"/>
+    <w:semiHidden/>
+    <w:unhideWhenUsed/>
+    <w:rsid w:val="00FE2FED"/>
+    <w:rPr>
+      <w:b/>
+      <w:bCs/>
+    </w:rPr>
+  </w:style>
+  <w:style w:type="character" w:customStyle="1" w:styleId="AsuntodelcomentarioCar">
+    <w:name w:val="Asunto del comentario Car"/>
+    <w:basedOn w:val="TextocomentarioCar"/>
+    <w:link w:val="Asuntodelcomentario"/>
+    <w:uiPriority w:val="99"/>
+    <w:semiHidden/>
+    <w:rsid w:val="00FE2FED"/>
+    <w:rPr>
+      <w:b/>
+      <w:bCs/>
+      <w:sz w:val="20"/>
+      <w:szCs w:val="20"/>
+    </w:rPr>
+  </w:style>
+  <w:style w:type="paragraph" w:styleId="Revisin">
+    <w:name w:val="Revision"/>
+    <w:hidden/>
+    <w:uiPriority w:val="99"/>
+    <w:semiHidden/>
+    <w:rsid w:val="00FE2FED"/>
+  </w:style>
+  <w:style w:type="paragraph" w:styleId="NormalWeb">
+    <w:name w:val="Normal (Web)"/>
+    <w:basedOn w:val="Normal"/>
+    <w:uiPriority w:val="99"/>
+    <w:semiHidden/>
+    <w:unhideWhenUsed/>
+    <w:rsid w:val="005436A4"/>
+    <w:pPr>
+      <w:spacing w:before="100" w:beforeAutospacing="1" w:after="100" w:afterAutospacing="1"/>
+    </w:pPr>
+    <w:rPr>
+      <w:rFonts w:ascii="Times New Roman" w:eastAsia="Times New Roman" w:hAnsi="Times New Roman" w:cs="Times New Roman"/>
+      <w:sz w:val="24"/>
+      <w:szCs w:val="24"/>
+      <w:lang w:val="es-CO"/>
+    </w:rPr>
+  </w:style>
+</w:styles>
+</file>
+
+<file path=word/stylesWithEffects.xml><?xml version="1.0" encoding="utf-8"?>
+<w:styles xmlns:wpc="http://schemas.microsoft.com/office/word/2010/wordprocessingCanvas" xmlns:mc="http://schemas.openxmlformats.org/markup-compatibility/2006" xmlns:o="urn:schemas-microsoft-com:office:office" xmlns:r="http://schemas.openxmlformats.org/officeDocument/2006/relationships" xmlns:m="http://schemas.openxmlformats.org/officeDocument/2006/math" xmlns:v="urn:schemas-microsoft-com:vml" xmlns:wp14="http://schemas.microsoft.com/office/word/2010/wordprocessingDrawing" xmlns:wp="http://schemas.openxmlformats.org/drawingml/2006/wordprocessingDrawing" xmlns:w10="urn:schemas-microsoft-com:office:word" xmlns:w="http://schemas.openxmlformats.org/wordprocessingml/2006/main" xmlns:w14="http://schemas.microsoft.com/office/word/2010/wordml" xmlns:wpg="http://schemas.microsoft.com/office/word/2010/wordprocessingGroup" xmlns:wpi="http://schemas.microsoft.com/office/word/2010/wordprocessingInk" xmlns:wne="http://schemas.microsoft.com/office/word/2006/wordml" xmlns:wps="http://schemas.microsoft.com/office/word/2010/wordprocessingShape" mc:Ignorable="w14 wp14">
+  <w:docDefaults>
+    <w:rPrDefault>
+      <w:rPr>
+        <w:rFonts w:ascii="Calibri" w:eastAsia="Calibri" w:hAnsi="Calibri" w:cs="Calibri"/>
+        <w:sz w:val="22"/>
+        <w:szCs w:val="22"/>
+        <w:lang w:val="es-ES" w:eastAsia="es-CO" w:bidi="ar-SA"/>
+      </w:rPr>
+    </w:rPrDefault>
+    <w:pPrDefault/>
+  </w:docDefaults>
+  <w:latentStyles w:defLockedState="0" w:defUIPriority="99" w:defSemiHidden="1" w:defUnhideWhenUsed="1" w:defQFormat="0" w:count="267">
+    <w:lsdException w:name="Normal" w:semiHidden="0" w:uiPriority="0" w:unhideWhenUsed="0" w:qFormat="1"/>
+    <w:lsdException w:name="heading 1" w:semiHidden="0" w:uiPriority="9" w:unhideWhenUsed="0" w:qFormat="1"/>
+    <w:lsdException w:name="heading 2" w:uiPriority="9" w:qFormat="1"/>
+    <w:lsdException w:name="heading 3" w:uiPriority="9" w:qFormat="1"/>
+    <w:lsdException w:name="heading 4" w:uiPriority="9" w:qFormat="1"/>
+    <w:lsdException w:name="heading 5" w:uiPriority="9" w:qFormat="1"/>
+    <w:lsdException w:name="heading 6" w:uiPriority="9" w:qFormat="1"/>
+    <w:lsdException w:name="heading 7" w:uiPriority="9" w:qFormat="1"/>
+    <w:lsdException w:name="heading 8" w:uiPriority="9" w:qFormat="1"/>
+    <w:lsdException w:name="heading 9" w:uiPriority="9" w:qFormat="1"/>
+    <w:lsdException w:name="toc 1" w:uiPriority="39"/>
+    <w:lsdException w:name="toc 2" w:uiPriority="39"/>
+    <w:lsdException w:name="toc 3" w:uiPriority="39"/>
+    <w:lsdException w:name="toc 4" w:uiPriority="39"/>
+    <w:lsdException w:name="toc 5" w:uiPriority="39"/>
+    <w:lsdException w:name="toc 6" w:uiPriority="39"/>
+    <w:lsdException w:name="toc 7" w:uiPriority="39"/>
+    <w:lsdException w:name="toc 8" w:uiPriority="39"/>
+    <w:lsdException w:name="toc 9" w:uiPriority="39"/>
+    <w:lsdException w:name="caption" w:uiPriority="35" w:qFormat="1"/>
+    <w:lsdException w:name="Title" w:semiHidden="0" w:uiPriority="10" w:unhideWhenUsed="0" w:qFormat="1"/>
+    <w:lsdException w:name="Default Paragraph Font" w:uiPriority="1"/>
+    <w:lsdException w:name="Subtitle" w:semiHidden="0" w:uiPriority="11" w:unhideWhenUsed="0" w:qFormat="1"/>
+    <w:lsdException w:name="Strong" w:semiHidden="0" w:uiPriority="22" w:unhideWhenUsed="0" w:qFormat="1"/>
+    <w:lsdException w:name="Emphasis" w:semiHidden="0" w:uiPriority="20" w:unhideWhenUsed="0" w:qFormat="1"/>
+    <w:lsdException w:name="Table Grid" w:uiPriority="39"/>
+    <w:lsdException w:name="Placeholder Text" w:unhideWhenUsed="0"/>
+    <w:lsdException w:name="No Spacing" w:semiHidden="0" w:uiPriority="1" w:unhideWhenUsed="0" w:qFormat="1"/>
+    <w:lsdException w:name="Light Shading" w:semiHidden="0" w:uiPriority="60" w:unhideWhenUsed="0"/>
+    <w:lsdException w:name="Light List" w:semiHidden="0" w:uiPriority="61" w:unhideWhenUsed="0"/>
+    <w:lsdException w:name="Light Grid" w:semiHidden="0" w:uiPriority="62" w:unhideWhenUsed="0"/>
+    <w:lsdException w:name="Medium Shading 1" w:semiHidden="0" w:uiPriority="63" w:unhideWhenUsed="0"/>
+    <w:lsdException w:name="Medium Shading 2" w:semiHidden="0" w:uiPriority="64" w:unhideWhenUsed="0"/>
+    <w:lsdException w:name="Medium List 1" w:semiHidden="0" w:uiPriority="65" w:unhideWhenUsed="0"/>
+    <w:lsdException w:name="Medium List 2" w:semiHidden="0" w:uiPriority="66" w:unhideWhenUsed="0"/>
+    <w:lsdException w:name="Medium Grid 1" w:semiHidden="0" w:uiPriority="67" w:unhideWhenUsed="0"/>
+    <w:lsdException w:name="Medium Grid 2" w:semiHidden="0" w:uiPriority="68" w:unhideWhenUsed="0"/>
+    <w:lsdException w:name="Medium Grid 3" w:semiHidden="0" w:uiPriority="69" w:unhideWhenUsed="0"/>
+    <w:lsdException w:name="Dark List" w:semiHidden="0" w:uiPriority="70" w:unhideWhenUsed="0"/>
+    <w:lsdException w:name="Colorful Shading" w:semiHidden="0" w:uiPriority="71" w:unhideWhenUsed="0"/>
+    <w:lsdException w:name="Colorful List" w:semiHidden="0" w:uiPriority="72" w:unhideWhenUsed="0"/>
+    <w:lsdException w:name="Colorful Grid" w:semiHidden="0" w:uiPriority="73" w:unhideWhenUsed="0"/>
+    <w:lsdException w:name="Light Shading Accent 1" w:semiHidden="0" w:uiPriority="60" w:unhideWhenUsed="0"/>
+    <w:lsdException w:name="Light List Accent 1" w:semiHidden="0" w:uiPriority="61" w:unhideWhenUsed="0"/>
+    <w:lsdException w:name="Light Grid Accent 1" w:semiHidden="0" w:uiPriority="62" w:unhideWhenUsed="0"/>
+    <w:lsdException w:name="Medium Shading 1 Accent 1" w:semiHidden="0" w:uiPriority="63" w:unhideWhenUsed="0"/>
+    <w:lsdException w:name="Medium Shading 2 Accent 1" w:semiHidden="0" w:uiPriority="64" w:unhideWhenUsed="0"/>
+    <w:lsdException w:name="Medium List 1 Accent 1" w:semiHidden="0" w:uiPriority="65" w:unhideWhenUsed="0"/>
+    <w:lsdException w:name="Revision" w:unhideWhenUsed="0"/>
+    <w:lsdException w:name="List Paragraph" w:semiHidden="0" w:uiPriority="34" w:unhideWhenUsed="0" w:qFormat="1"/>
+    <w:lsdException w:name="Quote" w:semiHidden="0" w:uiPriority="29" w:unhideWhenUsed="0" w:qFormat="1"/>
+    <w:lsdException w:name="Intense Quote" w:semiHidden="0" w:uiPriority="30" w:unhideWhenUsed="0" w:qFormat="1"/>
+    <w:lsdException w:name="Medium List 2 Accent 1" w:semiHidden="0" w:uiPriority="66" w:unhideWhenUsed="0"/>
+    <w:lsdException w:name="Medium Grid 1 Accent 1" w:semiHidden="0" w:uiPriority="67" w:unhideWhenUsed="0"/>
+    <w:lsdException w:name="Medium Grid 2 Accent 1" w:semiHidden="0" w:uiPriority="68" w:unhideWhenUsed="0"/>
+    <w:lsdException w:name="Medium Grid 3 Accent 1" w:semiHidden="0" w:uiPriority="69" w:unhideWhenUsed="0"/>
+    <w:lsdException w:name="Dark List Accent 1" w:semiHidden="0" w:uiPriority="70" w:unhideWhenUsed="0"/>
+    <w:lsdException w:name="Colorful Shading Accent 1" w:semiHidden="0" w:uiPriority="71" w:unhideWhenUsed="0"/>
+    <w:lsdException w:name="Colorful List Accent 1" w:semiHidden="0" w:uiPriority="72" w:unhideWhenUsed="0"/>
+    <w:lsdException w:name="Colorful Grid Accent 1" w:semiHidden="0" w:uiPriority="73" w:unhideWhenUsed="0"/>
+    <w:lsdException w:name="Light Shading Accent 2" w:semiHidden="0" w:uiPriority="60" w:unhideWhenUsed="0"/>
+    <w:lsdException w:name="Light List Accent 2" w:semiHidden="0" w:uiPriority="61" w:unhideWhenUsed="0"/>
+    <w:lsdException w:name="Light Grid Accent 2" w:semiHidden="0" w:uiPriority="62" w:unhideWhenUsed="0"/>
+    <w:lsdException w:name="Medium Shading 1 Accent 2" w:semiHidden="0" w:uiPriority="63" w:unhideWhenUsed="0"/>
+    <w:lsdException w:name="Medium Shading 2 Accent 2" w:semiHidden="0" w:uiPriority="64" w:unhideWhenUsed="0"/>
+    <w:lsdException w:name="Medium List 1 Accent 2" w:semiHidden="0" w:uiPriority="65" w:unhideWhenUsed="0"/>
+    <w:lsdException w:name="Medium List 2 Accent 2" w:semiHidden="0" w:uiPriority="66" w:unhideWhenUsed="0"/>
+    <w:lsdException w:name="Medium Grid 1 Accent 2" w:semiHidden="0" w:uiPriority="67" w:unhideWhenUsed="0"/>
+    <w:lsdException w:name="Medium Grid 2 Accent 2" w:semiHidden="0" w:uiPriority="68" w:unhideWhenUsed="0"/>
+    <w:lsdException w:name="Medium Grid 3 Accent 2" w:semiHidden="0" w:uiPriority="69" w:unhideWhenUsed="0"/>
+    <w:lsdException w:name="Dark List Accent 2" w:semiHidden="0" w:uiPriority="70" w:unhideWhenUsed="0"/>
+    <w:lsdException w:name="Colorful Shading Accent 2" w:semiHidden="0" w:uiPriority="71" w:unhideWhenUsed="0"/>
+    <w:lsdException w:name="Colorful List Accent 2" w:semiHidden="0" w:uiPriority="72" w:unhideWhenUsed="0"/>
+    <w:lsdException w:name="Colorful Grid Accent 2" w:semiHidden="0" w:uiPriority="73" w:unhideWhenUsed="0"/>
+    <w:lsdException w:name="Light Shading Accent 3" w:semiHidden="0" w:uiPriority="60" w:unhideWhenUsed="0"/>
+    <w:lsdException w:name="Light List Accent 3" w:semiHidden="0" w:uiPriority="61" w:unhideWhenUsed="0"/>
+    <w:lsdException w:name="Light Grid Accent 3" w:semiHidden="0" w:uiPriority="62" w:unhideWhenUsed="0"/>
+    <w:lsdException w:name="Medium Shading 1 Accent 3" w:semiHidden="0" w:uiPriority="63" w:unhideWhenUsed="0"/>
+    <w:lsdException w:name="Medium Shading 2 Accent 3" w:semiHidden="0" w:uiPriority="64" w:unhideWhenUsed="0"/>
+    <w:lsdException w:name="Medium List 1 Accent 3" w:semiHidden="0" w:uiPriority="65" w:unhideWhenUsed="0"/>
+    <w:lsdException w:name="Medium List 2 Accent 3" w:semiHidden="0" w:uiPriority="66" w:unhideWhenUsed="0"/>
+    <w:lsdException w:name="Medium Grid 1 Accent 3" w:semiHidden="0" w:uiPriority="67" w:unhideWhenUsed="0"/>
+    <w:lsdException w:name="Medium Grid 2 Accent 3" w:semiHidden="0" w:uiPriority="68" w:unhideWhenUsed="0"/>
+    <w:lsdException w:name="Medium Grid 3 Accent 3" w:semiHidden="0" w:uiPriority="69" w:unhideWhenUsed="0"/>
+    <w:lsdException w:name="Dark List Accent 3" w:semiHidden="0" w:uiPriority="70" w:unhideWhenUsed="0"/>
+    <w:lsdException w:name="Colorful Shading Accent 3" w:semiHidden="0" w:uiPriority="71" w:unhideWhenUsed="0"/>
+    <w:lsdException w:name="Colorful List Accent 3" w:semiHidden="0" w:uiPriority="72" w:unhideWhenUsed="0"/>
+    <w:lsdException w:name="Colorful Grid Accent 3" w:semiHidden="0" w:uiPriority="73" w:unhideWhenUsed="0"/>
+    <w:lsdException w:name="Light Shading Accent 4" w:semiHidden="0" w:uiPriority="60" w:unhideWhenUsed="0"/>
+    <w:lsdException w:name="Light List Accent 4" w:semiHidden="0" w:uiPriority="61" w:unhideWhenUsed="0"/>
+    <w:lsdException w:name="Light Grid Accent 4" w:semiHidden="0" w:uiPriority="62" w:unhideWhenUsed="0"/>
+    <w:lsdException w:name="Medium Shading 1 Accent 4" w:semiHidden="0" w:uiPriority="63" w:unhideWhenUsed="0"/>
+    <w:lsdException w:name="Medium Shading 2 Accent 4" w:semiHidden="0" w:uiPriority="64" w:unhideWhenUsed="0"/>
+    <w:lsdException w:name="Medium List 1 Accent 4" w:semiHidden="0" w:uiPriority="65" w:unhideWhenUsed="0"/>
+    <w:lsdException w:name="Medium List 2 Accent 4" w:semiHidden="0" w:uiPriority="66" w:unhideWhenUsed="0"/>
+    <w:lsdException w:name="Medium Grid 1 Accent 4" w:semiHidden="0" w:uiPriority="67" w:unhideWhenUsed="0"/>
+    <w:lsdException w:name="Medium Grid 2 Accent 4" w:semiHidden="0" w:uiPriority="68" w:unhideWhenUsed="0"/>
+    <w:lsdException w:name="Medium Grid 3 Accent 4" w:semiHidden="0" w:uiPriority="69" w:unhideWhenUsed="0"/>
+    <w:lsdException w:name="Dark List Accent 4" w:semiHidden="0" w:uiPriority="70" w:unhideWhenUsed="0"/>
+    <w:lsdException w:name="Colorful Shading Accent 4" w:semiHidden="0" w:uiPriority="71" w:unhideWhenUsed="0"/>
+    <w:lsdException w:name="Colorful List Accent 4" w:semiHidden="0" w:uiPriority="72" w:unhideWhenUsed="0"/>
+    <w:lsdException w:name="Colorful Grid Accent 4" w:semiHidden="0" w:uiPriority="73" w:unhideWhenUsed="0"/>
+    <w:lsdException w:name="Light Shading Accent 5" w:semiHidden="0" w:uiPriority="60" w:unhideWhenUsed="0"/>
+    <w:lsdException w:name="Light List Accent 5" w:semiHidden="0" w:uiPriority="61" w:unhideWhenUsed="0"/>
+    <w:lsdException w:name="Light Grid Accent 5" w:semiHidden="0" w:uiPriority="62" w:unhideWhenUsed="0"/>
+    <w:lsdException w:name="Medium Shading 1 Accent 5" w:semiHidden="0" w:uiPriority="63" w:unhideWhenUsed="0"/>
+    <w:lsdException w:name="Medium Shading 2 Accent 5" w:semiHidden="0" w:uiPriority="64" w:unhideWhenUsed="0"/>
+    <w:lsdException w:name="Medium List 1 Accent 5" w:semiHidden="0" w:uiPriority="65" w:unhideWhenUsed="0"/>
+    <w:lsdException w:name="Medium List 2 Accent 5" w:semiHidden="0" w:uiPriority="66" w:unhideWhenUsed="0"/>
+    <w:lsdException w:name="Medium Grid 1 Accent 5" w:semiHidden="0" w:uiPriority="67" w:unhideWhenUsed="0"/>
+    <w:lsdException w:name="Medium Grid 2 Accent 5" w:semiHidden="0" w:uiPriority="68" w:unhideWhenUsed="0"/>
+    <w:lsdException w:name="Medium Grid 3 Accent 5" w:semiHidden="0" w:uiPriority="69" w:unhideWhenUsed="0"/>
+    <w:lsdException w:name="Dark List Accent 5" w:semiHidden="0" w:uiPriority="70" w:unhideWhenUsed="0"/>
+    <w:lsdException w:name="Colorful Shading Accent 5" w:semiHidden="0" w:uiPriority="71" w:unhideWhenUsed="0"/>
+    <w:lsdException w:name="Colorful List Accent 5" w:semiHidden="0" w:uiPriority="72" w:unhideWhenUsed="0"/>
+    <w:lsdException w:name="Colorful Grid Accent 5" w:semiHidden="0" w:uiPriority="73" w:unhideWhenUsed="0"/>
+    <w:lsdException w:name="Light Shading Accent 6" w:semiHidden="0" w:uiPriority="60" w:unhideWhenUsed="0"/>
+    <w:lsdException w:name="Light List Accent 6" w:semiHidden="0" w:uiPriority="61" w:unhideWhenUsed="0"/>
+    <w:lsdException w:name="Light Grid Accent 6" w:semiHidden="0" w:uiPriority="62" w:unhideWhenUsed="0"/>
+    <w:lsdException w:name="Medium Shading 1 Accent 6" w:semiHidden="0" w:uiPriority="63" w:unhideWhenUsed="0"/>
+    <w:lsdException w:name="Medium Shading 2 Accent 6" w:semiHidden="0" w:uiPriority="64" w:unhideWhenUsed="0"/>
+    <w:lsdException w:name="Medium List 1 Accent 6" w:semiHidden="0" w:uiPriority="65" w:unhideWhenUsed="0"/>
+    <w:lsdException w:name="Medium List 2 Accent 6" w:semiHidden="0" w:uiPriority="66" w:unhideWhenUsed="0"/>
+    <w:lsdException w:name="Medium Grid 1 Accent 6" w:semiHidden="0" w:uiPriority="67" w:unhideWhenUsed="0"/>
+    <w:lsdException w:name="Medium Grid 2 Accent 6" w:semiHidden="0" w:uiPriority="68" w:unhideWhenUsed="0"/>
+    <w:lsdException w:name="Medium Grid 3 Accent 6" w:semiHidden="0" w:uiPriority="69" w:unhideWhenUsed="0"/>
+    <w:lsdException w:name="Dark List Accent 6" w:semiHidden="0" w:uiPriority="70" w:unhideWhenUsed="0"/>
+    <w:lsdException w:name="Colorful Shading Accent 6" w:semiHidden="0" w:uiPriority="71" w:unhideWhenUsed="0"/>
+    <w:lsdException w:name="Colorful List Accent 6" w:semiHidden="0" w:uiPriority="72" w:unhideWhenUsed="0"/>
+    <w:lsdException w:name="Colorful Grid Accent 6" w:semiHidden="0" w:uiPriority="73" w:unhideWhenUsed="0"/>
+    <w:lsdException w:name="Subtle Emphasis" w:semiHidden="0" w:uiPriority="19" w:unhideWhenUsed="0" w:qFormat="1"/>
+    <w:lsdException w:name="Intense Emphasis" w:semiHidden="0" w:uiPriority="21" w:unhideWhenUsed="0" w:qFormat="1"/>
+    <w:lsdException w:name="Subtle Reference" w:semiHidden="0" w:uiPriority="31" w:unhideWhenUsed="0" w:qFormat="1"/>
+    <w:lsdException w:name="Intense Reference" w:semiHidden="0" w:uiPriority="32" w:unhideWhenUsed="0" w:qFormat="1"/>
+    <w:lsdException w:name="Book Title" w:semiHidden="0" w:uiPriority="33" w:unhideWhenUsed="0" w:qFormat="1"/>
+    <w:lsdException w:name="Bibliography" w:uiPriority="37"/>
+    <w:lsdException w:name="TOC Heading" w:uiPriority="39" w:qFormat="1"/>
+  </w:latentStyles>
+  <w:style w:type="paragraph" w:default="1" w:styleId="Normal">
+    <w:name w:val="Normal"/>
+    <w:qFormat/>
+  </w:style>
+  <w:style w:type="paragraph" w:styleId="Ttulo1">
+    <w:name w:val="heading 1"/>
+    <w:basedOn w:val="Normal"/>
+    <w:next w:val="Normal"/>
+    <w:uiPriority w:val="9"/>
+    <w:qFormat/>
+    <w:pPr>
+      <w:keepNext/>
+      <w:ind w:left="502" w:hanging="360"/>
+      <w:jc w:val="both"/>
+      <w:outlineLvl w:val="0"/>
+    </w:pPr>
+    <w:rPr>
+      <w:rFonts w:ascii="Arial" w:eastAsia="Arial" w:hAnsi="Arial" w:cs="Arial"/>
+      <w:b/>
+      <w:sz w:val="24"/>
+      <w:szCs w:val="24"/>
+    </w:rPr>
+  </w:style>
+  <w:style w:type="paragraph" w:styleId="Ttulo2">
+    <w:name w:val="heading 2"/>
+    <w:basedOn w:val="Normal"/>
+    <w:next w:val="Normal"/>
+    <w:uiPriority w:val="9"/>
+    <w:semiHidden/>
+    <w:unhideWhenUsed/>
+    <w:qFormat/>
+    <w:pPr>
+      <w:keepNext/>
+      <w:widowControl w:val="0"/>
+      <w:tabs>
+        <w:tab w:val="left" w:pos="0"/>
+        <w:tab w:val="center" w:pos="4680"/>
+      </w:tabs>
+      <w:ind w:left="142"/>
+      <w:outlineLvl w:val="1"/>
+    </w:pPr>
+    <w:rPr>
+      <w:rFonts w:ascii="Arial" w:eastAsia="Arial" w:hAnsi="Arial" w:cs="Arial"/>
+      <w:sz w:val="26"/>
+      <w:szCs w:val="26"/>
+    </w:rPr>
+  </w:style>
+  <w:style w:type="paragraph" w:styleId="Ttulo3">
+    <w:name w:val="heading 3"/>
+    <w:basedOn w:val="Normal"/>
+    <w:next w:val="Normal"/>
+    <w:uiPriority w:val="9"/>
+    <w:semiHidden/>
+    <w:unhideWhenUsed/>
+    <w:qFormat/>
+    <w:pPr>
+      <w:keepNext/>
+      <w:widowControl w:val="0"/>
+      <w:tabs>
+        <w:tab w:val="left" w:pos="0"/>
+      </w:tabs>
+      <w:ind w:left="567"/>
+      <w:jc w:val="both"/>
+      <w:outlineLvl w:val="2"/>
+    </w:pPr>
+    <w:rPr>
+      <w:rFonts w:ascii="Arial" w:eastAsia="Arial" w:hAnsi="Arial" w:cs="Arial"/>
+      <w:sz w:val="26"/>
+      <w:szCs w:val="26"/>
+    </w:rPr>
+  </w:style>
+  <w:style w:type="paragraph" w:styleId="Ttulo4">
+    <w:name w:val="heading 4"/>
+    <w:basedOn w:val="Normal"/>
+    <w:next w:val="Normal"/>
+    <w:uiPriority w:val="9"/>
+    <w:semiHidden/>
+    <w:unhideWhenUsed/>
+    <w:qFormat/>
+    <w:pPr>
+      <w:keepNext/>
+      <w:tabs>
+        <w:tab w:val="left" w:pos="0"/>
+        <w:tab w:val="left" w:pos="1134"/>
+      </w:tabs>
+      <w:ind w:left="2662" w:hanging="360"/>
+      <w:jc w:val="both"/>
+      <w:outlineLvl w:val="3"/>
+    </w:pPr>
+    <w:rPr>
+      <w:rFonts w:ascii="Times New Roman" w:eastAsia="Times New Roman" w:hAnsi="Times New Roman" w:cs="Times New Roman"/>
+      <w:sz w:val="24"/>
+      <w:szCs w:val="24"/>
+    </w:rPr>
+  </w:style>
+  <w:style w:type="paragraph" w:styleId="Ttulo5">
+    <w:name w:val="heading 5"/>
+    <w:basedOn w:val="Normal"/>
+    <w:next w:val="Normal"/>
+    <w:uiPriority w:val="9"/>
+    <w:semiHidden/>
+    <w:unhideWhenUsed/>
+    <w:qFormat/>
+    <w:pPr>
+      <w:keepNext/>
+      <w:tabs>
+        <w:tab w:val="left" w:pos="0"/>
+      </w:tabs>
+      <w:spacing w:line="480" w:lineRule="auto"/>
+      <w:ind w:left="3382" w:hanging="360"/>
+      <w:jc w:val="both"/>
+      <w:outlineLvl w:val="4"/>
+    </w:pPr>
+    <w:rPr>
+      <w:rFonts w:ascii="Arial" w:eastAsia="Arial" w:hAnsi="Arial" w:cs="Arial"/>
+      <w:i/>
+      <w:sz w:val="28"/>
+      <w:szCs w:val="28"/>
+    </w:rPr>
+  </w:style>
+  <w:style w:type="paragraph" w:styleId="Ttulo6">
+    <w:name w:val="heading 6"/>
+    <w:basedOn w:val="Normal"/>
+    <w:next w:val="Normal"/>
+    <w:uiPriority w:val="9"/>
+    <w:semiHidden/>
+    <w:unhideWhenUsed/>
+    <w:qFormat/>
+    <w:pPr>
+      <w:spacing w:before="240" w:after="60"/>
+      <w:ind w:left="4102" w:hanging="180"/>
+      <w:outlineLvl w:val="5"/>
+    </w:pPr>
+    <w:rPr>
+      <w:rFonts w:ascii="Times New Roman" w:eastAsia="Times New Roman" w:hAnsi="Times New Roman" w:cs="Times New Roman"/>
+      <w:b/>
+      <w:sz w:val="20"/>
+      <w:szCs w:val="20"/>
+    </w:rPr>
+  </w:style>
+  <w:style w:type="character" w:default="1" w:styleId="Fuentedeprrafopredeter">
+    <w:name w:val="Default Paragraph Font"/>
+    <w:uiPriority w:val="1"/>
+    <w:semiHidden/>
+    <w:unhideWhenUsed/>
+  </w:style>
+  <w:style w:type="table" w:default="1" w:styleId="Tablanormal">
+    <w:name w:val="Normal Table"/>
+    <w:uiPriority w:val="99"/>
+    <w:semiHidden/>
+    <w:unhideWhenUsed/>
+    <w:tblPr>
+      <w:tblInd w:w="0" w:type="dxa"/>
+      <w:tblCellMar>
+        <w:top w:w="0" w:type="dxa"/>
+        <w:left w:w="108" w:type="dxa"/>
+        <w:bottom w:w="0" w:type="dxa"/>
+        <w:right w:w="108" w:type="dxa"/>
+      </w:tblCellMar>
+    </w:tblPr>
+  </w:style>
+  <w:style w:type="numbering" w:default="1" w:styleId="Sinlista">
+    <w:name w:val="No List"/>
+    <w:uiPriority w:val="99"/>
+    <w:semiHidden/>
+    <w:unhideWhenUsed/>
+  </w:style>
+  <w:style w:type="table" w:customStyle="1" w:styleId="TableNormal">
+    <w:name w:val="Table Normal"/>
+    <w:tblPr>
+      <w:tblCellMar>
+        <w:top w:w="0" w:type="dxa"/>
+        <w:left w:w="0" w:type="dxa"/>
+        <w:bottom w:w="0" w:type="dxa"/>
+        <w:right w:w="0" w:type="dxa"/>
+      </w:tblCellMar>
+    </w:tblPr>
+  </w:style>
+  <w:style w:type="paragraph" w:styleId="Ttulo">
+    <w:name w:val="Title"/>
+    <w:basedOn w:val="Normal"/>
+    <w:next w:val="Normal"/>
+    <w:uiPriority w:val="10"/>
+    <w:qFormat/>
+    <w:pPr>
+      <w:keepNext/>
+      <w:keepLines/>
+      <w:spacing w:before="480" w:after="120"/>
+    </w:pPr>
+    <w:rPr>
+      <w:b/>
+      <w:sz w:val="72"/>
+      <w:szCs w:val="72"/>
+    </w:rPr>
+  </w:style>
+  <w:style w:type="paragraph" w:styleId="Subttulo">
+    <w:name w:val="Subtitle"/>
+    <w:basedOn w:val="Normal"/>
+    <w:next w:val="Normal"/>
+    <w:uiPriority w:val="11"/>
+    <w:qFormat/>
+    <w:pPr>
+      <w:keepNext/>
+      <w:keepLines/>
+      <w:spacing w:before="360" w:after="80"/>
+    </w:pPr>
+    <w:rPr>
+      <w:rFonts w:ascii="Georgia" w:eastAsia="Georgia" w:hAnsi="Georgia" w:cs="Georgia"/>
+      <w:i/>
+      <w:color w:val="666666"/>
+      <w:sz w:val="48"/>
+      <w:szCs w:val="48"/>
+    </w:rPr>
+  </w:style>
+  <w:style w:type="table" w:customStyle="1" w:styleId="a">
+    <w:basedOn w:val="TableNormal"/>
+    <w:rPr>
+      <w:rFonts w:ascii="Times New Roman" w:eastAsia="Times New Roman" w:hAnsi="Times New Roman" w:cs="Times New Roman"/>
+    </w:rPr>
+    <w:tblPr>
+      <w:tblStyleRowBandSize w:val="1"/>
+      <w:tblStyleColBandSize w:val="1"/>
+      <w:tblCellMar>
+        <w:top w:w="0" w:type="dxa"/>
+        <w:left w:w="108" w:type="dxa"/>
+        <w:bottom w:w="0" w:type="dxa"/>
+        <w:right w:w="108" w:type="dxa"/>
+      </w:tblCellMar>
+    </w:tblPr>
+  </w:style>
+  <w:style w:type="table" w:customStyle="1" w:styleId="a0">
+    <w:basedOn w:val="TableNormal"/>
+    <w:rPr>
+      <w:rFonts w:ascii="Times New Roman" w:eastAsia="Times New Roman" w:hAnsi="Times New Roman" w:cs="Times New Roman"/>
+    </w:rPr>
+    <w:tblPr>
+      <w:tblStyleRowBandSize w:val="1"/>
+      <w:tblStyleColBandSize w:val="1"/>
+      <w:tblCellMar>
+        <w:top w:w="0" w:type="dxa"/>
+        <w:left w:w="108" w:type="dxa"/>
+        <w:bottom w:w="0" w:type="dxa"/>
+        <w:right w:w="108" w:type="dxa"/>
+      </w:tblCellMar>
+    </w:tblPr>
+  </w:style>
+  <w:style w:type="table" w:customStyle="1" w:styleId="a1">
+    <w:basedOn w:val="TableNormal"/>
+    <w:tblPr>
+      <w:tblStyleRowBandSize w:val="1"/>
+      <w:tblStyleColBandSize w:val="1"/>
+      <w:tblCellMar>
+        <w:top w:w="0" w:type="dxa"/>
+        <w:left w:w="115" w:type="dxa"/>
+        <w:bottom w:w="0" w:type="dxa"/>
+        <w:right w:w="115" w:type="dxa"/>
+      </w:tblCellMar>
+    </w:tblPr>
+  </w:style>
+  <w:style w:type="table" w:customStyle="1" w:styleId="a2">
+    <w:basedOn w:val="TableNormal"/>
+    <w:tblPr>
+      <w:tblStyleRowBandSize w:val="1"/>
+      <w:tblStyleColBandSize w:val="1"/>
+      <w:tblCellMar>
+        <w:top w:w="0" w:type="dxa"/>
+        <w:left w:w="115" w:type="dxa"/>
+        <w:bottom w:w="0" w:type="dxa"/>
+        <w:right w:w="115" w:type="dxa"/>
+      </w:tblCellMar>
+    </w:tblPr>
+  </w:style>
+  <w:style w:type="paragraph" w:styleId="Encabezado">
+    <w:name w:val="header"/>
+    <w:basedOn w:val="Normal"/>
+    <w:link w:val="EncabezadoCar"/>
+    <w:uiPriority w:val="99"/>
+    <w:unhideWhenUsed/>
+    <w:rsid w:val="005D2878"/>
+    <w:pPr>
+      <w:tabs>
+        <w:tab w:val="center" w:pos="4419"/>
+        <w:tab w:val="right" w:pos="8838"/>
+      </w:tabs>
+    </w:pPr>
+  </w:style>
+  <w:style w:type="character" w:customStyle="1" w:styleId="EncabezadoCar">
+    <w:name w:val="Encabezado Car"/>
+    <w:basedOn w:val="Fuentedeprrafopredeter"/>
+    <w:link w:val="Encabezado"/>
+    <w:uiPriority w:val="99"/>
+    <w:rsid w:val="005D2878"/>
+  </w:style>
+  <w:style w:type="paragraph" w:styleId="Piedepgina">
+    <w:name w:val="footer"/>
+    <w:basedOn w:val="Normal"/>
+    <w:link w:val="PiedepginaCar"/>
+    <w:uiPriority w:val="99"/>
+    <w:unhideWhenUsed/>
+    <w:rsid w:val="005D2878"/>
+    <w:pPr>
+      <w:tabs>
+        <w:tab w:val="center" w:pos="4419"/>
+        <w:tab w:val="right" w:pos="8838"/>
+      </w:tabs>
+    </w:pPr>
+  </w:style>
+  <w:style w:type="character" w:customStyle="1" w:styleId="PiedepginaCar">
+    <w:name w:val="Pie de página Car"/>
+    <w:basedOn w:val="Fuentedeprrafopredeter"/>
+    <w:link w:val="Piedepgina"/>
+    <w:uiPriority w:val="99"/>
+    <w:rsid w:val="005D2878"/>
+  </w:style>
+  <w:style w:type="table" w:styleId="Tablaconcuadrcula">
+    <w:name w:val="Table Grid"/>
+    <w:basedOn w:val="Tablanormal"/>
+    <w:uiPriority w:val="39"/>
+    <w:rsid w:val="00AB773A"/>
+    <w:tblPr>
+      <w:tblInd w:w="0" w:type="dxa"/>
+      <w:tblBorders>
+        <w:top w:val="single" w:sz="4" w:space="0" w:color="auto"/>
+        <w:left w:val="single" w:sz="4" w:space="0" w:color="auto"/>
+        <w:bottom w:val="single" w:sz="4" w:space="0" w:color="auto"/>
+        <w:right w:val="single" w:sz="4" w:space="0" w:color="auto"/>
+        <w:insideH w:val="single" w:sz="4" w:space="0" w:color="auto"/>
+        <w:insideV w:val="single" w:sz="4" w:space="0" w:color="auto"/>
+      </w:tblBorders>
+      <w:tblCellMar>
+        <w:top w:w="0" w:type="dxa"/>
+        <w:left w:w="108" w:type="dxa"/>
+        <w:bottom w:w="0" w:type="dxa"/>
+        <w:right w:w="108" w:type="dxa"/>
+      </w:tblCellMar>
     </w:tblPr>
   </w:style>
   <w:style w:type="paragraph" w:styleId="Textodeglobo">

</xml_diff>

<commit_message>
Actualización general de vistas, DAOs, servicios, controladores y plantillas
</commit_message>
<xml_diff>
--- a/plantillas/MODIFICACION_1_JUSTIFICACION.docx
+++ b/plantillas/MODIFICACION_1_JUSTIFICACION.docx
@@ -1,6 +1,6 @@
 
 <file path=word/document.xml><?xml version="1.0" encoding="utf-8"?>
-<w:document xmlns:wpc="http://schemas.microsoft.com/office/word/2010/wordprocessingCanvas" xmlns:mc="http://schemas.openxmlformats.org/markup-compatibility/2006" xmlns:o="urn:schemas-microsoft-com:office:office" xmlns:r="http://schemas.openxmlformats.org/officeDocument/2006/relationships" xmlns:m="http://schemas.openxmlformats.org/officeDocument/2006/math" xmlns:v="urn:schemas-microsoft-com:vml" xmlns:wp14="http://schemas.microsoft.com/office/word/2010/wordprocessingDrawing" xmlns:wp="http://schemas.openxmlformats.org/drawingml/2006/wordprocessingDrawing" xmlns:w10="urn:schemas-microsoft-com:office:word" xmlns:w="http://schemas.openxmlformats.org/wordprocessingml/2006/main" xmlns:w14="http://schemas.microsoft.com/office/word/2010/wordml" xmlns:wpg="http://schemas.microsoft.com/office/word/2010/wordprocessingGroup" xmlns:wpi="http://schemas.microsoft.com/office/word/2010/wordprocessingInk" xmlns:wne="http://schemas.microsoft.com/office/word/2006/wordml" xmlns:wps="http://schemas.microsoft.com/office/word/2010/wordprocessingShape" mc:Ignorable="w14 wp14">
+<w:document xmlns:wpc="http://schemas.microsoft.com/office/word/2010/wordprocessingCanvas" xmlns:cx="http://schemas.microsoft.com/office/drawing/2014/chartex" xmlns:cx1="http://schemas.microsoft.com/office/drawing/2015/9/8/chartex" xmlns:cx2="http://schemas.microsoft.com/office/drawing/2015/10/21/chartex" xmlns:cx3="http://schemas.microsoft.com/office/drawing/2016/5/9/chartex" xmlns:cx4="http://schemas.microsoft.com/office/drawing/2016/5/10/chartex" xmlns:cx5="http://schemas.microsoft.com/office/drawing/2016/5/11/chartex" xmlns:cx6="http://schemas.microsoft.com/office/drawing/2016/5/12/chartex" xmlns:cx7="http://schemas.microsoft.com/office/drawing/2016/5/13/chartex" xmlns:cx8="http://schemas.microsoft.com/office/drawing/2016/5/14/chartex" xmlns:mc="http://schemas.openxmlformats.org/markup-compatibility/2006" xmlns:aink="http://schemas.microsoft.com/office/drawing/2016/ink" xmlns:am3d="http://schemas.microsoft.com/office/drawing/2017/model3d" xmlns:o="urn:schemas-microsoft-com:office:office" xmlns:oel="http://schemas.microsoft.com/office/2019/extlst" xmlns:r="http://schemas.openxmlformats.org/officeDocument/2006/relationships" xmlns:m="http://schemas.openxmlformats.org/officeDocument/2006/math" xmlns:v="urn:schemas-microsoft-com:vml" xmlns:wp14="http://schemas.microsoft.com/office/word/2010/wordprocessingDrawing" xmlns:wp="http://schemas.openxmlformats.org/drawingml/2006/wordprocessingDrawing" xmlns:w10="urn:schemas-microsoft-com:office:word" xmlns:w="http://schemas.openxmlformats.org/wordprocessingml/2006/main" xmlns:w14="http://schemas.microsoft.com/office/word/2010/wordml" xmlns:w15="http://schemas.microsoft.com/office/word/2012/wordml" xmlns:w16cex="http://schemas.microsoft.com/office/word/2018/wordml/cex" xmlns:w16cid="http://schemas.microsoft.com/office/word/2016/wordml/cid" xmlns:w16="http://schemas.microsoft.com/office/word/2018/wordml" xmlns:w16du="http://schemas.microsoft.com/office/word/2023/wordml/word16du" xmlns:w16sdtdh="http://schemas.microsoft.com/office/word/2020/wordml/sdtdatahash" xmlns:w16sdtfl="http://schemas.microsoft.com/office/word/2024/wordml/sdtformatlock" xmlns:w16se="http://schemas.microsoft.com/office/word/2015/wordml/symex" xmlns:wpg="http://schemas.microsoft.com/office/word/2010/wordprocessingGroup" xmlns:wpi="http://schemas.microsoft.com/office/word/2010/wordprocessingInk" xmlns:wne="http://schemas.microsoft.com/office/word/2006/wordml" xmlns:wps="http://schemas.microsoft.com/office/word/2010/wordprocessingShape" mc:Ignorable="w14 w15 w16se w16cid w16 w16cex w16sdtdh w16sdtfl w16du wp14">
   <w:body>
     <w:tbl>
       <w:tblPr>
@@ -2826,7 +2826,27 @@
                 <w:szCs w:val="24"/>
                 <w:lang w:val="es-CO"/>
               </w:rPr>
-              <w:t xml:space="preserve"> y en consecuencia adicionar el valor del mismo por la suma </w:t>
+              <w:t xml:space="preserve"> y en consecuencia adicionar el valor del mismo por la suma</w:t>
+            </w:r>
+            <w:r>
+              <w:rPr>
+                <w:rFonts w:ascii="Arial" w:hAnsi="Arial" w:cs="Arial"/>
+                <w:color w:val="000000"/>
+                <w:sz w:val="24"/>
+                <w:szCs w:val="24"/>
+                <w:lang w:val="es-CO"/>
+              </w:rPr>
+              <w:t xml:space="preserve"> de</w:t>
+            </w:r>
+            <w:r>
+              <w:rPr>
+                <w:rFonts w:ascii="Arial" w:hAnsi="Arial" w:cs="Arial"/>
+                <w:color w:val="000000"/>
+                <w:sz w:val="24"/>
+                <w:szCs w:val="24"/>
+                <w:lang w:val="es-CO"/>
+              </w:rPr>
+              <w:t xml:space="preserve"> </w:t>
             </w:r>
             <w:r>
               <w:rPr>
@@ -2880,7 +2900,7 @@
                 <w:szCs w:val="24"/>
                 <w:lang w:val="es-CO"/>
               </w:rPr>
-              <w:t xml:space="preserve"> suma que </w:t>
+              <w:t xml:space="preserve"> suma </w:t>
             </w:r>
             <w:r>
               <w:rPr>
@@ -2891,7 +2911,7 @@
                 <w:lang w:val="es-CO"/>
               </w:rPr>
               <w:lastRenderedPageBreak/>
-              <w:t>no excede el 50% del valor inicial del: contrato, en cumplimiento del parágrafo del Artículo 40 de la Ley 80 de 1993, que establece la posibilidad de adicionar los contratos sin exceder el cincuenta por ciento (50%) del valor del contrato inicial.</w:t>
+              <w:t>que no excede el 50% del valor inicial del: contrato, en cumplimiento del parágrafo del Artículo 40 de la Ley 80 de 1993, que establece la posibilidad de adicionar los contratos sin exceder el cincuenta por ciento (50%) del valor del contrato inicial.</w:t>
             </w:r>
           </w:p>
           <w:p>
@@ -3331,32 +3351,8 @@
                 <w:shd w:val="clear" w:color="auto" w:fill="FFFF00"/>
                 <w:lang w:val="es-CO"/>
               </w:rPr>
-              <w:t>(</w:t>
-            </w:r>
-            <w:r>
-              <w:rPr>
-                <w:rFonts w:ascii="Arial" w:hAnsi="Arial" w:cs="Arial"/>
-                <w:color w:val="000000"/>
-                <w:sz w:val="24"/>
-                <w:szCs w:val="24"/>
-                <w:shd w:val="clear" w:color="auto" w:fill="FFFF00"/>
-                <w:lang w:val="es-CO"/>
-              </w:rPr>
               <w:t>{{VALOR_CDP_ADICION}}</w:t>
             </w:r>
-            <w:r>
-              <w:rPr>
-                <w:rFonts w:ascii="Arial" w:hAnsi="Arial" w:cs="Arial"/>
-                <w:color w:val="000000"/>
-                <w:sz w:val="24"/>
-                <w:szCs w:val="24"/>
-                <w:shd w:val="clear" w:color="auto" w:fill="FFFF00"/>
-                <w:lang w:val="es-CO"/>
-              </w:rPr>
-              <w:t>)</w:t>
-            </w:r>
-            <w:bookmarkStart w:id="0" w:name="_GoBack"/>
-            <w:bookmarkEnd w:id="0"/>
             <w:r>
               <w:rPr>
                 <w:rFonts w:ascii="Arial" w:hAnsi="Arial" w:cs="Arial"/>
@@ -3815,7 +3811,14 @@
               <w:rPr>
                 <w:rFonts w:ascii="Arial" w:eastAsia="Arial" w:hAnsi="Arial" w:cs="Arial"/>
               </w:rPr>
-              <w:t xml:space="preserve"> contrato de </w:t>
+              <w:t xml:space="preserve"> contrato </w:t>
+            </w:r>
+            <w:proofErr w:type="gramStart"/>
+            <w:r>
+              <w:rPr>
+                <w:rFonts w:ascii="Arial" w:eastAsia="Arial" w:hAnsi="Arial" w:cs="Arial"/>
+              </w:rPr>
+              <w:t xml:space="preserve">de </w:t>
             </w:r>
             <w:r>
               <w:rPr>
@@ -3828,7 +3831,15 @@
                 <w:rFonts w:ascii="Arial" w:eastAsia="Arial" w:hAnsi="Arial" w:cs="Arial"/>
                 <w:highlight w:val="yellow"/>
               </w:rPr>
-              <w:t>{{TIPO_CONTRATO}}</w:t>
+              <w:t>{</w:t>
+            </w:r>
+            <w:proofErr w:type="gramEnd"/>
+            <w:r>
+              <w:rPr>
+                <w:rFonts w:ascii="Arial" w:eastAsia="Arial" w:hAnsi="Arial" w:cs="Arial"/>
+                <w:highlight w:val="yellow"/>
+              </w:rPr>
+              <w:t>{TIPO_CONTRATO}}</w:t>
             </w:r>
             <w:r>
               <w:rPr>
@@ -3866,6 +3877,12 @@
                 <w:rFonts w:ascii="Arial" w:eastAsia="Arial" w:hAnsi="Arial" w:cs="Arial"/>
               </w:rPr>
               <w:t xml:space="preserve"> y en consecuencia adicionar el valor del mismo por la suma</w:t>
+            </w:r>
+            <w:r>
+              <w:rPr>
+                <w:rFonts w:ascii="Arial" w:eastAsia="Arial" w:hAnsi="Arial" w:cs="Arial"/>
+              </w:rPr>
+              <w:t xml:space="preserve"> de</w:t>
             </w:r>
             <w:r>
               <w:rPr>
@@ -4108,8 +4125,8 @@
       </w:pPr>
     </w:p>
     <w:sectPr>
-      <w:headerReference w:type="default" r:id="rId7"/>
-      <w:footerReference w:type="default" r:id="rId8"/>
+      <w:headerReference w:type="default" r:id="rId6"/>
+      <w:footerReference w:type="default" r:id="rId7"/>
       <w:pgSz w:w="12240" w:h="15840"/>
       <w:pgMar w:top="1134" w:right="1134" w:bottom="1701" w:left="1134" w:header="397" w:footer="709" w:gutter="0"/>
       <w:pgNumType w:start="1"/>
@@ -4120,7 +4137,7 @@
 </file>
 
 <file path=word/endnotes.xml><?xml version="1.0" encoding="utf-8"?>
-<w:endnotes xmlns:wpc="http://schemas.microsoft.com/office/word/2010/wordprocessingCanvas" xmlns:mc="http://schemas.openxmlformats.org/markup-compatibility/2006" xmlns:o="urn:schemas-microsoft-com:office:office" xmlns:r="http://schemas.openxmlformats.org/officeDocument/2006/relationships" xmlns:m="http://schemas.openxmlformats.org/officeDocument/2006/math" xmlns:v="urn:schemas-microsoft-com:vml" xmlns:wp14="http://schemas.microsoft.com/office/word/2010/wordprocessingDrawing" xmlns:wp="http://schemas.openxmlformats.org/drawingml/2006/wordprocessingDrawing" xmlns:w10="urn:schemas-microsoft-com:office:word" xmlns:w="http://schemas.openxmlformats.org/wordprocessingml/2006/main" xmlns:w14="http://schemas.microsoft.com/office/word/2010/wordml" xmlns:wpg="http://schemas.microsoft.com/office/word/2010/wordprocessingGroup" xmlns:wpi="http://schemas.microsoft.com/office/word/2010/wordprocessingInk" xmlns:wne="http://schemas.microsoft.com/office/word/2006/wordml" xmlns:wps="http://schemas.microsoft.com/office/word/2010/wordprocessingShape" mc:Ignorable="w14 wp14">
+<w:endnotes xmlns:wpc="http://schemas.microsoft.com/office/word/2010/wordprocessingCanvas" xmlns:cx="http://schemas.microsoft.com/office/drawing/2014/chartex" xmlns:cx1="http://schemas.microsoft.com/office/drawing/2015/9/8/chartex" xmlns:cx2="http://schemas.microsoft.com/office/drawing/2015/10/21/chartex" xmlns:cx3="http://schemas.microsoft.com/office/drawing/2016/5/9/chartex" xmlns:cx4="http://schemas.microsoft.com/office/drawing/2016/5/10/chartex" xmlns:cx5="http://schemas.microsoft.com/office/drawing/2016/5/11/chartex" xmlns:cx6="http://schemas.microsoft.com/office/drawing/2016/5/12/chartex" xmlns:cx7="http://schemas.microsoft.com/office/drawing/2016/5/13/chartex" xmlns:cx8="http://schemas.microsoft.com/office/drawing/2016/5/14/chartex" xmlns:mc="http://schemas.openxmlformats.org/markup-compatibility/2006" xmlns:aink="http://schemas.microsoft.com/office/drawing/2016/ink" xmlns:am3d="http://schemas.microsoft.com/office/drawing/2017/model3d" xmlns:o="urn:schemas-microsoft-com:office:office" xmlns:oel="http://schemas.microsoft.com/office/2019/extlst" xmlns:r="http://schemas.openxmlformats.org/officeDocument/2006/relationships" xmlns:m="http://schemas.openxmlformats.org/officeDocument/2006/math" xmlns:v="urn:schemas-microsoft-com:vml" xmlns:wp14="http://schemas.microsoft.com/office/word/2010/wordprocessingDrawing" xmlns:wp="http://schemas.openxmlformats.org/drawingml/2006/wordprocessingDrawing" xmlns:w10="urn:schemas-microsoft-com:office:word" xmlns:w="http://schemas.openxmlformats.org/wordprocessingml/2006/main" xmlns:w14="http://schemas.microsoft.com/office/word/2010/wordml" xmlns:w15="http://schemas.microsoft.com/office/word/2012/wordml" xmlns:w16cex="http://schemas.microsoft.com/office/word/2018/wordml/cex" xmlns:w16cid="http://schemas.microsoft.com/office/word/2016/wordml/cid" xmlns:w16="http://schemas.microsoft.com/office/word/2018/wordml" xmlns:w16du="http://schemas.microsoft.com/office/word/2023/wordml/word16du" xmlns:w16sdtdh="http://schemas.microsoft.com/office/word/2020/wordml/sdtdatahash" xmlns:w16sdtfl="http://schemas.microsoft.com/office/word/2024/wordml/sdtformatlock" xmlns:w16se="http://schemas.microsoft.com/office/word/2015/wordml/symex" xmlns:wpg="http://schemas.microsoft.com/office/word/2010/wordprocessingGroup" xmlns:wpi="http://schemas.microsoft.com/office/word/2010/wordprocessingInk" xmlns:wne="http://schemas.microsoft.com/office/word/2006/wordml" xmlns:wps="http://schemas.microsoft.com/office/word/2010/wordprocessingShape" mc:Ignorable="w14 w15 w16se w16cid w16 w16cex w16sdtdh w16sdtfl w16du wp14">
   <w:endnote w:type="separator" w:id="-1">
     <w:p>
       <w:r>
@@ -4139,7 +4156,7 @@
 </file>
 
 <file path=word/footer1.xml><?xml version="1.0" encoding="utf-8"?>
-<w:ftr xmlns:wpc="http://schemas.microsoft.com/office/word/2010/wordprocessingCanvas" xmlns:mc="http://schemas.openxmlformats.org/markup-compatibility/2006" xmlns:o="urn:schemas-microsoft-com:office:office" xmlns:r="http://schemas.openxmlformats.org/officeDocument/2006/relationships" xmlns:m="http://schemas.openxmlformats.org/officeDocument/2006/math" xmlns:v="urn:schemas-microsoft-com:vml" xmlns:wp14="http://schemas.microsoft.com/office/word/2010/wordprocessingDrawing" xmlns:wp="http://schemas.openxmlformats.org/drawingml/2006/wordprocessingDrawing" xmlns:w10="urn:schemas-microsoft-com:office:word" xmlns:w="http://schemas.openxmlformats.org/wordprocessingml/2006/main" xmlns:w14="http://schemas.microsoft.com/office/word/2010/wordml" xmlns:wpg="http://schemas.microsoft.com/office/word/2010/wordprocessingGroup" xmlns:wpi="http://schemas.microsoft.com/office/word/2010/wordprocessingInk" xmlns:wne="http://schemas.microsoft.com/office/word/2006/wordml" xmlns:wps="http://schemas.microsoft.com/office/word/2010/wordprocessingShape" mc:Ignorable="w14 wp14">
+<w:ftr xmlns:wpc="http://schemas.microsoft.com/office/word/2010/wordprocessingCanvas" xmlns:cx="http://schemas.microsoft.com/office/drawing/2014/chartex" xmlns:cx1="http://schemas.microsoft.com/office/drawing/2015/9/8/chartex" xmlns:cx2="http://schemas.microsoft.com/office/drawing/2015/10/21/chartex" xmlns:cx3="http://schemas.microsoft.com/office/drawing/2016/5/9/chartex" xmlns:cx4="http://schemas.microsoft.com/office/drawing/2016/5/10/chartex" xmlns:cx5="http://schemas.microsoft.com/office/drawing/2016/5/11/chartex" xmlns:cx6="http://schemas.microsoft.com/office/drawing/2016/5/12/chartex" xmlns:cx7="http://schemas.microsoft.com/office/drawing/2016/5/13/chartex" xmlns:cx8="http://schemas.microsoft.com/office/drawing/2016/5/14/chartex" xmlns:mc="http://schemas.openxmlformats.org/markup-compatibility/2006" xmlns:aink="http://schemas.microsoft.com/office/drawing/2016/ink" xmlns:am3d="http://schemas.microsoft.com/office/drawing/2017/model3d" xmlns:o="urn:schemas-microsoft-com:office:office" xmlns:oel="http://schemas.microsoft.com/office/2019/extlst" xmlns:r="http://schemas.openxmlformats.org/officeDocument/2006/relationships" xmlns:m="http://schemas.openxmlformats.org/officeDocument/2006/math" xmlns:v="urn:schemas-microsoft-com:vml" xmlns:wp14="http://schemas.microsoft.com/office/word/2010/wordprocessingDrawing" xmlns:wp="http://schemas.openxmlformats.org/drawingml/2006/wordprocessingDrawing" xmlns:w10="urn:schemas-microsoft-com:office:word" xmlns:w="http://schemas.openxmlformats.org/wordprocessingml/2006/main" xmlns:w14="http://schemas.microsoft.com/office/word/2010/wordml" xmlns:w15="http://schemas.microsoft.com/office/word/2012/wordml" xmlns:w16cex="http://schemas.microsoft.com/office/word/2018/wordml/cex" xmlns:w16cid="http://schemas.microsoft.com/office/word/2016/wordml/cid" xmlns:w16="http://schemas.microsoft.com/office/word/2018/wordml" xmlns:w16du="http://schemas.microsoft.com/office/word/2023/wordml/word16du" xmlns:w16sdtdh="http://schemas.microsoft.com/office/word/2020/wordml/sdtdatahash" xmlns:w16sdtfl="http://schemas.microsoft.com/office/word/2024/wordml/sdtformatlock" xmlns:w16se="http://schemas.microsoft.com/office/word/2015/wordml/symex" xmlns:wpg="http://schemas.microsoft.com/office/word/2010/wordprocessingGroup" xmlns:wpi="http://schemas.microsoft.com/office/word/2010/wordprocessingInk" xmlns:wne="http://schemas.microsoft.com/office/word/2006/wordml" xmlns:wps="http://schemas.microsoft.com/office/word/2010/wordprocessingShape" mc:Ignorable="w14 w15 w16se w16cid w16 w16cex w16sdtdh w16sdtfl w16du wp14">
   <w:p>
     <w:pPr>
       <w:pBdr>
@@ -4204,7 +4221,27 @@
         <w:sz w:val="16"/>
         <w:szCs w:val="16"/>
       </w:rPr>
-      <w:t xml:space="preserve"> por cualquier medio, sin previa autorización del Alcalde.</w:t>
+      <w:t xml:space="preserve"> por cualquier medio, sin previa autorización del </w:t>
+    </w:r>
+    <w:proofErr w:type="gramStart"/>
+    <w:r>
+      <w:rPr>
+        <w:rFonts w:ascii="Arial" w:eastAsia="Arial" w:hAnsi="Arial" w:cs="Arial"/>
+        <w:color w:val="000000"/>
+        <w:sz w:val="16"/>
+        <w:szCs w:val="16"/>
+      </w:rPr>
+      <w:t>Alcalde</w:t>
+    </w:r>
+    <w:proofErr w:type="gramEnd"/>
+    <w:r>
+      <w:rPr>
+        <w:rFonts w:ascii="Arial" w:eastAsia="Arial" w:hAnsi="Arial" w:cs="Arial"/>
+        <w:color w:val="000000"/>
+        <w:sz w:val="16"/>
+        <w:szCs w:val="16"/>
+      </w:rPr>
+      <w:t>.</w:t>
     </w:r>
   </w:p>
   <w:p>
@@ -4361,7 +4398,7 @@
 </file>
 
 <file path=word/footnotes.xml><?xml version="1.0" encoding="utf-8"?>
-<w:footnotes xmlns:wpc="http://schemas.microsoft.com/office/word/2010/wordprocessingCanvas" xmlns:mc="http://schemas.openxmlformats.org/markup-compatibility/2006" xmlns:o="urn:schemas-microsoft-com:office:office" xmlns:r="http://schemas.openxmlformats.org/officeDocument/2006/relationships" xmlns:m="http://schemas.openxmlformats.org/officeDocument/2006/math" xmlns:v="urn:schemas-microsoft-com:vml" xmlns:wp14="http://schemas.microsoft.com/office/word/2010/wordprocessingDrawing" xmlns:wp="http://schemas.openxmlformats.org/drawingml/2006/wordprocessingDrawing" xmlns:w10="urn:schemas-microsoft-com:office:word" xmlns:w="http://schemas.openxmlformats.org/wordprocessingml/2006/main" xmlns:w14="http://schemas.microsoft.com/office/word/2010/wordml" xmlns:wpg="http://schemas.microsoft.com/office/word/2010/wordprocessingGroup" xmlns:wpi="http://schemas.microsoft.com/office/word/2010/wordprocessingInk" xmlns:wne="http://schemas.microsoft.com/office/word/2006/wordml" xmlns:wps="http://schemas.microsoft.com/office/word/2010/wordprocessingShape" mc:Ignorable="w14 wp14">
+<w:footnotes xmlns:wpc="http://schemas.microsoft.com/office/word/2010/wordprocessingCanvas" xmlns:cx="http://schemas.microsoft.com/office/drawing/2014/chartex" xmlns:cx1="http://schemas.microsoft.com/office/drawing/2015/9/8/chartex" xmlns:cx2="http://schemas.microsoft.com/office/drawing/2015/10/21/chartex" xmlns:cx3="http://schemas.microsoft.com/office/drawing/2016/5/9/chartex" xmlns:cx4="http://schemas.microsoft.com/office/drawing/2016/5/10/chartex" xmlns:cx5="http://schemas.microsoft.com/office/drawing/2016/5/11/chartex" xmlns:cx6="http://schemas.microsoft.com/office/drawing/2016/5/12/chartex" xmlns:cx7="http://schemas.microsoft.com/office/drawing/2016/5/13/chartex" xmlns:cx8="http://schemas.microsoft.com/office/drawing/2016/5/14/chartex" xmlns:mc="http://schemas.openxmlformats.org/markup-compatibility/2006" xmlns:aink="http://schemas.microsoft.com/office/drawing/2016/ink" xmlns:am3d="http://schemas.microsoft.com/office/drawing/2017/model3d" xmlns:o="urn:schemas-microsoft-com:office:office" xmlns:oel="http://schemas.microsoft.com/office/2019/extlst" xmlns:r="http://schemas.openxmlformats.org/officeDocument/2006/relationships" xmlns:m="http://schemas.openxmlformats.org/officeDocument/2006/math" xmlns:v="urn:schemas-microsoft-com:vml" xmlns:wp14="http://schemas.microsoft.com/office/word/2010/wordprocessingDrawing" xmlns:wp="http://schemas.openxmlformats.org/drawingml/2006/wordprocessingDrawing" xmlns:w10="urn:schemas-microsoft-com:office:word" xmlns:w="http://schemas.openxmlformats.org/wordprocessingml/2006/main" xmlns:w14="http://schemas.microsoft.com/office/word/2010/wordml" xmlns:w15="http://schemas.microsoft.com/office/word/2012/wordml" xmlns:w16cex="http://schemas.microsoft.com/office/word/2018/wordml/cex" xmlns:w16cid="http://schemas.microsoft.com/office/word/2016/wordml/cid" xmlns:w16="http://schemas.microsoft.com/office/word/2018/wordml" xmlns:w16du="http://schemas.microsoft.com/office/word/2023/wordml/word16du" xmlns:w16sdtdh="http://schemas.microsoft.com/office/word/2020/wordml/sdtdatahash" xmlns:w16sdtfl="http://schemas.microsoft.com/office/word/2024/wordml/sdtformatlock" xmlns:w16se="http://schemas.microsoft.com/office/word/2015/wordml/symex" xmlns:wpg="http://schemas.microsoft.com/office/word/2010/wordprocessingGroup" xmlns:wpi="http://schemas.microsoft.com/office/word/2010/wordprocessingInk" xmlns:wne="http://schemas.microsoft.com/office/word/2006/wordml" xmlns:wps="http://schemas.microsoft.com/office/word/2010/wordprocessingShape" mc:Ignorable="w14 w15 w16se w16cid w16 w16cex w16sdtdh w16sdtfl w16du wp14">
   <w:footnote w:type="separator" w:id="-1">
     <w:p>
       <w:r>
@@ -4380,7 +4417,7 @@
 </file>
 
 <file path=word/header1.xml><?xml version="1.0" encoding="utf-8"?>
-<w:hdr xmlns:wpc="http://schemas.microsoft.com/office/word/2010/wordprocessingCanvas" xmlns:mc="http://schemas.openxmlformats.org/markup-compatibility/2006" xmlns:o="urn:schemas-microsoft-com:office:office" xmlns:r="http://schemas.openxmlformats.org/officeDocument/2006/relationships" xmlns:m="http://schemas.openxmlformats.org/officeDocument/2006/math" xmlns:v="urn:schemas-microsoft-com:vml" xmlns:wp14="http://schemas.microsoft.com/office/word/2010/wordprocessingDrawing" xmlns:wp="http://schemas.openxmlformats.org/drawingml/2006/wordprocessingDrawing" xmlns:w10="urn:schemas-microsoft-com:office:word" xmlns:w="http://schemas.openxmlformats.org/wordprocessingml/2006/main" xmlns:w14="http://schemas.microsoft.com/office/word/2010/wordml" xmlns:wpg="http://schemas.microsoft.com/office/word/2010/wordprocessingGroup" xmlns:wpi="http://schemas.microsoft.com/office/word/2010/wordprocessingInk" xmlns:wne="http://schemas.microsoft.com/office/word/2006/wordml" xmlns:wps="http://schemas.microsoft.com/office/word/2010/wordprocessingShape" mc:Ignorable="w14 wp14">
+<w:hdr xmlns:wpc="http://schemas.microsoft.com/office/word/2010/wordprocessingCanvas" xmlns:cx="http://schemas.microsoft.com/office/drawing/2014/chartex" xmlns:cx1="http://schemas.microsoft.com/office/drawing/2015/9/8/chartex" xmlns:cx2="http://schemas.microsoft.com/office/drawing/2015/10/21/chartex" xmlns:cx3="http://schemas.microsoft.com/office/drawing/2016/5/9/chartex" xmlns:cx4="http://schemas.microsoft.com/office/drawing/2016/5/10/chartex" xmlns:cx5="http://schemas.microsoft.com/office/drawing/2016/5/11/chartex" xmlns:cx6="http://schemas.microsoft.com/office/drawing/2016/5/12/chartex" xmlns:cx7="http://schemas.microsoft.com/office/drawing/2016/5/13/chartex" xmlns:cx8="http://schemas.microsoft.com/office/drawing/2016/5/14/chartex" xmlns:mc="http://schemas.openxmlformats.org/markup-compatibility/2006" xmlns:aink="http://schemas.microsoft.com/office/drawing/2016/ink" xmlns:am3d="http://schemas.microsoft.com/office/drawing/2017/model3d" xmlns:o="urn:schemas-microsoft-com:office:office" xmlns:oel="http://schemas.microsoft.com/office/2019/extlst" xmlns:r="http://schemas.openxmlformats.org/officeDocument/2006/relationships" xmlns:m="http://schemas.openxmlformats.org/officeDocument/2006/math" xmlns:v="urn:schemas-microsoft-com:vml" xmlns:wp14="http://schemas.microsoft.com/office/word/2010/wordprocessingDrawing" xmlns:wp="http://schemas.openxmlformats.org/drawingml/2006/wordprocessingDrawing" xmlns:w10="urn:schemas-microsoft-com:office:word" xmlns:w="http://schemas.openxmlformats.org/wordprocessingml/2006/main" xmlns:w14="http://schemas.microsoft.com/office/word/2010/wordml" xmlns:w15="http://schemas.microsoft.com/office/word/2012/wordml" xmlns:w16cex="http://schemas.microsoft.com/office/word/2018/wordml/cex" xmlns:w16cid="http://schemas.microsoft.com/office/word/2016/wordml/cid" xmlns:w16="http://schemas.microsoft.com/office/word/2018/wordml" xmlns:w16du="http://schemas.microsoft.com/office/word/2023/wordml/word16du" xmlns:w16sdtdh="http://schemas.microsoft.com/office/word/2020/wordml/sdtdatahash" xmlns:w16sdtfl="http://schemas.microsoft.com/office/word/2024/wordml/sdtformatlock" xmlns:w16se="http://schemas.microsoft.com/office/word/2015/wordml/symex" xmlns:wpg="http://schemas.microsoft.com/office/word/2010/wordprocessingGroup" xmlns:wpi="http://schemas.microsoft.com/office/word/2010/wordprocessingInk" xmlns:wne="http://schemas.microsoft.com/office/word/2006/wordml" xmlns:wps="http://schemas.microsoft.com/office/word/2010/wordprocessingShape" mc:Ignorable="w14 w15 w16se w16cid w16 w16cex w16sdtdh w16sdtfl w16du wp14">
   <w:p>
     <w:pPr>
       <w:pBdr>
@@ -4758,7 +4795,7 @@
               <w:szCs w:val="24"/>
             </w:rPr>
           </w:pPr>
-          <w:bookmarkStart w:id="1" w:name="_Hlk151385364"/>
+          <w:bookmarkStart w:id="0" w:name="_Hlk151385364"/>
           <w:r>
             <w:rPr>
               <w:rFonts w:ascii="Arial" w:eastAsia="Arial" w:hAnsi="Arial" w:cs="Arial"/>
@@ -4858,7 +4895,7 @@
             </w:rPr>
             <w:t>ORDEN DE COMPRA</w:t>
           </w:r>
-          <w:bookmarkEnd w:id="1"/>
+          <w:bookmarkEnd w:id="0"/>
         </w:p>
       </w:tc>
       <w:tc>
@@ -4885,7 +4922,29 @@
               <w:szCs w:val="20"/>
               <w:shd w:val="clear" w:color="auto" w:fill="FFFFFF"/>
             </w:rPr>
-            <w:t>MAJA01.04.03.P003.F001</w:t>
+            <w:t>MAJA01.04.</w:t>
+          </w:r>
+          <w:proofErr w:type="gramStart"/>
+          <w:r>
+            <w:rPr>
+              <w:rFonts w:ascii="Arial" w:hAnsi="Arial" w:cs="Arial"/>
+              <w:color w:val="000000"/>
+              <w:sz w:val="20"/>
+              <w:szCs w:val="20"/>
+              <w:shd w:val="clear" w:color="auto" w:fill="FFFFFF"/>
+            </w:rPr>
+            <w:t>03.P003.F</w:t>
+          </w:r>
+          <w:proofErr w:type="gramEnd"/>
+          <w:r>
+            <w:rPr>
+              <w:rFonts w:ascii="Arial" w:hAnsi="Arial" w:cs="Arial"/>
+              <w:color w:val="000000"/>
+              <w:sz w:val="20"/>
+              <w:szCs w:val="20"/>
+              <w:shd w:val="clear" w:color="auto" w:fill="FFFFFF"/>
+            </w:rPr>
+            <w:t>001</w:t>
           </w:r>
         </w:p>
       </w:tc>
@@ -5052,7 +5111,7 @@
 </file>
 
 <file path=word/styles.xml><?xml version="1.0" encoding="utf-8"?>
-<w:styles xmlns:mc="http://schemas.openxmlformats.org/markup-compatibility/2006" xmlns:r="http://schemas.openxmlformats.org/officeDocument/2006/relationships" xmlns:w="http://schemas.openxmlformats.org/wordprocessingml/2006/main" xmlns:w14="http://schemas.microsoft.com/office/word/2010/wordml" mc:Ignorable="w14">
+<w:styles xmlns:mc="http://schemas.openxmlformats.org/markup-compatibility/2006" xmlns:r="http://schemas.openxmlformats.org/officeDocument/2006/relationships" xmlns:w="http://schemas.openxmlformats.org/wordprocessingml/2006/main" xmlns:w14="http://schemas.microsoft.com/office/word/2010/wordml" xmlns:w15="http://schemas.microsoft.com/office/word/2012/wordml" xmlns:w16cex="http://schemas.microsoft.com/office/word/2018/wordml/cex" xmlns:w16cid="http://schemas.microsoft.com/office/word/2016/wordml/cid" xmlns:w16="http://schemas.microsoft.com/office/word/2018/wordml" xmlns:w16du="http://schemas.microsoft.com/office/word/2023/wordml/word16du" xmlns:w16sdtdh="http://schemas.microsoft.com/office/word/2020/wordml/sdtdatahash" xmlns:w16sdtfl="http://schemas.microsoft.com/office/word/2024/wordml/sdtformatlock" xmlns:w16se="http://schemas.microsoft.com/office/word/2015/wordml/symex" mc:Ignorable="w14 w15 w16se w16cid w16 w16cex w16sdtdh w16sdtfl w16du">
   <w:docDefaults>
     <w:rPrDefault>
       <w:rPr>
@@ -5064,144 +5123,383 @@
     </w:rPrDefault>
     <w:pPrDefault/>
   </w:docDefaults>
-  <w:latentStyles w:defLockedState="0" w:defUIPriority="99" w:defSemiHidden="1" w:defUnhideWhenUsed="1" w:defQFormat="0" w:count="267">
-    <w:lsdException w:name="Normal" w:semiHidden="0" w:uiPriority="0" w:unhideWhenUsed="0" w:qFormat="1"/>
-    <w:lsdException w:name="heading 1" w:semiHidden="0" w:uiPriority="9" w:unhideWhenUsed="0" w:qFormat="1"/>
-    <w:lsdException w:name="heading 2" w:uiPriority="9" w:qFormat="1"/>
-    <w:lsdException w:name="heading 3" w:uiPriority="9" w:qFormat="1"/>
-    <w:lsdException w:name="heading 4" w:uiPriority="9" w:qFormat="1"/>
-    <w:lsdException w:name="heading 5" w:uiPriority="9" w:qFormat="1"/>
-    <w:lsdException w:name="heading 6" w:uiPriority="9" w:qFormat="1"/>
-    <w:lsdException w:name="heading 7" w:uiPriority="9" w:qFormat="1"/>
-    <w:lsdException w:name="heading 8" w:uiPriority="9" w:qFormat="1"/>
-    <w:lsdException w:name="heading 9" w:uiPriority="9" w:qFormat="1"/>
-    <w:lsdException w:name="toc 1" w:uiPriority="39"/>
-    <w:lsdException w:name="toc 2" w:uiPriority="39"/>
-    <w:lsdException w:name="toc 3" w:uiPriority="39"/>
-    <w:lsdException w:name="toc 4" w:uiPriority="39"/>
-    <w:lsdException w:name="toc 5" w:uiPriority="39"/>
-    <w:lsdException w:name="toc 6" w:uiPriority="39"/>
-    <w:lsdException w:name="toc 7" w:uiPriority="39"/>
-    <w:lsdException w:name="toc 8" w:uiPriority="39"/>
-    <w:lsdException w:name="toc 9" w:uiPriority="39"/>
-    <w:lsdException w:name="caption" w:uiPriority="35" w:qFormat="1"/>
-    <w:lsdException w:name="Title" w:semiHidden="0" w:uiPriority="10" w:unhideWhenUsed="0" w:qFormat="1"/>
-    <w:lsdException w:name="Default Paragraph Font" w:uiPriority="1"/>
-    <w:lsdException w:name="Subtitle" w:semiHidden="0" w:uiPriority="11" w:unhideWhenUsed="0" w:qFormat="1"/>
-    <w:lsdException w:name="Strong" w:semiHidden="0" w:uiPriority="22" w:unhideWhenUsed="0" w:qFormat="1"/>
-    <w:lsdException w:name="Emphasis" w:semiHidden="0" w:uiPriority="20" w:unhideWhenUsed="0" w:qFormat="1"/>
+  <w:latentStyles w:defLockedState="0" w:defUIPriority="99" w:defSemiHidden="0" w:defUnhideWhenUsed="0" w:defQFormat="0" w:count="376">
+    <w:lsdException w:name="Normal" w:uiPriority="0" w:qFormat="1"/>
+    <w:lsdException w:name="heading 1" w:uiPriority="9" w:qFormat="1"/>
+    <w:lsdException w:name="heading 2" w:semiHidden="1" w:uiPriority="9" w:unhideWhenUsed="1" w:qFormat="1"/>
+    <w:lsdException w:name="heading 3" w:semiHidden="1" w:uiPriority="9" w:unhideWhenUsed="1" w:qFormat="1"/>
+    <w:lsdException w:name="heading 4" w:semiHidden="1" w:uiPriority="9" w:unhideWhenUsed="1" w:qFormat="1"/>
+    <w:lsdException w:name="heading 5" w:semiHidden="1" w:uiPriority="9" w:unhideWhenUsed="1" w:qFormat="1"/>
+    <w:lsdException w:name="heading 6" w:semiHidden="1" w:uiPriority="9" w:unhideWhenUsed="1" w:qFormat="1"/>
+    <w:lsdException w:name="heading 7" w:semiHidden="1" w:uiPriority="9" w:unhideWhenUsed="1" w:qFormat="1"/>
+    <w:lsdException w:name="heading 8" w:semiHidden="1" w:uiPriority="9" w:unhideWhenUsed="1" w:qFormat="1"/>
+    <w:lsdException w:name="heading 9" w:semiHidden="1" w:uiPriority="9" w:unhideWhenUsed="1" w:qFormat="1"/>
+    <w:lsdException w:name="index 1" w:semiHidden="1" w:unhideWhenUsed="1"/>
+    <w:lsdException w:name="index 2" w:semiHidden="1" w:unhideWhenUsed="1"/>
+    <w:lsdException w:name="index 3" w:semiHidden="1" w:unhideWhenUsed="1"/>
+    <w:lsdException w:name="index 4" w:semiHidden="1" w:unhideWhenUsed="1"/>
+    <w:lsdException w:name="index 5" w:semiHidden="1" w:unhideWhenUsed="1"/>
+    <w:lsdException w:name="index 6" w:semiHidden="1" w:unhideWhenUsed="1"/>
+    <w:lsdException w:name="index 7" w:semiHidden="1" w:unhideWhenUsed="1"/>
+    <w:lsdException w:name="index 8" w:semiHidden="1" w:unhideWhenUsed="1"/>
+    <w:lsdException w:name="index 9" w:semiHidden="1" w:unhideWhenUsed="1"/>
+    <w:lsdException w:name="toc 1" w:semiHidden="1" w:uiPriority="39" w:unhideWhenUsed="1"/>
+    <w:lsdException w:name="toc 2" w:semiHidden="1" w:uiPriority="39" w:unhideWhenUsed="1"/>
+    <w:lsdException w:name="toc 3" w:semiHidden="1" w:uiPriority="39" w:unhideWhenUsed="1"/>
+    <w:lsdException w:name="toc 4" w:semiHidden="1" w:uiPriority="39" w:unhideWhenUsed="1"/>
+    <w:lsdException w:name="toc 5" w:semiHidden="1" w:uiPriority="39" w:unhideWhenUsed="1"/>
+    <w:lsdException w:name="toc 6" w:semiHidden="1" w:uiPriority="39" w:unhideWhenUsed="1"/>
+    <w:lsdException w:name="toc 7" w:semiHidden="1" w:uiPriority="39" w:unhideWhenUsed="1"/>
+    <w:lsdException w:name="toc 8" w:semiHidden="1" w:uiPriority="39" w:unhideWhenUsed="1"/>
+    <w:lsdException w:name="toc 9" w:semiHidden="1" w:uiPriority="39" w:unhideWhenUsed="1"/>
+    <w:lsdException w:name="Normal Indent" w:semiHidden="1" w:unhideWhenUsed="1"/>
+    <w:lsdException w:name="footnote text" w:semiHidden="1" w:unhideWhenUsed="1"/>
+    <w:lsdException w:name="annotation text" w:semiHidden="1" w:unhideWhenUsed="1"/>
+    <w:lsdException w:name="header" w:semiHidden="1" w:unhideWhenUsed="1"/>
+    <w:lsdException w:name="footer" w:semiHidden="1" w:unhideWhenUsed="1"/>
+    <w:lsdException w:name="index heading" w:semiHidden="1" w:unhideWhenUsed="1"/>
+    <w:lsdException w:name="caption" w:semiHidden="1" w:uiPriority="35" w:unhideWhenUsed="1" w:qFormat="1"/>
+    <w:lsdException w:name="table of figures" w:semiHidden="1" w:unhideWhenUsed="1"/>
+    <w:lsdException w:name="envelope address" w:semiHidden="1" w:unhideWhenUsed="1"/>
+    <w:lsdException w:name="envelope return" w:semiHidden="1" w:unhideWhenUsed="1"/>
+    <w:lsdException w:name="footnote reference" w:semiHidden="1" w:unhideWhenUsed="1"/>
+    <w:lsdException w:name="annotation reference" w:semiHidden="1" w:unhideWhenUsed="1"/>
+    <w:lsdException w:name="line number" w:semiHidden="1" w:unhideWhenUsed="1"/>
+    <w:lsdException w:name="page number" w:semiHidden="1" w:unhideWhenUsed="1"/>
+    <w:lsdException w:name="endnote reference" w:semiHidden="1" w:unhideWhenUsed="1"/>
+    <w:lsdException w:name="endnote text" w:semiHidden="1" w:unhideWhenUsed="1"/>
+    <w:lsdException w:name="table of authorities" w:semiHidden="1" w:unhideWhenUsed="1"/>
+    <w:lsdException w:name="macro" w:semiHidden="1" w:unhideWhenUsed="1"/>
+    <w:lsdException w:name="toa heading" w:semiHidden="1" w:unhideWhenUsed="1"/>
+    <w:lsdException w:name="List" w:semiHidden="1" w:unhideWhenUsed="1"/>
+    <w:lsdException w:name="List Bullet" w:semiHidden="1" w:unhideWhenUsed="1"/>
+    <w:lsdException w:name="List Number" w:semiHidden="1" w:unhideWhenUsed="1"/>
+    <w:lsdException w:name="List 2" w:semiHidden="1" w:unhideWhenUsed="1"/>
+    <w:lsdException w:name="List 3" w:semiHidden="1" w:unhideWhenUsed="1"/>
+    <w:lsdException w:name="List 4" w:semiHidden="1" w:unhideWhenUsed="1"/>
+    <w:lsdException w:name="List 5" w:semiHidden="1" w:unhideWhenUsed="1"/>
+    <w:lsdException w:name="List Bullet 2" w:semiHidden="1" w:unhideWhenUsed="1"/>
+    <w:lsdException w:name="List Bullet 3" w:semiHidden="1" w:unhideWhenUsed="1"/>
+    <w:lsdException w:name="List Bullet 4" w:semiHidden="1" w:unhideWhenUsed="1"/>
+    <w:lsdException w:name="List Bullet 5" w:semiHidden="1" w:unhideWhenUsed="1"/>
+    <w:lsdException w:name="List Number 2" w:semiHidden="1" w:unhideWhenUsed="1"/>
+    <w:lsdException w:name="List Number 3" w:semiHidden="1" w:unhideWhenUsed="1"/>
+    <w:lsdException w:name="List Number 4" w:semiHidden="1" w:unhideWhenUsed="1"/>
+    <w:lsdException w:name="List Number 5" w:semiHidden="1" w:unhideWhenUsed="1"/>
+    <w:lsdException w:name="Title" w:uiPriority="10" w:qFormat="1"/>
+    <w:lsdException w:name="Closing" w:semiHidden="1" w:unhideWhenUsed="1"/>
+    <w:lsdException w:name="Signature" w:semiHidden="1" w:unhideWhenUsed="1"/>
+    <w:lsdException w:name="Default Paragraph Font" w:semiHidden="1" w:uiPriority="1" w:unhideWhenUsed="1"/>
+    <w:lsdException w:name="Body Text" w:semiHidden="1" w:unhideWhenUsed="1"/>
+    <w:lsdException w:name="Body Text Indent" w:semiHidden="1" w:unhideWhenUsed="1"/>
+    <w:lsdException w:name="List Continue" w:semiHidden="1" w:unhideWhenUsed="1"/>
+    <w:lsdException w:name="List Continue 2" w:semiHidden="1" w:unhideWhenUsed="1"/>
+    <w:lsdException w:name="List Continue 3" w:semiHidden="1" w:unhideWhenUsed="1"/>
+    <w:lsdException w:name="List Continue 4" w:semiHidden="1" w:unhideWhenUsed="1"/>
+    <w:lsdException w:name="List Continue 5" w:semiHidden="1" w:unhideWhenUsed="1"/>
+    <w:lsdException w:name="Message Header" w:semiHidden="1" w:unhideWhenUsed="1"/>
+    <w:lsdException w:name="Subtitle" w:uiPriority="11" w:qFormat="1"/>
+    <w:lsdException w:name="Salutation" w:semiHidden="1" w:unhideWhenUsed="1"/>
+    <w:lsdException w:name="Date" w:semiHidden="1" w:unhideWhenUsed="1"/>
+    <w:lsdException w:name="Body Text First Indent" w:semiHidden="1" w:unhideWhenUsed="1"/>
+    <w:lsdException w:name="Body Text First Indent 2" w:semiHidden="1" w:unhideWhenUsed="1"/>
+    <w:lsdException w:name="Note Heading" w:semiHidden="1" w:unhideWhenUsed="1"/>
+    <w:lsdException w:name="Body Text 2" w:semiHidden="1" w:unhideWhenUsed="1"/>
+    <w:lsdException w:name="Body Text 3" w:semiHidden="1" w:unhideWhenUsed="1"/>
+    <w:lsdException w:name="Body Text Indent 2" w:semiHidden="1" w:unhideWhenUsed="1"/>
+    <w:lsdException w:name="Body Text Indent 3" w:semiHidden="1" w:unhideWhenUsed="1"/>
+    <w:lsdException w:name="Block Text" w:semiHidden="1" w:unhideWhenUsed="1"/>
+    <w:lsdException w:name="Hyperlink" w:semiHidden="1" w:unhideWhenUsed="1"/>
+    <w:lsdException w:name="FollowedHyperlink" w:semiHidden="1" w:unhideWhenUsed="1"/>
+    <w:lsdException w:name="Strong" w:uiPriority="22" w:qFormat="1"/>
+    <w:lsdException w:name="Emphasis" w:uiPriority="20" w:qFormat="1"/>
+    <w:lsdException w:name="Document Map" w:semiHidden="1" w:unhideWhenUsed="1"/>
+    <w:lsdException w:name="Plain Text" w:semiHidden="1" w:unhideWhenUsed="1"/>
+    <w:lsdException w:name="E-mail Signature" w:semiHidden="1" w:unhideWhenUsed="1"/>
+    <w:lsdException w:name="HTML Top of Form" w:semiHidden="1" w:unhideWhenUsed="1"/>
+    <w:lsdException w:name="HTML Bottom of Form" w:semiHidden="1" w:unhideWhenUsed="1"/>
+    <w:lsdException w:name="Normal (Web)" w:semiHidden="1" w:unhideWhenUsed="1"/>
+    <w:lsdException w:name="HTML Acronym" w:semiHidden="1" w:unhideWhenUsed="1"/>
+    <w:lsdException w:name="HTML Address" w:semiHidden="1" w:unhideWhenUsed="1"/>
+    <w:lsdException w:name="HTML Cite" w:semiHidden="1" w:unhideWhenUsed="1"/>
+    <w:lsdException w:name="HTML Code" w:semiHidden="1" w:unhideWhenUsed="1"/>
+    <w:lsdException w:name="HTML Definition" w:semiHidden="1" w:unhideWhenUsed="1"/>
+    <w:lsdException w:name="HTML Keyboard" w:semiHidden="1" w:unhideWhenUsed="1"/>
+    <w:lsdException w:name="HTML Preformatted" w:semiHidden="1" w:unhideWhenUsed="1"/>
+    <w:lsdException w:name="HTML Sample" w:semiHidden="1" w:unhideWhenUsed="1"/>
+    <w:lsdException w:name="HTML Typewriter" w:semiHidden="1" w:unhideWhenUsed="1"/>
+    <w:lsdException w:name="HTML Variable" w:semiHidden="1" w:unhideWhenUsed="1"/>
+    <w:lsdException w:name="Normal Table" w:semiHidden="1" w:unhideWhenUsed="1"/>
+    <w:lsdException w:name="annotation subject" w:semiHidden="1" w:unhideWhenUsed="1"/>
+    <w:lsdException w:name="No List" w:semiHidden="1" w:unhideWhenUsed="1"/>
+    <w:lsdException w:name="Outline List 1" w:semiHidden="1" w:unhideWhenUsed="1"/>
+    <w:lsdException w:name="Outline List 2" w:semiHidden="1" w:unhideWhenUsed="1"/>
+    <w:lsdException w:name="Outline List 3" w:semiHidden="1" w:unhideWhenUsed="1"/>
+    <w:lsdException w:name="Table Simple 1" w:semiHidden="1" w:unhideWhenUsed="1"/>
+    <w:lsdException w:name="Table Simple 2" w:semiHidden="1" w:unhideWhenUsed="1"/>
+    <w:lsdException w:name="Table Simple 3" w:semiHidden="1" w:unhideWhenUsed="1"/>
+    <w:lsdException w:name="Table Classic 1" w:semiHidden="1" w:unhideWhenUsed="1"/>
+    <w:lsdException w:name="Table Classic 2" w:semiHidden="1" w:unhideWhenUsed="1"/>
+    <w:lsdException w:name="Table Classic 3" w:semiHidden="1" w:unhideWhenUsed="1"/>
+    <w:lsdException w:name="Table Classic 4" w:semiHidden="1" w:unhideWhenUsed="1"/>
+    <w:lsdException w:name="Table Colorful 1" w:semiHidden="1" w:unhideWhenUsed="1"/>
+    <w:lsdException w:name="Table Colorful 2" w:semiHidden="1" w:unhideWhenUsed="1"/>
+    <w:lsdException w:name="Table Colorful 3" w:semiHidden="1" w:unhideWhenUsed="1"/>
+    <w:lsdException w:name="Table Columns 1" w:semiHidden="1" w:unhideWhenUsed="1"/>
+    <w:lsdException w:name="Table Columns 2" w:semiHidden="1" w:unhideWhenUsed="1"/>
+    <w:lsdException w:name="Table Columns 3" w:semiHidden="1" w:unhideWhenUsed="1"/>
+    <w:lsdException w:name="Table Columns 4" w:semiHidden="1" w:unhideWhenUsed="1"/>
+    <w:lsdException w:name="Table Columns 5" w:semiHidden="1" w:unhideWhenUsed="1"/>
+    <w:lsdException w:name="Table Grid 1" w:semiHidden="1" w:unhideWhenUsed="1"/>
+    <w:lsdException w:name="Table Grid 2" w:semiHidden="1" w:unhideWhenUsed="1"/>
+    <w:lsdException w:name="Table Grid 3" w:semiHidden="1" w:unhideWhenUsed="1"/>
+    <w:lsdException w:name="Table Grid 4" w:semiHidden="1" w:unhideWhenUsed="1"/>
+    <w:lsdException w:name="Table Grid 5" w:semiHidden="1" w:unhideWhenUsed="1"/>
+    <w:lsdException w:name="Table Grid 6" w:semiHidden="1" w:unhideWhenUsed="1"/>
+    <w:lsdException w:name="Table Grid 7" w:semiHidden="1" w:unhideWhenUsed="1"/>
+    <w:lsdException w:name="Table Grid 8" w:semiHidden="1" w:unhideWhenUsed="1"/>
+    <w:lsdException w:name="Table List 1" w:semiHidden="1" w:unhideWhenUsed="1"/>
+    <w:lsdException w:name="Table List 2" w:semiHidden="1" w:unhideWhenUsed="1"/>
+    <w:lsdException w:name="Table List 3" w:semiHidden="1" w:unhideWhenUsed="1"/>
+    <w:lsdException w:name="Table List 4" w:semiHidden="1" w:unhideWhenUsed="1"/>
+    <w:lsdException w:name="Table List 5" w:semiHidden="1" w:unhideWhenUsed="1"/>
+    <w:lsdException w:name="Table List 6" w:semiHidden="1" w:unhideWhenUsed="1"/>
+    <w:lsdException w:name="Table List 7" w:semiHidden="1" w:unhideWhenUsed="1"/>
+    <w:lsdException w:name="Table List 8" w:semiHidden="1" w:unhideWhenUsed="1"/>
+    <w:lsdException w:name="Table 3D effects 1" w:semiHidden="1" w:unhideWhenUsed="1"/>
+    <w:lsdException w:name="Table 3D effects 2" w:semiHidden="1" w:unhideWhenUsed="1"/>
+    <w:lsdException w:name="Table 3D effects 3" w:semiHidden="1" w:unhideWhenUsed="1"/>
+    <w:lsdException w:name="Table Contemporary" w:semiHidden="1" w:unhideWhenUsed="1"/>
+    <w:lsdException w:name="Table Elegant" w:semiHidden="1" w:unhideWhenUsed="1"/>
+    <w:lsdException w:name="Table Professional" w:semiHidden="1" w:unhideWhenUsed="1"/>
+    <w:lsdException w:name="Table Subtle 1" w:semiHidden="1" w:unhideWhenUsed="1"/>
+    <w:lsdException w:name="Table Subtle 2" w:semiHidden="1" w:unhideWhenUsed="1"/>
+    <w:lsdException w:name="Table Web 1" w:semiHidden="1" w:unhideWhenUsed="1"/>
+    <w:lsdException w:name="Table Web 2" w:semiHidden="1" w:unhideWhenUsed="1"/>
+    <w:lsdException w:name="Table Web 3" w:semiHidden="1" w:unhideWhenUsed="1"/>
+    <w:lsdException w:name="Balloon Text" w:semiHidden="1" w:unhideWhenUsed="1"/>
     <w:lsdException w:name="Table Grid" w:uiPriority="39"/>
-    <w:lsdException w:name="Placeholder Text" w:unhideWhenUsed="0"/>
-    <w:lsdException w:name="No Spacing" w:semiHidden="0" w:uiPriority="1" w:unhideWhenUsed="0" w:qFormat="1"/>
-    <w:lsdException w:name="Light Shading" w:semiHidden="0" w:uiPriority="60" w:unhideWhenUsed="0"/>
-    <w:lsdException w:name="Light List" w:semiHidden="0" w:uiPriority="61" w:unhideWhenUsed="0"/>
-    <w:lsdException w:name="Light Grid" w:semiHidden="0" w:uiPriority="62" w:unhideWhenUsed="0"/>
-    <w:lsdException w:name="Medium Shading 1" w:semiHidden="0" w:uiPriority="63" w:unhideWhenUsed="0"/>
-    <w:lsdException w:name="Medium Shading 2" w:semiHidden="0" w:uiPriority="64" w:unhideWhenUsed="0"/>
-    <w:lsdException w:name="Medium List 1" w:semiHidden="0" w:uiPriority="65" w:unhideWhenUsed="0"/>
-    <w:lsdException w:name="Medium List 2" w:semiHidden="0" w:uiPriority="66" w:unhideWhenUsed="0"/>
-    <w:lsdException w:name="Medium Grid 1" w:semiHidden="0" w:uiPriority="67" w:unhideWhenUsed="0"/>
-    <w:lsdException w:name="Medium Grid 2" w:semiHidden="0" w:uiPriority="68" w:unhideWhenUsed="0"/>
-    <w:lsdException w:name="Medium Grid 3" w:semiHidden="0" w:uiPriority="69" w:unhideWhenUsed="0"/>
-    <w:lsdException w:name="Dark List" w:semiHidden="0" w:uiPriority="70" w:unhideWhenUsed="0"/>
-    <w:lsdException w:name="Colorful Shading" w:semiHidden="0" w:uiPriority="71" w:unhideWhenUsed="0"/>
-    <w:lsdException w:name="Colorful List" w:semiHidden="0" w:uiPriority="72" w:unhideWhenUsed="0"/>
-    <w:lsdException w:name="Colorful Grid" w:semiHidden="0" w:uiPriority="73" w:unhideWhenUsed="0"/>
-    <w:lsdException w:name="Light Shading Accent 1" w:semiHidden="0" w:uiPriority="60" w:unhideWhenUsed="0"/>
-    <w:lsdException w:name="Light List Accent 1" w:semiHidden="0" w:uiPriority="61" w:unhideWhenUsed="0"/>
-    <w:lsdException w:name="Light Grid Accent 1" w:semiHidden="0" w:uiPriority="62" w:unhideWhenUsed="0"/>
-    <w:lsdException w:name="Medium Shading 1 Accent 1" w:semiHidden="0" w:uiPriority="63" w:unhideWhenUsed="0"/>
-    <w:lsdException w:name="Medium Shading 2 Accent 1" w:semiHidden="0" w:uiPriority="64" w:unhideWhenUsed="0"/>
-    <w:lsdException w:name="Medium List 1 Accent 1" w:semiHidden="0" w:uiPriority="65" w:unhideWhenUsed="0"/>
-    <w:lsdException w:name="Revision" w:unhideWhenUsed="0"/>
-    <w:lsdException w:name="List Paragraph" w:semiHidden="0" w:uiPriority="34" w:unhideWhenUsed="0" w:qFormat="1"/>
-    <w:lsdException w:name="Quote" w:semiHidden="0" w:uiPriority="29" w:unhideWhenUsed="0" w:qFormat="1"/>
-    <w:lsdException w:name="Intense Quote" w:semiHidden="0" w:uiPriority="30" w:unhideWhenUsed="0" w:qFormat="1"/>
-    <w:lsdException w:name="Medium List 2 Accent 1" w:semiHidden="0" w:uiPriority="66" w:unhideWhenUsed="0"/>
-    <w:lsdException w:name="Medium Grid 1 Accent 1" w:semiHidden="0" w:uiPriority="67" w:unhideWhenUsed="0"/>
-    <w:lsdException w:name="Medium Grid 2 Accent 1" w:semiHidden="0" w:uiPriority="68" w:unhideWhenUsed="0"/>
-    <w:lsdException w:name="Medium Grid 3 Accent 1" w:semiHidden="0" w:uiPriority="69" w:unhideWhenUsed="0"/>
-    <w:lsdException w:name="Dark List Accent 1" w:semiHidden="0" w:uiPriority="70" w:unhideWhenUsed="0"/>
-    <w:lsdException w:name="Colorful Shading Accent 1" w:semiHidden="0" w:uiPriority="71" w:unhideWhenUsed="0"/>
-    <w:lsdException w:name="Colorful List Accent 1" w:semiHidden="0" w:uiPriority="72" w:unhideWhenUsed="0"/>
-    <w:lsdException w:name="Colorful Grid Accent 1" w:semiHidden="0" w:uiPriority="73" w:unhideWhenUsed="0"/>
-    <w:lsdException w:name="Light Shading Accent 2" w:semiHidden="0" w:uiPriority="60" w:unhideWhenUsed="0"/>
-    <w:lsdException w:name="Light List Accent 2" w:semiHidden="0" w:uiPriority="61" w:unhideWhenUsed="0"/>
-    <w:lsdException w:name="Light Grid Accent 2" w:semiHidden="0" w:uiPriority="62" w:unhideWhenUsed="0"/>
-    <w:lsdException w:name="Medium Shading 1 Accent 2" w:semiHidden="0" w:uiPriority="63" w:unhideWhenUsed="0"/>
-    <w:lsdException w:name="Medium Shading 2 Accent 2" w:semiHidden="0" w:uiPriority="64" w:unhideWhenUsed="0"/>
-    <w:lsdException w:name="Medium List 1 Accent 2" w:semiHidden="0" w:uiPriority="65" w:unhideWhenUsed="0"/>
-    <w:lsdException w:name="Medium List 2 Accent 2" w:semiHidden="0" w:uiPriority="66" w:unhideWhenUsed="0"/>
-    <w:lsdException w:name="Medium Grid 1 Accent 2" w:semiHidden="0" w:uiPriority="67" w:unhideWhenUsed="0"/>
-    <w:lsdException w:name="Medium Grid 2 Accent 2" w:semiHidden="0" w:uiPriority="68" w:unhideWhenUsed="0"/>
-    <w:lsdException w:name="Medium Grid 3 Accent 2" w:semiHidden="0" w:uiPriority="69" w:unhideWhenUsed="0"/>
-    <w:lsdException w:name="Dark List Accent 2" w:semiHidden="0" w:uiPriority="70" w:unhideWhenUsed="0"/>
-    <w:lsdException w:name="Colorful Shading Accent 2" w:semiHidden="0" w:uiPriority="71" w:unhideWhenUsed="0"/>
-    <w:lsdException w:name="Colorful List Accent 2" w:semiHidden="0" w:uiPriority="72" w:unhideWhenUsed="0"/>
-    <w:lsdException w:name="Colorful Grid Accent 2" w:semiHidden="0" w:uiPriority="73" w:unhideWhenUsed="0"/>
-    <w:lsdException w:name="Light Shading Accent 3" w:semiHidden="0" w:uiPriority="60" w:unhideWhenUsed="0"/>
-    <w:lsdException w:name="Light List Accent 3" w:semiHidden="0" w:uiPriority="61" w:unhideWhenUsed="0"/>
-    <w:lsdException w:name="Light Grid Accent 3" w:semiHidden="0" w:uiPriority="62" w:unhideWhenUsed="0"/>
-    <w:lsdException w:name="Medium Shading 1 Accent 3" w:semiHidden="0" w:uiPriority="63" w:unhideWhenUsed="0"/>
-    <w:lsdException w:name="Medium Shading 2 Accent 3" w:semiHidden="0" w:uiPriority="64" w:unhideWhenUsed="0"/>
-    <w:lsdException w:name="Medium List 1 Accent 3" w:semiHidden="0" w:uiPriority="65" w:unhideWhenUsed="0"/>
-    <w:lsdException w:name="Medium List 2 Accent 3" w:semiHidden="0" w:uiPriority="66" w:unhideWhenUsed="0"/>
-    <w:lsdException w:name="Medium Grid 1 Accent 3" w:semiHidden="0" w:uiPriority="67" w:unhideWhenUsed="0"/>
-    <w:lsdException w:name="Medium Grid 2 Accent 3" w:semiHidden="0" w:uiPriority="68" w:unhideWhenUsed="0"/>
-    <w:lsdException w:name="Medium Grid 3 Accent 3" w:semiHidden="0" w:uiPriority="69" w:unhideWhenUsed="0"/>
-    <w:lsdException w:name="Dark List Accent 3" w:semiHidden="0" w:uiPriority="70" w:unhideWhenUsed="0"/>
-    <w:lsdException w:name="Colorful Shading Accent 3" w:semiHidden="0" w:uiPriority="71" w:unhideWhenUsed="0"/>
-    <w:lsdException w:name="Colorful List Accent 3" w:semiHidden="0" w:uiPriority="72" w:unhideWhenUsed="0"/>
-    <w:lsdException w:name="Colorful Grid Accent 3" w:semiHidden="0" w:uiPriority="73" w:unhideWhenUsed="0"/>
-    <w:lsdException w:name="Light Shading Accent 4" w:semiHidden="0" w:uiPriority="60" w:unhideWhenUsed="0"/>
-    <w:lsdException w:name="Light List Accent 4" w:semiHidden="0" w:uiPriority="61" w:unhideWhenUsed="0"/>
-    <w:lsdException w:name="Light Grid Accent 4" w:semiHidden="0" w:uiPriority="62" w:unhideWhenUsed="0"/>
-    <w:lsdException w:name="Medium Shading 1 Accent 4" w:semiHidden="0" w:uiPriority="63" w:unhideWhenUsed="0"/>
-    <w:lsdException w:name="Medium Shading 2 Accent 4" w:semiHidden="0" w:uiPriority="64" w:unhideWhenUsed="0"/>
-    <w:lsdException w:name="Medium List 1 Accent 4" w:semiHidden="0" w:uiPriority="65" w:unhideWhenUsed="0"/>
-    <w:lsdException w:name="Medium List 2 Accent 4" w:semiHidden="0" w:uiPriority="66" w:unhideWhenUsed="0"/>
-    <w:lsdException w:name="Medium Grid 1 Accent 4" w:semiHidden="0" w:uiPriority="67" w:unhideWhenUsed="0"/>
-    <w:lsdException w:name="Medium Grid 2 Accent 4" w:semiHidden="0" w:uiPriority="68" w:unhideWhenUsed="0"/>
-    <w:lsdException w:name="Medium Grid 3 Accent 4" w:semiHidden="0" w:uiPriority="69" w:unhideWhenUsed="0"/>
-    <w:lsdException w:name="Dark List Accent 4" w:semiHidden="0" w:uiPriority="70" w:unhideWhenUsed="0"/>
-    <w:lsdException w:name="Colorful Shading Accent 4" w:semiHidden="0" w:uiPriority="71" w:unhideWhenUsed="0"/>
-    <w:lsdException w:name="Colorful List Accent 4" w:semiHidden="0" w:uiPriority="72" w:unhideWhenUsed="0"/>
-    <w:lsdException w:name="Colorful Grid Accent 4" w:semiHidden="0" w:uiPriority="73" w:unhideWhenUsed="0"/>
-    <w:lsdException w:name="Light Shading Accent 5" w:semiHidden="0" w:uiPriority="60" w:unhideWhenUsed="0"/>
-    <w:lsdException w:name="Light List Accent 5" w:semiHidden="0" w:uiPriority="61" w:unhideWhenUsed="0"/>
-    <w:lsdException w:name="Light Grid Accent 5" w:semiHidden="0" w:uiPriority="62" w:unhideWhenUsed="0"/>
-    <w:lsdException w:name="Medium Shading 1 Accent 5" w:semiHidden="0" w:uiPriority="63" w:unhideWhenUsed="0"/>
-    <w:lsdException w:name="Medium Shading 2 Accent 5" w:semiHidden="0" w:uiPriority="64" w:unhideWhenUsed="0"/>
-    <w:lsdException w:name="Medium List 1 Accent 5" w:semiHidden="0" w:uiPriority="65" w:unhideWhenUsed="0"/>
-    <w:lsdException w:name="Medium List 2 Accent 5" w:semiHidden="0" w:uiPriority="66" w:unhideWhenUsed="0"/>
-    <w:lsdException w:name="Medium Grid 1 Accent 5" w:semiHidden="0" w:uiPriority="67" w:unhideWhenUsed="0"/>
-    <w:lsdException w:name="Medium Grid 2 Accent 5" w:semiHidden="0" w:uiPriority="68" w:unhideWhenUsed="0"/>
-    <w:lsdException w:name="Medium Grid 3 Accent 5" w:semiHidden="0" w:uiPriority="69" w:unhideWhenUsed="0"/>
-    <w:lsdException w:name="Dark List Accent 5" w:semiHidden="0" w:uiPriority="70" w:unhideWhenUsed="0"/>
-    <w:lsdException w:name="Colorful Shading Accent 5" w:semiHidden="0" w:uiPriority="71" w:unhideWhenUsed="0"/>
-    <w:lsdException w:name="Colorful List Accent 5" w:semiHidden="0" w:uiPriority="72" w:unhideWhenUsed="0"/>
-    <w:lsdException w:name="Colorful Grid Accent 5" w:semiHidden="0" w:uiPriority="73" w:unhideWhenUsed="0"/>
-    <w:lsdException w:name="Light Shading Accent 6" w:semiHidden="0" w:uiPriority="60" w:unhideWhenUsed="0"/>
-    <w:lsdException w:name="Light List Accent 6" w:semiHidden="0" w:uiPriority="61" w:unhideWhenUsed="0"/>
-    <w:lsdException w:name="Light Grid Accent 6" w:semiHidden="0" w:uiPriority="62" w:unhideWhenUsed="0"/>
-    <w:lsdException w:name="Medium Shading 1 Accent 6" w:semiHidden="0" w:uiPriority="63" w:unhideWhenUsed="0"/>
-    <w:lsdException w:name="Medium Shading 2 Accent 6" w:semiHidden="0" w:uiPriority="64" w:unhideWhenUsed="0"/>
-    <w:lsdException w:name="Medium List 1 Accent 6" w:semiHidden="0" w:uiPriority="65" w:unhideWhenUsed="0"/>
-    <w:lsdException w:name="Medium List 2 Accent 6" w:semiHidden="0" w:uiPriority="66" w:unhideWhenUsed="0"/>
-    <w:lsdException w:name="Medium Grid 1 Accent 6" w:semiHidden="0" w:uiPriority="67" w:unhideWhenUsed="0"/>
-    <w:lsdException w:name="Medium Grid 2 Accent 6" w:semiHidden="0" w:uiPriority="68" w:unhideWhenUsed="0"/>
-    <w:lsdException w:name="Medium Grid 3 Accent 6" w:semiHidden="0" w:uiPriority="69" w:unhideWhenUsed="0"/>
-    <w:lsdException w:name="Dark List Accent 6" w:semiHidden="0" w:uiPriority="70" w:unhideWhenUsed="0"/>
-    <w:lsdException w:name="Colorful Shading Accent 6" w:semiHidden="0" w:uiPriority="71" w:unhideWhenUsed="0"/>
-    <w:lsdException w:name="Colorful List Accent 6" w:semiHidden="0" w:uiPriority="72" w:unhideWhenUsed="0"/>
-    <w:lsdException w:name="Colorful Grid Accent 6" w:semiHidden="0" w:uiPriority="73" w:unhideWhenUsed="0"/>
-    <w:lsdException w:name="Subtle Emphasis" w:semiHidden="0" w:uiPriority="19" w:unhideWhenUsed="0" w:qFormat="1"/>
-    <w:lsdException w:name="Intense Emphasis" w:semiHidden="0" w:uiPriority="21" w:unhideWhenUsed="0" w:qFormat="1"/>
-    <w:lsdException w:name="Subtle Reference" w:semiHidden="0" w:uiPriority="31" w:unhideWhenUsed="0" w:qFormat="1"/>
-    <w:lsdException w:name="Intense Reference" w:semiHidden="0" w:uiPriority="32" w:unhideWhenUsed="0" w:qFormat="1"/>
-    <w:lsdException w:name="Book Title" w:semiHidden="0" w:uiPriority="33" w:unhideWhenUsed="0" w:qFormat="1"/>
-    <w:lsdException w:name="Bibliography" w:uiPriority="37"/>
-    <w:lsdException w:name="TOC Heading" w:uiPriority="39" w:qFormat="1"/>
+    <w:lsdException w:name="Table Theme" w:semiHidden="1" w:unhideWhenUsed="1"/>
+    <w:lsdException w:name="Placeholder Text" w:semiHidden="1"/>
+    <w:lsdException w:name="No Spacing" w:uiPriority="1" w:qFormat="1"/>
+    <w:lsdException w:name="Light Shading" w:uiPriority="60"/>
+    <w:lsdException w:name="Light List" w:uiPriority="61"/>
+    <w:lsdException w:name="Light Grid" w:uiPriority="62"/>
+    <w:lsdException w:name="Medium Shading 1" w:uiPriority="63"/>
+    <w:lsdException w:name="Medium Shading 2" w:uiPriority="64"/>
+    <w:lsdException w:name="Medium List 1" w:uiPriority="65"/>
+    <w:lsdException w:name="Medium List 2" w:uiPriority="66"/>
+    <w:lsdException w:name="Medium Grid 1" w:uiPriority="67"/>
+    <w:lsdException w:name="Medium Grid 2" w:uiPriority="68"/>
+    <w:lsdException w:name="Medium Grid 3" w:uiPriority="69"/>
+    <w:lsdException w:name="Dark List" w:uiPriority="70"/>
+    <w:lsdException w:name="Colorful Shading" w:uiPriority="71"/>
+    <w:lsdException w:name="Colorful List" w:uiPriority="72"/>
+    <w:lsdException w:name="Colorful Grid" w:uiPriority="73"/>
+    <w:lsdException w:name="Light Shading Accent 1" w:uiPriority="60"/>
+    <w:lsdException w:name="Light List Accent 1" w:uiPriority="61"/>
+    <w:lsdException w:name="Light Grid Accent 1" w:uiPriority="62"/>
+    <w:lsdException w:name="Medium Shading 1 Accent 1" w:uiPriority="63"/>
+    <w:lsdException w:name="Medium Shading 2 Accent 1" w:uiPriority="64"/>
+    <w:lsdException w:name="Medium List 1 Accent 1" w:uiPriority="65"/>
+    <w:lsdException w:name="Revision" w:semiHidden="1"/>
+    <w:lsdException w:name="List Paragraph" w:uiPriority="34" w:qFormat="1"/>
+    <w:lsdException w:name="Quote" w:uiPriority="29" w:qFormat="1"/>
+    <w:lsdException w:name="Intense Quote" w:uiPriority="30" w:qFormat="1"/>
+    <w:lsdException w:name="Medium List 2 Accent 1" w:uiPriority="66"/>
+    <w:lsdException w:name="Medium Grid 1 Accent 1" w:uiPriority="67"/>
+    <w:lsdException w:name="Medium Grid 2 Accent 1" w:uiPriority="68"/>
+    <w:lsdException w:name="Medium Grid 3 Accent 1" w:uiPriority="69"/>
+    <w:lsdException w:name="Dark List Accent 1" w:uiPriority="70"/>
+    <w:lsdException w:name="Colorful Shading Accent 1" w:uiPriority="71"/>
+    <w:lsdException w:name="Colorful List Accent 1" w:uiPriority="72"/>
+    <w:lsdException w:name="Colorful Grid Accent 1" w:uiPriority="73"/>
+    <w:lsdException w:name="Light Shading Accent 2" w:uiPriority="60"/>
+    <w:lsdException w:name="Light List Accent 2" w:uiPriority="61"/>
+    <w:lsdException w:name="Light Grid Accent 2" w:uiPriority="62"/>
+    <w:lsdException w:name="Medium Shading 1 Accent 2" w:uiPriority="63"/>
+    <w:lsdException w:name="Medium Shading 2 Accent 2" w:uiPriority="64"/>
+    <w:lsdException w:name="Medium List 1 Accent 2" w:uiPriority="65"/>
+    <w:lsdException w:name="Medium List 2 Accent 2" w:uiPriority="66"/>
+    <w:lsdException w:name="Medium Grid 1 Accent 2" w:uiPriority="67"/>
+    <w:lsdException w:name="Medium Grid 2 Accent 2" w:uiPriority="68"/>
+    <w:lsdException w:name="Medium Grid 3 Accent 2" w:uiPriority="69"/>
+    <w:lsdException w:name="Dark List Accent 2" w:uiPriority="70"/>
+    <w:lsdException w:name="Colorful Shading Accent 2" w:uiPriority="71"/>
+    <w:lsdException w:name="Colorful List Accent 2" w:uiPriority="72"/>
+    <w:lsdException w:name="Colorful Grid Accent 2" w:uiPriority="73"/>
+    <w:lsdException w:name="Light Shading Accent 3" w:uiPriority="60"/>
+    <w:lsdException w:name="Light List Accent 3" w:uiPriority="61"/>
+    <w:lsdException w:name="Light Grid Accent 3" w:uiPriority="62"/>
+    <w:lsdException w:name="Medium Shading 1 Accent 3" w:uiPriority="63"/>
+    <w:lsdException w:name="Medium Shading 2 Accent 3" w:uiPriority="64"/>
+    <w:lsdException w:name="Medium List 1 Accent 3" w:uiPriority="65"/>
+    <w:lsdException w:name="Medium List 2 Accent 3" w:uiPriority="66"/>
+    <w:lsdException w:name="Medium Grid 1 Accent 3" w:uiPriority="67"/>
+    <w:lsdException w:name="Medium Grid 2 Accent 3" w:uiPriority="68"/>
+    <w:lsdException w:name="Medium Grid 3 Accent 3" w:uiPriority="69"/>
+    <w:lsdException w:name="Dark List Accent 3" w:uiPriority="70"/>
+    <w:lsdException w:name="Colorful Shading Accent 3" w:uiPriority="71"/>
+    <w:lsdException w:name="Colorful List Accent 3" w:uiPriority="72"/>
+    <w:lsdException w:name="Colorful Grid Accent 3" w:uiPriority="73"/>
+    <w:lsdException w:name="Light Shading Accent 4" w:uiPriority="60"/>
+    <w:lsdException w:name="Light List Accent 4" w:uiPriority="61"/>
+    <w:lsdException w:name="Light Grid Accent 4" w:uiPriority="62"/>
+    <w:lsdException w:name="Medium Shading 1 Accent 4" w:uiPriority="63"/>
+    <w:lsdException w:name="Medium Shading 2 Accent 4" w:uiPriority="64"/>
+    <w:lsdException w:name="Medium List 1 Accent 4" w:uiPriority="65"/>
+    <w:lsdException w:name="Medium List 2 Accent 4" w:uiPriority="66"/>
+    <w:lsdException w:name="Medium Grid 1 Accent 4" w:uiPriority="67"/>
+    <w:lsdException w:name="Medium Grid 2 Accent 4" w:uiPriority="68"/>
+    <w:lsdException w:name="Medium Grid 3 Accent 4" w:uiPriority="69"/>
+    <w:lsdException w:name="Dark List Accent 4" w:uiPriority="70"/>
+    <w:lsdException w:name="Colorful Shading Accent 4" w:uiPriority="71"/>
+    <w:lsdException w:name="Colorful List Accent 4" w:uiPriority="72"/>
+    <w:lsdException w:name="Colorful Grid Accent 4" w:uiPriority="73"/>
+    <w:lsdException w:name="Light Shading Accent 5" w:uiPriority="60"/>
+    <w:lsdException w:name="Light List Accent 5" w:uiPriority="61"/>
+    <w:lsdException w:name="Light Grid Accent 5" w:uiPriority="62"/>
+    <w:lsdException w:name="Medium Shading 1 Accent 5" w:uiPriority="63"/>
+    <w:lsdException w:name="Medium Shading 2 Accent 5" w:uiPriority="64"/>
+    <w:lsdException w:name="Medium List 1 Accent 5" w:uiPriority="65"/>
+    <w:lsdException w:name="Medium List 2 Accent 5" w:uiPriority="66"/>
+    <w:lsdException w:name="Medium Grid 1 Accent 5" w:uiPriority="67"/>
+    <w:lsdException w:name="Medium Grid 2 Accent 5" w:uiPriority="68"/>
+    <w:lsdException w:name="Medium Grid 3 Accent 5" w:uiPriority="69"/>
+    <w:lsdException w:name="Dark List Accent 5" w:uiPriority="70"/>
+    <w:lsdException w:name="Colorful Shading Accent 5" w:uiPriority="71"/>
+    <w:lsdException w:name="Colorful List Accent 5" w:uiPriority="72"/>
+    <w:lsdException w:name="Colorful Grid Accent 5" w:uiPriority="73"/>
+    <w:lsdException w:name="Light Shading Accent 6" w:uiPriority="60"/>
+    <w:lsdException w:name="Light List Accent 6" w:uiPriority="61"/>
+    <w:lsdException w:name="Light Grid Accent 6" w:uiPriority="62"/>
+    <w:lsdException w:name="Medium Shading 1 Accent 6" w:uiPriority="63"/>
+    <w:lsdException w:name="Medium Shading 2 Accent 6" w:uiPriority="64"/>
+    <w:lsdException w:name="Medium List 1 Accent 6" w:uiPriority="65"/>
+    <w:lsdException w:name="Medium List 2 Accent 6" w:uiPriority="66"/>
+    <w:lsdException w:name="Medium Grid 1 Accent 6" w:uiPriority="67"/>
+    <w:lsdException w:name="Medium Grid 2 Accent 6" w:uiPriority="68"/>
+    <w:lsdException w:name="Medium Grid 3 Accent 6" w:uiPriority="69"/>
+    <w:lsdException w:name="Dark List Accent 6" w:uiPriority="70"/>
+    <w:lsdException w:name="Colorful Shading Accent 6" w:uiPriority="71"/>
+    <w:lsdException w:name="Colorful List Accent 6" w:uiPriority="72"/>
+    <w:lsdException w:name="Colorful Grid Accent 6" w:uiPriority="73"/>
+    <w:lsdException w:name="Subtle Emphasis" w:uiPriority="19" w:qFormat="1"/>
+    <w:lsdException w:name="Intense Emphasis" w:uiPriority="21" w:qFormat="1"/>
+    <w:lsdException w:name="Subtle Reference" w:uiPriority="31" w:qFormat="1"/>
+    <w:lsdException w:name="Intense Reference" w:uiPriority="32" w:qFormat="1"/>
+    <w:lsdException w:name="Book Title" w:uiPriority="33" w:qFormat="1"/>
+    <w:lsdException w:name="Bibliography" w:semiHidden="1" w:uiPriority="37" w:unhideWhenUsed="1"/>
+    <w:lsdException w:name="TOC Heading" w:semiHidden="1" w:uiPriority="39" w:unhideWhenUsed="1" w:qFormat="1"/>
+    <w:lsdException w:name="Plain Table 1" w:uiPriority="41"/>
+    <w:lsdException w:name="Plain Table 2" w:uiPriority="42"/>
+    <w:lsdException w:name="Plain Table 3" w:uiPriority="43"/>
+    <w:lsdException w:name="Plain Table 4" w:uiPriority="44"/>
+    <w:lsdException w:name="Plain Table 5" w:uiPriority="45"/>
+    <w:lsdException w:name="Grid Table Light" w:uiPriority="40"/>
+    <w:lsdException w:name="Grid Table 1 Light" w:uiPriority="46"/>
+    <w:lsdException w:name="Grid Table 2" w:uiPriority="47"/>
+    <w:lsdException w:name="Grid Table 3" w:uiPriority="48"/>
+    <w:lsdException w:name="Grid Table 4" w:uiPriority="49"/>
+    <w:lsdException w:name="Grid Table 5 Dark" w:uiPriority="50"/>
+    <w:lsdException w:name="Grid Table 6 Colorful" w:uiPriority="51"/>
+    <w:lsdException w:name="Grid Table 7 Colorful" w:uiPriority="52"/>
+    <w:lsdException w:name="Grid Table 1 Light Accent 1" w:uiPriority="46"/>
+    <w:lsdException w:name="Grid Table 2 Accent 1" w:uiPriority="47"/>
+    <w:lsdException w:name="Grid Table 3 Accent 1" w:uiPriority="48"/>
+    <w:lsdException w:name="Grid Table 4 Accent 1" w:uiPriority="49"/>
+    <w:lsdException w:name="Grid Table 5 Dark Accent 1" w:uiPriority="50"/>
+    <w:lsdException w:name="Grid Table 6 Colorful Accent 1" w:uiPriority="51"/>
+    <w:lsdException w:name="Grid Table 7 Colorful Accent 1" w:uiPriority="52"/>
+    <w:lsdException w:name="Grid Table 1 Light Accent 2" w:uiPriority="46"/>
+    <w:lsdException w:name="Grid Table 2 Accent 2" w:uiPriority="47"/>
+    <w:lsdException w:name="Grid Table 3 Accent 2" w:uiPriority="48"/>
+    <w:lsdException w:name="Grid Table 4 Accent 2" w:uiPriority="49"/>
+    <w:lsdException w:name="Grid Table 5 Dark Accent 2" w:uiPriority="50"/>
+    <w:lsdException w:name="Grid Table 6 Colorful Accent 2" w:uiPriority="51"/>
+    <w:lsdException w:name="Grid Table 7 Colorful Accent 2" w:uiPriority="52"/>
+    <w:lsdException w:name="Grid Table 1 Light Accent 3" w:uiPriority="46"/>
+    <w:lsdException w:name="Grid Table 2 Accent 3" w:uiPriority="47"/>
+    <w:lsdException w:name="Grid Table 3 Accent 3" w:uiPriority="48"/>
+    <w:lsdException w:name="Grid Table 4 Accent 3" w:uiPriority="49"/>
+    <w:lsdException w:name="Grid Table 5 Dark Accent 3" w:uiPriority="50"/>
+    <w:lsdException w:name="Grid Table 6 Colorful Accent 3" w:uiPriority="51"/>
+    <w:lsdException w:name="Grid Table 7 Colorful Accent 3" w:uiPriority="52"/>
+    <w:lsdException w:name="Grid Table 1 Light Accent 4" w:uiPriority="46"/>
+    <w:lsdException w:name="Grid Table 2 Accent 4" w:uiPriority="47"/>
+    <w:lsdException w:name="Grid Table 3 Accent 4" w:uiPriority="48"/>
+    <w:lsdException w:name="Grid Table 4 Accent 4" w:uiPriority="49"/>
+    <w:lsdException w:name="Grid Table 5 Dark Accent 4" w:uiPriority="50"/>
+    <w:lsdException w:name="Grid Table 6 Colorful Accent 4" w:uiPriority="51"/>
+    <w:lsdException w:name="Grid Table 7 Colorful Accent 4" w:uiPriority="52"/>
+    <w:lsdException w:name="Grid Table 1 Light Accent 5" w:uiPriority="46"/>
+    <w:lsdException w:name="Grid Table 2 Accent 5" w:uiPriority="47"/>
+    <w:lsdException w:name="Grid Table 3 Accent 5" w:uiPriority="48"/>
+    <w:lsdException w:name="Grid Table 4 Accent 5" w:uiPriority="49"/>
+    <w:lsdException w:name="Grid Table 5 Dark Accent 5" w:uiPriority="50"/>
+    <w:lsdException w:name="Grid Table 6 Colorful Accent 5" w:uiPriority="51"/>
+    <w:lsdException w:name="Grid Table 7 Colorful Accent 5" w:uiPriority="52"/>
+    <w:lsdException w:name="Grid Table 1 Light Accent 6" w:uiPriority="46"/>
+    <w:lsdException w:name="Grid Table 2 Accent 6" w:uiPriority="47"/>
+    <w:lsdException w:name="Grid Table 3 Accent 6" w:uiPriority="48"/>
+    <w:lsdException w:name="Grid Table 4 Accent 6" w:uiPriority="49"/>
+    <w:lsdException w:name="Grid Table 5 Dark Accent 6" w:uiPriority="50"/>
+    <w:lsdException w:name="Grid Table 6 Colorful Accent 6" w:uiPriority="51"/>
+    <w:lsdException w:name="Grid Table 7 Colorful Accent 6" w:uiPriority="52"/>
+    <w:lsdException w:name="List Table 1 Light" w:uiPriority="46"/>
+    <w:lsdException w:name="List Table 2" w:uiPriority="47"/>
+    <w:lsdException w:name="List Table 3" w:uiPriority="48"/>
+    <w:lsdException w:name="List Table 4" w:uiPriority="49"/>
+    <w:lsdException w:name="List Table 5 Dark" w:uiPriority="50"/>
+    <w:lsdException w:name="List Table 6 Colorful" w:uiPriority="51"/>
+    <w:lsdException w:name="List Table 7 Colorful" w:uiPriority="52"/>
+    <w:lsdException w:name="List Table 1 Light Accent 1" w:uiPriority="46"/>
+    <w:lsdException w:name="List Table 2 Accent 1" w:uiPriority="47"/>
+    <w:lsdException w:name="List Table 3 Accent 1" w:uiPriority="48"/>
+    <w:lsdException w:name="List Table 4 Accent 1" w:uiPriority="49"/>
+    <w:lsdException w:name="List Table 5 Dark Accent 1" w:uiPriority="50"/>
+    <w:lsdException w:name="List Table 6 Colorful Accent 1" w:uiPriority="51"/>
+    <w:lsdException w:name="List Table 7 Colorful Accent 1" w:uiPriority="52"/>
+    <w:lsdException w:name="List Table 1 Light Accent 2" w:uiPriority="46"/>
+    <w:lsdException w:name="List Table 2 Accent 2" w:uiPriority="47"/>
+    <w:lsdException w:name="List Table 3 Accent 2" w:uiPriority="48"/>
+    <w:lsdException w:name="List Table 4 Accent 2" w:uiPriority="49"/>
+    <w:lsdException w:name="List Table 5 Dark Accent 2" w:uiPriority="50"/>
+    <w:lsdException w:name="List Table 6 Colorful Accent 2" w:uiPriority="51"/>
+    <w:lsdException w:name="List Table 7 Colorful Accent 2" w:uiPriority="52"/>
+    <w:lsdException w:name="List Table 1 Light Accent 3" w:uiPriority="46"/>
+    <w:lsdException w:name="List Table 2 Accent 3" w:uiPriority="47"/>
+    <w:lsdException w:name="List Table 3 Accent 3" w:uiPriority="48"/>
+    <w:lsdException w:name="List Table 4 Accent 3" w:uiPriority="49"/>
+    <w:lsdException w:name="List Table 5 Dark Accent 3" w:uiPriority="50"/>
+    <w:lsdException w:name="List Table 6 Colorful Accent 3" w:uiPriority="51"/>
+    <w:lsdException w:name="List Table 7 Colorful Accent 3" w:uiPriority="52"/>
+    <w:lsdException w:name="List Table 1 Light Accent 4" w:uiPriority="46"/>
+    <w:lsdException w:name="List Table 2 Accent 4" w:uiPriority="47"/>
+    <w:lsdException w:name="List Table 3 Accent 4" w:uiPriority="48"/>
+    <w:lsdException w:name="List Table 4 Accent 4" w:uiPriority="49"/>
+    <w:lsdException w:name="List Table 5 Dark Accent 4" w:uiPriority="50"/>
+    <w:lsdException w:name="List Table 6 Colorful Accent 4" w:uiPriority="51"/>
+    <w:lsdException w:name="List Table 7 Colorful Accent 4" w:uiPriority="52"/>
+    <w:lsdException w:name="List Table 1 Light Accent 5" w:uiPriority="46"/>
+    <w:lsdException w:name="List Table 2 Accent 5" w:uiPriority="47"/>
+    <w:lsdException w:name="List Table 3 Accent 5" w:uiPriority="48"/>
+    <w:lsdException w:name="List Table 4 Accent 5" w:uiPriority="49"/>
+    <w:lsdException w:name="List Table 5 Dark Accent 5" w:uiPriority="50"/>
+    <w:lsdException w:name="List Table 6 Colorful Accent 5" w:uiPriority="51"/>
+    <w:lsdException w:name="List Table 7 Colorful Accent 5" w:uiPriority="52"/>
+    <w:lsdException w:name="List Table 1 Light Accent 6" w:uiPriority="46"/>
+    <w:lsdException w:name="List Table 2 Accent 6" w:uiPriority="47"/>
+    <w:lsdException w:name="List Table 3 Accent 6" w:uiPriority="48"/>
+    <w:lsdException w:name="List Table 4 Accent 6" w:uiPriority="49"/>
+    <w:lsdException w:name="List Table 5 Dark Accent 6" w:uiPriority="50"/>
+    <w:lsdException w:name="List Table 6 Colorful Accent 6" w:uiPriority="51"/>
+    <w:lsdException w:name="List Table 7 Colorful Accent 6" w:uiPriority="52"/>
+    <w:lsdException w:name="Mention" w:semiHidden="1" w:unhideWhenUsed="1"/>
+    <w:lsdException w:name="Smart Hyperlink" w:semiHidden="1" w:unhideWhenUsed="1"/>
+    <w:lsdException w:name="Hashtag" w:semiHidden="1" w:unhideWhenUsed="1"/>
+    <w:lsdException w:name="Unresolved Mention" w:semiHidden="1" w:unhideWhenUsed="1"/>
+    <w:lsdException w:name="Smart Link" w:semiHidden="1" w:unhideWhenUsed="1"/>
   </w:latentStyles>
   <w:style w:type="paragraph" w:default="1" w:styleId="Normal">
     <w:name w:val="Normal"/>
@@ -5426,9 +5724,7 @@
       <w:tblStyleRowBandSize w:val="1"/>
       <w:tblStyleColBandSize w:val="1"/>
       <w:tblCellMar>
-        <w:top w:w="0" w:type="dxa"/>
         <w:left w:w="108" w:type="dxa"/>
-        <w:bottom w:w="0" w:type="dxa"/>
         <w:right w:w="108" w:type="dxa"/>
       </w:tblCellMar>
     </w:tblPr>
@@ -5442,9 +5738,7 @@
       <w:tblStyleRowBandSize w:val="1"/>
       <w:tblStyleColBandSize w:val="1"/>
       <w:tblCellMar>
-        <w:top w:w="0" w:type="dxa"/>
         <w:left w:w="108" w:type="dxa"/>
-        <w:bottom w:w="0" w:type="dxa"/>
         <w:right w:w="108" w:type="dxa"/>
       </w:tblCellMar>
     </w:tblPr>
@@ -5455,9 +5749,7 @@
       <w:tblStyleRowBandSize w:val="1"/>
       <w:tblStyleColBandSize w:val="1"/>
       <w:tblCellMar>
-        <w:top w:w="0" w:type="dxa"/>
         <w:left w:w="115" w:type="dxa"/>
-        <w:bottom w:w="0" w:type="dxa"/>
         <w:right w:w="115" w:type="dxa"/>
       </w:tblCellMar>
     </w:tblPr>
@@ -5468,9 +5760,7 @@
       <w:tblStyleRowBandSize w:val="1"/>
       <w:tblStyleColBandSize w:val="1"/>
       <w:tblCellMar>
-        <w:top w:w="0" w:type="dxa"/>
         <w:left w:w="115" w:type="dxa"/>
-        <w:bottom w:w="0" w:type="dxa"/>
         <w:right w:w="115" w:type="dxa"/>
       </w:tblCellMar>
     </w:tblPr>
@@ -5523,7 +5813,6 @@
     <w:uiPriority w:val="39"/>
     <w:rsid w:val="00AB773A"/>
     <w:tblPr>
-      <w:tblInd w:w="0" w:type="dxa"/>
       <w:tblBorders>
         <w:top w:val="single" w:sz="4" w:space="0" w:color="auto"/>
         <w:left w:val="single" w:sz="4" w:space="0" w:color="auto"/>
@@ -5532,620 +5821,6 @@
         <w:insideH w:val="single" w:sz="4" w:space="0" w:color="auto"/>
         <w:insideV w:val="single" w:sz="4" w:space="0" w:color="auto"/>
       </w:tblBorders>
-      <w:tblCellMar>
-        <w:top w:w="0" w:type="dxa"/>
-        <w:left w:w="108" w:type="dxa"/>
-        <w:bottom w:w="0" w:type="dxa"/>
-        <w:right w:w="108" w:type="dxa"/>
-      </w:tblCellMar>
-    </w:tblPr>
-  </w:style>
-  <w:style w:type="paragraph" w:styleId="Textodeglobo">
-    <w:name w:val="Balloon Text"/>
-    <w:basedOn w:val="Normal"/>
-    <w:link w:val="TextodegloboCar"/>
-    <w:uiPriority w:val="99"/>
-    <w:semiHidden/>
-    <w:unhideWhenUsed/>
-    <w:rsid w:val="003A0A20"/>
-    <w:rPr>
-      <w:rFonts w:ascii="Segoe UI" w:hAnsi="Segoe UI" w:cs="Segoe UI"/>
-      <w:sz w:val="18"/>
-      <w:szCs w:val="18"/>
-    </w:rPr>
-  </w:style>
-  <w:style w:type="character" w:customStyle="1" w:styleId="TextodegloboCar">
-    <w:name w:val="Texto de globo Car"/>
-    <w:basedOn w:val="Fuentedeprrafopredeter"/>
-    <w:link w:val="Textodeglobo"/>
-    <w:uiPriority w:val="99"/>
-    <w:semiHidden/>
-    <w:rsid w:val="003A0A20"/>
-    <w:rPr>
-      <w:rFonts w:ascii="Segoe UI" w:hAnsi="Segoe UI" w:cs="Segoe UI"/>
-      <w:sz w:val="18"/>
-      <w:szCs w:val="18"/>
-    </w:rPr>
-  </w:style>
-  <w:style w:type="character" w:styleId="Refdecomentario">
-    <w:name w:val="annotation reference"/>
-    <w:basedOn w:val="Fuentedeprrafopredeter"/>
-    <w:uiPriority w:val="99"/>
-    <w:semiHidden/>
-    <w:unhideWhenUsed/>
-    <w:rsid w:val="00FE2FED"/>
-    <w:rPr>
-      <w:sz w:val="16"/>
-      <w:szCs w:val="16"/>
-    </w:rPr>
-  </w:style>
-  <w:style w:type="paragraph" w:styleId="Textocomentario">
-    <w:name w:val="annotation text"/>
-    <w:basedOn w:val="Normal"/>
-    <w:link w:val="TextocomentarioCar"/>
-    <w:uiPriority w:val="99"/>
-    <w:semiHidden/>
-    <w:unhideWhenUsed/>
-    <w:rsid w:val="00FE2FED"/>
-    <w:rPr>
-      <w:sz w:val="20"/>
-      <w:szCs w:val="20"/>
-    </w:rPr>
-  </w:style>
-  <w:style w:type="character" w:customStyle="1" w:styleId="TextocomentarioCar">
-    <w:name w:val="Texto comentario Car"/>
-    <w:basedOn w:val="Fuentedeprrafopredeter"/>
-    <w:link w:val="Textocomentario"/>
-    <w:uiPriority w:val="99"/>
-    <w:semiHidden/>
-    <w:rsid w:val="00FE2FED"/>
-    <w:rPr>
-      <w:sz w:val="20"/>
-      <w:szCs w:val="20"/>
-    </w:rPr>
-  </w:style>
-  <w:style w:type="paragraph" w:styleId="Asuntodelcomentario">
-    <w:name w:val="annotation subject"/>
-    <w:basedOn w:val="Textocomentario"/>
-    <w:next w:val="Textocomentario"/>
-    <w:link w:val="AsuntodelcomentarioCar"/>
-    <w:uiPriority w:val="99"/>
-    <w:semiHidden/>
-    <w:unhideWhenUsed/>
-    <w:rsid w:val="00FE2FED"/>
-    <w:rPr>
-      <w:b/>
-      <w:bCs/>
-    </w:rPr>
-  </w:style>
-  <w:style w:type="character" w:customStyle="1" w:styleId="AsuntodelcomentarioCar">
-    <w:name w:val="Asunto del comentario Car"/>
-    <w:basedOn w:val="TextocomentarioCar"/>
-    <w:link w:val="Asuntodelcomentario"/>
-    <w:uiPriority w:val="99"/>
-    <w:semiHidden/>
-    <w:rsid w:val="00FE2FED"/>
-    <w:rPr>
-      <w:b/>
-      <w:bCs/>
-      <w:sz w:val="20"/>
-      <w:szCs w:val="20"/>
-    </w:rPr>
-  </w:style>
-  <w:style w:type="paragraph" w:styleId="Revisin">
-    <w:name w:val="Revision"/>
-    <w:hidden/>
-    <w:uiPriority w:val="99"/>
-    <w:semiHidden/>
-    <w:rsid w:val="00FE2FED"/>
-  </w:style>
-  <w:style w:type="paragraph" w:styleId="NormalWeb">
-    <w:name w:val="Normal (Web)"/>
-    <w:basedOn w:val="Normal"/>
-    <w:uiPriority w:val="99"/>
-    <w:semiHidden/>
-    <w:unhideWhenUsed/>
-    <w:rsid w:val="005436A4"/>
-    <w:pPr>
-      <w:spacing w:before="100" w:beforeAutospacing="1" w:after="100" w:afterAutospacing="1"/>
-    </w:pPr>
-    <w:rPr>
-      <w:rFonts w:ascii="Times New Roman" w:eastAsia="Times New Roman" w:hAnsi="Times New Roman" w:cs="Times New Roman"/>
-      <w:sz w:val="24"/>
-      <w:szCs w:val="24"/>
-      <w:lang w:val="es-CO"/>
-    </w:rPr>
-  </w:style>
-</w:styles>
-</file>
-
-<file path=word/stylesWithEffects.xml><?xml version="1.0" encoding="utf-8"?>
-<w:styles xmlns:wpc="http://schemas.microsoft.com/office/word/2010/wordprocessingCanvas" xmlns:mc="http://schemas.openxmlformats.org/markup-compatibility/2006" xmlns:o="urn:schemas-microsoft-com:office:office" xmlns:r="http://schemas.openxmlformats.org/officeDocument/2006/relationships" xmlns:m="http://schemas.openxmlformats.org/officeDocument/2006/math" xmlns:v="urn:schemas-microsoft-com:vml" xmlns:wp14="http://schemas.microsoft.com/office/word/2010/wordprocessingDrawing" xmlns:wp="http://schemas.openxmlformats.org/drawingml/2006/wordprocessingDrawing" xmlns:w10="urn:schemas-microsoft-com:office:word" xmlns:w="http://schemas.openxmlformats.org/wordprocessingml/2006/main" xmlns:w14="http://schemas.microsoft.com/office/word/2010/wordml" xmlns:wpg="http://schemas.microsoft.com/office/word/2010/wordprocessingGroup" xmlns:wpi="http://schemas.microsoft.com/office/word/2010/wordprocessingInk" xmlns:wne="http://schemas.microsoft.com/office/word/2006/wordml" xmlns:wps="http://schemas.microsoft.com/office/word/2010/wordprocessingShape" mc:Ignorable="w14 wp14">
-  <w:docDefaults>
-    <w:rPrDefault>
-      <w:rPr>
-        <w:rFonts w:ascii="Calibri" w:eastAsia="Calibri" w:hAnsi="Calibri" w:cs="Calibri"/>
-        <w:sz w:val="22"/>
-        <w:szCs w:val="22"/>
-        <w:lang w:val="es-ES" w:eastAsia="es-CO" w:bidi="ar-SA"/>
-      </w:rPr>
-    </w:rPrDefault>
-    <w:pPrDefault/>
-  </w:docDefaults>
-  <w:latentStyles w:defLockedState="0" w:defUIPriority="99" w:defSemiHidden="1" w:defUnhideWhenUsed="1" w:defQFormat="0" w:count="267">
-    <w:lsdException w:name="Normal" w:semiHidden="0" w:uiPriority="0" w:unhideWhenUsed="0" w:qFormat="1"/>
-    <w:lsdException w:name="heading 1" w:semiHidden="0" w:uiPriority="9" w:unhideWhenUsed="0" w:qFormat="1"/>
-    <w:lsdException w:name="heading 2" w:uiPriority="9" w:qFormat="1"/>
-    <w:lsdException w:name="heading 3" w:uiPriority="9" w:qFormat="1"/>
-    <w:lsdException w:name="heading 4" w:uiPriority="9" w:qFormat="1"/>
-    <w:lsdException w:name="heading 5" w:uiPriority="9" w:qFormat="1"/>
-    <w:lsdException w:name="heading 6" w:uiPriority="9" w:qFormat="1"/>
-    <w:lsdException w:name="heading 7" w:uiPriority="9" w:qFormat="1"/>
-    <w:lsdException w:name="heading 8" w:uiPriority="9" w:qFormat="1"/>
-    <w:lsdException w:name="heading 9" w:uiPriority="9" w:qFormat="1"/>
-    <w:lsdException w:name="toc 1" w:uiPriority="39"/>
-    <w:lsdException w:name="toc 2" w:uiPriority="39"/>
-    <w:lsdException w:name="toc 3" w:uiPriority="39"/>
-    <w:lsdException w:name="toc 4" w:uiPriority="39"/>
-    <w:lsdException w:name="toc 5" w:uiPriority="39"/>
-    <w:lsdException w:name="toc 6" w:uiPriority="39"/>
-    <w:lsdException w:name="toc 7" w:uiPriority="39"/>
-    <w:lsdException w:name="toc 8" w:uiPriority="39"/>
-    <w:lsdException w:name="toc 9" w:uiPriority="39"/>
-    <w:lsdException w:name="caption" w:uiPriority="35" w:qFormat="1"/>
-    <w:lsdException w:name="Title" w:semiHidden="0" w:uiPriority="10" w:unhideWhenUsed="0" w:qFormat="1"/>
-    <w:lsdException w:name="Default Paragraph Font" w:uiPriority="1"/>
-    <w:lsdException w:name="Subtitle" w:semiHidden="0" w:uiPriority="11" w:unhideWhenUsed="0" w:qFormat="1"/>
-    <w:lsdException w:name="Strong" w:semiHidden="0" w:uiPriority="22" w:unhideWhenUsed="0" w:qFormat="1"/>
-    <w:lsdException w:name="Emphasis" w:semiHidden="0" w:uiPriority="20" w:unhideWhenUsed="0" w:qFormat="1"/>
-    <w:lsdException w:name="Table Grid" w:uiPriority="39"/>
-    <w:lsdException w:name="Placeholder Text" w:unhideWhenUsed="0"/>
-    <w:lsdException w:name="No Spacing" w:semiHidden="0" w:uiPriority="1" w:unhideWhenUsed="0" w:qFormat="1"/>
-    <w:lsdException w:name="Light Shading" w:semiHidden="0" w:uiPriority="60" w:unhideWhenUsed="0"/>
-    <w:lsdException w:name="Light List" w:semiHidden="0" w:uiPriority="61" w:unhideWhenUsed="0"/>
-    <w:lsdException w:name="Light Grid" w:semiHidden="0" w:uiPriority="62" w:unhideWhenUsed="0"/>
-    <w:lsdException w:name="Medium Shading 1" w:semiHidden="0" w:uiPriority="63" w:unhideWhenUsed="0"/>
-    <w:lsdException w:name="Medium Shading 2" w:semiHidden="0" w:uiPriority="64" w:unhideWhenUsed="0"/>
-    <w:lsdException w:name="Medium List 1" w:semiHidden="0" w:uiPriority="65" w:unhideWhenUsed="0"/>
-    <w:lsdException w:name="Medium List 2" w:semiHidden="0" w:uiPriority="66" w:unhideWhenUsed="0"/>
-    <w:lsdException w:name="Medium Grid 1" w:semiHidden="0" w:uiPriority="67" w:unhideWhenUsed="0"/>
-    <w:lsdException w:name="Medium Grid 2" w:semiHidden="0" w:uiPriority="68" w:unhideWhenUsed="0"/>
-    <w:lsdException w:name="Medium Grid 3" w:semiHidden="0" w:uiPriority="69" w:unhideWhenUsed="0"/>
-    <w:lsdException w:name="Dark List" w:semiHidden="0" w:uiPriority="70" w:unhideWhenUsed="0"/>
-    <w:lsdException w:name="Colorful Shading" w:semiHidden="0" w:uiPriority="71" w:unhideWhenUsed="0"/>
-    <w:lsdException w:name="Colorful List" w:semiHidden="0" w:uiPriority="72" w:unhideWhenUsed="0"/>
-    <w:lsdException w:name="Colorful Grid" w:semiHidden="0" w:uiPriority="73" w:unhideWhenUsed="0"/>
-    <w:lsdException w:name="Light Shading Accent 1" w:semiHidden="0" w:uiPriority="60" w:unhideWhenUsed="0"/>
-    <w:lsdException w:name="Light List Accent 1" w:semiHidden="0" w:uiPriority="61" w:unhideWhenUsed="0"/>
-    <w:lsdException w:name="Light Grid Accent 1" w:semiHidden="0" w:uiPriority="62" w:unhideWhenUsed="0"/>
-    <w:lsdException w:name="Medium Shading 1 Accent 1" w:semiHidden="0" w:uiPriority="63" w:unhideWhenUsed="0"/>
-    <w:lsdException w:name="Medium Shading 2 Accent 1" w:semiHidden="0" w:uiPriority="64" w:unhideWhenUsed="0"/>
-    <w:lsdException w:name="Medium List 1 Accent 1" w:semiHidden="0" w:uiPriority="65" w:unhideWhenUsed="0"/>
-    <w:lsdException w:name="Revision" w:unhideWhenUsed="0"/>
-    <w:lsdException w:name="List Paragraph" w:semiHidden="0" w:uiPriority="34" w:unhideWhenUsed="0" w:qFormat="1"/>
-    <w:lsdException w:name="Quote" w:semiHidden="0" w:uiPriority="29" w:unhideWhenUsed="0" w:qFormat="1"/>
-    <w:lsdException w:name="Intense Quote" w:semiHidden="0" w:uiPriority="30" w:unhideWhenUsed="0" w:qFormat="1"/>
-    <w:lsdException w:name="Medium List 2 Accent 1" w:semiHidden="0" w:uiPriority="66" w:unhideWhenUsed="0"/>
-    <w:lsdException w:name="Medium Grid 1 Accent 1" w:semiHidden="0" w:uiPriority="67" w:unhideWhenUsed="0"/>
-    <w:lsdException w:name="Medium Grid 2 Accent 1" w:semiHidden="0" w:uiPriority="68" w:unhideWhenUsed="0"/>
-    <w:lsdException w:name="Medium Grid 3 Accent 1" w:semiHidden="0" w:uiPriority="69" w:unhideWhenUsed="0"/>
-    <w:lsdException w:name="Dark List Accent 1" w:semiHidden="0" w:uiPriority="70" w:unhideWhenUsed="0"/>
-    <w:lsdException w:name="Colorful Shading Accent 1" w:semiHidden="0" w:uiPriority="71" w:unhideWhenUsed="0"/>
-    <w:lsdException w:name="Colorful List Accent 1" w:semiHidden="0" w:uiPriority="72" w:unhideWhenUsed="0"/>
-    <w:lsdException w:name="Colorful Grid Accent 1" w:semiHidden="0" w:uiPriority="73" w:unhideWhenUsed="0"/>
-    <w:lsdException w:name="Light Shading Accent 2" w:semiHidden="0" w:uiPriority="60" w:unhideWhenUsed="0"/>
-    <w:lsdException w:name="Light List Accent 2" w:semiHidden="0" w:uiPriority="61" w:unhideWhenUsed="0"/>
-    <w:lsdException w:name="Light Grid Accent 2" w:semiHidden="0" w:uiPriority="62" w:unhideWhenUsed="0"/>
-    <w:lsdException w:name="Medium Shading 1 Accent 2" w:semiHidden="0" w:uiPriority="63" w:unhideWhenUsed="0"/>
-    <w:lsdException w:name="Medium Shading 2 Accent 2" w:semiHidden="0" w:uiPriority="64" w:unhideWhenUsed="0"/>
-    <w:lsdException w:name="Medium List 1 Accent 2" w:semiHidden="0" w:uiPriority="65" w:unhideWhenUsed="0"/>
-    <w:lsdException w:name="Medium List 2 Accent 2" w:semiHidden="0" w:uiPriority="66" w:unhideWhenUsed="0"/>
-    <w:lsdException w:name="Medium Grid 1 Accent 2" w:semiHidden="0" w:uiPriority="67" w:unhideWhenUsed="0"/>
-    <w:lsdException w:name="Medium Grid 2 Accent 2" w:semiHidden="0" w:uiPriority="68" w:unhideWhenUsed="0"/>
-    <w:lsdException w:name="Medium Grid 3 Accent 2" w:semiHidden="0" w:uiPriority="69" w:unhideWhenUsed="0"/>
-    <w:lsdException w:name="Dark List Accent 2" w:semiHidden="0" w:uiPriority="70" w:unhideWhenUsed="0"/>
-    <w:lsdException w:name="Colorful Shading Accent 2" w:semiHidden="0" w:uiPriority="71" w:unhideWhenUsed="0"/>
-    <w:lsdException w:name="Colorful List Accent 2" w:semiHidden="0" w:uiPriority="72" w:unhideWhenUsed="0"/>
-    <w:lsdException w:name="Colorful Grid Accent 2" w:semiHidden="0" w:uiPriority="73" w:unhideWhenUsed="0"/>
-    <w:lsdException w:name="Light Shading Accent 3" w:semiHidden="0" w:uiPriority="60" w:unhideWhenUsed="0"/>
-    <w:lsdException w:name="Light List Accent 3" w:semiHidden="0" w:uiPriority="61" w:unhideWhenUsed="0"/>
-    <w:lsdException w:name="Light Grid Accent 3" w:semiHidden="0" w:uiPriority="62" w:unhideWhenUsed="0"/>
-    <w:lsdException w:name="Medium Shading 1 Accent 3" w:semiHidden="0" w:uiPriority="63" w:unhideWhenUsed="0"/>
-    <w:lsdException w:name="Medium Shading 2 Accent 3" w:semiHidden="0" w:uiPriority="64" w:unhideWhenUsed="0"/>
-    <w:lsdException w:name="Medium List 1 Accent 3" w:semiHidden="0" w:uiPriority="65" w:unhideWhenUsed="0"/>
-    <w:lsdException w:name="Medium List 2 Accent 3" w:semiHidden="0" w:uiPriority="66" w:unhideWhenUsed="0"/>
-    <w:lsdException w:name="Medium Grid 1 Accent 3" w:semiHidden="0" w:uiPriority="67" w:unhideWhenUsed="0"/>
-    <w:lsdException w:name="Medium Grid 2 Accent 3" w:semiHidden="0" w:uiPriority="68" w:unhideWhenUsed="0"/>
-    <w:lsdException w:name="Medium Grid 3 Accent 3" w:semiHidden="0" w:uiPriority="69" w:unhideWhenUsed="0"/>
-    <w:lsdException w:name="Dark List Accent 3" w:semiHidden="0" w:uiPriority="70" w:unhideWhenUsed="0"/>
-    <w:lsdException w:name="Colorful Shading Accent 3" w:semiHidden="0" w:uiPriority="71" w:unhideWhenUsed="0"/>
-    <w:lsdException w:name="Colorful List Accent 3" w:semiHidden="0" w:uiPriority="72" w:unhideWhenUsed="0"/>
-    <w:lsdException w:name="Colorful Grid Accent 3" w:semiHidden="0" w:uiPriority="73" w:unhideWhenUsed="0"/>
-    <w:lsdException w:name="Light Shading Accent 4" w:semiHidden="0" w:uiPriority="60" w:unhideWhenUsed="0"/>
-    <w:lsdException w:name="Light List Accent 4" w:semiHidden="0" w:uiPriority="61" w:unhideWhenUsed="0"/>
-    <w:lsdException w:name="Light Grid Accent 4" w:semiHidden="0" w:uiPriority="62" w:unhideWhenUsed="0"/>
-    <w:lsdException w:name="Medium Shading 1 Accent 4" w:semiHidden="0" w:uiPriority="63" w:unhideWhenUsed="0"/>
-    <w:lsdException w:name="Medium Shading 2 Accent 4" w:semiHidden="0" w:uiPriority="64" w:unhideWhenUsed="0"/>
-    <w:lsdException w:name="Medium List 1 Accent 4" w:semiHidden="0" w:uiPriority="65" w:unhideWhenUsed="0"/>
-    <w:lsdException w:name="Medium List 2 Accent 4" w:semiHidden="0" w:uiPriority="66" w:unhideWhenUsed="0"/>
-    <w:lsdException w:name="Medium Grid 1 Accent 4" w:semiHidden="0" w:uiPriority="67" w:unhideWhenUsed="0"/>
-    <w:lsdException w:name="Medium Grid 2 Accent 4" w:semiHidden="0" w:uiPriority="68" w:unhideWhenUsed="0"/>
-    <w:lsdException w:name="Medium Grid 3 Accent 4" w:semiHidden="0" w:uiPriority="69" w:unhideWhenUsed="0"/>
-    <w:lsdException w:name="Dark List Accent 4" w:semiHidden="0" w:uiPriority="70" w:unhideWhenUsed="0"/>
-    <w:lsdException w:name="Colorful Shading Accent 4" w:semiHidden="0" w:uiPriority="71" w:unhideWhenUsed="0"/>
-    <w:lsdException w:name="Colorful List Accent 4" w:semiHidden="0" w:uiPriority="72" w:unhideWhenUsed="0"/>
-    <w:lsdException w:name="Colorful Grid Accent 4" w:semiHidden="0" w:uiPriority="73" w:unhideWhenUsed="0"/>
-    <w:lsdException w:name="Light Shading Accent 5" w:semiHidden="0" w:uiPriority="60" w:unhideWhenUsed="0"/>
-    <w:lsdException w:name="Light List Accent 5" w:semiHidden="0" w:uiPriority="61" w:unhideWhenUsed="0"/>
-    <w:lsdException w:name="Light Grid Accent 5" w:semiHidden="0" w:uiPriority="62" w:unhideWhenUsed="0"/>
-    <w:lsdException w:name="Medium Shading 1 Accent 5" w:semiHidden="0" w:uiPriority="63" w:unhideWhenUsed="0"/>
-    <w:lsdException w:name="Medium Shading 2 Accent 5" w:semiHidden="0" w:uiPriority="64" w:unhideWhenUsed="0"/>
-    <w:lsdException w:name="Medium List 1 Accent 5" w:semiHidden="0" w:uiPriority="65" w:unhideWhenUsed="0"/>
-    <w:lsdException w:name="Medium List 2 Accent 5" w:semiHidden="0" w:uiPriority="66" w:unhideWhenUsed="0"/>
-    <w:lsdException w:name="Medium Grid 1 Accent 5" w:semiHidden="0" w:uiPriority="67" w:unhideWhenUsed="0"/>
-    <w:lsdException w:name="Medium Grid 2 Accent 5" w:semiHidden="0" w:uiPriority="68" w:unhideWhenUsed="0"/>
-    <w:lsdException w:name="Medium Grid 3 Accent 5" w:semiHidden="0" w:uiPriority="69" w:unhideWhenUsed="0"/>
-    <w:lsdException w:name="Dark List Accent 5" w:semiHidden="0" w:uiPriority="70" w:unhideWhenUsed="0"/>
-    <w:lsdException w:name="Colorful Shading Accent 5" w:semiHidden="0" w:uiPriority="71" w:unhideWhenUsed="0"/>
-    <w:lsdException w:name="Colorful List Accent 5" w:semiHidden="0" w:uiPriority="72" w:unhideWhenUsed="0"/>
-    <w:lsdException w:name="Colorful Grid Accent 5" w:semiHidden="0" w:uiPriority="73" w:unhideWhenUsed="0"/>
-    <w:lsdException w:name="Light Shading Accent 6" w:semiHidden="0" w:uiPriority="60" w:unhideWhenUsed="0"/>
-    <w:lsdException w:name="Light List Accent 6" w:semiHidden="0" w:uiPriority="61" w:unhideWhenUsed="0"/>
-    <w:lsdException w:name="Light Grid Accent 6" w:semiHidden="0" w:uiPriority="62" w:unhideWhenUsed="0"/>
-    <w:lsdException w:name="Medium Shading 1 Accent 6" w:semiHidden="0" w:uiPriority="63" w:unhideWhenUsed="0"/>
-    <w:lsdException w:name="Medium Shading 2 Accent 6" w:semiHidden="0" w:uiPriority="64" w:unhideWhenUsed="0"/>
-    <w:lsdException w:name="Medium List 1 Accent 6" w:semiHidden="0" w:uiPriority="65" w:unhideWhenUsed="0"/>
-    <w:lsdException w:name="Medium List 2 Accent 6" w:semiHidden="0" w:uiPriority="66" w:unhideWhenUsed="0"/>
-    <w:lsdException w:name="Medium Grid 1 Accent 6" w:semiHidden="0" w:uiPriority="67" w:unhideWhenUsed="0"/>
-    <w:lsdException w:name="Medium Grid 2 Accent 6" w:semiHidden="0" w:uiPriority="68" w:unhideWhenUsed="0"/>
-    <w:lsdException w:name="Medium Grid 3 Accent 6" w:semiHidden="0" w:uiPriority="69" w:unhideWhenUsed="0"/>
-    <w:lsdException w:name="Dark List Accent 6" w:semiHidden="0" w:uiPriority="70" w:unhideWhenUsed="0"/>
-    <w:lsdException w:name="Colorful Shading Accent 6" w:semiHidden="0" w:uiPriority="71" w:unhideWhenUsed="0"/>
-    <w:lsdException w:name="Colorful List Accent 6" w:semiHidden="0" w:uiPriority="72" w:unhideWhenUsed="0"/>
-    <w:lsdException w:name="Colorful Grid Accent 6" w:semiHidden="0" w:uiPriority="73" w:unhideWhenUsed="0"/>
-    <w:lsdException w:name="Subtle Emphasis" w:semiHidden="0" w:uiPriority="19" w:unhideWhenUsed="0" w:qFormat="1"/>
-    <w:lsdException w:name="Intense Emphasis" w:semiHidden="0" w:uiPriority="21" w:unhideWhenUsed="0" w:qFormat="1"/>
-    <w:lsdException w:name="Subtle Reference" w:semiHidden="0" w:uiPriority="31" w:unhideWhenUsed="0" w:qFormat="1"/>
-    <w:lsdException w:name="Intense Reference" w:semiHidden="0" w:uiPriority="32" w:unhideWhenUsed="0" w:qFormat="1"/>
-    <w:lsdException w:name="Book Title" w:semiHidden="0" w:uiPriority="33" w:unhideWhenUsed="0" w:qFormat="1"/>
-    <w:lsdException w:name="Bibliography" w:uiPriority="37"/>
-    <w:lsdException w:name="TOC Heading" w:uiPriority="39" w:qFormat="1"/>
-  </w:latentStyles>
-  <w:style w:type="paragraph" w:default="1" w:styleId="Normal">
-    <w:name w:val="Normal"/>
-    <w:qFormat/>
-  </w:style>
-  <w:style w:type="paragraph" w:styleId="Ttulo1">
-    <w:name w:val="heading 1"/>
-    <w:basedOn w:val="Normal"/>
-    <w:next w:val="Normal"/>
-    <w:uiPriority w:val="9"/>
-    <w:qFormat/>
-    <w:pPr>
-      <w:keepNext/>
-      <w:ind w:left="502" w:hanging="360"/>
-      <w:jc w:val="both"/>
-      <w:outlineLvl w:val="0"/>
-    </w:pPr>
-    <w:rPr>
-      <w:rFonts w:ascii="Arial" w:eastAsia="Arial" w:hAnsi="Arial" w:cs="Arial"/>
-      <w:b/>
-      <w:sz w:val="24"/>
-      <w:szCs w:val="24"/>
-    </w:rPr>
-  </w:style>
-  <w:style w:type="paragraph" w:styleId="Ttulo2">
-    <w:name w:val="heading 2"/>
-    <w:basedOn w:val="Normal"/>
-    <w:next w:val="Normal"/>
-    <w:uiPriority w:val="9"/>
-    <w:semiHidden/>
-    <w:unhideWhenUsed/>
-    <w:qFormat/>
-    <w:pPr>
-      <w:keepNext/>
-      <w:widowControl w:val="0"/>
-      <w:tabs>
-        <w:tab w:val="left" w:pos="0"/>
-        <w:tab w:val="center" w:pos="4680"/>
-      </w:tabs>
-      <w:ind w:left="142"/>
-      <w:outlineLvl w:val="1"/>
-    </w:pPr>
-    <w:rPr>
-      <w:rFonts w:ascii="Arial" w:eastAsia="Arial" w:hAnsi="Arial" w:cs="Arial"/>
-      <w:sz w:val="26"/>
-      <w:szCs w:val="26"/>
-    </w:rPr>
-  </w:style>
-  <w:style w:type="paragraph" w:styleId="Ttulo3">
-    <w:name w:val="heading 3"/>
-    <w:basedOn w:val="Normal"/>
-    <w:next w:val="Normal"/>
-    <w:uiPriority w:val="9"/>
-    <w:semiHidden/>
-    <w:unhideWhenUsed/>
-    <w:qFormat/>
-    <w:pPr>
-      <w:keepNext/>
-      <w:widowControl w:val="0"/>
-      <w:tabs>
-        <w:tab w:val="left" w:pos="0"/>
-      </w:tabs>
-      <w:ind w:left="567"/>
-      <w:jc w:val="both"/>
-      <w:outlineLvl w:val="2"/>
-    </w:pPr>
-    <w:rPr>
-      <w:rFonts w:ascii="Arial" w:eastAsia="Arial" w:hAnsi="Arial" w:cs="Arial"/>
-      <w:sz w:val="26"/>
-      <w:szCs w:val="26"/>
-    </w:rPr>
-  </w:style>
-  <w:style w:type="paragraph" w:styleId="Ttulo4">
-    <w:name w:val="heading 4"/>
-    <w:basedOn w:val="Normal"/>
-    <w:next w:val="Normal"/>
-    <w:uiPriority w:val="9"/>
-    <w:semiHidden/>
-    <w:unhideWhenUsed/>
-    <w:qFormat/>
-    <w:pPr>
-      <w:keepNext/>
-      <w:tabs>
-        <w:tab w:val="left" w:pos="0"/>
-        <w:tab w:val="left" w:pos="1134"/>
-      </w:tabs>
-      <w:ind w:left="2662" w:hanging="360"/>
-      <w:jc w:val="both"/>
-      <w:outlineLvl w:val="3"/>
-    </w:pPr>
-    <w:rPr>
-      <w:rFonts w:ascii="Times New Roman" w:eastAsia="Times New Roman" w:hAnsi="Times New Roman" w:cs="Times New Roman"/>
-      <w:sz w:val="24"/>
-      <w:szCs w:val="24"/>
-    </w:rPr>
-  </w:style>
-  <w:style w:type="paragraph" w:styleId="Ttulo5">
-    <w:name w:val="heading 5"/>
-    <w:basedOn w:val="Normal"/>
-    <w:next w:val="Normal"/>
-    <w:uiPriority w:val="9"/>
-    <w:semiHidden/>
-    <w:unhideWhenUsed/>
-    <w:qFormat/>
-    <w:pPr>
-      <w:keepNext/>
-      <w:tabs>
-        <w:tab w:val="left" w:pos="0"/>
-      </w:tabs>
-      <w:spacing w:line="480" w:lineRule="auto"/>
-      <w:ind w:left="3382" w:hanging="360"/>
-      <w:jc w:val="both"/>
-      <w:outlineLvl w:val="4"/>
-    </w:pPr>
-    <w:rPr>
-      <w:rFonts w:ascii="Arial" w:eastAsia="Arial" w:hAnsi="Arial" w:cs="Arial"/>
-      <w:i/>
-      <w:sz w:val="28"/>
-      <w:szCs w:val="28"/>
-    </w:rPr>
-  </w:style>
-  <w:style w:type="paragraph" w:styleId="Ttulo6">
-    <w:name w:val="heading 6"/>
-    <w:basedOn w:val="Normal"/>
-    <w:next w:val="Normal"/>
-    <w:uiPriority w:val="9"/>
-    <w:semiHidden/>
-    <w:unhideWhenUsed/>
-    <w:qFormat/>
-    <w:pPr>
-      <w:spacing w:before="240" w:after="60"/>
-      <w:ind w:left="4102" w:hanging="180"/>
-      <w:outlineLvl w:val="5"/>
-    </w:pPr>
-    <w:rPr>
-      <w:rFonts w:ascii="Times New Roman" w:eastAsia="Times New Roman" w:hAnsi="Times New Roman" w:cs="Times New Roman"/>
-      <w:b/>
-      <w:sz w:val="20"/>
-      <w:szCs w:val="20"/>
-    </w:rPr>
-  </w:style>
-  <w:style w:type="character" w:default="1" w:styleId="Fuentedeprrafopredeter">
-    <w:name w:val="Default Paragraph Font"/>
-    <w:uiPriority w:val="1"/>
-    <w:semiHidden/>
-    <w:unhideWhenUsed/>
-  </w:style>
-  <w:style w:type="table" w:default="1" w:styleId="Tablanormal">
-    <w:name w:val="Normal Table"/>
-    <w:uiPriority w:val="99"/>
-    <w:semiHidden/>
-    <w:unhideWhenUsed/>
-    <w:tblPr>
-      <w:tblInd w:w="0" w:type="dxa"/>
-      <w:tblCellMar>
-        <w:top w:w="0" w:type="dxa"/>
-        <w:left w:w="108" w:type="dxa"/>
-        <w:bottom w:w="0" w:type="dxa"/>
-        <w:right w:w="108" w:type="dxa"/>
-      </w:tblCellMar>
-    </w:tblPr>
-  </w:style>
-  <w:style w:type="numbering" w:default="1" w:styleId="Sinlista">
-    <w:name w:val="No List"/>
-    <w:uiPriority w:val="99"/>
-    <w:semiHidden/>
-    <w:unhideWhenUsed/>
-  </w:style>
-  <w:style w:type="table" w:customStyle="1" w:styleId="TableNormal">
-    <w:name w:val="Table Normal"/>
-    <w:tblPr>
-      <w:tblCellMar>
-        <w:top w:w="0" w:type="dxa"/>
-        <w:left w:w="0" w:type="dxa"/>
-        <w:bottom w:w="0" w:type="dxa"/>
-        <w:right w:w="0" w:type="dxa"/>
-      </w:tblCellMar>
-    </w:tblPr>
-  </w:style>
-  <w:style w:type="paragraph" w:styleId="Ttulo">
-    <w:name w:val="Title"/>
-    <w:basedOn w:val="Normal"/>
-    <w:next w:val="Normal"/>
-    <w:uiPriority w:val="10"/>
-    <w:qFormat/>
-    <w:pPr>
-      <w:keepNext/>
-      <w:keepLines/>
-      <w:spacing w:before="480" w:after="120"/>
-    </w:pPr>
-    <w:rPr>
-      <w:b/>
-      <w:sz w:val="72"/>
-      <w:szCs w:val="72"/>
-    </w:rPr>
-  </w:style>
-  <w:style w:type="paragraph" w:styleId="Subttulo">
-    <w:name w:val="Subtitle"/>
-    <w:basedOn w:val="Normal"/>
-    <w:next w:val="Normal"/>
-    <w:uiPriority w:val="11"/>
-    <w:qFormat/>
-    <w:pPr>
-      <w:keepNext/>
-      <w:keepLines/>
-      <w:spacing w:before="360" w:after="80"/>
-    </w:pPr>
-    <w:rPr>
-      <w:rFonts w:ascii="Georgia" w:eastAsia="Georgia" w:hAnsi="Georgia" w:cs="Georgia"/>
-      <w:i/>
-      <w:color w:val="666666"/>
-      <w:sz w:val="48"/>
-      <w:szCs w:val="48"/>
-    </w:rPr>
-  </w:style>
-  <w:style w:type="table" w:customStyle="1" w:styleId="a">
-    <w:basedOn w:val="TableNormal"/>
-    <w:rPr>
-      <w:rFonts w:ascii="Times New Roman" w:eastAsia="Times New Roman" w:hAnsi="Times New Roman" w:cs="Times New Roman"/>
-    </w:rPr>
-    <w:tblPr>
-      <w:tblStyleRowBandSize w:val="1"/>
-      <w:tblStyleColBandSize w:val="1"/>
-      <w:tblCellMar>
-        <w:top w:w="0" w:type="dxa"/>
-        <w:left w:w="108" w:type="dxa"/>
-        <w:bottom w:w="0" w:type="dxa"/>
-        <w:right w:w="108" w:type="dxa"/>
-      </w:tblCellMar>
-    </w:tblPr>
-  </w:style>
-  <w:style w:type="table" w:customStyle="1" w:styleId="a0">
-    <w:basedOn w:val="TableNormal"/>
-    <w:rPr>
-      <w:rFonts w:ascii="Times New Roman" w:eastAsia="Times New Roman" w:hAnsi="Times New Roman" w:cs="Times New Roman"/>
-    </w:rPr>
-    <w:tblPr>
-      <w:tblStyleRowBandSize w:val="1"/>
-      <w:tblStyleColBandSize w:val="1"/>
-      <w:tblCellMar>
-        <w:top w:w="0" w:type="dxa"/>
-        <w:left w:w="108" w:type="dxa"/>
-        <w:bottom w:w="0" w:type="dxa"/>
-        <w:right w:w="108" w:type="dxa"/>
-      </w:tblCellMar>
-    </w:tblPr>
-  </w:style>
-  <w:style w:type="table" w:customStyle="1" w:styleId="a1">
-    <w:basedOn w:val="TableNormal"/>
-    <w:tblPr>
-      <w:tblStyleRowBandSize w:val="1"/>
-      <w:tblStyleColBandSize w:val="1"/>
-      <w:tblCellMar>
-        <w:top w:w="0" w:type="dxa"/>
-        <w:left w:w="115" w:type="dxa"/>
-        <w:bottom w:w="0" w:type="dxa"/>
-        <w:right w:w="115" w:type="dxa"/>
-      </w:tblCellMar>
-    </w:tblPr>
-  </w:style>
-  <w:style w:type="table" w:customStyle="1" w:styleId="a2">
-    <w:basedOn w:val="TableNormal"/>
-    <w:tblPr>
-      <w:tblStyleRowBandSize w:val="1"/>
-      <w:tblStyleColBandSize w:val="1"/>
-      <w:tblCellMar>
-        <w:top w:w="0" w:type="dxa"/>
-        <w:left w:w="115" w:type="dxa"/>
-        <w:bottom w:w="0" w:type="dxa"/>
-        <w:right w:w="115" w:type="dxa"/>
-      </w:tblCellMar>
-    </w:tblPr>
-  </w:style>
-  <w:style w:type="paragraph" w:styleId="Encabezado">
-    <w:name w:val="header"/>
-    <w:basedOn w:val="Normal"/>
-    <w:link w:val="EncabezadoCar"/>
-    <w:uiPriority w:val="99"/>
-    <w:unhideWhenUsed/>
-    <w:rsid w:val="005D2878"/>
-    <w:pPr>
-      <w:tabs>
-        <w:tab w:val="center" w:pos="4419"/>
-        <w:tab w:val="right" w:pos="8838"/>
-      </w:tabs>
-    </w:pPr>
-  </w:style>
-  <w:style w:type="character" w:customStyle="1" w:styleId="EncabezadoCar">
-    <w:name w:val="Encabezado Car"/>
-    <w:basedOn w:val="Fuentedeprrafopredeter"/>
-    <w:link w:val="Encabezado"/>
-    <w:uiPriority w:val="99"/>
-    <w:rsid w:val="005D2878"/>
-  </w:style>
-  <w:style w:type="paragraph" w:styleId="Piedepgina">
-    <w:name w:val="footer"/>
-    <w:basedOn w:val="Normal"/>
-    <w:link w:val="PiedepginaCar"/>
-    <w:uiPriority w:val="99"/>
-    <w:unhideWhenUsed/>
-    <w:rsid w:val="005D2878"/>
-    <w:pPr>
-      <w:tabs>
-        <w:tab w:val="center" w:pos="4419"/>
-        <w:tab w:val="right" w:pos="8838"/>
-      </w:tabs>
-    </w:pPr>
-  </w:style>
-  <w:style w:type="character" w:customStyle="1" w:styleId="PiedepginaCar">
-    <w:name w:val="Pie de página Car"/>
-    <w:basedOn w:val="Fuentedeprrafopredeter"/>
-    <w:link w:val="Piedepgina"/>
-    <w:uiPriority w:val="99"/>
-    <w:rsid w:val="005D2878"/>
-  </w:style>
-  <w:style w:type="table" w:styleId="Tablaconcuadrcula">
-    <w:name w:val="Table Grid"/>
-    <w:basedOn w:val="Tablanormal"/>
-    <w:uiPriority w:val="39"/>
-    <w:rsid w:val="00AB773A"/>
-    <w:tblPr>
-      <w:tblInd w:w="0" w:type="dxa"/>
-      <w:tblBorders>
-        <w:top w:val="single" w:sz="4" w:space="0" w:color="auto"/>
-        <w:left w:val="single" w:sz="4" w:space="0" w:color="auto"/>
-        <w:bottom w:val="single" w:sz="4" w:space="0" w:color="auto"/>
-        <w:right w:val="single" w:sz="4" w:space="0" w:color="auto"/>
-        <w:insideH w:val="single" w:sz="4" w:space="0" w:color="auto"/>
-        <w:insideV w:val="single" w:sz="4" w:space="0" w:color="auto"/>
-      </w:tblBorders>
-      <w:tblCellMar>
-        <w:top w:w="0" w:type="dxa"/>
-        <w:left w:w="108" w:type="dxa"/>
-        <w:bottom w:w="0" w:type="dxa"/>
-        <w:right w:w="108" w:type="dxa"/>
-      </w:tblCellMar>
     </w:tblPr>
   </w:style>
   <w:style w:type="paragraph" w:styleId="Textodeglobo">

</xml_diff>